<commit_message>
Aggiornamento Quaderno: evidenziazioni (Mate cap. 3-4, Programmazione cap. 5), STATO e piano
Co-Authored-By: Claude Sonnet 5.5 <noreply@anthropic.com>
</commit_message>
<xml_diff>
--- a/Riassunto Matematica discreta.docx
+++ b/Riassunto Matematica discreta.docx
@@ -1857,7 +1857,16 @@
         <w:t>Importanza dell'Ordine delle Coppie</w:t>
       </w:r>
       <w:r>
-        <w:t xml:space="preserve">: Nelle coppie ordinate la posizione dei termini è vincolante. Se a ≠ b, allora la coppia (a, b) è distinta dalla coppia (b, a). Ad esempio, la coppia (2, 1) è diversa dalla coppia (1, 2). Questo concetto è alla base della </w:t>
+        <w:t>: Nelle c</w:t>
+      </w:r>
+      <w:r>
+        <w:rPr>
+          <w:highlight w:val="yellow"/>
+        </w:rPr>
+        <w:t>oppie ordinate la posizione dei termini è vincolante</w:t>
+      </w:r>
+      <w:r>
+        <w:t xml:space="preserve">. Se a ≠ b, allora la coppia (a, b) è distinta dalla coppia (b, a). Ad esempio, la coppia (2, 1) è diversa dalla coppia (1, 2). Questo concetto è alla base della </w:t>
       </w:r>
       <w:r>
         <w:rPr>
@@ -1885,7 +1894,16 @@
         <w:t>Differenza Concettuale rispetto all'Unione</w:t>
       </w:r>
       <w:r>
-        <w:t>: L'unione A ∪ B inserisce i singoli elementi originari in un'unica "scatola" comune. Il prodotto cartesiano A × B, al contrario, costruisce oggetti di natura del tutto nuova: le coppie ordinate.</w:t>
+        <w:t xml:space="preserve">: L'unione A ∪ B inserisce i singoli elementi originari in un'unica "scatola" comune. Il </w:t>
+      </w:r>
+      <w:r>
+        <w:rPr>
+          <w:highlight w:val="yellow"/>
+        </w:rPr>
+        <w:t>prodotto cartesiano A × B, al contrario, costruisce oggetti di natura del tutto nuova: le coppie ordinate</w:t>
+      </w:r>
+      <w:r>
+        <w:t>.</w:t>
       </w:r>
     </w:p>
     <w:p>
@@ -1903,7 +1921,25 @@
         <w:t>Prodotto di un Insieme con Se Stesso</w:t>
       </w:r>
       <w:r>
-        <w:t>: È possibile effettuare il prodotto cartesiano di un insieme con se stesso (A × A), ottenendo coppie formate da elementi appartenenti al medesimo insieme.</w:t>
+        <w:t xml:space="preserve">: È </w:t>
+      </w:r>
+      <w:r>
+        <w:rPr>
+          <w:highlight w:val="yellow"/>
+        </w:rPr>
+        <w:t>possibile effettuare il prodotto cartesiano di un insieme con se stesso</w:t>
+      </w:r>
+      <w:r>
+        <w:t xml:space="preserve"> (A × A), </w:t>
+      </w:r>
+      <w:r>
+        <w:rPr>
+          <w:highlight w:val="yellow"/>
+        </w:rPr>
+        <w:t>ottenendo coppie formate da elementi appartenenti al medesimo insieme</w:t>
+      </w:r>
+      <w:r>
+        <w:t>.</w:t>
       </w:r>
     </w:p>
     <w:p>
@@ -1912,6 +1948,9 @@
           <w:ilvl w:val="0"/>
           <w:numId w:val="14"/>
         </w:numPr>
+        <w:rPr>
+          <w:highlight w:val="yellow"/>
+        </w:rPr>
       </w:pPr>
       <w:r>
         <w:rPr>
@@ -1921,7 +1960,19 @@
         <w:t>Cardinalità del Prodotto Cartesiano</w:t>
       </w:r>
       <w:r>
-        <w:t xml:space="preserve">: Se A e B sono insiemi finiti di cardinalità |A| = m e |B| = n, gli elementi di A × B si possono disporre in una griglia o tabella rettangolare di m righe e n colonne. Di conseguenza, la cardinalità del prodotto cartesiano è data dal prodotto aritmetico delle singole cardinalità: </w:t>
+        <w:t xml:space="preserve">: Se A e B sono insiemi finiti di cardinalità |A| = m e |B| = n, gli elementi di A × B si </w:t>
+      </w:r>
+      <w:r>
+        <w:t>possono disporre in una griglia o tabella rettangolare di m righe e n colonne.</w:t>
+      </w:r>
+      <w:r>
+        <w:t xml:space="preserve"> Di conseguenza, </w:t>
+      </w:r>
+      <w:r>
+        <w:rPr>
+          <w:highlight w:val="yellow"/>
+        </w:rPr>
+        <w:t xml:space="preserve">la cardinalità del prodotto cartesiano è data dal prodotto aritmetico delle singole cardinalità: </w:t>
       </w:r>
     </w:p>
     <w:p>
@@ -1929,6 +1980,9 @@
         <w:jc w:val="center"/>
       </w:pPr>
       <w:r>
+        <w:rPr>
+          <w:highlight w:val="yellow"/>
+        </w:rPr>
         <w:t>|A × B| = |A| · |B| = m · n</w:t>
       </w:r>
     </w:p>
@@ -1985,16 +2039,21 @@
         <w:rPr>
           <w:b/>
           <w:bCs/>
+          <w:highlight w:val="yellow"/>
         </w:rPr>
         <w:t>differenza tra insiemi</w:t>
       </w:r>
       <w:r>
+        <w:rPr>
+          <w:highlight w:val="yellow"/>
+        </w:rPr>
         <w:t xml:space="preserve"> e il concetto di </w:t>
       </w:r>
       <w:r>
         <w:rPr>
           <w:b/>
           <w:bCs/>
+          <w:highlight w:val="yellow"/>
         </w:rPr>
         <w:t>complementare</w:t>
       </w:r>
@@ -2017,17 +2076,30 @@
         <w:t>Differenza di Insiemi (A ∖ B)</w:t>
       </w:r>
       <w:r>
-        <w:t xml:space="preserve">: Dati due insiemi A e B definiti all'interno di un comune universo di riferimento, l'insieme differenza A ∖ B è formato da tutti e soli gli elementi che appartengono ad A ma </w:t>
-      </w:r>
-      <w:r>
-        <w:rPr>
-          <w:b/>
-          <w:bCs/>
+        <w:t>: Dati due insiemi A e B definiti all'interno di un comune universo di riferimento, l'insieme differenza A ∖ B è fo</w:t>
+      </w:r>
+      <w:r>
+        <w:rPr>
+          <w:highlight w:val="yellow"/>
+        </w:rPr>
+        <w:t xml:space="preserve">rmato da tutti e soli gli elementi che appartengono ad A ma </w:t>
+      </w:r>
+      <w:r>
+        <w:rPr>
+          <w:b/>
+          <w:bCs/>
+          <w:highlight w:val="yellow"/>
         </w:rPr>
         <w:t>non</w:t>
       </w:r>
       <w:r>
-        <w:t xml:space="preserve"> appartengono a B: </w:t>
+        <w:rPr>
+          <w:highlight w:val="yellow"/>
+        </w:rPr>
+        <w:t xml:space="preserve"> appartengono a B</w:t>
+      </w:r>
+      <w:r>
+        <w:t xml:space="preserve">: </w:t>
       </w:r>
     </w:p>
     <w:p>
@@ -2040,7 +2112,16 @@
     </w:p>
     <w:p>
       <w:r>
-        <w:t>In generale, la differenza tra insiemi non è commutativa: esistono insiemi per cui A ∖ B ≠ B ∖ A (ad esempio per A = {1, 2} e B = {2, 3} si ha A ∖ B = {1} e B ∖ A = {3}).</w:t>
+        <w:t xml:space="preserve">In generale, la </w:t>
+      </w:r>
+      <w:r>
+        <w:rPr>
+          <w:highlight w:val="yellow"/>
+        </w:rPr>
+        <w:t>differenza tra insiemi non è commutativa:</w:t>
+      </w:r>
+      <w:r>
+        <w:t xml:space="preserve"> esistono insiemi per cui A ∖ B ≠ B ∖ A (ad esempio per A = {1, 2} e B = {2, 3} si ha A ∖ B = {1} e B ∖ A = {3}).</w:t>
       </w:r>
     </w:p>
     <w:p>
@@ -2073,12 +2154,28 @@
         <w:t>(S))</w:t>
       </w:r>
       <w:r>
-        <w:t xml:space="preserve">: Nel caso particolare in cui un insieme S figuri come sottoinsieme dell'universo A (S ⊆ A), la differenza A ∖ S prende il nome specifico di </w:t>
-      </w:r>
-      <w:r>
-        <w:rPr>
-          <w:b/>
-          <w:bCs/>
+        <w:t xml:space="preserve">: Nel caso particolare in cui un </w:t>
+      </w:r>
+      <w:r>
+        <w:rPr>
+          <w:highlight w:val="yellow"/>
+        </w:rPr>
+        <w:t>insieme S figuri come sottoinsieme dell'universo A</w:t>
+      </w:r>
+      <w:r>
+        <w:t xml:space="preserve"> (S ⊆ A), la </w:t>
+      </w:r>
+      <w:r>
+        <w:rPr>
+          <w:highlight w:val="yellow"/>
+        </w:rPr>
+        <w:t xml:space="preserve">differenza A ∖ S prende il nome specifico di </w:t>
+      </w:r>
+      <w:r>
+        <w:rPr>
+          <w:b/>
+          <w:bCs/>
+          <w:highlight w:val="yellow"/>
         </w:rPr>
         <w:t>complementare di S rispetto ad A</w:t>
       </w:r>
@@ -2111,6 +2208,26 @@
       <w:r>
         <w:t>(S) = {x ∈ A | x ∉ S}</w:t>
       </w:r>
+    </w:p>
+    <w:p>
+      <w:pPr>
+        <w:pStyle w:val="Titolo2"/>
+        <w:rPr>
+          <w:b/>
+          <w:bCs/>
+          <w:color w:val="E97132" w:themeColor="accent2"/>
+        </w:rPr>
+      </w:pPr>
+    </w:p>
+    <w:p>
+      <w:pPr>
+        <w:pStyle w:val="Titolo2"/>
+        <w:rPr>
+          <w:b/>
+          <w:bCs/>
+          <w:color w:val="E97132" w:themeColor="accent2"/>
+        </w:rPr>
+      </w:pPr>
     </w:p>
     <w:p>
       <w:pPr>
@@ -2147,11 +2264,19 @@
           <w:b/>
           <w:bCs/>
         </w:rPr>
-        <w:lastRenderedPageBreak/>
         <w:t>Complementari degli insiemi estremi</w:t>
       </w:r>
       <w:r>
-        <w:t>: Il complementare dell'insieme vuoto coincide con l'intero universo (𝒞</w:t>
+        <w:t xml:space="preserve">: Il </w:t>
+      </w:r>
+      <w:r>
+        <w:rPr>
+          <w:highlight w:val="yellow"/>
+        </w:rPr>
+        <w:t>complementare dell'insieme vuoto coincide con l'intero universo</w:t>
+      </w:r>
+      <w:r>
+        <w:t xml:space="preserve"> (𝒞</w:t>
       </w:r>
       <w:r>
         <w:rPr>
@@ -2160,7 +2285,16 @@
         <w:t>A</w:t>
       </w:r>
       <w:r>
-        <w:t>(∅) = A), mentre il complementare dell'universo stesso è l'insieme vuoto (𝒞</w:t>
+        <w:t xml:space="preserve">(∅) = A), </w:t>
+      </w:r>
+      <w:r>
+        <w:rPr>
+          <w:highlight w:val="yellow"/>
+        </w:rPr>
+        <w:t>mentre il complementare dell'universo stesso è l'insieme vuoto</w:t>
+      </w:r>
+      <w:r>
+        <w:t xml:space="preserve"> (𝒞</w:t>
       </w:r>
       <w:r>
         <w:rPr>
@@ -2187,7 +2321,16 @@
         <w:t>Involutività del Complementare</w:t>
       </w:r>
       <w:r>
-        <w:t xml:space="preserve">: Applicare due volte la complementazione restituisce l'insieme di partenza: </w:t>
+        <w:t xml:space="preserve">: </w:t>
+      </w:r>
+      <w:r>
+        <w:rPr>
+          <w:highlight w:val="yellow"/>
+        </w:rPr>
+        <w:t>Applicare due volte la complementazione restituisce l'insieme di partenza</w:t>
+      </w:r>
+      <w:r>
+        <w:t xml:space="preserve">: </w:t>
       </w:r>
     </w:p>
     <w:p>
@@ -2231,7 +2374,16 @@
         <w:t>Disgiunzione e Ricoprimento Totale</w:t>
       </w:r>
       <w:r>
-        <w:t>: L'intersezione tra un insieme e il suo complementare è sempre priva di elementi (𝒞</w:t>
+        <w:t>: L'inter</w:t>
+      </w:r>
+      <w:r>
+        <w:rPr>
+          <w:highlight w:val="yellow"/>
+        </w:rPr>
+        <w:t>sezione tra un insieme e il suo complementare è sempre priva di elementi</w:t>
+      </w:r>
+      <w:r>
+        <w:t xml:space="preserve"> (𝒞</w:t>
       </w:r>
       <w:r>
         <w:rPr>
@@ -2240,7 +2392,16 @@
         <w:t>A</w:t>
       </w:r>
       <w:r>
-        <w:t>(S) ∩ S = ∅), mentre la loro unione ricostruisce l'intero insieme universale A (S ∪ 𝒞</w:t>
+        <w:t xml:space="preserve">(S) ∩ S = ∅), </w:t>
+      </w:r>
+      <w:r>
+        <w:rPr>
+          <w:highlight w:val="yellow"/>
+        </w:rPr>
+        <w:t>mentre la loro unione ricostruisce l'intero insieme universale</w:t>
+      </w:r>
+      <w:r>
+        <w:t xml:space="preserve"> A (S ∪ 𝒞</w:t>
       </w:r>
       <w:r>
         <w:rPr>
@@ -2276,18 +2437,43 @@
         <w:rPr>
           <w:b/>
           <w:bCs/>
+          <w:highlight w:val="yellow"/>
         </w:rPr>
         <w:t>Leggi di De Morgan</w:t>
       </w:r>
       <w:r>
-        <w:t xml:space="preserve"> stabiliscono una fondamentale relazione algebrica di dualità che lega l'unione e l'intersezione con l'operazione di complementazione. Dal punto di vista intuitivo e mnemonico, esse si sintetizzano dicendo che </w:t>
-      </w:r>
-      <w:r>
-        <w:rPr>
-          <w:b/>
-          <w:bCs/>
-        </w:rPr>
-        <w:t>"il complementare scambia l'unione con l'intersezione e viceversa"</w:t>
+        <w:t xml:space="preserve"> stabiliscono una </w:t>
+      </w:r>
+      <w:r>
+        <w:rPr>
+          <w:highlight w:val="yellow"/>
+        </w:rPr>
+        <w:t>fondamentale relazione algebrica di dualità che lega l'unione e l'intersezione con l'operazione di complementazione</w:t>
+      </w:r>
+      <w:r>
+        <w:t xml:space="preserve">. Dal punto di vista intuitivo e mnemonico, esse si sintetizzano dicendo che </w:t>
+      </w:r>
+      <w:r>
+        <w:rPr>
+          <w:b/>
+          <w:bCs/>
+        </w:rPr>
+        <w:t>"</w:t>
+      </w:r>
+      <w:r>
+        <w:rPr>
+          <w:b/>
+          <w:bCs/>
+          <w:highlight w:val="yellow"/>
+        </w:rPr>
+        <w:t>il complementare scambia l'unione con l'intersezione e viceversa</w:t>
+      </w:r>
+      <w:r>
+        <w:rPr>
+          <w:b/>
+          <w:bCs/>
+        </w:rPr>
+        <w:t>"</w:t>
       </w:r>
       <w:r>
         <w:t>.</w:t>
@@ -2365,7 +2551,22 @@
           <w:i/>
           <w:iCs/>
         </w:rPr>
-        <w:t>(Il complementare dell'unione è l'intersezione dei complementari)</w:t>
+        <w:t>(</w:t>
+      </w:r>
+      <w:r>
+        <w:rPr>
+          <w:i/>
+          <w:iCs/>
+          <w:highlight w:val="yellow"/>
+        </w:rPr>
+        <w:t>Il complementare dell'unione è l'intersezione dei complementari</w:t>
+      </w:r>
+      <w:r>
+        <w:rPr>
+          <w:i/>
+          <w:iCs/>
+        </w:rPr>
+        <w:t>)</w:t>
       </w:r>
       <w:r>
         <w:t>.</w:t>
@@ -2420,7 +2621,22 @@
           <w:i/>
           <w:iCs/>
         </w:rPr>
-        <w:t>(Il complementare dell'intersezione è l'unione dei complementari)</w:t>
+        <w:t>(</w:t>
+      </w:r>
+      <w:r>
+        <w:rPr>
+          <w:i/>
+          <w:iCs/>
+          <w:highlight w:val="yellow"/>
+        </w:rPr>
+        <w:t>Il complementare dell'intersezione è l'unione dei complementari</w:t>
+      </w:r>
+      <w:r>
+        <w:rPr>
+          <w:i/>
+          <w:iCs/>
+        </w:rPr>
+        <w:t>)</w:t>
       </w:r>
       <w:r>
         <w:t>.</w:t>
@@ -2556,12 +2772,22 @@
           <w:color w:val="E97132" w:themeColor="accent2"/>
         </w:rPr>
       </w:pPr>
-      <w:r>
+    </w:p>
+    <w:p>
+      <w:pPr>
+        <w:pStyle w:val="Titolo2"/>
         <w:rPr>
           <w:b/>
           <w:bCs/>
           <w:color w:val="E97132" w:themeColor="accent2"/>
         </w:rPr>
+      </w:pPr>
+      <w:r>
+        <w:rPr>
+          <w:b/>
+          <w:bCs/>
+          <w:color w:val="E97132" w:themeColor="accent2"/>
+        </w:rPr>
         <w:t>Dimostrazione Formale della Seconda Legge</w:t>
       </w:r>
     </w:p>
@@ -2643,7 +2869,6 @@
         <w:ind w:left="720"/>
       </w:pPr>
       <w:r>
-        <w:lastRenderedPageBreak/>
         <w:t xml:space="preserve"> ⟺ x ∈ 𝒞</w:t>
       </w:r>
       <w:r>
@@ -2688,14 +2913,15 @@
         <w:t>A</w:t>
       </w:r>
       <w:r>
-        <w:t>(T)    (per definizione di unione)</w:t>
-      </w:r>
-    </w:p>
-    <w:p>
-      <w:r>
-        <w:pict w14:anchorId="2C665961">
-          <v:rect id="_x0000_i1025" style="width:0;height:1.5pt" o:hralign="center" o:hrstd="t" o:hr="t" fillcolor="#a0a0a0" stroked="f"/>
-        </w:pict>
+        <w:t>(</w:t>
+      </w:r>
+      <w:proofErr w:type="gramStart"/>
+      <w:r>
+        <w:t xml:space="preserve">T)   </w:t>
+      </w:r>
+      <w:proofErr w:type="gramEnd"/>
+      <w:r>
+        <w:t xml:space="preserve"> (per definizione di unione)</w:t>
       </w:r>
     </w:p>
     <w:p>
@@ -2735,17 +2961,30 @@
     </w:p>
     <w:p>
       <w:r>
-        <w:t xml:space="preserve">Assegnato un qualsiasi insieme A, è possibile costruire una nuova struttura astratta i cui elementi costitutivi sono </w:t>
-      </w:r>
-      <w:r>
-        <w:rPr>
-          <w:b/>
-          <w:bCs/>
+        <w:t xml:space="preserve">Assegnato un qualsiasi insieme A, è possibile </w:t>
+      </w:r>
+      <w:r>
+        <w:rPr>
+          <w:highlight w:val="yellow"/>
+        </w:rPr>
+        <w:t xml:space="preserve">costruire una nuova struttura astratta i cui elementi costitutivi sono </w:t>
+      </w:r>
+      <w:r>
+        <w:rPr>
+          <w:b/>
+          <w:bCs/>
+          <w:highlight w:val="yellow"/>
         </w:rPr>
         <w:t>tutti i possibili sottoinsiemi</w:t>
       </w:r>
       <w:r>
-        <w:t xml:space="preserve"> che si possono estrarre da A.</w:t>
+        <w:rPr>
+          <w:highlight w:val="yellow"/>
+        </w:rPr>
+        <w:t xml:space="preserve"> che si possono estrarre da A</w:t>
+      </w:r>
+      <w:r>
+        <w:t>.</w:t>
       </w:r>
     </w:p>
     <w:p>
@@ -2763,12 +3002,19 @@
         <w:t>Definizione Formale</w:t>
       </w:r>
       <w:r>
-        <w:t>: L'</w:t>
-      </w:r>
-      <w:r>
-        <w:rPr>
-          <w:b/>
-          <w:bCs/>
+        <w:t xml:space="preserve">: </w:t>
+      </w:r>
+      <w:r>
+        <w:rPr>
+          <w:highlight w:val="yellow"/>
+        </w:rPr>
+        <w:t>L'</w:t>
+      </w:r>
+      <w:r>
+        <w:rPr>
+          <w:b/>
+          <w:bCs/>
+          <w:highlight w:val="yellow"/>
         </w:rPr>
         <w:t>insieme delle parti</w:t>
       </w:r>
@@ -2808,7 +3054,25 @@
         <w:t>Nota Cruciale sulla Natura degli Elementi</w:t>
       </w:r>
       <w:r>
-        <w:t xml:space="preserve">: Gli elementi di 𝒫(A) sono anch'essi insiemi. Per qualsiasi insieme A, l'insieme vuoto ∅ e l'insieme stesso A appartengono sempre a 𝒫(A) come singoli elementi: </w:t>
+        <w:t xml:space="preserve">: </w:t>
+      </w:r>
+      <w:r>
+        <w:rPr>
+          <w:highlight w:val="yellow"/>
+        </w:rPr>
+        <w:t>Gli elementi di 𝒫(A) sono anch'essi insiemi</w:t>
+      </w:r>
+      <w:r>
+        <w:t>. Per qualsiasi insieme A, l'</w:t>
+      </w:r>
+      <w:r>
+        <w:rPr>
+          <w:highlight w:val="yellow"/>
+        </w:rPr>
+        <w:t>insieme vuoto ∅ e l'insieme stesso A appartengono sempre a 𝒫(A) come singoli elementi</w:t>
+      </w:r>
+      <w:r>
+        <w:t xml:space="preserve">: </w:t>
       </w:r>
     </w:p>
     <w:p>
@@ -2857,7 +3121,16 @@
         <w:t>n = 0 (A = ∅)</w:t>
       </w:r>
       <w:r>
-        <w:t>: L'unico sottoinsieme dell'insieme vuoto è l'insieme vuoto stesso. Pertanto 𝒫(∅) = {∅}, con cardinalità |𝒫(∅)| = 1 = 2</w:t>
+        <w:t>: L'un</w:t>
+      </w:r>
+      <w:r>
+        <w:rPr>
+          <w:highlight w:val="yellow"/>
+        </w:rPr>
+        <w:t>ico sottoinsieme dell'insieme vuoto è l'insieme vuoto stesso</w:t>
+      </w:r>
+      <w:r>
+        <w:t>. Pertanto 𝒫(∅) = {∅}, con cardinalità |𝒫(∅)| = 1 = 2</w:t>
       </w:r>
       <w:r>
         <w:rPr>
@@ -2884,7 +3157,16 @@
         <w:t>n = 1 (A = {a})</w:t>
       </w:r>
       <w:r>
-        <w:t>: I sottoinsiemi possibili sono l'insieme vuoto e l'insieme formato dal singolo elemento {a}. Dunque 𝒫(A) = {∅, {a}}, con cardinalità |𝒫(A)| = 2 = 2</w:t>
+        <w:t xml:space="preserve">: </w:t>
+      </w:r>
+      <w:r>
+        <w:rPr>
+          <w:highlight w:val="yellow"/>
+        </w:rPr>
+        <w:t>I sottoinsiemi possibili sono l'insieme vuoto e l'insieme formato dal singolo elemento {a}.</w:t>
+      </w:r>
+      <w:r>
+        <w:t xml:space="preserve"> Dunque 𝒫(A) = {∅, {a}}, con cardinalità |𝒫(A)| = 2 = 2</w:t>
       </w:r>
       <w:r>
         <w:rPr>
@@ -2911,7 +3193,16 @@
         <w:t>n = 2 (A = {a, b})</w:t>
       </w:r>
       <w:r>
-        <w:t>: I sottoinsiemi includono ∅, i due singoletti {a} e {b}, e l'insieme intero {a, b}. Dunque 𝒫(A) = {∅, {a}, {b}, {a, b}}, con cardinalità |𝒫(A)| = 4 = 2</w:t>
+        <w:t xml:space="preserve">: I </w:t>
+      </w:r>
+      <w:r>
+        <w:rPr>
+          <w:highlight w:val="yellow"/>
+        </w:rPr>
+        <w:t>sottoinsiemi includono ∅, i due singoletti {a} e {b}, e l'insieme intero {a, b}.</w:t>
+      </w:r>
+      <w:r>
+        <w:t xml:space="preserve"> Dunque 𝒫(A) = {∅, {a}, {b}, {a, b}}, con cardinalità |𝒫(A)| = 4 = 2</w:t>
       </w:r>
       <w:r>
         <w:rPr>
@@ -2938,7 +3229,16 @@
         <w:t>n = 3 (A = {a, b, c})</w:t>
       </w:r>
       <w:r>
-        <w:t>: Elencando l'insieme vuoto ∅, i tre singoletti ({a}, {b}, {c}), le tre coppie ({a, b}, {a, c}, {b, c}) e l'insieme intero {a, b, c}, si contano in tutto 8 sottoinsiemi. Dunque |𝒫(A)| = 8 = 2</w:t>
+        <w:t xml:space="preserve">: </w:t>
+      </w:r>
+      <w:r>
+        <w:rPr>
+          <w:highlight w:val="yellow"/>
+        </w:rPr>
+        <w:t>Elencando l'insieme vuoto ∅, i tre singoletti ({a}, {b}, {c}), le tre coppie ({a, b}, {a, c}, {b, c}) e l'insieme intero {a, b, c}, si contano in tutto 8 sottoinsiemi.</w:t>
+      </w:r>
+      <w:r>
+        <w:t xml:space="preserve"> Dunque |𝒫(A)| = 8 = 2</w:t>
       </w:r>
       <w:r>
         <w:rPr>
@@ -2969,8 +3269,19 @@
       </w:r>
     </w:p>
     <w:p>
-      <w:r>
-        <w:t xml:space="preserve">La progressione numerica 1, 2, 4, 8, … conduce direttamente alla formulazione del teorema generale: se A è un insieme finito contenente n = |A| elementi, la cardinalità del suo insieme delle parti è data da: </w:t>
+      <w:pPr>
+        <w:rPr>
+          <w:highlight w:val="yellow"/>
+        </w:rPr>
+      </w:pPr>
+      <w:r>
+        <w:t xml:space="preserve">La progressione numerica 1, 2, 4, 8, … conduce direttamente alla formulazione del teorema generale: </w:t>
+      </w:r>
+      <w:r>
+        <w:rPr>
+          <w:highlight w:val="yellow"/>
+        </w:rPr>
+        <w:t xml:space="preserve">se A è un insieme finito contenente n = |A| elementi, la cardinalità del suo insieme delle parti è data da: </w:t>
       </w:r>
     </w:p>
     <w:p>
@@ -2978,10 +3289,14 @@
         <w:jc w:val="center"/>
       </w:pPr>
       <w:r>
+        <w:rPr>
+          <w:highlight w:val="yellow"/>
+        </w:rPr>
         <w:t>|𝒫(A)| = 2</w:t>
       </w:r>
       <w:r>
         <w:rPr>
+          <w:highlight w:val="yellow"/>
           <w:vertAlign w:val="superscript"/>
         </w:rPr>
         <w:t>n</w:t>
@@ -3026,11 +3341,7 @@
     </w:p>
     <w:p>
       <w:r>
-        <w:t xml:space="preserve">Tra la fine dell'Ottocento e l'inizio del Novecento, la comunità matematica cercò di definire i numeri naturali a partire dalle strutture insiemistiche più elementari. Gli assiomi di Peano (1889) seguono un'altra strada: non costruiscono i numeri naturali a partire dagli insiemi, ma li caratterizzano dando un elemento iniziale, lo 0, e una funzione successore con proprietà precise. (Il paradosso di Russell, </w:t>
-      </w:r>
-      <w:r>
-        <w:lastRenderedPageBreak/>
-        <w:t>del 1901, relativo alla collezione di tutti gli insiemi che non contengono se stessi, mostrò poi che la teoria ingenua degli insiemi va maneggiata con cautela.)</w:t>
+        <w:t>Tra la fine dell'Ottocento e l'inizio del Novecento, la comunità matematica cercò di definire i numeri naturali a partire dalle strutture insiemistiche più elementari. Gli assiomi di Peano (1889) seguono un'altra strada: non costruiscono i numeri naturali a partire dagli insiemi, ma li caratterizzano dando un elemento iniziale, lo 0, e una funzione successore con proprietà precise. (Il paradosso di Russell, del 1901, relativo alla collezione di tutti gli insiemi che non contengono se stessi, mostrò poi che la teoria ingenua degli insiemi va maneggiata con cautela.)</w:t>
       </w:r>
     </w:p>
     <w:p>
@@ -3318,6 +3629,7 @@
           <w:b/>
           <w:bCs/>
         </w:rPr>
+        <w:lastRenderedPageBreak/>
         <w:t>Passo Induttivo (P(n) ⟹ P(n+1))</w:t>
       </w:r>
       <w:r>
@@ -3374,7 +3686,6 @@
           <w:bCs/>
           <w:color w:val="E97132" w:themeColor="accent2"/>
         </w:rPr>
-        <w:lastRenderedPageBreak/>
         <w:t>Applicazioni Concrete del Principio di Induzione</w:t>
       </w:r>
     </w:p>
@@ -3896,6 +4207,7 @@
     </w:p>
     <w:p>
       <w:r>
+        <w:lastRenderedPageBreak/>
         <w:t xml:space="preserve">Sommando le due famiglie disgiunte, la cardinalità totale risulta: </w:t>
       </w:r>
     </w:p>
@@ -3961,7 +4273,6 @@
           <w:bCs/>
           <w:color w:val="EE0000"/>
         </w:rPr>
-        <w:lastRenderedPageBreak/>
         <w:t>6</w:t>
       </w:r>
       <w:r>
@@ -4502,6 +4813,7 @@
           <w:bCs/>
           <w:color w:val="E97132" w:themeColor="accent2"/>
         </w:rPr>
+        <w:lastRenderedPageBreak/>
         <w:t>Esempi Pratici e Trabocchetti d'Esame sulle Partizioni</w:t>
       </w:r>
     </w:p>
@@ -4567,7 +4879,6 @@
           <w:b/>
           <w:bCs/>
         </w:rPr>
-        <w:lastRenderedPageBreak/>
         <w:t>Ricoprimento</w:t>
       </w:r>
       <w:r>
@@ -4960,6 +5271,7 @@
           <w:b/>
           <w:bCs/>
         </w:rPr>
+        <w:lastRenderedPageBreak/>
         <w:t>Numeri Reali (ℝ)</w:t>
       </w:r>
       <w:r>
@@ -5044,7 +5356,6 @@
           <w:b/>
           <w:bCs/>
         </w:rPr>
-        <w:lastRenderedPageBreak/>
         <w:t>Definizione Formale</w:t>
       </w:r>
       <w:r>
@@ -5351,6 +5662,7 @@
         <w:jc w:val="center"/>
       </w:pPr>
       <w:r>
+        <w:lastRenderedPageBreak/>
         <w:t>R ⊆ S × S</w:t>
       </w:r>
     </w:p>
@@ -5400,7 +5712,6 @@
           <w:bCs/>
           <w:color w:val="E97132" w:themeColor="accent2"/>
         </w:rPr>
-        <w:lastRenderedPageBreak/>
         <w:t>Esempi di Relazioni Binarie</w:t>
       </w:r>
     </w:p>
@@ -5753,6 +6064,7 @@
           <w:b/>
           <w:bCs/>
         </w:rPr>
+        <w:lastRenderedPageBreak/>
         <w:t>Transitività</w:t>
       </w:r>
       <w:r>
@@ -5825,7 +6137,6 @@
           <w:bCs/>
           <w:color w:val="E97132" w:themeColor="accent2"/>
         </w:rPr>
-        <w:lastRenderedPageBreak/>
         <w:t>Relazioni di Equivalenza</w:t>
       </w:r>
     </w:p>
@@ -6193,6 +6504,7 @@
           <w:bCs/>
           <w:color w:val="E97132" w:themeColor="accent2"/>
         </w:rPr>
+        <w:lastRenderedPageBreak/>
         <w:t>Proprietà Immediate delle Classi</w:t>
       </w:r>
     </w:p>
@@ -6252,7 +6564,6 @@
           <w:b/>
           <w:bCs/>
         </w:rPr>
-        <w:lastRenderedPageBreak/>
         <w:t>Ricoprimento dell'Insieme</w:t>
       </w:r>
       <w:r>
@@ -6751,6 +7062,7 @@
         </w:numPr>
       </w:pPr>
       <w:r>
+        <w:lastRenderedPageBreak/>
         <w:t xml:space="preserve">L'insieme formato da tutte le classi di equivalenza prende il nome di </w:t>
       </w:r>
       <w:r>
@@ -6826,7 +7138,6 @@
           <w:i/>
           <w:iCs/>
         </w:rPr>
-        <w:lastRenderedPageBreak/>
         <w:t>Sintesi Didattica</w:t>
       </w:r>
       <w:r>
@@ -7129,6 +7440,7 @@
           <w:b/>
           <w:color w:val="EE0000"/>
         </w:rPr>
+        <w:lastRenderedPageBreak/>
         <w:t>10. Funzioni: Definizione, Rappresentazioni e Uguaglianza</w:t>
       </w:r>
     </w:p>
@@ -7191,11 +7503,156 @@
         <w:t>grafico</w:t>
       </w:r>
       <w:r>
-        <w:t xml:space="preserve"> Γ ⊆ A × B con la condizione di esistenza e unicità ∀ a ∈ A, ∃! b ∈ B tale che (a, b) ∈ Γ; dare una funzione significa dare la tripla (A, B, Γ). Quando (a, b) ∈ Γ si scrive f(a) = b, e le due scritture sono equivalenti. Lettere come f, g, h sono la scelta abituale per i nomi delle funzioni, ma non c'è alcun </w:t>
+        <w:t xml:space="preserve"> Γ ⊆ A × B con la condizione di esistenza e unicità ∀ a ∈ A, ∃! b ∈ B tale che (a, b) ∈ Γ; dare una funzione significa dare la tripla (A, B, Γ). Quando (a, b) ∈ Γ si scrive f(a) = b, e le due scritture sono equivalenti. Lettere come f, g, h sono la scelta abituale per i nomi delle funzioni, ma non c'è alcun obbligo. Va notato che A e B possono anche essere lo stesso insieme: fa parte della definizione e capiterà spesso, con lo stesso insieme che una volta gioca da dominio e una volta da codominio.</w:t>
+      </w:r>
+    </w:p>
+    <w:p>
+      <w:pPr>
+        <w:pStyle w:val="Titolo2"/>
+      </w:pPr>
+      <w:r>
+        <w:rPr>
+          <w:b/>
+          <w:color w:val="E97132"/>
+        </w:rPr>
+        <w:t>Un esempio completo su insiemi piccoli</w:t>
+      </w:r>
+    </w:p>
+    <w:p>
+      <w:r>
+        <w:t>Prendiamo A = {a, b, c, d} e B = {1, 2, 3}. Il prodotto cartesiano A × B si può disegnare come una piccola scacchiera di 4 × 3 caselle, ciascuna delle quali è una coppia (per esempio una casella rappresenta (c, 2), un'altra (a, 3)). Assegnare un grafico significa scegliere quali caselle appartengono a Γ.</w:t>
+      </w:r>
+    </w:p>
+    <w:p>
+      <w:r>
+        <w:t>Se segniamo le caselle (a, 2), (b, 2), (c, 3), (d, 1), sopra ogni elemento di A c'è esattamente una casella segnata: Γ definisce una funzione, con f(a) = 2, f(b) = 2, f(c) = 3, f(d) = 1. Si noti che 2 compare due volte come valore, e non è un problema: la definizione chiede un solo valore per ogni elemento del dominio, non valori diversi.</w:t>
+      </w:r>
+    </w:p>
+    <w:p>
+      <w:r>
+        <w:t>Questa descrizione a scacchiera serve a capire la definizione, ma nella pratica non si scrive così: se non c'è una formula che esprima la funzione, il modo più rapido è assegnare direttamente a ogni elemento del dominio il suo valore.</w:t>
+      </w:r>
+    </w:p>
+    <w:p>
+      <w:pPr>
+        <w:pStyle w:val="Titolo2"/>
+      </w:pPr>
+      <w:r>
+        <w:rPr>
+          <w:b/>
+          <w:color w:val="E97132"/>
+        </w:rPr>
+        <w:t>Cosa NON è una funzione</w:t>
+      </w:r>
+    </w:p>
+    <w:p>
+      <w:r>
+        <w:t>Sulla scacchiera la condizione di esistenza e unicità può fallire in due modi: se sopra un elemento di A non c'è nessuna casella segnata manca l'esistenza, se ce ne sono due o più manca l'unicità. Nell'esempio precedente, se avessimo segnato due caselle sopra l'elemento b, il valore di f in b sarebbe ambiguo e Γ non definirebbe una funzione.</w:t>
+      </w:r>
+    </w:p>
+    <w:p>
+      <w:pPr>
+        <w:pStyle w:val="Titolo2"/>
+      </w:pPr>
+      <w:r>
+        <w:rPr>
+          <w:b/>
+          <w:color w:val="E97132"/>
+        </w:rPr>
+        <w:t>Differenza rispetto alla funzione di analisi</w:t>
+      </w:r>
+    </w:p>
+    <w:p>
+      <w:r>
+        <w:t xml:space="preserve">Chi è abituato alle funzioni reali di variabile reale parte sempre dal calcolare il dominio come insieme dei punti in cui l'espressione ha senso (denominatore diverso da zero, radicando maggiore o uguale a zero e così via). Qui questo passo non esiste: il dominio </w:t>
+      </w:r>
+      <w:r>
+        <w:rPr>
+          <w:b/>
+        </w:rPr>
+        <w:t>viene assegnato</w:t>
+      </w:r>
+      <w:r>
+        <w:t xml:space="preserve"> insieme alla funzione, e si richiede che il valore f(a) esista per ogni a del dominio scelto. Dire "f(a) = b" deve essere sempre possibile, qualunque sia a ∈ A.</w:t>
+      </w:r>
+    </w:p>
+    <w:p>
+      <w:pPr>
+        <w:pStyle w:val="Titolo2"/>
+      </w:pPr>
+      <w:r>
+        <w:rPr>
+          <w:b/>
+          <w:color w:val="E97132"/>
+        </w:rPr>
+        <w:t>Le notazioni a freccia</w:t>
+      </w:r>
+    </w:p>
+    <w:p>
+      <w:r>
+        <w:t xml:space="preserve">Una funzione si scrive quasi sempre f : A → B, che dice in un colpo solo dominio e codominio. Il nome si può anche mettere sopra la freccia, A →(f) B: è comodo quando si hanno più funzioni nello stesso diagramma, per esempio due funzioni f e g entrambe da A in B. Per questo motivo si parla spesso di </w:t>
+      </w:r>
+      <w:r>
+        <w:rPr>
+          <w:b/>
+        </w:rPr>
+        <w:t>freccia</w:t>
+      </w:r>
+      <w:r>
+        <w:t xml:space="preserve"> (o di </w:t>
+      </w:r>
+      <w:r>
+        <w:rPr>
+          <w:b/>
+        </w:rPr>
+        <w:t>mappa</w:t>
+      </w:r>
+      <w:r>
+        <w:t>) per indicare una funzione.</w:t>
+      </w:r>
+    </w:p>
+    <w:p>
+      <w:r>
+        <w:t>Per descrivere il singolo elemento si usa la freccia con il trattino, x ↦ f(x), che si legge "x va in f(x)": per esempio n ↦ a</w:t>
+      </w:r>
+      <w:r>
+        <w:rPr>
+          <w:vertAlign w:val="subscript"/>
+        </w:rPr>
+        <w:t>n</w:t>
+      </w:r>
+      <w:r>
+        <w:t xml:space="preserve"> associa a ogni naturale n un numero reale.</w:t>
+      </w:r>
+    </w:p>
+    <w:p>
+      <w:pPr>
+        <w:pStyle w:val="Titolo2"/>
+      </w:pPr>
+      <w:r>
+        <w:rPr>
+          <w:b/>
+          <w:color w:val="E97132"/>
+        </w:rPr>
+        <w:t>Rappresentazione con i diagrammi di Venn</w:t>
+      </w:r>
+    </w:p>
+    <w:p>
+      <w:r>
+        <w:t xml:space="preserve">Una funzione si può rappresentare con due ovali, uno per A e uno per B, e una freccia da ogni punto x del dominio al punto y = f(x) del codominio. Anche quando A = B conviene </w:t>
+      </w:r>
+      <w:r>
+        <w:rPr>
+          <w:b/>
+        </w:rPr>
+        <w:t>disegnare due copie separate</w:t>
+      </w:r>
+      <w:r>
+        <w:t xml:space="preserve"> dell'insieme, una come dominio e una come codominio. Un modo intuitivo di pensare a una </w:t>
       </w:r>
       <w:r>
         <w:lastRenderedPageBreak/>
-        <w:t>obbligo. Va notato che A e B possono anche essere lo stesso insieme: fa parte della definizione e capiterà spesso, con lo stesso insieme che una volta gioca da dominio e una volta da codominio.</w:t>
+        <w:t>funzione è come a una scatola con un'entrata e un'uscita: dentro entra un elemento del dominio e ne esce uno del codominio.</w:t>
       </w:r>
     </w:p>
     <w:p>
@@ -7207,151 +7664,6 @@
           <w:b/>
           <w:color w:val="E97132"/>
         </w:rPr>
-        <w:t>Un esempio completo su insiemi piccoli</w:t>
-      </w:r>
-    </w:p>
-    <w:p>
-      <w:r>
-        <w:t>Prendiamo A = {a, b, c, d} e B = {1, 2, 3}. Il prodotto cartesiano A × B si può disegnare come una piccola scacchiera di 4 × 3 caselle, ciascuna delle quali è una coppia (per esempio una casella rappresenta (c, 2), un'altra (a, 3)). Assegnare un grafico significa scegliere quali caselle appartengono a Γ.</w:t>
-      </w:r>
-    </w:p>
-    <w:p>
-      <w:r>
-        <w:t>Se segniamo le caselle (a, 2), (b, 2), (c, 3), (d, 1), sopra ogni elemento di A c'è esattamente una casella segnata: Γ definisce una funzione, con f(a) = 2, f(b) = 2, f(c) = 3, f(d) = 1. Si noti che 2 compare due volte come valore, e non è un problema: la definizione chiede un solo valore per ogni elemento del dominio, non valori diversi.</w:t>
-      </w:r>
-    </w:p>
-    <w:p>
-      <w:r>
-        <w:t>Questa descrizione a scacchiera serve a capire la definizione, ma nella pratica non si scrive così: se non c'è una formula che esprima la funzione, il modo più rapido è assegnare direttamente a ogni elemento del dominio il suo valore.</w:t>
-      </w:r>
-    </w:p>
-    <w:p>
-      <w:pPr>
-        <w:pStyle w:val="Titolo2"/>
-      </w:pPr>
-      <w:r>
-        <w:rPr>
-          <w:b/>
-          <w:color w:val="E97132"/>
-        </w:rPr>
-        <w:t>Cosa NON è una funzione</w:t>
-      </w:r>
-    </w:p>
-    <w:p>
-      <w:r>
-        <w:t>Sulla scacchiera la condizione di esistenza e unicità può fallire in due modi: se sopra un elemento di A non c'è nessuna casella segnata manca l'esistenza, se ce ne sono due o più manca l'unicità. Nell'esempio precedente, se avessimo segnato due caselle sopra l'elemento b, il valore di f in b sarebbe ambiguo e Γ non definirebbe una funzione.</w:t>
-      </w:r>
-    </w:p>
-    <w:p>
-      <w:pPr>
-        <w:pStyle w:val="Titolo2"/>
-      </w:pPr>
-      <w:r>
-        <w:rPr>
-          <w:b/>
-          <w:color w:val="E97132"/>
-        </w:rPr>
-        <w:t>Differenza rispetto alla funzione di analisi</w:t>
-      </w:r>
-    </w:p>
-    <w:p>
-      <w:r>
-        <w:t xml:space="preserve">Chi è abituato alle funzioni reali di variabile reale parte sempre dal calcolare il dominio come insieme dei punti in cui l'espressione ha senso (denominatore diverso da zero, radicando maggiore o uguale a zero e così via). Qui questo passo non esiste: il dominio </w:t>
-      </w:r>
-      <w:r>
-        <w:rPr>
-          <w:b/>
-        </w:rPr>
-        <w:t>viene assegnato</w:t>
-      </w:r>
-      <w:r>
-        <w:t xml:space="preserve"> insieme alla funzione, e si richiede che il valore f(a) esista per ogni a del dominio scelto. Dire "f(a) = b" deve essere sempre possibile, qualunque sia a ∈ A.</w:t>
-      </w:r>
-    </w:p>
-    <w:p>
-      <w:pPr>
-        <w:pStyle w:val="Titolo2"/>
-      </w:pPr>
-      <w:r>
-        <w:rPr>
-          <w:b/>
-          <w:color w:val="E97132"/>
-        </w:rPr>
-        <w:t>Le notazioni a freccia</w:t>
-      </w:r>
-    </w:p>
-    <w:p>
-      <w:r>
-        <w:t xml:space="preserve">Una funzione si scrive quasi sempre f : A → B, che dice in un colpo solo dominio e codominio. Il nome si può anche mettere sopra la freccia, A →(f) B: è comodo quando si hanno più funzioni nello stesso diagramma, per esempio due funzioni f e g entrambe da A in B. Per questo motivo si parla spesso di </w:t>
-      </w:r>
-      <w:r>
-        <w:rPr>
-          <w:b/>
-        </w:rPr>
-        <w:t>freccia</w:t>
-      </w:r>
-      <w:r>
-        <w:t xml:space="preserve"> (o di </w:t>
-      </w:r>
-      <w:r>
-        <w:rPr>
-          <w:b/>
-        </w:rPr>
-        <w:t>mappa</w:t>
-      </w:r>
-      <w:r>
-        <w:t>) per indicare una funzione.</w:t>
-      </w:r>
-    </w:p>
-    <w:p>
-      <w:r>
-        <w:t>Per descrivere il singolo elemento si usa la freccia con il trattino, x ↦ f(x), che si legge "x va in f(x)": per esempio n ↦ a</w:t>
-      </w:r>
-      <w:r>
-        <w:rPr>
-          <w:vertAlign w:val="subscript"/>
-        </w:rPr>
-        <w:t>n</w:t>
-      </w:r>
-      <w:r>
-        <w:t xml:space="preserve"> associa a ogni naturale n un numero reale.</w:t>
-      </w:r>
-    </w:p>
-    <w:p>
-      <w:pPr>
-        <w:pStyle w:val="Titolo2"/>
-      </w:pPr>
-      <w:r>
-        <w:rPr>
-          <w:b/>
-          <w:color w:val="E97132"/>
-        </w:rPr>
-        <w:t>Rappresentazione con i diagrammi di Venn</w:t>
-      </w:r>
-    </w:p>
-    <w:p>
-      <w:r>
-        <w:t xml:space="preserve">Una funzione si può rappresentare con due ovali, uno per A e uno per B, e una freccia da ogni punto x del dominio al punto y = f(x) del codominio. Anche quando A = B conviene </w:t>
-      </w:r>
-      <w:r>
-        <w:rPr>
-          <w:b/>
-        </w:rPr>
-        <w:t>disegnare due copie separate</w:t>
-      </w:r>
-      <w:r>
-        <w:t xml:space="preserve"> dell'insieme, una come dominio e una come codominio. Un modo intuitivo di pensare a una funzione è come a una scatola con un'entrata e un'uscita: dentro entra un elemento del dominio e ne esce uno del codominio.</w:t>
-      </w:r>
-    </w:p>
-    <w:p>
-      <w:pPr>
-        <w:pStyle w:val="Titolo2"/>
-      </w:pPr>
-      <w:r>
-        <w:rPr>
-          <w:b/>
-          <w:color w:val="E97132"/>
-        </w:rPr>
         <w:t>Quando due funzioni sono uguali</w:t>
       </w:r>
     </w:p>
@@ -7371,7 +7683,6 @@
     </w:p>
     <w:p>
       <w:r>
-        <w:lastRenderedPageBreak/>
         <w:t>Un esempio fa vedere l'effetto contrario. Sull'insieme {0, 1, 2} (con codominio ℝ) consideriamo f(x) = 3x² − 1 e g(x) = x³ + 2x − 1. Le due espressioni sono diverse, ma:</w:t>
       </w:r>
     </w:p>
@@ -7589,6 +7900,7 @@
         </w:numPr>
       </w:pPr>
       <w:r>
+        <w:lastRenderedPageBreak/>
         <w:t xml:space="preserve">la </w:t>
       </w:r>
       <w:r>
@@ -7689,31 +8001,283 @@
           <w:b/>
           <w:color w:val="E97132"/>
         </w:rPr>
+        <w:t>Inclusione canonica</w:t>
+      </w:r>
+    </w:p>
+    <w:p>
+      <w:r>
+        <w:t>Se S ⊆ A, l'</w:t>
+      </w:r>
+      <w:r>
+        <w:rPr>
+          <w:b/>
+        </w:rPr>
+        <w:t>inclusione canonica</w:t>
+      </w:r>
+      <w:r>
+        <w:t xml:space="preserve"> j : S → A è definita da j(s) = s per ogni s ∈ S. Manda ogni s in sé stesso; se S = A coincide con id</w:t>
+      </w:r>
+      <w:r>
+        <w:rPr>
+          <w:vertAlign w:val="subscript"/>
+        </w:rPr>
+        <w:t>A</w:t>
+      </w:r>
+      <w:r>
+        <w:t>.</w:t>
+      </w:r>
+    </w:p>
+    <w:p>
+      <w:pPr>
+        <w:pStyle w:val="Titolo2"/>
+      </w:pPr>
+      <w:r>
+        <w:rPr>
+          <w:b/>
+          <w:color w:val="E97132"/>
+        </w:rPr>
+        <w:t>Le successioni come funzioni</w:t>
+      </w:r>
+    </w:p>
+    <w:p>
+      <w:r>
+        <w:t xml:space="preserve">Una </w:t>
+      </w:r>
+      <w:r>
+        <w:rPr>
+          <w:b/>
+        </w:rPr>
+        <w:t>successione</w:t>
+      </w:r>
+      <w:r>
+        <w:t xml:space="preserve"> è una lista di numeri a</w:t>
+      </w:r>
+      <w:r>
+        <w:rPr>
+          <w:vertAlign w:val="subscript"/>
+        </w:rPr>
+        <w:t>0</w:t>
+      </w:r>
+      <w:r>
+        <w:t>, a</w:t>
+      </w:r>
+      <w:r>
+        <w:rPr>
+          <w:vertAlign w:val="subscript"/>
+        </w:rPr>
+        <w:t>1</w:t>
+      </w:r>
+      <w:r>
+        <w:t>, a</w:t>
+      </w:r>
+      <w:r>
+        <w:rPr>
+          <w:vertAlign w:val="subscript"/>
+        </w:rPr>
+        <w:t>2</w:t>
+      </w:r>
+      <w:r>
+        <w:t>, … (si può partire da 0 o da 1, è irrilevante). Assegnare una successione di numeri reali significa assegnare un valore reale a 0, uno a 1, uno a 2 e così via, cioè definire una funzione</w:t>
+      </w:r>
+    </w:p>
+    <w:p>
+      <w:r>
+        <w:t>a : ℕ → ℝ, n ↦ a</w:t>
+      </w:r>
+      <w:r>
+        <w:rPr>
+          <w:vertAlign w:val="subscript"/>
+        </w:rPr>
+        <w:t>n</w:t>
+      </w:r>
+      <w:r>
+        <w:t>.</w:t>
+      </w:r>
+    </w:p>
+    <w:p>
+      <w:r>
+        <w:t>Dunque una successione non è altro che una funzione con dominio ℕ e codominio ℝ. Un esempio di successione è quella di Fibonacci.</w:t>
+      </w:r>
+    </w:p>
+    <w:p>
+      <w:pPr>
+        <w:pStyle w:val="Titolo2"/>
+      </w:pPr>
+      <w:r>
+        <w:rPr>
+          <w:b/>
+          <w:color w:val="E97132"/>
+        </w:rPr>
+        <w:t>La restrizione di una funzione</w:t>
+      </w:r>
+    </w:p>
+    <w:p>
+      <w:r>
+        <w:t xml:space="preserve">Sia f : A → B una funzione e sia S ⊆ A un sottoinsieme del dominio. Poiché gli elementi di S sono particolari elementi di A, f assume un valore anche su di essi. Possiamo allora definire una </w:t>
+      </w:r>
+      <w:r>
+        <w:rPr>
+          <w:b/>
+        </w:rPr>
+        <w:t>nuova funzione</w:t>
+      </w:r>
+      <w:r>
+        <w:t xml:space="preserve"> f|</w:t>
+      </w:r>
+      <w:r>
+        <w:rPr>
+          <w:vertAlign w:val="subscript"/>
+        </w:rPr>
+        <w:t>S</w:t>
+      </w:r>
+      <w:r>
+        <w:t xml:space="preserve"> : S → B, la </w:t>
+      </w:r>
+      <w:r>
+        <w:rPr>
+          <w:b/>
+        </w:rPr>
+        <w:t>restrizione di f a S</w:t>
+      </w:r>
+      <w:r>
+        <w:t>, con la stessa regola di prima: f|</w:t>
+      </w:r>
+      <w:r>
+        <w:rPr>
+          <w:vertAlign w:val="subscript"/>
+        </w:rPr>
+        <w:t>S</w:t>
+      </w:r>
+      <w:r>
+        <w:t>(s) = f(s) per ogni s ∈ S.</w:t>
+      </w:r>
+    </w:p>
+    <w:p>
+      <w:r>
+        <w:t xml:space="preserve">Si sta restringendo il dominio, lasciando invariati i valori; ma dal punto di vista concettuale </w:t>
+      </w:r>
+      <w:r>
+        <w:rPr>
+          <w:b/>
+        </w:rPr>
+        <w:t>f|</w:t>
+      </w:r>
+      <w:r>
+        <w:rPr>
+          <w:b/>
+          <w:vertAlign w:val="subscript"/>
+        </w:rPr>
+        <w:t>S</w:t>
+      </w:r>
+      <w:r>
+        <w:rPr>
+          <w:b/>
+        </w:rPr>
+        <w:t xml:space="preserve"> è una funzione diversa da f</w:t>
+      </w:r>
+      <w:r>
+        <w:t>, perché ha un dominio diverso (si ricordi il criterio di uguaglianza del capitolo 10).</w:t>
+      </w:r>
+    </w:p>
+    <w:p>
+      <w:pPr>
+        <w:pStyle w:val="Titolo2"/>
+      </w:pPr>
+      <w:r>
+        <w:rPr>
+          <w:b/>
+          <w:color w:val="E97132"/>
+        </w:rPr>
+        <w:t>Funzioni diverse con restrizioni uguali</w:t>
+      </w:r>
+    </w:p>
+    <w:p>
+      <w:r>
+        <w:t>Non è vero che due funzioni diverse restano diverse dopo la restrizione. Riprendiamo l'esempio del capitolo 10: le espressioni f(x) = 3x² − 1 e g(x) = x³ + 2x − 1 sono definite per ogni numero reale e, come funzioni su ℝ, sono diverse (hanno grafici diversi). Se però le restringiamo a S = {0, 1, 2}, diventano uguali: f|</w:t>
+      </w:r>
+      <w:r>
+        <w:rPr>
+          <w:vertAlign w:val="subscript"/>
+        </w:rPr>
+        <w:t>S</w:t>
+      </w:r>
+      <w:r>
+        <w:t xml:space="preserve"> = g|</w:t>
+      </w:r>
+      <w:r>
+        <w:rPr>
+          <w:vertAlign w:val="subscript"/>
+        </w:rPr>
+        <w:t>S</w:t>
+      </w:r>
+      <w:r>
+        <w:t>.</w:t>
+      </w:r>
+    </w:p>
+    <w:p>
+      <w:r>
+        <w:t>Lo stesso accade graficamente con due funzioni reali i cui grafici coincidono solo su un intervallo [a, b]: sono diverse su ℝ, ma se le restringiamo a S = [a, b] si ottengono due funzioni uguali. Non è detto che succeda: è una possibilità, e vedremo più avanti perché a volte conviene restringere il dominio apposta.</w:t>
+      </w:r>
+    </w:p>
+    <w:p>
+      <w:r>
+        <w:t>Il prossimo capitolo affronta una questione molto più delicata, che riguarda le funzioni definite su un insieme quoziente.</w:t>
+      </w:r>
+    </w:p>
+    <w:p>
+      <w:pPr>
+        <w:pStyle w:val="Titolo1"/>
+      </w:pPr>
+      <w:r>
+        <w:rPr>
+          <w:b/>
+          <w:color w:val="EE0000"/>
+        </w:rPr>
+        <w:t>12. Funzioni sull'Insieme Quoziente e Dipendenza dal Rappresentante</w:t>
+      </w:r>
+    </w:p>
+    <w:p>
+      <w:pPr>
+        <w:pStyle w:val="Titolo2"/>
+      </w:pPr>
+      <w:r>
+        <w:rPr>
+          <w:b/>
+          <w:color w:val="E97132"/>
+        </w:rPr>
+        <w:t>Il problema</w:t>
+      </w:r>
+    </w:p>
+    <w:p>
+      <w:r>
+        <w:t>Come visto nel capitolo 9, una relazione di equivalenza R su un insieme A divide A in classi di equivalenza e dà l'</w:t>
+      </w:r>
+      <w:r>
+        <w:rPr>
+          <w:b/>
+        </w:rPr>
+        <w:t>insieme quoziente</w:t>
+      </w:r>
+      <w:r>
+        <w:t xml:space="preserve"> Q, i cui elementi sono le classi. Un elemento x ∈ A individua la </w:t>
+      </w:r>
+      <w:r>
         <w:lastRenderedPageBreak/>
-        <w:t>Inclusione canonica</w:t>
-      </w:r>
-    </w:p>
-    <w:p>
-      <w:r>
-        <w:t>Se S ⊆ A, l'</w:t>
-      </w:r>
-      <w:r>
-        <w:rPr>
-          <w:b/>
-        </w:rPr>
-        <w:t>inclusione canonica</w:t>
-      </w:r>
-      <w:r>
-        <w:t xml:space="preserve"> j : S → A è definita da j(s) = s per ogni s ∈ S. Manda ogni s in sé stesso; se S = A coincide con id</w:t>
+        <w:t>sua classe, che indichiamo con [x] oppure con x̄ (a volte anche C</w:t>
       </w:r>
       <w:r>
         <w:rPr>
           <w:vertAlign w:val="subscript"/>
         </w:rPr>
-        <w:t>A</w:t>
-      </w:r>
-      <w:r>
-        <w:t>.</w:t>
+        <w:t>x</w:t>
+      </w:r>
+      <w:r>
+        <w:t>): sono modi alternativi di scrivere la stessa cosa, e le notazioni semplici contano, perché scegliere il simbolismo giusto aiuta a capire.</w:t>
+      </w:r>
+    </w:p>
+    <w:p>
+      <w:r>
+        <w:t>Questa situazione è molto frequente in matematica e porta a una questione delicata, che a lezione è stata indicata come forse il punto concettualmente più difficile del corso. Supponiamo di voler definire una funzione da Q in Q, cioè di associare a ogni classe un'altra classe, e di farlo dicendo "alla classe di x associo la classe di una certa espressione in x".</w:t>
       </w:r>
     </w:p>
     <w:p>
@@ -7725,256 +8289,6 @@
           <w:b/>
           <w:color w:val="E97132"/>
         </w:rPr>
-        <w:t>Le successioni come funzioni</w:t>
-      </w:r>
-    </w:p>
-    <w:p>
-      <w:r>
-        <w:t xml:space="preserve">Una </w:t>
-      </w:r>
-      <w:r>
-        <w:rPr>
-          <w:b/>
-        </w:rPr>
-        <w:t>successione</w:t>
-      </w:r>
-      <w:r>
-        <w:t xml:space="preserve"> è una lista di numeri a</w:t>
-      </w:r>
-      <w:r>
-        <w:rPr>
-          <w:vertAlign w:val="subscript"/>
-        </w:rPr>
-        <w:t>0</w:t>
-      </w:r>
-      <w:r>
-        <w:t>, a</w:t>
-      </w:r>
-      <w:r>
-        <w:rPr>
-          <w:vertAlign w:val="subscript"/>
-        </w:rPr>
-        <w:t>1</w:t>
-      </w:r>
-      <w:r>
-        <w:t>, a</w:t>
-      </w:r>
-      <w:r>
-        <w:rPr>
-          <w:vertAlign w:val="subscript"/>
-        </w:rPr>
-        <w:t>2</w:t>
-      </w:r>
-      <w:r>
-        <w:t>, … (si può partire da 0 o da 1, è irrilevante). Assegnare una successione di numeri reali significa assegnare un valore reale a 0, uno a 1, uno a 2 e così via, cioè definire una funzione</w:t>
-      </w:r>
-    </w:p>
-    <w:p>
-      <w:r>
-        <w:t>a : ℕ → ℝ, n ↦ a</w:t>
-      </w:r>
-      <w:r>
-        <w:rPr>
-          <w:vertAlign w:val="subscript"/>
-        </w:rPr>
-        <w:t>n</w:t>
-      </w:r>
-      <w:r>
-        <w:t>.</w:t>
-      </w:r>
-    </w:p>
-    <w:p>
-      <w:r>
-        <w:t>Dunque una successione non è altro che una funzione con dominio ℕ e codominio ℝ. Un esempio di successione è quella di Fibonacci.</w:t>
-      </w:r>
-    </w:p>
-    <w:p>
-      <w:pPr>
-        <w:pStyle w:val="Titolo2"/>
-      </w:pPr>
-      <w:r>
-        <w:rPr>
-          <w:b/>
-          <w:color w:val="E97132"/>
-        </w:rPr>
-        <w:t>La restrizione di una funzione</w:t>
-      </w:r>
-    </w:p>
-    <w:p>
-      <w:r>
-        <w:t xml:space="preserve">Sia f : A → B una funzione e sia S ⊆ A un sottoinsieme del dominio. Poiché gli elementi di S sono particolari elementi di A, f assume un valore anche su di essi. Possiamo allora definire una </w:t>
-      </w:r>
-      <w:r>
-        <w:rPr>
-          <w:b/>
-        </w:rPr>
-        <w:t>nuova funzione</w:t>
-      </w:r>
-      <w:r>
-        <w:t xml:space="preserve"> f|</w:t>
-      </w:r>
-      <w:r>
-        <w:rPr>
-          <w:vertAlign w:val="subscript"/>
-        </w:rPr>
-        <w:t>S</w:t>
-      </w:r>
-      <w:r>
-        <w:t xml:space="preserve"> : S → B, la </w:t>
-      </w:r>
-      <w:r>
-        <w:rPr>
-          <w:b/>
-        </w:rPr>
-        <w:t>restrizione di f a S</w:t>
-      </w:r>
-      <w:r>
-        <w:t>, con la stessa regola di prima: f|</w:t>
-      </w:r>
-      <w:r>
-        <w:rPr>
-          <w:vertAlign w:val="subscript"/>
-        </w:rPr>
-        <w:t>S</w:t>
-      </w:r>
-      <w:r>
-        <w:t>(s) = f(s) per ogni s ∈ S.</w:t>
-      </w:r>
-    </w:p>
-    <w:p>
-      <w:r>
-        <w:t xml:space="preserve">Si sta restringendo il dominio, lasciando invariati i valori; ma dal punto di vista concettuale </w:t>
-      </w:r>
-      <w:r>
-        <w:rPr>
-          <w:b/>
-        </w:rPr>
-        <w:t>f|</w:t>
-      </w:r>
-      <w:r>
-        <w:rPr>
-          <w:b/>
-          <w:vertAlign w:val="subscript"/>
-        </w:rPr>
-        <w:t>S</w:t>
-      </w:r>
-      <w:r>
-        <w:rPr>
-          <w:b/>
-        </w:rPr>
-        <w:t xml:space="preserve"> è una funzione diversa da f</w:t>
-      </w:r>
-      <w:r>
-        <w:t>, perché ha un dominio diverso (si ricordi il criterio di uguaglianza del capitolo 10).</w:t>
-      </w:r>
-    </w:p>
-    <w:p>
-      <w:pPr>
-        <w:pStyle w:val="Titolo2"/>
-      </w:pPr>
-      <w:r>
-        <w:rPr>
-          <w:b/>
-          <w:color w:val="E97132"/>
-        </w:rPr>
-        <w:t>Funzioni diverse con restrizioni uguali</w:t>
-      </w:r>
-    </w:p>
-    <w:p>
-      <w:r>
-        <w:t>Non è vero che due funzioni diverse restano diverse dopo la restrizione. Riprendiamo l'esempio del capitolo 10: le espressioni f(x) = 3x² − 1 e g(x) = x³ + 2x − 1 sono definite per ogni numero reale e, come funzioni su ℝ, sono diverse (hanno grafici diversi). Se però le restringiamo a S = {0, 1, 2}, diventano uguali: f|</w:t>
-      </w:r>
-      <w:r>
-        <w:rPr>
-          <w:vertAlign w:val="subscript"/>
-        </w:rPr>
-        <w:t>S</w:t>
-      </w:r>
-      <w:r>
-        <w:t xml:space="preserve"> = g|</w:t>
-      </w:r>
-      <w:r>
-        <w:rPr>
-          <w:vertAlign w:val="subscript"/>
-        </w:rPr>
-        <w:t>S</w:t>
-      </w:r>
-      <w:r>
-        <w:t>.</w:t>
-      </w:r>
-    </w:p>
-    <w:p>
-      <w:r>
-        <w:t>Lo stesso accade graficamente con due funzioni reali i cui grafici coincidono solo su un intervallo [a, b]: sono diverse su ℝ, ma se le restringiamo a S = [a, b] si ottengono due funzioni uguali. Non è detto che succeda: è una possibilità, e vedremo più avanti perché a volte conviene restringere il dominio apposta.</w:t>
-      </w:r>
-    </w:p>
-    <w:p>
-      <w:r>
-        <w:t>Il prossimo capitolo affronta una questione molto più delicata, che riguarda le funzioni definite su un insieme quoziente.</w:t>
-      </w:r>
-    </w:p>
-    <w:p>
-      <w:pPr>
-        <w:pStyle w:val="Titolo1"/>
-      </w:pPr>
-      <w:r>
-        <w:rPr>
-          <w:b/>
-          <w:color w:val="EE0000"/>
-        </w:rPr>
-        <w:t>12. Funzioni sull'Insieme Quoziente e Dipendenza dal Rappresentante</w:t>
-      </w:r>
-    </w:p>
-    <w:p>
-      <w:pPr>
-        <w:pStyle w:val="Titolo2"/>
-      </w:pPr>
-      <w:r>
-        <w:rPr>
-          <w:b/>
-          <w:color w:val="E97132"/>
-        </w:rPr>
-        <w:t>Il problema</w:t>
-      </w:r>
-    </w:p>
-    <w:p>
-      <w:r>
-        <w:t>Come visto nel capitolo 9, una relazione di equivalenza R su un insieme A divide A in classi di equivalenza e dà l'</w:t>
-      </w:r>
-      <w:r>
-        <w:rPr>
-          <w:b/>
-        </w:rPr>
-        <w:t>insieme quoziente</w:t>
-      </w:r>
-      <w:r>
-        <w:t xml:space="preserve"> Q, i cui elementi sono le classi. Un elemento x ∈ A individua la sua classe, che indichiamo con [x] oppure con x̄ (a volte anche C</w:t>
-      </w:r>
-      <w:r>
-        <w:rPr>
-          <w:vertAlign w:val="subscript"/>
-        </w:rPr>
-        <w:t>x</w:t>
-      </w:r>
-      <w:r>
-        <w:t>): sono modi alternativi di scrivere la stessa cosa, e le notazioni semplici contano, perché scegliere il simbolismo giusto aiuta a capire.</w:t>
-      </w:r>
-    </w:p>
-    <w:p>
-      <w:r>
-        <w:t>Questa situazione è molto frequente in matematica e porta a una questione delicata, che a lezione è stata indicata come forse il punto concettualmente più difficile del corso. Supponiamo di voler definire una funzione da Q in Q, cioè di associare a ogni classe un'altra classe, e di farlo dicendo "alla classe di x associo la classe di una certa espressione in x".</w:t>
-      </w:r>
-    </w:p>
-    <w:p>
-      <w:pPr>
-        <w:pStyle w:val="Titolo2"/>
-      </w:pPr>
-      <w:r>
-        <w:rPr>
-          <w:b/>
-          <w:color w:val="E97132"/>
-        </w:rPr>
-        <w:lastRenderedPageBreak/>
         <w:t>Il difetto: molti modi per scrivere la stessa classe</w:t>
       </w:r>
     </w:p>
@@ -8145,6 +8459,7 @@
     </w:p>
     <w:p>
       <w:r>
+        <w:lastRenderedPageBreak/>
         <w:t xml:space="preserve">cioè un sottoinsieme del </w:t>
       </w:r>
       <w:r>
@@ -8217,7 +8532,6 @@
     </w:p>
     <w:p>
       <w:r>
-        <w:lastRenderedPageBreak/>
         <w:t>Se T = {b} ha un solo elemento si scrive f</w:t>
       </w:r>
       <w:r>
@@ -8482,6 +8796,7 @@
           <w:b/>
           <w:color w:val="EE0000"/>
         </w:rPr>
+        <w:lastRenderedPageBreak/>
         <w:t>14. Funzioni Suriettive, Iniettive e Biettive</w:t>
       </w:r>
     </w:p>
@@ -8530,7 +8845,6 @@
         </w:numPr>
       </w:pPr>
       <w:r>
-        <w:lastRenderedPageBreak/>
         <w:t>∀ b ∈ B, f</w:t>
       </w:r>
       <w:r>
@@ -8764,6 +9078,7 @@
     </w:p>
     <w:p>
       <w:r>
+        <w:lastRenderedPageBreak/>
         <w:t>Con queste proprietà possiamo parlare di funzioni composte e di funzioni inverse.</w:t>
       </w:r>
     </w:p>
@@ -8807,7 +9122,6 @@
     </w:p>
     <w:p>
       <w:r>
-        <w:lastRenderedPageBreak/>
         <w:t>(g ∘ f)(a) = g(f(a)) per ogni a ∈ A.</w:t>
       </w:r>
     </w:p>
@@ -9156,6 +9470,7 @@
         <w:rPr>
           <w:b/>
         </w:rPr>
+        <w:lastRenderedPageBreak/>
         <w:t>Non è iniettiva.</w:t>
       </w:r>
       <w:r>
@@ -9176,34 +9491,188 @@
         <w:rPr>
           <w:b/>
         </w:rPr>
+        <w:t>È suriettiva.</w:t>
+      </w:r>
+      <w:r>
+        <w:t xml:space="preserve"> Dato a ∈ A basta scegliere un qualsiasi elemento b ∈ B: la coppia (a, b) ha immagine a. Qui serve che B non sia vuoto (precisazione); l'elemento scelto in B è irrilevante, perché la proiezione lo ignora. Tutta la retta verticale sopra a viene mandata in a.</w:t>
+      </w:r>
+    </w:p>
+    <w:p>
+      <w:r>
+        <w:t>Esiste un solo caso in cui p</w:t>
+      </w:r>
+      <w:r>
+        <w:rPr>
+          <w:vertAlign w:val="subscript"/>
+        </w:rPr>
+        <w:t>1</w:t>
+      </w:r>
+      <w:r>
+        <w:t xml:space="preserve"> diventa iniettiva: quando B ha </w:t>
+      </w:r>
+      <w:r>
+        <w:rPr>
+          <w:b/>
+        </w:rPr>
+        <w:t>un solo elemento</w:t>
+      </w:r>
+      <w:r>
+        <w:t>. Allora non si possono scegliere due elementi diversi di B, quindi due coppie diverse differiscono necessariamente nella prima componente. A parte questo caso eccezionale, la proiezione è suriettiva ma non iniettiva.</w:t>
+      </w:r>
+    </w:p>
+    <w:p>
+      <w:pPr>
+        <w:pStyle w:val="Titolo2"/>
+      </w:pPr>
+      <w:r>
+        <w:rPr>
+          <w:b/>
+          <w:color w:val="E97132"/>
+        </w:rPr>
+        <w:t>La funzione affine f(x) = ax + b su ℝ</w:t>
+      </w:r>
+    </w:p>
+    <w:p>
+      <w:r>
+        <w:t xml:space="preserve">Sia f : ℝ → ℝ, f(x) = ax + b, con a e b costanti e </w:t>
+      </w:r>
+      <w:r>
+        <w:rPr>
+          <w:b/>
+        </w:rPr>
+        <w:t>a ≠ 0</w:t>
+      </w:r>
+      <w:r>
+        <w:t>. Graficamente è una retta, ma per esercizio la studiamo per via algebrica.</w:t>
+      </w:r>
+    </w:p>
+    <w:p>
+      <w:r>
+        <w:rPr>
+          <w:b/>
+        </w:rPr>
+        <w:t>Iniettività.</w:t>
+      </w:r>
+      <w:r>
+        <w:t xml:space="preserve"> Si prendono due numeri x e y e si suppone che abbiano la stessa immagine, cioè ax + b = ay + b. Sottraendo b da entrambi i membri resta ax = ay; poiché a ≠ 0 si può dividere per a e si ottiene x = y. Dunque se due numeri hanno la stessa immagine sono lo stesso numero, e di conseguenza due numeri diversi hanno immagini diverse: f è iniettiva.</w:t>
+      </w:r>
+    </w:p>
+    <w:p>
+      <w:r>
+        <w:rPr>
+          <w:b/>
+        </w:rPr>
+        <w:t>Suriettività.</w:t>
+      </w:r>
+      <w:r>
+        <w:t xml:space="preserve"> La verifica si traduce sempre nel risolvere un'equazione. Dato y ∈ ℝ ci chiediamo se esiste x ∈ ℝ con f(x) = y, cioè con ax + b = y. L'incognita è x, e isolandola si ottiene x = (1/a)(y − b). Qualunque sia y questa espressione dà un x tale che f(x) = y, quindi f è suriettiva, e quindi biettiva.</w:t>
+      </w:r>
+    </w:p>
+    <w:p>
+      <w:pPr>
+        <w:pStyle w:val="Titolo2"/>
+      </w:pPr>
+      <w:r>
+        <w:rPr>
+          <w:b/>
+          <w:color w:val="E97132"/>
+        </w:rPr>
+        <w:t>Gli stessi calcoli su ℤ: la suriettività cade</w:t>
+      </w:r>
+    </w:p>
+    <w:p>
+      <w:r>
+        <w:t xml:space="preserve">Se a e b sono interi, la stessa espressione definisce una funzione f : ℤ → ℤ. È un'altra funzione, perché cambiano dominio e codominio. Che cosa resta valido? L'iniettività sì: le semplificazioni usate (sottrarre b, dividere per a ≠ 0) sono ancora lecite. La suriettività invece </w:t>
+      </w:r>
+      <w:r>
+        <w:rPr>
+          <w:b/>
+        </w:rPr>
+        <w:t>no</w:t>
+      </w:r>
+      <w:r>
+        <w:t>: nella formula x = (1/a)(y − b) la divisione per a può portare fuori dagli interi.</w:t>
+      </w:r>
+    </w:p>
+    <w:p>
+      <w:r>
+        <w:t xml:space="preserve">Esempio: f(x) = 2x + 1. Esiste un x intero con f(x) = 2? Dalla formula x = (1/2)(2 − 1) = 1/2, che non è un intero, quindi 2 non è nell'immagine. In realtà un intero moltiplicato per 2 è pari e sommando 1 si ottiene sempre un </w:t>
+      </w:r>
+      <w:r>
+        <w:rPr>
+          <w:b/>
+        </w:rPr>
+        <w:t>numero dispari</w:t>
+      </w:r>
+      <w:r>
+        <w:t>: i numeri pari non compaiono mai nell'immagine, e la funzione non è suriettiva. (Precisazione: per a = ±1 la divisione per a non porta fuori dagli interi e la funzione resta biettiva.)</w:t>
+      </w:r>
+    </w:p>
+    <w:p>
+      <w:r>
+        <w:t>Il prossimo capitolo mostra come si rimedia a questa situazione cambiando dominio e codominio.</w:t>
+      </w:r>
+    </w:p>
+    <w:p>
+      <w:pPr>
+        <w:pStyle w:val="Titolo1"/>
+      </w:pPr>
+      <w:r>
+        <w:rPr>
+          <w:b/>
+          <w:color w:val="EE0000"/>
+        </w:rPr>
+        <w:t>17. Rendere Biettiva una Funzione: Cambiare Codominio e Dominio</w:t>
+      </w:r>
+    </w:p>
+    <w:p>
+      <w:pPr>
+        <w:pStyle w:val="Titolo2"/>
+      </w:pPr>
+      <w:r>
+        <w:rPr>
+          <w:b/>
+          <w:color w:val="E97132"/>
+        </w:rPr>
+        <w:t>L'idea generale</w:t>
+      </w:r>
+    </w:p>
+    <w:p>
+      <w:r>
+        <w:t xml:space="preserve">Una funzione definita da un'espressione può non essere né iniettiva né suriettiva, ma spesso si può </w:t>
+      </w:r>
+      <w:r>
+        <w:rPr>
+          <w:b/>
+        </w:rPr>
+        <w:t>ritoccare</w:t>
+      </w:r>
+      <w:r>
+        <w:t xml:space="preserve"> la funzione, cambiando l'insieme di arrivo e quello di partenza, fino a ottenerne una biettiva. Si procede in due passi: prima si </w:t>
+      </w:r>
+      <w:r>
+        <w:rPr>
+          <w:b/>
+        </w:rPr>
+        <w:t>riduce il codominio</w:t>
+      </w:r>
+      <w:r>
+        <w:t xml:space="preserve"> a ciò che la funzione raggiunge davvero, e la funzione diventa suriettiva; poi si </w:t>
+      </w:r>
+      <w:r>
+        <w:rPr>
+          <w:b/>
+        </w:rPr>
+        <w:t>restringe il dominio</w:t>
+      </w:r>
+      <w:r>
+        <w:t>, scartando alcuni elementi in modo consistente, fino a rendere la funzione iniettiva.</w:t>
+      </w:r>
+    </w:p>
+    <w:p>
+      <w:r>
         <w:lastRenderedPageBreak/>
-        <w:t>È suriettiva.</w:t>
-      </w:r>
-      <w:r>
-        <w:t xml:space="preserve"> Dato a ∈ A basta scegliere un qualsiasi elemento b ∈ B: la coppia (a, b) ha immagine a. Qui serve che B non sia vuoto (precisazione); l'elemento scelto in B è irrilevante, perché la proiezione lo ignora. Tutta la retta verticale sopra a viene mandata in a.</w:t>
-      </w:r>
-    </w:p>
-    <w:p>
-      <w:r>
-        <w:t>Esiste un solo caso in cui p</w:t>
-      </w:r>
-      <w:r>
-        <w:rPr>
-          <w:vertAlign w:val="subscript"/>
-        </w:rPr>
-        <w:t>1</w:t>
-      </w:r>
-      <w:r>
-        <w:t xml:space="preserve"> diventa iniettiva: quando B ha </w:t>
-      </w:r>
-      <w:r>
-        <w:rPr>
-          <w:b/>
-        </w:rPr>
-        <w:t>un solo elemento</w:t>
-      </w:r>
-      <w:r>
-        <w:t>. Allora non si possono scegliere due elementi diversi di B, quindi due coppie diverse differiscono necessariamente nella prima componente. A parte questo caso eccezionale, la proiezione è suriettiva ma non iniettiva.</w:t>
+        <w:t>In linea di principio questo si può fare per qualsiasi funzione. Il prezzo è che a ogni passo si ottiene una funzione diversa da quella di partenza (capitolo 10), con le stesse regole di calcolo ma con proprietà diverse.</w:t>
       </w:r>
     </w:p>
     <w:p>
@@ -9215,160 +9684,6 @@
           <w:b/>
           <w:color w:val="E97132"/>
         </w:rPr>
-        <w:t>La funzione affine f(x) = ax + b su ℝ</w:t>
-      </w:r>
-    </w:p>
-    <w:p>
-      <w:r>
-        <w:t xml:space="preserve">Sia f : ℝ → ℝ, f(x) = ax + b, con a e b costanti e </w:t>
-      </w:r>
-      <w:r>
-        <w:rPr>
-          <w:b/>
-        </w:rPr>
-        <w:t>a ≠ 0</w:t>
-      </w:r>
-      <w:r>
-        <w:t>. Graficamente è una retta, ma per esercizio la studiamo per via algebrica.</w:t>
-      </w:r>
-    </w:p>
-    <w:p>
-      <w:r>
-        <w:rPr>
-          <w:b/>
-        </w:rPr>
-        <w:t>Iniettività.</w:t>
-      </w:r>
-      <w:r>
-        <w:t xml:space="preserve"> Si prendono due numeri x e y e si suppone che abbiano la stessa immagine, cioè ax + b = ay + b. Sottraendo b da entrambi i membri resta ax = ay; poiché a ≠ 0 si può dividere per a e si ottiene x = y. Dunque se due numeri hanno la stessa immagine sono lo stesso numero, e di conseguenza due numeri diversi hanno immagini diverse: f è iniettiva.</w:t>
-      </w:r>
-    </w:p>
-    <w:p>
-      <w:r>
-        <w:rPr>
-          <w:b/>
-        </w:rPr>
-        <w:t>Suriettività.</w:t>
-      </w:r>
-      <w:r>
-        <w:t xml:space="preserve"> La verifica si traduce sempre nel risolvere un'equazione. Dato y ∈ ℝ ci chiediamo se esiste x ∈ ℝ con f(x) = y, cioè con ax + b = y. L'incognita è x, e isolandola si ottiene x = (1/a)(y − b). Qualunque sia y questa espressione dà un x tale che f(x) = y, quindi f è suriettiva, e quindi biettiva.</w:t>
-      </w:r>
-    </w:p>
-    <w:p>
-      <w:pPr>
-        <w:pStyle w:val="Titolo2"/>
-      </w:pPr>
-      <w:r>
-        <w:rPr>
-          <w:b/>
-          <w:color w:val="E97132"/>
-        </w:rPr>
-        <w:t>Gli stessi calcoli su ℤ: la suriettività cade</w:t>
-      </w:r>
-    </w:p>
-    <w:p>
-      <w:r>
-        <w:t xml:space="preserve">Se a e b sono interi, la stessa espressione definisce una funzione f : ℤ → ℤ. È un'altra funzione, perché cambiano dominio e codominio. Che cosa resta valido? L'iniettività sì: le semplificazioni usate (sottrarre b, dividere per a ≠ 0) sono ancora lecite. La suriettività invece </w:t>
-      </w:r>
-      <w:r>
-        <w:rPr>
-          <w:b/>
-        </w:rPr>
-        <w:t>no</w:t>
-      </w:r>
-      <w:r>
-        <w:t>: nella formula x = (1/a)(y − b) la divisione per a può portare fuori dagli interi.</w:t>
-      </w:r>
-    </w:p>
-    <w:p>
-      <w:r>
-        <w:t xml:space="preserve">Esempio: f(x) = 2x + 1. Esiste un x intero con f(x) = 2? Dalla formula x = (1/2)(2 − 1) = 1/2, che non è un intero, quindi 2 non è nell'immagine. In realtà un intero moltiplicato per 2 è pari e sommando 1 si ottiene sempre un </w:t>
-      </w:r>
-      <w:r>
-        <w:rPr>
-          <w:b/>
-        </w:rPr>
-        <w:t>numero dispari</w:t>
-      </w:r>
-      <w:r>
-        <w:t>: i numeri pari non compaiono mai nell'immagine, e la funzione non è suriettiva. (Precisazione: per a = ±1 la divisione per a non porta fuori dagli interi e la funzione resta biettiva.)</w:t>
-      </w:r>
-    </w:p>
-    <w:p>
-      <w:r>
-        <w:t>Il prossimo capitolo mostra come si rimedia a questa situazione cambiando dominio e codominio.</w:t>
-      </w:r>
-    </w:p>
-    <w:p>
-      <w:pPr>
-        <w:pStyle w:val="Titolo1"/>
-      </w:pPr>
-      <w:r>
-        <w:rPr>
-          <w:b/>
-          <w:color w:val="EE0000"/>
-        </w:rPr>
-        <w:t>17. Rendere Biettiva una Funzione: Cambiare Codominio e Dominio</w:t>
-      </w:r>
-    </w:p>
-    <w:p>
-      <w:pPr>
-        <w:pStyle w:val="Titolo2"/>
-      </w:pPr>
-      <w:r>
-        <w:rPr>
-          <w:b/>
-          <w:color w:val="E97132"/>
-        </w:rPr>
-        <w:t>L'idea generale</w:t>
-      </w:r>
-    </w:p>
-    <w:p>
-      <w:r>
-        <w:t xml:space="preserve">Una funzione definita da un'espressione può non essere né iniettiva né suriettiva, ma spesso si può </w:t>
-      </w:r>
-      <w:r>
-        <w:rPr>
-          <w:b/>
-        </w:rPr>
-        <w:t>ritoccare</w:t>
-      </w:r>
-      <w:r>
-        <w:t xml:space="preserve"> la funzione, cambiando l'insieme di arrivo e quello di partenza, fino a ottenerne una biettiva. Si procede in due passi: prima si </w:t>
-      </w:r>
-      <w:r>
-        <w:rPr>
-          <w:b/>
-        </w:rPr>
-        <w:t>riduce il codominio</w:t>
-      </w:r>
-      <w:r>
-        <w:t xml:space="preserve"> a ciò che la funzione raggiunge davvero, e la funzione diventa suriettiva; poi si </w:t>
-      </w:r>
-      <w:r>
-        <w:rPr>
-          <w:b/>
-        </w:rPr>
-        <w:t>restringe il dominio</w:t>
-      </w:r>
-      <w:r>
-        <w:t>, scartando alcuni elementi in modo consistente, fino a rendere la funzione iniettiva.</w:t>
-      </w:r>
-    </w:p>
-    <w:p>
-      <w:r>
-        <w:t>In linea di principio questo si può fare per qualsiasi funzione. Il prezzo è che a ogni passo si ottiene una funzione diversa da quella di partenza (capitolo 10), con le stesse regole di calcolo ma con proprietà diverse.</w:t>
-      </w:r>
-    </w:p>
-    <w:p>
-      <w:pPr>
-        <w:pStyle w:val="Titolo2"/>
-      </w:pPr>
-      <w:r>
-        <w:rPr>
-          <w:b/>
-          <w:color w:val="E97132"/>
-        </w:rPr>
         <w:t>Esempio: f(x) = x²</w:t>
       </w:r>
     </w:p>
@@ -9391,7 +9706,6 @@
         <w:rPr>
           <w:b/>
         </w:rPr>
-        <w:lastRenderedPageBreak/>
         <w:t>Passo 1: ridurre il codominio.</w:t>
       </w:r>
       <w:r>
@@ -9592,6 +9906,7 @@
     </w:p>
     <w:p>
       <w:r>
+        <w:lastRenderedPageBreak/>
         <w:t>(g ∘ f)(a) = g(f(a)).</w:t>
       </w:r>
     </w:p>
@@ -9628,7 +9943,6 @@
     </w:p>
     <w:p>
       <w:r>
-        <w:lastRenderedPageBreak/>
         <w:t xml:space="preserve">La composizione si può fare solo se c'è </w:t>
       </w:r>
       <w:r>
@@ -9804,6 +10118,7 @@
         </w:numPr>
       </w:pPr>
       <w:r>
+        <w:lastRenderedPageBreak/>
         <w:t>(g ∘ f)(x) = g(f(x)) = x² + 1: prima si eleva al quadrato, poi si somma 1;</w:t>
       </w:r>
     </w:p>
@@ -9834,11 +10149,7 @@
     </w:p>
     <w:p>
       <w:r>
-        <w:t xml:space="preserve">Questo è forse il primo esempio di operazione non commutativa che si incontra: il vecchio detto "l'ordine dei fattori non cambia il prodotto" vale per i numeri, ma non per oggetti di natura diversa </w:t>
-      </w:r>
-      <w:r>
-        <w:lastRenderedPageBreak/>
-        <w:t>come le funzioni. Nel corso di Algebra e Geometria compariranno altri oggetti che si possono moltiplicare ma con un'operazione non commutativa.</w:t>
+        <w:t>Questo è forse il primo esempio di operazione non commutativa che si incontra: il vecchio detto "l'ordine dei fattori non cambia il prodotto" vale per i numeri, ma non per oggetti di natura diversa come le funzioni. Nel corso di Algebra e Geometria compariranno altri oggetti che si possono moltiplicare ma con un'operazione non commutativa.</w:t>
       </w:r>
     </w:p>
     <w:p>
@@ -10094,6 +10405,7 @@
           <w:b/>
           <w:color w:val="E97132"/>
         </w:rPr>
+        <w:lastRenderedPageBreak/>
         <w:t>Il viceversa: che cosa si deduce da g ∘ f</w:t>
       </w:r>
     </w:p>
@@ -10157,7 +10469,6 @@
     </w:p>
     <w:p>
       <w:r>
-        <w:lastRenderedPageBreak/>
         <w:t>1. Se f non è iniettiva esistono a₁ ≠ a₂ in A con f(a₁) = f(a₂).</w:t>
       </w:r>
     </w:p>

</xml_diff>

<commit_message>
Aggiornamento: evidenziazioni, dati del Quaderno, Word di Matematica discreta
Co-Authored-By: Claude Sonnet 5.5 <noreply@anthropic.com>
</commit_message>
<xml_diff>
--- a/Riassunto Matematica discreta.docx
+++ b/Riassunto Matematica discreta.docx
@@ -3352,26 +3352,38 @@
         <w:rPr>
           <w:b/>
           <w:bCs/>
+          <w:highlight w:val="yellow"/>
         </w:rPr>
         <w:t>numeri naturali</w:t>
       </w:r>
       <w:r>
+        <w:rPr>
+          <w:highlight w:val="yellow"/>
+        </w:rPr>
         <w:t xml:space="preserve"> ℕ = {0, 1, 2, 3, …} attraverso i </w:t>
       </w:r>
       <w:r>
         <w:rPr>
           <w:b/>
           <w:bCs/>
+          <w:highlight w:val="yellow"/>
         </w:rPr>
         <w:t>5 Assiomi di Giuseppe Peano</w:t>
       </w:r>
       <w:r>
-        <w:t xml:space="preserve">. Il sistema si basa su un elemento iniziale (lo 0) e su una </w:t>
-      </w:r>
-      <w:r>
-        <w:rPr>
-          <w:b/>
-          <w:bCs/>
+        <w:t xml:space="preserve">. Il sistema si basa su un </w:t>
+      </w:r>
+      <w:r>
+        <w:rPr>
+          <w:highlight w:val="yellow"/>
+        </w:rPr>
+        <w:t xml:space="preserve">elemento iniziale (lo 0) e su una </w:t>
+      </w:r>
+      <w:r>
+        <w:rPr>
+          <w:b/>
+          <w:bCs/>
+          <w:highlight w:val="yellow"/>
         </w:rPr>
         <w:t>funzione successore</w:t>
       </w:r>
@@ -3394,7 +3406,16 @@
         <w:t>Esistenza dello zero</w:t>
       </w:r>
       <w:r>
-        <w:t xml:space="preserve">: 0 ∈ ℕ </w:t>
+        <w:t xml:space="preserve">: </w:t>
+      </w:r>
+      <w:r>
+        <w:rPr>
+          <w:highlight w:val="yellow"/>
+        </w:rPr>
+        <w:t>0 ∈ ℕ</w:t>
+      </w:r>
+      <w:r>
+        <w:t xml:space="preserve"> </w:t>
       </w:r>
       <w:r>
         <w:rPr>
@@ -3422,7 +3443,25 @@
         <w:t>Esistenza del successore</w:t>
       </w:r>
       <w:r>
-        <w:t>: Per ogni n ∈ ℕ, esiste un unico successore S(n) ∈ ℕ.</w:t>
+        <w:t xml:space="preserve">: </w:t>
+      </w:r>
+      <w:r>
+        <w:rPr>
+          <w:highlight w:val="yellow"/>
+        </w:rPr>
+        <w:t>Per ogni n</w:t>
+      </w:r>
+      <w:r>
+        <w:t xml:space="preserve"> ∈ ℕ, </w:t>
+      </w:r>
+      <w:r>
+        <w:rPr>
+          <w:highlight w:val="yellow"/>
+        </w:rPr>
+        <w:t xml:space="preserve">esiste un unico successore </w:t>
+      </w:r>
+      <w:r>
+        <w:t>S(n) ∈ ℕ.</w:t>
       </w:r>
     </w:p>
     <w:p>
@@ -3440,7 +3479,16 @@
         <w:t>Iniettività della funzione successore</w:t>
       </w:r>
       <w:r>
-        <w:t xml:space="preserve">: Numeri naturali distinti hanno successori distinti: </w:t>
+        <w:t xml:space="preserve">: </w:t>
+      </w:r>
+      <w:r>
+        <w:rPr>
+          <w:highlight w:val="yellow"/>
+        </w:rPr>
+        <w:t>Numeri naturali distinti hanno successori distinti:</w:t>
+      </w:r>
+      <w:r>
+        <w:t xml:space="preserve"> </w:t>
       </w:r>
     </w:p>
     <w:p>
@@ -3466,7 +3514,16 @@
         <w:t>Lo zero come elemento iniziale</w:t>
       </w:r>
       <w:r>
-        <w:t xml:space="preserve">: Il numero 0 non è il successore di alcun numero naturale: </w:t>
+        <w:t xml:space="preserve">: Il </w:t>
+      </w:r>
+      <w:r>
+        <w:rPr>
+          <w:highlight w:val="yellow"/>
+        </w:rPr>
+        <w:t>numero 0 non è il successore di alcun numero naturale</w:t>
+      </w:r>
+      <w:r>
+        <w:t xml:space="preserve">: </w:t>
       </w:r>
     </w:p>
     <w:p>
@@ -3483,6 +3540,9 @@
           <w:ilvl w:val="0"/>
           <w:numId w:val="20"/>
         </w:numPr>
+        <w:rPr>
+          <w:highlight w:val="yellow"/>
+        </w:rPr>
       </w:pPr>
       <w:r>
         <w:rPr>
@@ -3492,7 +3552,13 @@
         <w:t>Assioma di Induzione</w:t>
       </w:r>
       <w:r>
-        <w:t>: Sia U ⊆ ℕ un sottoinsieme di numeri naturali. Se U soddisfa le due condizioni:</w:t>
+        <w:t xml:space="preserve">: </w:t>
+      </w:r>
+      <w:r>
+        <w:rPr>
+          <w:highlight w:val="yellow"/>
+        </w:rPr>
+        <w:t>Sia U ⊆ ℕ un sottoinsieme di numeri naturali. Se U soddisfa le due condizioni:</w:t>
       </w:r>
     </w:p>
     <w:p>
@@ -3501,8 +3567,14 @@
           <w:ilvl w:val="1"/>
           <w:numId w:val="20"/>
         </w:numPr>
-      </w:pPr>
-      <w:r>
+        <w:rPr>
+          <w:highlight w:val="yellow"/>
+        </w:rPr>
+      </w:pPr>
+      <w:r>
+        <w:rPr>
+          <w:highlight w:val="yellow"/>
+        </w:rPr>
         <w:t>0 ∈ U</w:t>
       </w:r>
     </w:p>
@@ -3513,11 +3585,13 @@
           <w:numId w:val="20"/>
         </w:numPr>
         <w:rPr>
+          <w:highlight w:val="yellow"/>
           <w:lang w:val="en-US"/>
         </w:rPr>
       </w:pPr>
       <w:r>
         <w:rPr>
+          <w:highlight w:val="yellow"/>
           <w:lang w:val="en-US"/>
         </w:rPr>
         <w:t>∀ n ∈ U ⟹ S(n) ∈ U</w:t>
@@ -3548,12 +3622,37 @@
     </w:p>
     <w:p>
       <w:r>
-        <w:t xml:space="preserve">I primi quattro assiomi da soli non bastano a identificare in modo univoco l'insieme ℕ, poiché ammetterebbero strutture patologiche composte da catene infinite "separate" (ad esempio, ℕ affiancato da una seconda catena infinita separata (…, −1′, 0′, 1′, …) i cui elementi non si raggiungono mai partendo da 0 con il successore: una struttura del genere soddisfa i primi quattro assiomi ma non il quinto). Il quinto assioma garantisce che </w:t>
-      </w:r>
-      <w:r>
-        <w:rPr>
-          <w:b/>
-          <w:bCs/>
+        <w:t xml:space="preserve">I </w:t>
+      </w:r>
+      <w:r>
+        <w:rPr>
+          <w:highlight w:val="yellow"/>
+        </w:rPr>
+        <w:t>primi quattro assiomi da soli non bastano a identificare in modo univoco l'insieme ℕ</w:t>
+      </w:r>
+      <w:r>
+        <w:t xml:space="preserve">, poiché </w:t>
+      </w:r>
+      <w:r>
+        <w:rPr>
+          <w:highlight w:val="yellow"/>
+        </w:rPr>
+        <w:t>ammetterebbero strutture patologiche composte da catene infinite "separate"</w:t>
+      </w:r>
+      <w:r>
+        <w:t xml:space="preserve"> (ad esempio, ℕ affiancato da una seconda catena infinita separata (…, −1′, 0′, 1′, …) i cui elementi non si raggiungono mai partendo da 0 con il successore: una struttura del genere soddisfa i primi quattro assiomi ma non il quinto). Il </w:t>
+      </w:r>
+      <w:r>
+        <w:rPr>
+          <w:highlight w:val="yellow"/>
+        </w:rPr>
+        <w:t xml:space="preserve">quinto assioma garantisce che </w:t>
+      </w:r>
+      <w:r>
+        <w:rPr>
+          <w:b/>
+          <w:bCs/>
+          <w:highlight w:val="yellow"/>
         </w:rPr>
         <w:t>qualsiasi numero naturale è raggiungibile a partire da 0 in un numero finito di iterazioni della funzione successore</w:t>
       </w:r>
@@ -3581,12 +3680,19 @@
     </w:p>
     <w:p>
       <w:r>
-        <w:t xml:space="preserve">Il quinto assioma di Peano si traduce in uno strumento dimostrativo di primaria importanza: il </w:t>
-      </w:r>
-      <w:r>
-        <w:rPr>
-          <w:b/>
-          <w:bCs/>
+        <w:t xml:space="preserve">Il quinto assioma di Peano si traduce in uno </w:t>
+      </w:r>
+      <w:r>
+        <w:rPr>
+          <w:highlight w:val="yellow"/>
+        </w:rPr>
+        <w:t xml:space="preserve">strumento dimostrativo di primaria importanza: il </w:t>
+      </w:r>
+      <w:r>
+        <w:rPr>
+          <w:b/>
+          <w:bCs/>
+          <w:highlight w:val="yellow"/>
         </w:rPr>
         <w:t>Principio di Induzione</w:t>
       </w:r>
@@ -3596,7 +3702,22 @@
     </w:p>
     <w:p>
       <w:r>
-        <w:t>Per dimostrare che una determinata proprietà P(n) è vera per tutti i numeri naturali n ≥ 0 (oppure n ≥ 1), si articola la prova in due fasi obbligatorie:</w:t>
+        <w:rPr>
+          <w:highlight w:val="yellow"/>
+        </w:rPr>
+        <w:t>Per dimostrare che una determinata proprietà P(n) è vera per tutti i numeri naturali n ≥ 0 (oppure n ≥ 1),</w:t>
+      </w:r>
+      <w:r>
+        <w:t xml:space="preserve"> </w:t>
+      </w:r>
+      <w:r>
+        <w:rPr>
+          <w:highlight w:val="yellow"/>
+        </w:rPr>
+        <w:t>si articola la prova in due fasi obbligatorie</w:t>
+      </w:r>
+      <w:r>
+        <w:t>:</w:t>
       </w:r>
     </w:p>
     <w:p>
@@ -3614,7 +3735,16 @@
         <w:t>Base dell'Induzione</w:t>
       </w:r>
       <w:r>
-        <w:t>: Si verifica che la proprietà sia valida per il caso iniziale, ossia che P(0) (o P(1)) sia vera.</w:t>
+        <w:t xml:space="preserve">: Si </w:t>
+      </w:r>
+      <w:r>
+        <w:rPr>
+          <w:highlight w:val="yellow"/>
+        </w:rPr>
+        <w:t>verifica che la proprietà sia valida per il caso iniziale</w:t>
+      </w:r>
+      <w:r>
+        <w:t>, ossia che P(0) (o P(1)) sia vera.</w:t>
       </w:r>
     </w:p>
     <w:p>
@@ -3633,7 +3763,16 @@
         <w:t>Passo Induttivo (P(n) ⟹ P(n+1))</w:t>
       </w:r>
       <w:r>
-        <w:t>: Si assume vera la proprietà per un generico n (</w:t>
+        <w:t xml:space="preserve">: Si </w:t>
+      </w:r>
+      <w:r>
+        <w:rPr>
+          <w:highlight w:val="yellow"/>
+        </w:rPr>
+        <w:t>assume vera la proprietà per un generico n</w:t>
+      </w:r>
+      <w:r>
+        <w:t xml:space="preserve"> (</w:t>
       </w:r>
       <w:r>
         <w:rPr>
@@ -3643,7 +3782,16 @@
         <w:t>Ipotesi Induttiva</w:t>
       </w:r>
       <w:r>
-        <w:t>) e si dimostra che essa continua a valere per il successore n+1 (</w:t>
+        <w:t xml:space="preserve">) e </w:t>
+      </w:r>
+      <w:r>
+        <w:rPr>
+          <w:highlight w:val="yellow"/>
+        </w:rPr>
+        <w:t>si dimostra che essa continua a valere per il successore n+1</w:t>
+      </w:r>
+      <w:r>
+        <w:t xml:space="preserve"> (</w:t>
       </w:r>
       <w:r>
         <w:rPr>
@@ -3664,6 +3812,7 @@
         <w:rPr>
           <w:b/>
           <w:bCs/>
+          <w:highlight w:val="yellow"/>
         </w:rPr>
         <w:t>effetto domino</w:t>
       </w:r>
@@ -3709,7 +3858,16 @@
     </w:p>
     <w:p>
       <w:r>
-        <w:t xml:space="preserve">Vogliamo dimostrare la formula per la somma dei quadrati dei primi n numeri naturali: </w:t>
+        <w:t xml:space="preserve">Vogliamo </w:t>
+      </w:r>
+      <w:r>
+        <w:rPr>
+          <w:highlight w:val="yellow"/>
+        </w:rPr>
+        <w:t>dimostrare la formula per la somma dei quadrati dei primi n numeri naturali</w:t>
+      </w:r>
+      <w:r>
+        <w:t xml:space="preserve">: </w:t>
       </w:r>
     </w:p>
     <w:p>
@@ -3961,16 +4119,29 @@
     </w:p>
     <w:p>
       <w:r>
-        <w:t>Dimostriamo per induzione che un insieme finito A con n elementi possiede esattamente 2</w:t>
-      </w:r>
-      <w:r>
-        <w:rPr>
+        <w:t xml:space="preserve">Dimostriamo per induzione che un </w:t>
+      </w:r>
+      <w:r>
+        <w:rPr>
+          <w:highlight w:val="yellow"/>
+        </w:rPr>
+        <w:t>insieme finito A con n elementi possiede esattamente 2</w:t>
+      </w:r>
+      <w:r>
+        <w:rPr>
+          <w:highlight w:val="yellow"/>
           <w:vertAlign w:val="superscript"/>
         </w:rPr>
         <w:t>n</w:t>
       </w:r>
       <w:r>
-        <w:t xml:space="preserve"> sottoinsiemi.</w:t>
+        <w:rPr>
+          <w:highlight w:val="yellow"/>
+        </w:rPr>
+        <w:t xml:space="preserve"> sottoinsiemi</w:t>
+      </w:r>
+      <w:r>
+        <w:t>.</w:t>
       </w:r>
     </w:p>
     <w:p>
@@ -4109,7 +4280,10 @@
         <w:t>n</w:t>
       </w:r>
       <w:r>
-        <w:t>}, di cardinalità |A'| = n.</w:t>
+        <w:t>}, di cardinalità |A'| = n</w:t>
+      </w:r>
+      <w:r>
+        <w:t>.</w:t>
       </w:r>
     </w:p>
     <w:p>

</xml_diff>

<commit_message>
Matematica discreta: 39 figure inserite nei capitoli 1-19 (inserisci_figure.py, figure_mate.py)
Co-Authored-By: Claude Sonnet 5.5 <noreply@anthropic.com>
</commit_message>
<xml_diff>
--- a/Riassunto Matematica discreta.docx
+++ b/Riassunto Matematica discreta.docx
@@ -622,6 +622,59 @@
         <w:t>. L'insieme è rappresentato da un ovale o regione chiusa del piano, gli elementi interni sono raffigurati come punti situati dentro la regione, mentre gli oggetti che non vi appartengono sono collocati all'esterno.</w:t>
       </w:r>
     </w:p>
+    <w:p>
+      <w:pPr>
+        <w:keepNext/>
+        <w:spacing w:before="120"/>
+        <w:jc w:val="center"/>
+      </w:pPr>
+      <w:r>
+        <w:drawing>
+          <wp:inline xmlns:a="http://schemas.openxmlformats.org/drawingml/2006/main" xmlns:pic="http://schemas.openxmlformats.org/drawingml/2006/picture">
+            <wp:extent cx="2340000" cy="2150052"/>
+            <wp:docPr id="39" name="Picture 39"/>
+            <wp:cNvGraphicFramePr>
+              <a:graphicFrameLocks noChangeAspect="1"/>
+            </wp:cNvGraphicFramePr>
+            <a:graphic>
+              <a:graphicData uri="http://schemas.openxmlformats.org/drawingml/2006/picture">
+                <pic:pic>
+                  <pic:nvPicPr>
+                    <pic:cNvPr id="0" name="ch01_venn_insieme.png"/>
+                    <pic:cNvPicPr/>
+                  </pic:nvPicPr>
+                  <pic:blipFill>
+                    <a:blip r:embed="rId45"/>
+                    <a:stretch>
+                      <a:fillRect/>
+                    </a:stretch>
+                  </pic:blipFill>
+                  <pic:spPr>
+                    <a:xfrm>
+                      <a:off x="0" y="0"/>
+                      <a:ext cx="2340000" cy="2150052"/>
+                    </a:xfrm>
+                    <a:prstGeom prst="rect"/>
+                  </pic:spPr>
+                </pic:pic>
+              </a:graphicData>
+            </a:graphic>
+          </wp:inline>
+        </w:drawing>
+      </w:r>
+    </w:p>
+    <w:p>
+      <w:pPr>
+        <w:jc w:val="center"/>
+      </w:pPr>
+      <w:r>
+        <w:rPr>
+          <w:i/>
+          <w:sz w:val="18"/>
+        </w:rPr>
+        <w:t>Un insieme come diagramma di Venn: 1, 2, 3 ∈ A e 5 ∉ A.</w:t>
+      </w:r>
+    </w:p>
     <w:p/>
     <w:p>
       <w:pPr>
@@ -864,6 +917,59 @@
       </w:r>
     </w:p>
     <w:p>
+      <w:pPr>
+        <w:keepNext/>
+        <w:spacing w:before="120"/>
+        <w:jc w:val="center"/>
+      </w:pPr>
+      <w:r>
+        <w:drawing>
+          <wp:inline xmlns:a="http://schemas.openxmlformats.org/drawingml/2006/main" xmlns:pic="http://schemas.openxmlformats.org/drawingml/2006/picture">
+            <wp:extent cx="2880000" cy="2385374"/>
+            <wp:docPr id="38" name="Picture 38"/>
+            <wp:cNvGraphicFramePr>
+              <a:graphicFrameLocks noChangeAspect="1"/>
+            </wp:cNvGraphicFramePr>
+            <a:graphic>
+              <a:graphicData uri="http://schemas.openxmlformats.org/drawingml/2006/picture">
+                <pic:pic>
+                  <pic:nvPicPr>
+                    <pic:cNvPr id="0" name="ch02_sottoinsieme.png"/>
+                    <pic:cNvPicPr/>
+                  </pic:nvPicPr>
+                  <pic:blipFill>
+                    <a:blip r:embed="rId44"/>
+                    <a:stretch>
+                      <a:fillRect/>
+                    </a:stretch>
+                  </pic:blipFill>
+                  <pic:spPr>
+                    <a:xfrm>
+                      <a:off x="0" y="0"/>
+                      <a:ext cx="2880000" cy="2385374"/>
+                    </a:xfrm>
+                    <a:prstGeom prst="rect"/>
+                  </pic:spPr>
+                </pic:pic>
+              </a:graphicData>
+            </a:graphic>
+          </wp:inline>
+        </w:drawing>
+      </w:r>
+    </w:p>
+    <w:p>
+      <w:pPr>
+        <w:jc w:val="center"/>
+      </w:pPr>
+      <w:r>
+        <w:rPr>
+          <w:i/>
+          <w:sz w:val="18"/>
+        </w:rPr>
+        <w:t>S ⊆ T: la regione di S sta dentro quella di T.</w:t>
+      </w:r>
+    </w:p>
+    <w:p>
       <w:r>
         <w:rPr>
           <w:b/>
@@ -1239,6 +1345,59 @@
         <w:t>: A ∈ B non implica A ⊆ B. Aggiungere una parentesi graffa altera completamente la natura dell'oggetto matematico: la notazione a indica un elemento semplice, mentre {a} indica l'insieme che contiene quell'elemento.</w:t>
       </w:r>
     </w:p>
+    <w:p>
+      <w:pPr>
+        <w:keepNext/>
+        <w:spacing w:before="120"/>
+        <w:jc w:val="center"/>
+      </w:pPr>
+      <w:r>
+        <w:drawing>
+          <wp:inline xmlns:a="http://schemas.openxmlformats.org/drawingml/2006/main" xmlns:pic="http://schemas.openxmlformats.org/drawingml/2006/picture">
+            <wp:extent cx="3060000" cy="2343133"/>
+            <wp:docPr id="37" name="Picture 37"/>
+            <wp:cNvGraphicFramePr>
+              <a:graphicFrameLocks noChangeAspect="1"/>
+            </wp:cNvGraphicFramePr>
+            <a:graphic>
+              <a:graphicData uri="http://schemas.openxmlformats.org/drawingml/2006/picture">
+                <pic:pic>
+                  <pic:nvPicPr>
+                    <pic:cNvPr id="0" name="ch02_scatole_cinesi.png"/>
+                    <pic:cNvPicPr/>
+                  </pic:nvPicPr>
+                  <pic:blipFill>
+                    <a:blip r:embed="rId43"/>
+                    <a:stretch>
+                      <a:fillRect/>
+                    </a:stretch>
+                  </pic:blipFill>
+                  <pic:spPr>
+                    <a:xfrm>
+                      <a:off x="0" y="0"/>
+                      <a:ext cx="3060000" cy="2343133"/>
+                    </a:xfrm>
+                    <a:prstGeom prst="rect"/>
+                  </pic:spPr>
+                </pic:pic>
+              </a:graphicData>
+            </a:graphic>
+          </wp:inline>
+        </w:drawing>
+      </w:r>
+    </w:p>
+    <w:p>
+      <w:pPr>
+        <w:jc w:val="center"/>
+      </w:pPr>
+      <w:r>
+        <w:rPr>
+          <w:i/>
+          <w:sz w:val="18"/>
+        </w:rPr>
+        <w:t>Le scatole cinesi: A è un elemento di B, ma gli elementi di A non lo sono di B.</w:t>
+      </w:r>
+    </w:p>
     <w:p/>
     <w:p>
       <w:pPr>
@@ -1456,6 +1615,59 @@
     </w:p>
     <w:p>
       <w:pPr>
+        <w:keepNext/>
+        <w:spacing w:before="120"/>
+        <w:jc w:val="center"/>
+      </w:pPr>
+      <w:r>
+        <w:drawing>
+          <wp:inline xmlns:a="http://schemas.openxmlformats.org/drawingml/2006/main" xmlns:pic="http://schemas.openxmlformats.org/drawingml/2006/picture">
+            <wp:extent cx="3960000" cy="1869120"/>
+            <wp:docPr id="36" name="Picture 36"/>
+            <wp:cNvGraphicFramePr>
+              <a:graphicFrameLocks noChangeAspect="1"/>
+            </wp:cNvGraphicFramePr>
+            <a:graphic>
+              <a:graphicData uri="http://schemas.openxmlformats.org/drawingml/2006/picture">
+                <pic:pic>
+                  <pic:nvPicPr>
+                    <pic:cNvPr id="0" name="ch03_unione_intersezione.png"/>
+                    <pic:cNvPicPr/>
+                  </pic:nvPicPr>
+                  <pic:blipFill>
+                    <a:blip r:embed="rId42"/>
+                    <a:stretch>
+                      <a:fillRect/>
+                    </a:stretch>
+                  </pic:blipFill>
+                  <pic:spPr>
+                    <a:xfrm>
+                      <a:off x="0" y="0"/>
+                      <a:ext cx="3960000" cy="1869120"/>
+                    </a:xfrm>
+                    <a:prstGeom prst="rect"/>
+                  </pic:spPr>
+                </pic:pic>
+              </a:graphicData>
+            </a:graphic>
+          </wp:inline>
+        </w:drawing>
+      </w:r>
+    </w:p>
+    <w:p>
+      <w:pPr>
+        <w:jc w:val="center"/>
+      </w:pPr>
+      <w:r>
+        <w:rPr>
+          <w:i/>
+          <w:sz w:val="18"/>
+        </w:rPr>
+        <w:t>Intersezione e unione di due insiemi X e Y (regioni in azzurro).</w:t>
+      </w:r>
+    </w:p>
+    <w:p>
+      <w:pPr>
         <w:pStyle w:val="Titolo2"/>
         <w:rPr>
           <w:color w:val="E97132" w:themeColor="accent2"/>
@@ -1986,6 +2198,59 @@
         <w:t>|A × B| = |A| · |B| = m · n</w:t>
       </w:r>
     </w:p>
+    <w:p>
+      <w:pPr>
+        <w:keepNext/>
+        <w:spacing w:before="120"/>
+        <w:jc w:val="center"/>
+      </w:pPr>
+      <w:r>
+        <w:drawing>
+          <wp:inline xmlns:a="http://schemas.openxmlformats.org/drawingml/2006/main" xmlns:pic="http://schemas.openxmlformats.org/drawingml/2006/picture">
+            <wp:extent cx="2880000" cy="2256887"/>
+            <wp:docPr id="35" name="Picture 35"/>
+            <wp:cNvGraphicFramePr>
+              <a:graphicFrameLocks noChangeAspect="1"/>
+            </wp:cNvGraphicFramePr>
+            <a:graphic>
+              <a:graphicData uri="http://schemas.openxmlformats.org/drawingml/2006/picture">
+                <pic:pic>
+                  <pic:nvPicPr>
+                    <pic:cNvPr id="0" name="ch03_prodotto_cartesiano.png"/>
+                    <pic:cNvPicPr/>
+                  </pic:nvPicPr>
+                  <pic:blipFill>
+                    <a:blip r:embed="rId41"/>
+                    <a:stretch>
+                      <a:fillRect/>
+                    </a:stretch>
+                  </pic:blipFill>
+                  <pic:spPr>
+                    <a:xfrm>
+                      <a:off x="0" y="0"/>
+                      <a:ext cx="2880000" cy="2256887"/>
+                    </a:xfrm>
+                    <a:prstGeom prst="rect"/>
+                  </pic:spPr>
+                </pic:pic>
+              </a:graphicData>
+            </a:graphic>
+          </wp:inline>
+        </w:drawing>
+      </w:r>
+    </w:p>
+    <w:p>
+      <w:pPr>
+        <w:jc w:val="center"/>
+      </w:pPr>
+      <w:r>
+        <w:rPr>
+          <w:i/>
+          <w:sz w:val="18"/>
+        </w:rPr>
+        <w:t>Il prodotto cartesiano A × B come griglia di coppie ordinate.</w:t>
+      </w:r>
+    </w:p>
     <w:p/>
     <w:p>
       <w:pPr>
@@ -2126,6 +2391,59 @@
     </w:p>
     <w:p>
       <w:pPr>
+        <w:keepNext/>
+        <w:spacing w:before="120"/>
+        <w:jc w:val="center"/>
+      </w:pPr>
+      <w:r>
+        <w:drawing>
+          <wp:inline xmlns:a="http://schemas.openxmlformats.org/drawingml/2006/main" xmlns:pic="http://schemas.openxmlformats.org/drawingml/2006/picture">
+            <wp:extent cx="3960000" cy="1872640"/>
+            <wp:docPr id="34" name="Picture 34"/>
+            <wp:cNvGraphicFramePr>
+              <a:graphicFrameLocks noChangeAspect="1"/>
+            </wp:cNvGraphicFramePr>
+            <a:graphic>
+              <a:graphicData uri="http://schemas.openxmlformats.org/drawingml/2006/picture">
+                <pic:pic>
+                  <pic:nvPicPr>
+                    <pic:cNvPr id="0" name="ch04_differenza.png"/>
+                    <pic:cNvPicPr/>
+                  </pic:nvPicPr>
+                  <pic:blipFill>
+                    <a:blip r:embed="rId40"/>
+                    <a:stretch>
+                      <a:fillRect/>
+                    </a:stretch>
+                  </pic:blipFill>
+                  <pic:spPr>
+                    <a:xfrm>
+                      <a:off x="0" y="0"/>
+                      <a:ext cx="3960000" cy="1872640"/>
+                    </a:xfrm>
+                    <a:prstGeom prst="rect"/>
+                  </pic:spPr>
+                </pic:pic>
+              </a:graphicData>
+            </a:graphic>
+          </wp:inline>
+        </w:drawing>
+      </w:r>
+    </w:p>
+    <w:p>
+      <w:pPr>
+        <w:jc w:val="center"/>
+      </w:pPr>
+      <w:r>
+        <w:rPr>
+          <w:i/>
+          <w:sz w:val="18"/>
+        </w:rPr>
+        <w:t>La differenza non è commutativa: A ∖ B ≠ B ∖ A.</w:t>
+      </w:r>
+    </w:p>
+    <w:p>
+      <w:pPr>
         <w:numPr>
           <w:ilvl w:val="0"/>
           <w:numId w:val="15"/>
@@ -2211,6 +2529,59 @@
     </w:p>
     <w:p>
       <w:pPr>
+        <w:keepNext/>
+        <w:spacing w:before="120"/>
+        <w:jc w:val="center"/>
+      </w:pPr>
+      <w:r>
+        <w:drawing>
+          <wp:inline xmlns:a="http://schemas.openxmlformats.org/drawingml/2006/main" xmlns:pic="http://schemas.openxmlformats.org/drawingml/2006/picture">
+            <wp:extent cx="2700000" cy="1924580"/>
+            <wp:docPr id="33" name="Picture 33"/>
+            <wp:cNvGraphicFramePr>
+              <a:graphicFrameLocks noChangeAspect="1"/>
+            </wp:cNvGraphicFramePr>
+            <a:graphic>
+              <a:graphicData uri="http://schemas.openxmlformats.org/drawingml/2006/picture">
+                <pic:pic>
+                  <pic:nvPicPr>
+                    <pic:cNvPr id="0" name="ch04_complementare.png"/>
+                    <pic:cNvPicPr/>
+                  </pic:nvPicPr>
+                  <pic:blipFill>
+                    <a:blip r:embed="rId39"/>
+                    <a:stretch>
+                      <a:fillRect/>
+                    </a:stretch>
+                  </pic:blipFill>
+                  <pic:spPr>
+                    <a:xfrm>
+                      <a:off x="0" y="0"/>
+                      <a:ext cx="2700000" cy="1924580"/>
+                    </a:xfrm>
+                    <a:prstGeom prst="rect"/>
+                  </pic:spPr>
+                </pic:pic>
+              </a:graphicData>
+            </a:graphic>
+          </wp:inline>
+        </w:drawing>
+      </w:r>
+    </w:p>
+    <w:p>
+      <w:pPr>
+        <w:jc w:val="center"/>
+      </w:pPr>
+      <w:r>
+        <w:rPr>
+          <w:i/>
+          <w:sz w:val="18"/>
+        </w:rPr>
+        <w:t>Il complementare di S rispetto all'universo A.</w:t>
+      </w:r>
+    </w:p>
+    <w:p>
+      <w:pPr>
         <w:pStyle w:val="Titolo2"/>
         <w:rPr>
           <w:b/>
@@ -2644,6 +3015,59 @@
     </w:p>
     <w:p>
       <w:pPr>
+        <w:keepNext/>
+        <w:spacing w:before="120"/>
+        <w:jc w:val="center"/>
+      </w:pPr>
+      <w:r>
+        <w:drawing>
+          <wp:inline xmlns:a="http://schemas.openxmlformats.org/drawingml/2006/main" xmlns:pic="http://schemas.openxmlformats.org/drawingml/2006/picture">
+            <wp:extent cx="3960000" cy="3576651"/>
+            <wp:docPr id="32" name="Picture 32"/>
+            <wp:cNvGraphicFramePr>
+              <a:graphicFrameLocks noChangeAspect="1"/>
+            </wp:cNvGraphicFramePr>
+            <a:graphic>
+              <a:graphicData uri="http://schemas.openxmlformats.org/drawingml/2006/picture">
+                <pic:pic>
+                  <pic:nvPicPr>
+                    <pic:cNvPr id="0" name="ch04_de_morgan.png"/>
+                    <pic:cNvPicPr/>
+                  </pic:nvPicPr>
+                  <pic:blipFill>
+                    <a:blip r:embed="rId38"/>
+                    <a:stretch>
+                      <a:fillRect/>
+                    </a:stretch>
+                  </pic:blipFill>
+                  <pic:spPr>
+                    <a:xfrm>
+                      <a:off x="0" y="0"/>
+                      <a:ext cx="3960000" cy="3576651"/>
+                    </a:xfrm>
+                    <a:prstGeom prst="rect"/>
+                  </pic:spPr>
+                </pic:pic>
+              </a:graphicData>
+            </a:graphic>
+          </wp:inline>
+        </w:drawing>
+      </w:r>
+    </w:p>
+    <w:p>
+      <w:pPr>
+        <w:jc w:val="center"/>
+      </w:pPr>
+      <w:r>
+        <w:rPr>
+          <w:i/>
+          <w:sz w:val="18"/>
+        </w:rPr>
+        <w:t>Leggi di De Morgan: in ogni riga le due regioni azzurre coincidono.</w:t>
+      </w:r>
+    </w:p>
+    <w:p>
+      <w:pPr>
         <w:pStyle w:val="Titolo2"/>
         <w:rPr>
           <w:b/>
@@ -3252,6 +3676,59 @@
     </w:p>
     <w:p>
       <w:pPr>
+        <w:keepNext/>
+        <w:spacing w:before="120"/>
+        <w:jc w:val="center"/>
+      </w:pPr>
+      <w:r>
+        <w:drawing>
+          <wp:inline xmlns:a="http://schemas.openxmlformats.org/drawingml/2006/main" xmlns:pic="http://schemas.openxmlformats.org/drawingml/2006/picture">
+            <wp:extent cx="3600000" cy="2689362"/>
+            <wp:docPr id="31" name="Picture 31"/>
+            <wp:cNvGraphicFramePr>
+              <a:graphicFrameLocks noChangeAspect="1"/>
+            </wp:cNvGraphicFramePr>
+            <a:graphic>
+              <a:graphicData uri="http://schemas.openxmlformats.org/drawingml/2006/picture">
+                <pic:pic>
+                  <pic:nvPicPr>
+                    <pic:cNvPr id="0" name="ch04_insieme_parti.png"/>
+                    <pic:cNvPicPr/>
+                  </pic:nvPicPr>
+                  <pic:blipFill>
+                    <a:blip r:embed="rId37"/>
+                    <a:stretch>
+                      <a:fillRect/>
+                    </a:stretch>
+                  </pic:blipFill>
+                  <pic:spPr>
+                    <a:xfrm>
+                      <a:off x="0" y="0"/>
+                      <a:ext cx="3600000" cy="2689362"/>
+                    </a:xfrm>
+                    <a:prstGeom prst="rect"/>
+                  </pic:spPr>
+                </pic:pic>
+              </a:graphicData>
+            </a:graphic>
+          </wp:inline>
+        </w:drawing>
+      </w:r>
+    </w:p>
+    <w:p>
+      <w:pPr>
+        <w:jc w:val="center"/>
+      </w:pPr>
+      <w:r>
+        <w:rPr>
+          <w:i/>
+          <w:sz w:val="18"/>
+        </w:rPr>
+        <w:t>L'insieme delle parti di {a, b, c}: 8 sottoinsiemi ordinati per inclusione.</w:t>
+      </w:r>
+    </w:p>
+    <w:p>
+      <w:pPr>
         <w:pStyle w:val="Titolo2"/>
         <w:rPr>
           <w:b/>
@@ -3822,6 +4299,59 @@
     </w:p>
     <w:p>
       <w:pPr>
+        <w:keepNext/>
+        <w:spacing w:before="120"/>
+        <w:jc w:val="center"/>
+      </w:pPr>
+      <w:r>
+        <w:drawing>
+          <wp:inline xmlns:a="http://schemas.openxmlformats.org/drawingml/2006/main" xmlns:pic="http://schemas.openxmlformats.org/drawingml/2006/picture">
+            <wp:extent cx="4320000" cy="1772197"/>
+            <wp:docPr id="30" name="Picture 30"/>
+            <wp:cNvGraphicFramePr>
+              <a:graphicFrameLocks noChangeAspect="1"/>
+            </wp:cNvGraphicFramePr>
+            <a:graphic>
+              <a:graphicData uri="http://schemas.openxmlformats.org/drawingml/2006/picture">
+                <pic:pic>
+                  <pic:nvPicPr>
+                    <pic:cNvPr id="0" name="ch05_domino.png"/>
+                    <pic:cNvPicPr/>
+                  </pic:nvPicPr>
+                  <pic:blipFill>
+                    <a:blip r:embed="rId36"/>
+                    <a:stretch>
+                      <a:fillRect/>
+                    </a:stretch>
+                  </pic:blipFill>
+                  <pic:spPr>
+                    <a:xfrm>
+                      <a:off x="0" y="0"/>
+                      <a:ext cx="4320000" cy="1772197"/>
+                    </a:xfrm>
+                    <a:prstGeom prst="rect"/>
+                  </pic:spPr>
+                </pic:pic>
+              </a:graphicData>
+            </a:graphic>
+          </wp:inline>
+        </w:drawing>
+      </w:r>
+    </w:p>
+    <w:p>
+      <w:pPr>
+        <w:jc w:val="center"/>
+      </w:pPr>
+      <w:r>
+        <w:rPr>
+          <w:i/>
+          <w:sz w:val="18"/>
+        </w:rPr>
+        <w:t>L'effetto domino: la base fa cadere la prima tessera, il passo induttivo le fa cadere tutte.</w:t>
+      </w:r>
+    </w:p>
+    <w:p>
+      <w:pPr>
         <w:pStyle w:val="Titolo2"/>
         <w:rPr>
           <w:b/>
@@ -4783,6 +5313,59 @@
     </w:p>
     <w:p>
       <w:pPr>
+        <w:keepNext/>
+        <w:spacing w:before="120"/>
+        <w:jc w:val="center"/>
+      </w:pPr>
+      <w:r>
+        <w:drawing>
+          <wp:inline xmlns:a="http://schemas.openxmlformats.org/drawingml/2006/main" xmlns:pic="http://schemas.openxmlformats.org/drawingml/2006/picture">
+            <wp:extent cx="3960000" cy="2025049"/>
+            <wp:docPr id="29" name="Picture 29"/>
+            <wp:cNvGraphicFramePr>
+              <a:graphicFrameLocks noChangeAspect="1"/>
+            </wp:cNvGraphicFramePr>
+            <a:graphic>
+              <a:graphicData uri="http://schemas.openxmlformats.org/drawingml/2006/picture">
+                <pic:pic>
+                  <pic:nvPicPr>
+                    <pic:cNvPr id="0" name="ch06_ricoprimento.png"/>
+                    <pic:cNvPicPr/>
+                  </pic:nvPicPr>
+                  <pic:blipFill>
+                    <a:blip r:embed="rId35"/>
+                    <a:stretch>
+                      <a:fillRect/>
+                    </a:stretch>
+                  </pic:blipFill>
+                  <pic:spPr>
+                    <a:xfrm>
+                      <a:off x="0" y="0"/>
+                      <a:ext cx="3960000" cy="2025049"/>
+                    </a:xfrm>
+                    <a:prstGeom prst="rect"/>
+                  </pic:spPr>
+                </pic:pic>
+              </a:graphicData>
+            </a:graphic>
+          </wp:inline>
+        </w:drawing>
+      </w:r>
+    </w:p>
+    <w:p>
+      <w:pPr>
+        <w:jc w:val="center"/>
+      </w:pPr>
+      <w:r>
+        <w:rPr>
+          <w:i/>
+          <w:sz w:val="18"/>
+        </w:rPr>
+        <w:t>Un ricoprimento di ℕ: A₁ e A₂ si sovrappongono tra 100 e 1000.</w:t>
+      </w:r>
+    </w:p>
+    <w:p>
+      <w:pPr>
         <w:pStyle w:val="Titolo2"/>
         <w:rPr>
           <w:b/>
@@ -5112,6 +5695,59 @@
     </w:p>
     <w:p>
       <w:pPr>
+        <w:keepNext/>
+        <w:spacing w:before="120"/>
+        <w:jc w:val="center"/>
+      </w:pPr>
+      <w:r>
+        <w:drawing>
+          <wp:inline xmlns:a="http://schemas.openxmlformats.org/drawingml/2006/main" xmlns:pic="http://schemas.openxmlformats.org/drawingml/2006/picture">
+            <wp:extent cx="3060000" cy="2502439"/>
+            <wp:docPr id="28" name="Picture 28"/>
+            <wp:cNvGraphicFramePr>
+              <a:graphicFrameLocks noChangeAspect="1"/>
+            </wp:cNvGraphicFramePr>
+            <a:graphic>
+              <a:graphicData uri="http://schemas.openxmlformats.org/drawingml/2006/picture">
+                <pic:pic>
+                  <pic:nvPicPr>
+                    <pic:cNvPr id="0" name="ch06_partizione_pari_dispari.png"/>
+                    <pic:cNvPicPr/>
+                  </pic:nvPicPr>
+                  <pic:blipFill>
+                    <a:blip r:embed="rId34"/>
+                    <a:stretch>
+                      <a:fillRect/>
+                    </a:stretch>
+                  </pic:blipFill>
+                  <pic:spPr>
+                    <a:xfrm>
+                      <a:off x="0" y="0"/>
+                      <a:ext cx="3060000" cy="2502439"/>
+                    </a:xfrm>
+                    <a:prstGeom prst="rect"/>
+                  </pic:spPr>
+                </pic:pic>
+              </a:graphicData>
+            </a:graphic>
+          </wp:inline>
+        </w:drawing>
+      </w:r>
+    </w:p>
+    <w:p>
+      <w:pPr>
+        <w:jc w:val="center"/>
+      </w:pPr>
+      <w:r>
+        <w:rPr>
+          <w:i/>
+          <w:sz w:val="18"/>
+        </w:rPr>
+        <w:t>Una partizione di ℕ: pari e dispari non si sovrappongono e coprono tutto.</w:t>
+      </w:r>
+    </w:p>
+    <w:p>
+      <w:pPr>
         <w:pStyle w:val="Titolo2"/>
         <w:rPr>
           <w:b/>
@@ -5250,6 +5886,59 @@
     </w:p>
     <w:p>
       <w:pPr>
+        <w:keepNext/>
+        <w:spacing w:before="120"/>
+        <w:jc w:val="center"/>
+      </w:pPr>
+      <w:r>
+        <w:drawing>
+          <wp:inline xmlns:a="http://schemas.openxmlformats.org/drawingml/2006/main" xmlns:pic="http://schemas.openxmlformats.org/drawingml/2006/picture">
+            <wp:extent cx="2880000" cy="2425037"/>
+            <wp:docPr id="27" name="Picture 27"/>
+            <wp:cNvGraphicFramePr>
+              <a:graphicFrameLocks noChangeAspect="1"/>
+            </wp:cNvGraphicFramePr>
+            <a:graphic>
+              <a:graphicData uri="http://schemas.openxmlformats.org/drawingml/2006/picture">
+                <pic:pic>
+                  <pic:nvPicPr>
+                    <pic:cNvPr id="0" name="ch06_non_partizione.png"/>
+                    <pic:cNvPicPr/>
+                  </pic:nvPicPr>
+                  <pic:blipFill>
+                    <a:blip r:embed="rId33"/>
+                    <a:stretch>
+                      <a:fillRect/>
+                    </a:stretch>
+                  </pic:blipFill>
+                  <pic:spPr>
+                    <a:xfrm>
+                      <a:off x="0" y="0"/>
+                      <a:ext cx="2880000" cy="2425037"/>
+                    </a:xfrm>
+                    <a:prstGeom prst="rect"/>
+                  </pic:spPr>
+                </pic:pic>
+              </a:graphicData>
+            </a:graphic>
+          </wp:inline>
+        </w:drawing>
+      </w:r>
+    </w:p>
+    <w:p>
+      <w:pPr>
+        <w:jc w:val="center"/>
+      </w:pPr>
+      <w:r>
+        <w:rPr>
+          <w:i/>
+          <w:sz w:val="18"/>
+        </w:rPr>
+        <w:t>Un ricoprimento che non è una partizione: 3 sta in entrambi i blocchi.</w:t>
+      </w:r>
+    </w:p>
+    <w:p>
+      <w:pPr>
         <w:pStyle w:val="Titolo2"/>
         <w:rPr>
           <w:b/>
@@ -5746,6 +6435,59 @@
         <w:t xml:space="preserve"> e pari a due (|Q| = 2), poiché i suoi unici due elementi sono i due oggetti-blocco P e D.</w:t>
       </w:r>
     </w:p>
+    <w:p>
+      <w:pPr>
+        <w:keepNext/>
+        <w:spacing w:before="120"/>
+        <w:jc w:val="center"/>
+      </w:pPr>
+      <w:r>
+        <w:drawing>
+          <wp:inline xmlns:a="http://schemas.openxmlformats.org/drawingml/2006/main" xmlns:pic="http://schemas.openxmlformats.org/drawingml/2006/picture">
+            <wp:extent cx="3960000" cy="2320176"/>
+            <wp:docPr id="26" name="Picture 26"/>
+            <wp:cNvGraphicFramePr>
+              <a:graphicFrameLocks noChangeAspect="1"/>
+            </wp:cNvGraphicFramePr>
+            <a:graphic>
+              <a:graphicData uri="http://schemas.openxmlformats.org/drawingml/2006/picture">
+                <pic:pic>
+                  <pic:nvPicPr>
+                    <pic:cNvPr id="0" name="ch07_insieme_quoziente.png"/>
+                    <pic:cNvPicPr/>
+                  </pic:nvPicPr>
+                  <pic:blipFill>
+                    <a:blip r:embed="rId32"/>
+                    <a:stretch>
+                      <a:fillRect/>
+                    </a:stretch>
+                  </pic:blipFill>
+                  <pic:spPr>
+                    <a:xfrm>
+                      <a:off x="0" y="0"/>
+                      <a:ext cx="3960000" cy="2320176"/>
+                    </a:xfrm>
+                    <a:prstGeom prst="rect"/>
+                  </pic:spPr>
+                </pic:pic>
+              </a:graphicData>
+            </a:graphic>
+          </wp:inline>
+        </w:drawing>
+      </w:r>
+    </w:p>
+    <w:p>
+      <w:pPr>
+        <w:jc w:val="center"/>
+      </w:pPr>
+      <w:r>
+        <w:rPr>
+          <w:i/>
+          <w:sz w:val="18"/>
+        </w:rPr>
+        <w:t>Dalla partizione all'insieme quoziente: ogni blocco diventa un elemento di Q.</w:t>
+      </w:r>
+    </w:p>
     <w:p/>
     <w:p>
       <w:pPr>
@@ -5762,7 +6504,23 @@
           <w:bCs/>
           <w:color w:val="EE0000"/>
         </w:rPr>
-        <w:t>8. Relazioni Binarie, Proprietà Fondamentali e Relazioni di Equivalenza</w:t>
+        <w:t xml:space="preserve">8. Relazioni </w:t>
+      </w:r>
+      <w:r>
+        <w:rPr>
+          <w:b/>
+          <w:bCs/>
+          <w:color w:val="EE0000"/>
+        </w:rPr>
+        <w:t>Binarie</w:t>
+      </w:r>
+      <w:r>
+        <w:rPr>
+          <w:b/>
+          <w:bCs/>
+          <w:color w:val="EE0000"/>
+        </w:rPr>
+        <w:t>, Proprietà Fondamentali e Relazioni di Equivalenza</w:t>
       </w:r>
     </w:p>
     <w:p>
@@ -5927,6 +6685,59 @@
     </w:p>
     <w:p>
       <w:pPr>
+        <w:keepNext/>
+        <w:spacing w:before="120"/>
+        <w:jc w:val="center"/>
+      </w:pPr>
+      <w:r>
+        <w:drawing>
+          <wp:inline xmlns:a="http://schemas.openxmlformats.org/drawingml/2006/main" xmlns:pic="http://schemas.openxmlformats.org/drawingml/2006/picture">
+            <wp:extent cx="3240000" cy="2999125"/>
+            <wp:docPr id="25" name="Picture 25"/>
+            <wp:cNvGraphicFramePr>
+              <a:graphicFrameLocks noChangeAspect="1"/>
+            </wp:cNvGraphicFramePr>
+            <a:graphic>
+              <a:graphicData uri="http://schemas.openxmlformats.org/drawingml/2006/picture">
+                <pic:pic>
+                  <pic:nvPicPr>
+                    <pic:cNvPr id="0" name="ch08_relazione_divisibilita.png"/>
+                    <pic:cNvPicPr/>
+                  </pic:nvPicPr>
+                  <pic:blipFill>
+                    <a:blip r:embed="rId31"/>
+                    <a:stretch>
+                      <a:fillRect/>
+                    </a:stretch>
+                  </pic:blipFill>
+                  <pic:spPr>
+                    <a:xfrm>
+                      <a:off x="0" y="0"/>
+                      <a:ext cx="3240000" cy="2999125"/>
+                    </a:xfrm>
+                    <a:prstGeom prst="rect"/>
+                  </pic:spPr>
+                </pic:pic>
+              </a:graphicData>
+            </a:graphic>
+          </wp:inline>
+        </w:drawing>
+      </w:r>
+    </w:p>
+    <w:p>
+      <w:pPr>
+        <w:jc w:val="center"/>
+      </w:pPr>
+      <w:r>
+        <w:rPr>
+          <w:i/>
+          <w:sz w:val="18"/>
+        </w:rPr>
+        <w:t>La divisibilità su {1, 2, 3, 6} come grafo orientato: una freccia da m a n se m divide n.</w:t>
+      </w:r>
+    </w:p>
+    <w:p>
+      <w:pPr>
         <w:numPr>
           <w:ilvl w:val="0"/>
           <w:numId w:val="37"/>
@@ -6906,6 +7717,59 @@
         <w:t>.</w:t>
       </w:r>
     </w:p>
+    <w:p>
+      <w:pPr>
+        <w:keepNext/>
+        <w:spacing w:before="120"/>
+        <w:jc w:val="center"/>
+      </w:pPr>
+      <w:r>
+        <w:drawing>
+          <wp:inline xmlns:a="http://schemas.openxmlformats.org/drawingml/2006/main" xmlns:pic="http://schemas.openxmlformats.org/drawingml/2006/picture">
+            <wp:extent cx="4140000" cy="1398573"/>
+            <wp:docPr id="24" name="Picture 24"/>
+            <wp:cNvGraphicFramePr>
+              <a:graphicFrameLocks noChangeAspect="1"/>
+            </wp:cNvGraphicFramePr>
+            <a:graphic>
+              <a:graphicData uri="http://schemas.openxmlformats.org/drawingml/2006/picture">
+                <pic:pic>
+                  <pic:nvPicPr>
+                    <pic:cNvPr id="0" name="ch09_classi_equivalenza.png"/>
+                    <pic:cNvPicPr/>
+                  </pic:nvPicPr>
+                  <pic:blipFill>
+                    <a:blip r:embed="rId30"/>
+                    <a:stretch>
+                      <a:fillRect/>
+                    </a:stretch>
+                  </pic:blipFill>
+                  <pic:spPr>
+                    <a:xfrm>
+                      <a:off x="0" y="0"/>
+                      <a:ext cx="4140000" cy="1398573"/>
+                    </a:xfrm>
+                    <a:prstGeom prst="rect"/>
+                  </pic:spPr>
+                </pic:pic>
+              </a:graphicData>
+            </a:graphic>
+          </wp:inline>
+        </w:drawing>
+      </w:r>
+    </w:p>
+    <w:p>
+      <w:pPr>
+        <w:jc w:val="center"/>
+      </w:pPr>
+      <w:r>
+        <w:rPr>
+          <w:i/>
+          <w:sz w:val="18"/>
+        </w:rPr>
+        <w:t>Esempio di classi di equivalenza: disgiunte e con unione uguale all'insieme.</w:t>
+      </w:r>
+    </w:p>
     <w:p/>
     <w:p>
       <w:pPr>
@@ -7607,6 +8471,59 @@
     </w:p>
     <w:p>
       <w:pPr>
+        <w:keepNext/>
+        <w:spacing w:before="120"/>
+        <w:jc w:val="center"/>
+      </w:pPr>
+      <w:r>
+        <w:drawing>
+          <wp:inline xmlns:a="http://schemas.openxmlformats.org/drawingml/2006/main" xmlns:pic="http://schemas.openxmlformats.org/drawingml/2006/picture">
+            <wp:extent cx="4320000" cy="1583634"/>
+            <wp:docPr id="23" name="Picture 23"/>
+            <wp:cNvGraphicFramePr>
+              <a:graphicFrameLocks noChangeAspect="1"/>
+            </wp:cNvGraphicFramePr>
+            <a:graphic>
+              <a:graphicData uri="http://schemas.openxmlformats.org/drawingml/2006/picture">
+                <pic:pic>
+                  <pic:nvPicPr>
+                    <pic:cNvPr id="0" name="ch09_esistenza_unicita.png"/>
+                    <pic:cNvPicPr/>
+                  </pic:nvPicPr>
+                  <pic:blipFill>
+                    <a:blip r:embed="rId29"/>
+                    <a:stretch>
+                      <a:fillRect/>
+                    </a:stretch>
+                  </pic:blipFill>
+                  <pic:spPr>
+                    <a:xfrm>
+                      <a:off x="0" y="0"/>
+                      <a:ext cx="4320000" cy="1583634"/>
+                    </a:xfrm>
+                    <a:prstGeom prst="rect"/>
+                  </pic:spPr>
+                </pic:pic>
+              </a:graphicData>
+            </a:graphic>
+          </wp:inline>
+        </w:drawing>
+      </w:r>
+    </w:p>
+    <w:p>
+      <w:pPr>
+        <w:jc w:val="center"/>
+      </w:pPr>
+      <w:r>
+        <w:rPr>
+          <w:i/>
+          <w:sz w:val="18"/>
+        </w:rPr>
+        <w:t>Esistenza e unicità: la prima è una funzione, le altre due no.</w:t>
+      </w:r>
+    </w:p>
+    <w:p>
+      <w:pPr>
         <w:pStyle w:val="Titolo1"/>
       </w:pPr>
       <w:r>
@@ -7703,6 +8620,59 @@
       </w:r>
     </w:p>
     <w:p>
+      <w:pPr>
+        <w:keepNext/>
+        <w:spacing w:before="120"/>
+        <w:jc w:val="center"/>
+      </w:pPr>
+      <w:r>
+        <w:drawing>
+          <wp:inline xmlns:a="http://schemas.openxmlformats.org/drawingml/2006/main" xmlns:pic="http://schemas.openxmlformats.org/drawingml/2006/picture">
+            <wp:extent cx="2880000" cy="2320734"/>
+            <wp:docPr id="22" name="Picture 22"/>
+            <wp:cNvGraphicFramePr>
+              <a:graphicFrameLocks noChangeAspect="1"/>
+            </wp:cNvGraphicFramePr>
+            <a:graphic>
+              <a:graphicData uri="http://schemas.openxmlformats.org/drawingml/2006/picture">
+                <pic:pic>
+                  <pic:nvPicPr>
+                    <pic:cNvPr id="0" name="ch10_scacchiera.png"/>
+                    <pic:cNvPicPr/>
+                  </pic:nvPicPr>
+                  <pic:blipFill>
+                    <a:blip r:embed="rId28"/>
+                    <a:stretch>
+                      <a:fillRect/>
+                    </a:stretch>
+                  </pic:blipFill>
+                  <pic:spPr>
+                    <a:xfrm>
+                      <a:off x="0" y="0"/>
+                      <a:ext cx="2880000" cy="2320734"/>
+                    </a:xfrm>
+                    <a:prstGeom prst="rect"/>
+                  </pic:spPr>
+                </pic:pic>
+              </a:graphicData>
+            </a:graphic>
+          </wp:inline>
+        </w:drawing>
+      </w:r>
+    </w:p>
+    <w:p>
+      <w:pPr>
+        <w:jc w:val="center"/>
+      </w:pPr>
+      <w:r>
+        <w:rPr>
+          <w:i/>
+          <w:sz w:val="18"/>
+        </w:rPr>
+        <w:t>Il grafico Γ come caselle segnate nella scacchiera A × B: una casella per ogni elemento di A.</w:t>
+      </w:r>
+    </w:p>
+    <w:p>
       <w:r>
         <w:t>Questa descrizione a scacchiera serve a capire la definizione, ma nella pratica non si scrive così: se non c'è una formula che esprima la funzione, il modo più rapido è assegnare direttamente a ogni elemento del dominio il suo valore.</w:t>
       </w:r>
@@ -7722,6 +8692,59 @@
     <w:p>
       <w:r>
         <w:t>Sulla scacchiera la condizione di esistenza e unicità può fallire in due modi: se sopra un elemento di A non c'è nessuna casella segnata manca l'esistenza, se ce ne sono due o più manca l'unicità. Nell'esempio precedente, se avessimo segnato due caselle sopra l'elemento b, il valore di f in b sarebbe ambiguo e Γ non definirebbe una funzione.</w:t>
+      </w:r>
+    </w:p>
+    <w:p>
+      <w:pPr>
+        <w:keepNext/>
+        <w:spacing w:before="120"/>
+        <w:jc w:val="center"/>
+      </w:pPr>
+      <w:r>
+        <w:drawing>
+          <wp:inline xmlns:a="http://schemas.openxmlformats.org/drawingml/2006/main" xmlns:pic="http://schemas.openxmlformats.org/drawingml/2006/picture">
+            <wp:extent cx="4320000" cy="1708277"/>
+            <wp:docPr id="21" name="Picture 21"/>
+            <wp:cNvGraphicFramePr>
+              <a:graphicFrameLocks noChangeAspect="1"/>
+            </wp:cNvGraphicFramePr>
+            <a:graphic>
+              <a:graphicData uri="http://schemas.openxmlformats.org/drawingml/2006/picture">
+                <pic:pic>
+                  <pic:nvPicPr>
+                    <pic:cNvPr id="0" name="ch10_non_funzione.png"/>
+                    <pic:cNvPicPr/>
+                  </pic:nvPicPr>
+                  <pic:blipFill>
+                    <a:blip r:embed="rId27"/>
+                    <a:stretch>
+                      <a:fillRect/>
+                    </a:stretch>
+                  </pic:blipFill>
+                  <pic:spPr>
+                    <a:xfrm>
+                      <a:off x="0" y="0"/>
+                      <a:ext cx="4320000" cy="1708277"/>
+                    </a:xfrm>
+                    <a:prstGeom prst="rect"/>
+                  </pic:spPr>
+                </pic:pic>
+              </a:graphicData>
+            </a:graphic>
+          </wp:inline>
+        </w:drawing>
+      </w:r>
+    </w:p>
+    <w:p>
+      <w:pPr>
+        <w:jc w:val="center"/>
+      </w:pPr>
+      <w:r>
+        <w:rPr>
+          <w:i/>
+          <w:sz w:val="18"/>
+        </w:rPr>
+        <w:t>Due modi in cui Γ non definisce una funzione (caselle in rosso: l'unicità fallisce).</w:t>
       </w:r>
     </w:p>
     <w:p>
@@ -7827,6 +8850,59 @@
       <w:r>
         <w:lastRenderedPageBreak/>
         <w:t>funzione è come a una scatola con un'entrata e un'uscita: dentro entra un elemento del dominio e ne esce uno del codominio.</w:t>
+      </w:r>
+    </w:p>
+    <w:p>
+      <w:pPr>
+        <w:keepNext/>
+        <w:spacing w:before="120"/>
+        <w:jc w:val="center"/>
+      </w:pPr>
+      <w:r>
+        <w:drawing>
+          <wp:inline xmlns:a="http://schemas.openxmlformats.org/drawingml/2006/main" xmlns:pic="http://schemas.openxmlformats.org/drawingml/2006/picture">
+            <wp:extent cx="3060000" cy="2076170"/>
+            <wp:docPr id="20" name="Picture 20"/>
+            <wp:cNvGraphicFramePr>
+              <a:graphicFrameLocks noChangeAspect="1"/>
+            </wp:cNvGraphicFramePr>
+            <a:graphic>
+              <a:graphicData uri="http://schemas.openxmlformats.org/drawingml/2006/picture">
+                <pic:pic>
+                  <pic:nvPicPr>
+                    <pic:cNvPr id="0" name="ch10_frecce.png"/>
+                    <pic:cNvPicPr/>
+                  </pic:nvPicPr>
+                  <pic:blipFill>
+                    <a:blip r:embed="rId26"/>
+                    <a:stretch>
+                      <a:fillRect/>
+                    </a:stretch>
+                  </pic:blipFill>
+                  <pic:spPr>
+                    <a:xfrm>
+                      <a:off x="0" y="0"/>
+                      <a:ext cx="3060000" cy="2076170"/>
+                    </a:xfrm>
+                    <a:prstGeom prst="rect"/>
+                  </pic:spPr>
+                </pic:pic>
+              </a:graphicData>
+            </a:graphic>
+          </wp:inline>
+        </w:drawing>
+      </w:r>
+    </w:p>
+    <w:p>
+      <w:pPr>
+        <w:jc w:val="center"/>
+      </w:pPr>
+      <w:r>
+        <w:rPr>
+          <w:i/>
+          <w:sz w:val="18"/>
+        </w:rPr>
+        <w:t>La stessa funzione con il diagramma a frecce.</w:t>
       </w:r>
     </w:p>
     <w:p>
@@ -7908,6 +8984,59 @@
       </w:r>
     </w:p>
     <w:p>
+      <w:pPr>
+        <w:keepNext/>
+        <w:spacing w:before="120"/>
+        <w:jc w:val="center"/>
+      </w:pPr>
+      <w:r>
+        <w:drawing>
+          <wp:inline xmlns:a="http://schemas.openxmlformats.org/drawingml/2006/main" xmlns:pic="http://schemas.openxmlformats.org/drawingml/2006/picture">
+            <wp:extent cx="3420000" cy="2746304"/>
+            <wp:docPr id="19" name="Picture 19"/>
+            <wp:cNvGraphicFramePr>
+              <a:graphicFrameLocks noChangeAspect="1"/>
+            </wp:cNvGraphicFramePr>
+            <a:graphic>
+              <a:graphicData uri="http://schemas.openxmlformats.org/drawingml/2006/picture">
+                <pic:pic>
+                  <pic:nvPicPr>
+                    <pic:cNvPr id="0" name="ch10_f_uguale_g.png"/>
+                    <pic:cNvPicPr/>
+                  </pic:nvPicPr>
+                  <pic:blipFill>
+                    <a:blip r:embed="rId25"/>
+                    <a:stretch>
+                      <a:fillRect/>
+                    </a:stretch>
+                  </pic:blipFill>
+                  <pic:spPr>
+                    <a:xfrm>
+                      <a:off x="0" y="0"/>
+                      <a:ext cx="3420000" cy="2746304"/>
+                    </a:xfrm>
+                    <a:prstGeom prst="rect"/>
+                  </pic:spPr>
+                </pic:pic>
+              </a:graphicData>
+            </a:graphic>
+          </wp:inline>
+        </w:drawing>
+      </w:r>
+    </w:p>
+    <w:p>
+      <w:pPr>
+        <w:jc w:val="center"/>
+      </w:pPr>
+      <w:r>
+        <w:rPr>
+          <w:i/>
+          <w:sz w:val="18"/>
+        </w:rPr>
+        <w:t>f e g hanno lo stesso grafico su {0, 1, 2} ma sono diverse su ℝ.</w:t>
+      </w:r>
+    </w:p>
+    <w:p>
       <w:r>
         <w:rPr>
           <w:b/>
@@ -8007,6 +9136,59 @@
     </w:p>
     <w:p>
       <w:pPr>
+        <w:keepNext/>
+        <w:spacing w:before="120"/>
+        <w:jc w:val="center"/>
+      </w:pPr>
+      <w:r>
+        <w:drawing>
+          <wp:inline xmlns:a="http://schemas.openxmlformats.org/drawingml/2006/main" xmlns:pic="http://schemas.openxmlformats.org/drawingml/2006/picture">
+            <wp:extent cx="3060000" cy="2178167"/>
+            <wp:docPr id="18" name="Picture 18"/>
+            <wp:cNvGraphicFramePr>
+              <a:graphicFrameLocks noChangeAspect="1"/>
+            </wp:cNvGraphicFramePr>
+            <a:graphic>
+              <a:graphicData uri="http://schemas.openxmlformats.org/drawingml/2006/picture">
+                <pic:pic>
+                  <pic:nvPicPr>
+                    <pic:cNvPr id="0" name="ch11_identita.png"/>
+                    <pic:cNvPicPr/>
+                  </pic:nvPicPr>
+                  <pic:blipFill>
+                    <a:blip r:embed="rId24"/>
+                    <a:stretch>
+                      <a:fillRect/>
+                    </a:stretch>
+                  </pic:blipFill>
+                  <pic:spPr>
+                    <a:xfrm>
+                      <a:off x="0" y="0"/>
+                      <a:ext cx="3060000" cy="2178167"/>
+                    </a:xfrm>
+                    <a:prstGeom prst="rect"/>
+                  </pic:spPr>
+                </pic:pic>
+              </a:graphicData>
+            </a:graphic>
+          </wp:inline>
+        </w:drawing>
+      </w:r>
+    </w:p>
+    <w:p>
+      <w:pPr>
+        <w:jc w:val="center"/>
+      </w:pPr>
+      <w:r>
+        <w:rPr>
+          <w:i/>
+          <w:sz w:val="18"/>
+        </w:rPr>
+        <w:t>La funzione identità: ogni elemento resta dov'è.</w:t>
+      </w:r>
+    </w:p>
+    <w:p>
+      <w:pPr>
         <w:pStyle w:val="Titolo2"/>
       </w:pPr>
       <w:r>
@@ -8047,6 +9229,59 @@
       </w:r>
       <w:r>
         <w:t>(a) = β per ogni a ∈ A: qualunque cosa si inserisca nella scatola, esce sempre β. Per le funzioni numeriche il grafico è una retta orizzontale.</w:t>
+      </w:r>
+    </w:p>
+    <w:p>
+      <w:pPr>
+        <w:keepNext/>
+        <w:spacing w:before="120"/>
+        <w:jc w:val="center"/>
+      </w:pPr>
+      <w:r>
+        <w:drawing>
+          <wp:inline xmlns:a="http://schemas.openxmlformats.org/drawingml/2006/main" xmlns:pic="http://schemas.openxmlformats.org/drawingml/2006/picture">
+            <wp:extent cx="3060000" cy="2365100"/>
+            <wp:docPr id="17" name="Picture 17"/>
+            <wp:cNvGraphicFramePr>
+              <a:graphicFrameLocks noChangeAspect="1"/>
+            </wp:cNvGraphicFramePr>
+            <a:graphic>
+              <a:graphicData uri="http://schemas.openxmlformats.org/drawingml/2006/picture">
+                <pic:pic>
+                  <pic:nvPicPr>
+                    <pic:cNvPr id="0" name="ch11_costante.png"/>
+                    <pic:cNvPicPr/>
+                  </pic:nvPicPr>
+                  <pic:blipFill>
+                    <a:blip r:embed="rId23"/>
+                    <a:stretch>
+                      <a:fillRect/>
+                    </a:stretch>
+                  </pic:blipFill>
+                  <pic:spPr>
+                    <a:xfrm>
+                      <a:off x="0" y="0"/>
+                      <a:ext cx="3060000" cy="2365100"/>
+                    </a:xfrm>
+                    <a:prstGeom prst="rect"/>
+                  </pic:spPr>
+                </pic:pic>
+              </a:graphicData>
+            </a:graphic>
+          </wp:inline>
+        </w:drawing>
+      </w:r>
+    </w:p>
+    <w:p>
+      <w:pPr>
+        <w:jc w:val="center"/>
+      </w:pPr>
+      <w:r>
+        <w:rPr>
+          <w:i/>
+          <w:sz w:val="18"/>
+        </w:rPr>
+        <w:t>Una funzione costante: tutti gli elementi vanno nello stesso punto.</w:t>
       </w:r>
     </w:p>
     <w:p>
@@ -8168,6 +9403,59 @@
     </w:p>
     <w:p>
       <w:pPr>
+        <w:keepNext/>
+        <w:spacing w:before="120"/>
+        <w:jc w:val="center"/>
+      </w:pPr>
+      <w:r>
+        <w:drawing>
+          <wp:inline xmlns:a="http://schemas.openxmlformats.org/drawingml/2006/main" xmlns:pic="http://schemas.openxmlformats.org/drawingml/2006/picture">
+            <wp:extent cx="2880000" cy="2494523"/>
+            <wp:docPr id="16" name="Picture 16"/>
+            <wp:cNvGraphicFramePr>
+              <a:graphicFrameLocks noChangeAspect="1"/>
+            </wp:cNvGraphicFramePr>
+            <a:graphic>
+              <a:graphicData uri="http://schemas.openxmlformats.org/drawingml/2006/picture">
+                <pic:pic>
+                  <pic:nvPicPr>
+                    <pic:cNvPr id="0" name="ch11_proiezioni.png"/>
+                    <pic:cNvPicPr/>
+                  </pic:nvPicPr>
+                  <pic:blipFill>
+                    <a:blip r:embed="rId22"/>
+                    <a:stretch>
+                      <a:fillRect/>
+                    </a:stretch>
+                  </pic:blipFill>
+                  <pic:spPr>
+                    <a:xfrm>
+                      <a:off x="0" y="0"/>
+                      <a:ext cx="2880000" cy="2494523"/>
+                    </a:xfrm>
+                    <a:prstGeom prst="rect"/>
+                  </pic:spPr>
+                </pic:pic>
+              </a:graphicData>
+            </a:graphic>
+          </wp:inline>
+        </w:drawing>
+      </w:r>
+    </w:p>
+    <w:p>
+      <w:pPr>
+        <w:jc w:val="center"/>
+      </w:pPr>
+      <w:r>
+        <w:rPr>
+          <w:i/>
+          <w:sz w:val="18"/>
+        </w:rPr>
+        <w:t>Le proiezioni dal piano sugli assi.</w:t>
+      </w:r>
+    </w:p>
+    <w:p>
+      <w:pPr>
         <w:pStyle w:val="Titolo2"/>
       </w:pPr>
       <w:r>
@@ -8391,6 +9679,59 @@
     <w:p>
       <w:r>
         <w:t>Lo stesso accade graficamente con due funzioni reali i cui grafici coincidono solo su un intervallo [a, b]: sono diverse su ℝ, ma se le restringiamo a S = [a, b] si ottengono due funzioni uguali. Non è detto che succeda: è una possibilità, e vedremo più avanti perché a volte conviene restringere il dominio apposta.</w:t>
+      </w:r>
+    </w:p>
+    <w:p>
+      <w:pPr>
+        <w:keepNext/>
+        <w:spacing w:before="120"/>
+        <w:jc w:val="center"/>
+      </w:pPr>
+      <w:r>
+        <w:drawing>
+          <wp:inline xmlns:a="http://schemas.openxmlformats.org/drawingml/2006/main" xmlns:pic="http://schemas.openxmlformats.org/drawingml/2006/picture">
+            <wp:extent cx="3420000" cy="2486480"/>
+            <wp:docPr id="15" name="Picture 15"/>
+            <wp:cNvGraphicFramePr>
+              <a:graphicFrameLocks noChangeAspect="1"/>
+            </wp:cNvGraphicFramePr>
+            <a:graphic>
+              <a:graphicData uri="http://schemas.openxmlformats.org/drawingml/2006/picture">
+                <pic:pic>
+                  <pic:nvPicPr>
+                    <pic:cNvPr id="0" name="ch11_restrizione.png"/>
+                    <pic:cNvPicPr/>
+                  </pic:nvPicPr>
+                  <pic:blipFill>
+                    <a:blip r:embed="rId21"/>
+                    <a:stretch>
+                      <a:fillRect/>
+                    </a:stretch>
+                  </pic:blipFill>
+                  <pic:spPr>
+                    <a:xfrm>
+                      <a:off x="0" y="0"/>
+                      <a:ext cx="3420000" cy="2486480"/>
+                    </a:xfrm>
+                    <a:prstGeom prst="rect"/>
+                  </pic:spPr>
+                </pic:pic>
+              </a:graphicData>
+            </a:graphic>
+          </wp:inline>
+        </w:drawing>
+      </w:r>
+    </w:p>
+    <w:p>
+      <w:pPr>
+        <w:jc w:val="center"/>
+      </w:pPr>
+      <w:r>
+        <w:rPr>
+          <w:i/>
+          <w:sz w:val="18"/>
+        </w:rPr>
+        <w:t>Funzioni con grafici diversi ma uguali ristrette a [a, b].</w:t>
       </w:r>
     </w:p>
     <w:p>
@@ -8540,6 +9881,59 @@
     </w:p>
     <w:p>
       <w:pPr>
+        <w:keepNext/>
+        <w:spacing w:before="120"/>
+        <w:jc w:val="center"/>
+      </w:pPr>
+      <w:r>
+        <w:drawing>
+          <wp:inline xmlns:a="http://schemas.openxmlformats.org/drawingml/2006/main" xmlns:pic="http://schemas.openxmlformats.org/drawingml/2006/picture">
+            <wp:extent cx="4140000" cy="2092298"/>
+            <wp:docPr id="14" name="Picture 14"/>
+            <wp:cNvGraphicFramePr>
+              <a:graphicFrameLocks noChangeAspect="1"/>
+            </wp:cNvGraphicFramePr>
+            <a:graphic>
+              <a:graphicData uri="http://schemas.openxmlformats.org/drawingml/2006/picture">
+                <pic:pic>
+                  <pic:nvPicPr>
+                    <pic:cNvPr id="0" name="ch12_quoziente_non_ben_definita.png"/>
+                    <pic:cNvPicPr/>
+                  </pic:nvPicPr>
+                  <pic:blipFill>
+                    <a:blip r:embed="rId20"/>
+                    <a:stretch>
+                      <a:fillRect/>
+                    </a:stretch>
+                  </pic:blipFill>
+                  <pic:spPr>
+                    <a:xfrm>
+                      <a:off x="0" y="0"/>
+                      <a:ext cx="4140000" cy="2092298"/>
+                    </a:xfrm>
+                    <a:prstGeom prst="rect"/>
+                  </pic:spPr>
+                </pic:pic>
+              </a:graphicData>
+            </a:graphic>
+          </wp:inline>
+        </w:drawing>
+      </w:r>
+    </w:p>
+    <w:p>
+      <w:pPr>
+        <w:jc w:val="center"/>
+      </w:pPr>
+      <w:r>
+        <w:rPr>
+          <w:i/>
+          <w:sz w:val="18"/>
+        </w:rPr>
+        <w:t>La regola F([x]) = [2x] manda la stessa classe in due classi diverse.</w:t>
+      </w:r>
+    </w:p>
+    <w:p>
+      <w:pPr>
         <w:pStyle w:val="Titolo2"/>
       </w:pPr>
       <w:r>
@@ -8662,6 +10056,59 @@
       </w:r>
       <w:r>
         <w:t xml:space="preserve"> della funzione e indicata anche con Im(f).</w:t>
+      </w:r>
+    </w:p>
+    <w:p>
+      <w:pPr>
+        <w:keepNext/>
+        <w:spacing w:before="120"/>
+        <w:jc w:val="center"/>
+      </w:pPr>
+      <w:r>
+        <w:drawing>
+          <wp:inline xmlns:a="http://schemas.openxmlformats.org/drawingml/2006/main" xmlns:pic="http://schemas.openxmlformats.org/drawingml/2006/picture">
+            <wp:extent cx="4320000" cy="1923077"/>
+            <wp:docPr id="13" name="Picture 13"/>
+            <wp:cNvGraphicFramePr>
+              <a:graphicFrameLocks noChangeAspect="1"/>
+            </wp:cNvGraphicFramePr>
+            <a:graphic>
+              <a:graphicData uri="http://schemas.openxmlformats.org/drawingml/2006/picture">
+                <pic:pic>
+                  <pic:nvPicPr>
+                    <pic:cNvPr id="0" name="ch13_immagine_controimmagine.png"/>
+                    <pic:cNvPicPr/>
+                  </pic:nvPicPr>
+                  <pic:blipFill>
+                    <a:blip r:embed="rId19"/>
+                    <a:stretch>
+                      <a:fillRect/>
+                    </a:stretch>
+                  </pic:blipFill>
+                  <pic:spPr>
+                    <a:xfrm>
+                      <a:off x="0" y="0"/>
+                      <a:ext cx="4320000" cy="1923077"/>
+                    </a:xfrm>
+                    <a:prstGeom prst="rect"/>
+                  </pic:spPr>
+                </pic:pic>
+              </a:graphicData>
+            </a:graphic>
+          </wp:inline>
+        </w:drawing>
+      </w:r>
+    </w:p>
+    <w:p>
+      <w:pPr>
+        <w:jc w:val="center"/>
+      </w:pPr>
+      <w:r>
+        <w:rPr>
+          <w:i/>
+          <w:sz w:val="18"/>
+        </w:rPr>
+        <w:t>A sinistra l'immagine di un sottoinsieme S, a destra la controimmagine di T.</w:t>
       </w:r>
     </w:p>
     <w:p>
@@ -8932,6 +10379,59 @@
     </w:p>
     <w:p>
       <w:pPr>
+        <w:keepNext/>
+        <w:spacing w:before="120"/>
+        <w:jc w:val="center"/>
+      </w:pPr>
+      <w:r>
+        <w:drawing>
+          <wp:inline xmlns:a="http://schemas.openxmlformats.org/drawingml/2006/main" xmlns:pic="http://schemas.openxmlformats.org/drawingml/2006/picture">
+            <wp:extent cx="3240000" cy="2750012"/>
+            <wp:docPr id="12" name="Picture 12"/>
+            <wp:cNvGraphicFramePr>
+              <a:graphicFrameLocks noChangeAspect="1"/>
+            </wp:cNvGraphicFramePr>
+            <a:graphic>
+              <a:graphicData uri="http://schemas.openxmlformats.org/drawingml/2006/picture">
+                <pic:pic>
+                  <pic:nvPicPr>
+                    <pic:cNvPr id="0" name="ch13_parabola.png"/>
+                    <pic:cNvPicPr/>
+                  </pic:nvPicPr>
+                  <pic:blipFill>
+                    <a:blip r:embed="rId18"/>
+                    <a:stretch>
+                      <a:fillRect/>
+                    </a:stretch>
+                  </pic:blipFill>
+                  <pic:spPr>
+                    <a:xfrm>
+                      <a:off x="0" y="0"/>
+                      <a:ext cx="3240000" cy="2750012"/>
+                    </a:xfrm>
+                    <a:prstGeom prst="rect"/>
+                  </pic:spPr>
+                </pic:pic>
+              </a:graphicData>
+            </a:graphic>
+          </wp:inline>
+        </w:drawing>
+      </w:r>
+    </w:p>
+    <w:p>
+      <w:pPr>
+        <w:jc w:val="center"/>
+      </w:pPr>
+      <w:r>
+        <w:rPr>
+          <w:i/>
+          <w:sz w:val="18"/>
+        </w:rPr>
+        <w:t>La controimmagine di T = [0, 4] tramite x² è [−2, 2].</w:t>
+      </w:r>
+    </w:p>
+    <w:p>
+      <w:pPr>
         <w:pStyle w:val="Titolo2"/>
       </w:pPr>
       <w:r>
@@ -9127,6 +10627,59 @@
     </w:p>
     <w:p>
       <w:pPr>
+        <w:keepNext/>
+        <w:spacing w:before="120"/>
+        <w:jc w:val="center"/>
+      </w:pPr>
+      <w:r>
+        <w:drawing>
+          <wp:inline xmlns:a="http://schemas.openxmlformats.org/drawingml/2006/main" xmlns:pic="http://schemas.openxmlformats.org/drawingml/2006/picture">
+            <wp:extent cx="4320000" cy="1620333"/>
+            <wp:docPr id="11" name="Picture 11"/>
+            <wp:cNvGraphicFramePr>
+              <a:graphicFrameLocks noChangeAspect="1"/>
+            </wp:cNvGraphicFramePr>
+            <a:graphic>
+              <a:graphicData uri="http://schemas.openxmlformats.org/drawingml/2006/picture">
+                <pic:pic>
+                  <pic:nvPicPr>
+                    <pic:cNvPr id="0" name="ch14_tre_funzioni.png"/>
+                    <pic:cNvPicPr/>
+                  </pic:nvPicPr>
+                  <pic:blipFill>
+                    <a:blip r:embed="rId17"/>
+                    <a:stretch>
+                      <a:fillRect/>
+                    </a:stretch>
+                  </pic:blipFill>
+                  <pic:spPr>
+                    <a:xfrm>
+                      <a:off x="0" y="0"/>
+                      <a:ext cx="4320000" cy="1620333"/>
+                    </a:xfrm>
+                    <a:prstGeom prst="rect"/>
+                  </pic:spPr>
+                </pic:pic>
+              </a:graphicData>
+            </a:graphic>
+          </wp:inline>
+        </w:drawing>
+      </w:r>
+    </w:p>
+    <w:p>
+      <w:pPr>
+        <w:jc w:val="center"/>
+      </w:pPr>
+      <w:r>
+        <w:rPr>
+          <w:i/>
+          <w:sz w:val="18"/>
+        </w:rPr>
+        <w:t>Le tre situazioni: iniettiva, suriettiva, biettiva.</w:t>
+      </w:r>
+    </w:p>
+    <w:p>
+      <w:pPr>
         <w:pStyle w:val="Titolo2"/>
       </w:pPr>
       <w:r>
@@ -9174,6 +10727,59 @@
       </w:r>
     </w:p>
     <w:p>
+      <w:pPr>
+        <w:keepNext/>
+        <w:spacing w:before="120"/>
+        <w:jc w:val="center"/>
+      </w:pPr>
+      <w:r>
+        <w:drawing>
+          <wp:inline xmlns:a="http://schemas.openxmlformats.org/drawingml/2006/main" xmlns:pic="http://schemas.openxmlformats.org/drawingml/2006/picture">
+            <wp:extent cx="3240000" cy="2647783"/>
+            <wp:docPr id="10" name="Picture 10"/>
+            <wp:cNvGraphicFramePr>
+              <a:graphicFrameLocks noChangeAspect="1"/>
+            </wp:cNvGraphicFramePr>
+            <a:graphic>
+              <a:graphicData uri="http://schemas.openxmlformats.org/drawingml/2006/picture">
+                <pic:pic>
+                  <pic:nvPicPr>
+                    <pic:cNvPr id="0" name="ch14_x2_iniettiva_suriettiva.png"/>
+                    <pic:cNvPicPr/>
+                  </pic:nvPicPr>
+                  <pic:blipFill>
+                    <a:blip r:embed="rId16"/>
+                    <a:stretch>
+                      <a:fillRect/>
+                    </a:stretch>
+                  </pic:blipFill>
+                  <pic:spPr>
+                    <a:xfrm>
+                      <a:off x="0" y="0"/>
+                      <a:ext cx="3240000" cy="2647783"/>
+                    </a:xfrm>
+                    <a:prstGeom prst="rect"/>
+                  </pic:spPr>
+                </pic:pic>
+              </a:graphicData>
+            </a:graphic>
+          </wp:inline>
+        </w:drawing>
+      </w:r>
+    </w:p>
+    <w:p>
+      <w:pPr>
+        <w:jc w:val="center"/>
+      </w:pPr>
+      <w:r>
+        <w:rPr>
+          <w:i/>
+          <w:sz w:val="18"/>
+        </w:rPr>
+        <w:t>Con f(x) = x² su ℝ: nessuna intersezione per y = −4, due per y = 1.</w:t>
+      </w:r>
+    </w:p>
+    <w:p>
       <w:r>
         <w:t xml:space="preserve">Se cambiamo il codominio e consideriamo g : ℝ → [0, +∞), g(x) = x², la funzione </w:t>
       </w:r>
@@ -9305,6 +10911,59 @@
       </w:r>
     </w:p>
     <w:p>
+      <w:pPr>
+        <w:keepNext/>
+        <w:spacing w:before="120"/>
+        <w:jc w:val="center"/>
+      </w:pPr>
+      <w:r>
+        <w:drawing>
+          <wp:inline xmlns:a="http://schemas.openxmlformats.org/drawingml/2006/main" xmlns:pic="http://schemas.openxmlformats.org/drawingml/2006/picture">
+            <wp:extent cx="4140000" cy="2328492"/>
+            <wp:docPr id="9" name="Picture 9"/>
+            <wp:cNvGraphicFramePr>
+              <a:graphicFrameLocks noChangeAspect="1"/>
+            </wp:cNvGraphicFramePr>
+            <a:graphic>
+              <a:graphicData uri="http://schemas.openxmlformats.org/drawingml/2006/picture">
+                <pic:pic>
+                  <pic:nvPicPr>
+                    <pic:cNvPr id="0" name="ch15_composizione.png"/>
+                    <pic:cNvPicPr/>
+                  </pic:nvPicPr>
+                  <pic:blipFill>
+                    <a:blip r:embed="rId15"/>
+                    <a:stretch>
+                      <a:fillRect/>
+                    </a:stretch>
+                  </pic:blipFill>
+                  <pic:spPr>
+                    <a:xfrm>
+                      <a:off x="0" y="0"/>
+                      <a:ext cx="4140000" cy="2328492"/>
+                    </a:xfrm>
+                    <a:prstGeom prst="rect"/>
+                  </pic:spPr>
+                </pic:pic>
+              </a:graphicData>
+            </a:graphic>
+          </wp:inline>
+        </w:drawing>
+      </w:r>
+    </w:p>
+    <w:p>
+      <w:pPr>
+        <w:jc w:val="center"/>
+      </w:pPr>
+      <w:r>
+        <w:rPr>
+          <w:i/>
+          <w:sz w:val="18"/>
+        </w:rPr>
+        <w:t>La composizione: si applica prima f e poi g.</w:t>
+      </w:r>
+    </w:p>
+    <w:p>
       <w:r>
         <w:t>Proprietà:</w:t>
       </w:r>
@@ -9477,6 +11136,59 @@
       </w:r>
     </w:p>
     <w:p>
+      <w:pPr>
+        <w:keepNext/>
+        <w:spacing w:before="120"/>
+        <w:jc w:val="center"/>
+      </w:pPr>
+      <w:r>
+        <w:drawing>
+          <wp:inline xmlns:a="http://schemas.openxmlformats.org/drawingml/2006/main" xmlns:pic="http://schemas.openxmlformats.org/drawingml/2006/picture">
+            <wp:extent cx="3240000" cy="2198571"/>
+            <wp:docPr id="8" name="Picture 8"/>
+            <wp:cNvGraphicFramePr>
+              <a:graphicFrameLocks noChangeAspect="1"/>
+            </wp:cNvGraphicFramePr>
+            <a:graphic>
+              <a:graphicData uri="http://schemas.openxmlformats.org/drawingml/2006/picture">
+                <pic:pic>
+                  <pic:nvPicPr>
+                    <pic:cNvPr id="0" name="ch15_inversa.png"/>
+                    <pic:cNvPicPr/>
+                  </pic:nvPicPr>
+                  <pic:blipFill>
+                    <a:blip r:embed="rId14"/>
+                    <a:stretch>
+                      <a:fillRect/>
+                    </a:stretch>
+                  </pic:blipFill>
+                  <pic:spPr>
+                    <a:xfrm>
+                      <a:off x="0" y="0"/>
+                      <a:ext cx="3240000" cy="2198571"/>
+                    </a:xfrm>
+                    <a:prstGeom prst="rect"/>
+                  </pic:spPr>
+                </pic:pic>
+              </a:graphicData>
+            </a:graphic>
+          </wp:inline>
+        </w:drawing>
+      </w:r>
+    </w:p>
+    <w:p>
+      <w:pPr>
+        <w:jc w:val="center"/>
+      </w:pPr>
+      <w:r>
+        <w:rPr>
+          <w:i/>
+          <w:sz w:val="18"/>
+        </w:rPr>
+        <w:t>Una funzione biettiva e la sua inversa: le frecce si invertono.</w:t>
+      </w:r>
+    </w:p>
+    <w:p>
       <w:r>
         <w:t>Non va confusa la funzione inversa f</w:t>
       </w:r>
@@ -9661,6 +11373,59 @@
       </w:r>
     </w:p>
     <w:p>
+      <w:pPr>
+        <w:keepNext/>
+        <w:spacing w:before="120"/>
+        <w:jc w:val="center"/>
+      </w:pPr>
+      <w:r>
+        <w:drawing>
+          <wp:inline xmlns:a="http://schemas.openxmlformats.org/drawingml/2006/main" xmlns:pic="http://schemas.openxmlformats.org/drawingml/2006/picture">
+            <wp:extent cx="2880000" cy="2302384"/>
+            <wp:docPr id="7" name="Picture 7"/>
+            <wp:cNvGraphicFramePr>
+              <a:graphicFrameLocks noChangeAspect="1"/>
+            </wp:cNvGraphicFramePr>
+            <a:graphic>
+              <a:graphicData uri="http://schemas.openxmlformats.org/drawingml/2006/picture">
+                <pic:pic>
+                  <pic:nvPicPr>
+                    <pic:cNvPr id="0" name="ch16_proiezione_non_iniettiva.png"/>
+                    <pic:cNvPicPr/>
+                  </pic:nvPicPr>
+                  <pic:blipFill>
+                    <a:blip r:embed="rId13"/>
+                    <a:stretch>
+                      <a:fillRect/>
+                    </a:stretch>
+                  </pic:blipFill>
+                  <pic:spPr>
+                    <a:xfrm>
+                      <a:off x="0" y="0"/>
+                      <a:ext cx="2880000" cy="2302384"/>
+                    </a:xfrm>
+                    <a:prstGeom prst="rect"/>
+                  </pic:spPr>
+                </pic:pic>
+              </a:graphicData>
+            </a:graphic>
+          </wp:inline>
+        </w:drawing>
+      </w:r>
+    </w:p>
+    <w:p>
+      <w:pPr>
+        <w:jc w:val="center"/>
+      </w:pPr>
+      <w:r>
+        <w:rPr>
+          <w:i/>
+          <w:sz w:val="18"/>
+        </w:rPr>
+        <w:t>La proiezione non è iniettiva: (a, b) e (a, b′) hanno la stessa immagine.</w:t>
+      </w:r>
+    </w:p>
+    <w:p>
       <w:r>
         <w:rPr>
           <w:b/>
@@ -9744,6 +11509,59 @@
     </w:p>
     <w:p>
       <w:pPr>
+        <w:keepNext/>
+        <w:spacing w:before="120"/>
+        <w:jc w:val="center"/>
+      </w:pPr>
+      <w:r>
+        <w:drawing>
+          <wp:inline xmlns:a="http://schemas.openxmlformats.org/drawingml/2006/main" xmlns:pic="http://schemas.openxmlformats.org/drawingml/2006/picture">
+            <wp:extent cx="3060000" cy="2500024"/>
+            <wp:docPr id="6" name="Picture 6"/>
+            <wp:cNvGraphicFramePr>
+              <a:graphicFrameLocks noChangeAspect="1"/>
+            </wp:cNvGraphicFramePr>
+            <a:graphic>
+              <a:graphicData uri="http://schemas.openxmlformats.org/drawingml/2006/picture">
+                <pic:pic>
+                  <pic:nvPicPr>
+                    <pic:cNvPr id="0" name="ch16_retta_affine.png"/>
+                    <pic:cNvPicPr/>
+                  </pic:nvPicPr>
+                  <pic:blipFill>
+                    <a:blip r:embed="rId12"/>
+                    <a:stretch>
+                      <a:fillRect/>
+                    </a:stretch>
+                  </pic:blipFill>
+                  <pic:spPr>
+                    <a:xfrm>
+                      <a:off x="0" y="0"/>
+                      <a:ext cx="3060000" cy="2500024"/>
+                    </a:xfrm>
+                    <a:prstGeom prst="rect"/>
+                  </pic:spPr>
+                </pic:pic>
+              </a:graphicData>
+            </a:graphic>
+          </wp:inline>
+        </w:drawing>
+      </w:r>
+    </w:p>
+    <w:p>
+      <w:pPr>
+        <w:jc w:val="center"/>
+      </w:pPr>
+      <w:r>
+        <w:rPr>
+          <w:i/>
+          <w:sz w:val="18"/>
+        </w:rPr>
+        <w:t>La retta y = 2x − 1: ogni retta orizzontale la taglia una volta.</w:t>
+      </w:r>
+    </w:p>
+    <w:p>
+      <w:pPr>
         <w:pStyle w:val="Titolo2"/>
       </w:pPr>
       <w:r>
@@ -9780,6 +11598,59 @@
       </w:r>
       <w:r>
         <w:t>: i numeri pari non compaiono mai nell'immagine, e la funzione non è suriettiva. (Precisazione: per a = ±1 la divisione per a non porta fuori dagli interi e la funzione resta biettiva.)</w:t>
+      </w:r>
+    </w:p>
+    <w:p>
+      <w:pPr>
+        <w:keepNext/>
+        <w:spacing w:before="120"/>
+        <w:jc w:val="center"/>
+      </w:pPr>
+      <w:r>
+        <w:drawing>
+          <wp:inline xmlns:a="http://schemas.openxmlformats.org/drawingml/2006/main" xmlns:pic="http://schemas.openxmlformats.org/drawingml/2006/picture">
+            <wp:extent cx="3420000" cy="1960446"/>
+            <wp:docPr id="5" name="Picture 5"/>
+            <wp:cNvGraphicFramePr>
+              <a:graphicFrameLocks noChangeAspect="1"/>
+            </wp:cNvGraphicFramePr>
+            <a:graphic>
+              <a:graphicData uri="http://schemas.openxmlformats.org/drawingml/2006/picture">
+                <pic:pic>
+                  <pic:nvPicPr>
+                    <pic:cNvPr id="0" name="ch16_2n_piu_1.png"/>
+                    <pic:cNvPicPr/>
+                  </pic:nvPicPr>
+                  <pic:blipFill>
+                    <a:blip r:embed="rId11"/>
+                    <a:stretch>
+                      <a:fillRect/>
+                    </a:stretch>
+                  </pic:blipFill>
+                  <pic:spPr>
+                    <a:xfrm>
+                      <a:off x="0" y="0"/>
+                      <a:ext cx="3420000" cy="1960446"/>
+                    </a:xfrm>
+                    <a:prstGeom prst="rect"/>
+                  </pic:spPr>
+                </pic:pic>
+              </a:graphicData>
+            </a:graphic>
+          </wp:inline>
+        </w:drawing>
+      </w:r>
+    </w:p>
+    <w:p>
+      <w:pPr>
+        <w:jc w:val="center"/>
+      </w:pPr>
+      <w:r>
+        <w:rPr>
+          <w:i/>
+          <w:sz w:val="18"/>
+        </w:rPr>
+        <w:t>f(n) = 2n + 1 su ℤ: i numeri pari non vengono mai raggiunti.</w:t>
       </w:r>
     </w:p>
     <w:p>
@@ -9969,6 +11840,59 @@
       </w:r>
       <w:r>
         <w:t>.</w:t>
+      </w:r>
+    </w:p>
+    <w:p>
+      <w:pPr>
+        <w:keepNext/>
+        <w:spacing w:before="120"/>
+        <w:jc w:val="center"/>
+      </w:pPr>
+      <w:r>
+        <w:drawing>
+          <wp:inline xmlns:a="http://schemas.openxmlformats.org/drawingml/2006/main" xmlns:pic="http://schemas.openxmlformats.org/drawingml/2006/picture">
+            <wp:extent cx="4140000" cy="2154421"/>
+            <wp:docPr id="4" name="Picture 4"/>
+            <wp:cNvGraphicFramePr>
+              <a:graphicFrameLocks noChangeAspect="1"/>
+            </wp:cNvGraphicFramePr>
+            <a:graphic>
+              <a:graphicData uri="http://schemas.openxmlformats.org/drawingml/2006/picture">
+                <pic:pic>
+                  <pic:nvPicPr>
+                    <pic:cNvPr id="0" name="ch17_x2_restrizione.png"/>
+                    <pic:cNvPicPr/>
+                  </pic:nvPicPr>
+                  <pic:blipFill>
+                    <a:blip r:embed="rId10"/>
+                    <a:stretch>
+                      <a:fillRect/>
+                    </a:stretch>
+                  </pic:blipFill>
+                  <pic:spPr>
+                    <a:xfrm>
+                      <a:off x="0" y="0"/>
+                      <a:ext cx="4140000" cy="2154421"/>
+                    </a:xfrm>
+                    <a:prstGeom prst="rect"/>
+                  </pic:spPr>
+                </pic:pic>
+              </a:graphicData>
+            </a:graphic>
+          </wp:inline>
+        </w:drawing>
+      </w:r>
+    </w:p>
+    <w:p>
+      <w:pPr>
+        <w:jc w:val="center"/>
+      </w:pPr>
+      <w:r>
+        <w:rPr>
+          <w:i/>
+          <w:sz w:val="18"/>
+        </w:rPr>
+        <w:t>Cambiando codominio e dominio si passa da suriettiva a biettiva.</w:t>
       </w:r>
     </w:p>
     <w:p>
@@ -10031,6 +11955,59 @@
       </w:r>
     </w:p>
     <w:p>
+      <w:pPr>
+        <w:keepNext/>
+        <w:spacing w:before="120"/>
+        <w:jc w:val="center"/>
+      </w:pPr>
+      <w:r>
+        <w:drawing>
+          <wp:inline xmlns:a="http://schemas.openxmlformats.org/drawingml/2006/main" xmlns:pic="http://schemas.openxmlformats.org/drawingml/2006/picture">
+            <wp:extent cx="3600000" cy="2257173"/>
+            <wp:docPr id="3" name="Picture 3"/>
+            <wp:cNvGraphicFramePr>
+              <a:graphicFrameLocks noChangeAspect="1"/>
+            </wp:cNvGraphicFramePr>
+            <a:graphic>
+              <a:graphicData uri="http://schemas.openxmlformats.org/drawingml/2006/picture">
+                <pic:pic>
+                  <pic:nvPicPr>
+                    <pic:cNvPr id="0" name="ch17_seno.png"/>
+                    <pic:cNvPicPr/>
+                  </pic:nvPicPr>
+                  <pic:blipFill>
+                    <a:blip r:embed="rId9"/>
+                    <a:stretch>
+                      <a:fillRect/>
+                    </a:stretch>
+                  </pic:blipFill>
+                  <pic:spPr>
+                    <a:xfrm>
+                      <a:off x="0" y="0"/>
+                      <a:ext cx="3600000" cy="2257173"/>
+                    </a:xfrm>
+                    <a:prstGeom prst="rect"/>
+                  </pic:spPr>
+                </pic:pic>
+              </a:graphicData>
+            </a:graphic>
+          </wp:inline>
+        </w:drawing>
+      </w:r>
+    </w:p>
+    <w:p>
+      <w:pPr>
+        <w:jc w:val="center"/>
+      </w:pPr>
+      <w:r>
+        <w:rPr>
+          <w:i/>
+          <w:sz w:val="18"/>
+        </w:rPr>
+        <w:t>La funzione seno ristretta a [−π/2, π/2] con codominio [−1, 1].</w:t>
+      </w:r>
+    </w:p>
+    <w:p>
       <w:r>
         <w:t>Un discorso analogo si fa per il coseno (che ha lo stesso grafico traslato) e per la tangente. Nella tangente, che ha asintoti, non si prende un intervallo chiuso ma l'intervallo aperto (−π/2, π/2) come dominio e tutta la retta come codominio: la funzione risulta biettiva.</w:t>
       </w:r>
@@ -10322,6 +12299,59 @@
       </w:r>
     </w:p>
     <w:p>
+      <w:pPr>
+        <w:keepNext/>
+        <w:spacing w:before="120"/>
+        <w:jc w:val="center"/>
+      </w:pPr>
+      <w:r>
+        <w:drawing>
+          <wp:inline xmlns:a="http://schemas.openxmlformats.org/drawingml/2006/main" xmlns:pic="http://schemas.openxmlformats.org/drawingml/2006/picture">
+            <wp:extent cx="3240000" cy="2342036"/>
+            <wp:docPr id="2" name="Picture 2"/>
+            <wp:cNvGraphicFramePr>
+              <a:graphicFrameLocks noChangeAspect="1"/>
+            </wp:cNvGraphicFramePr>
+            <a:graphic>
+              <a:graphicData uri="http://schemas.openxmlformats.org/drawingml/2006/picture">
+                <pic:pic>
+                  <pic:nvPicPr>
+                    <pic:cNvPr id="0" name="ch18_non_commutativa.png"/>
+                    <pic:cNvPicPr/>
+                  </pic:nvPicPr>
+                  <pic:blipFill>
+                    <a:blip r:embed="rId8"/>
+                    <a:stretch>
+                      <a:fillRect/>
+                    </a:stretch>
+                  </pic:blipFill>
+                  <pic:spPr>
+                    <a:xfrm>
+                      <a:off x="0" y="0"/>
+                      <a:ext cx="3240000" cy="2342036"/>
+                    </a:xfrm>
+                    <a:prstGeom prst="rect"/>
+                  </pic:spPr>
+                </pic:pic>
+              </a:graphicData>
+            </a:graphic>
+          </wp:inline>
+        </w:drawing>
+      </w:r>
+    </w:p>
+    <w:p>
+      <w:pPr>
+        <w:jc w:val="center"/>
+      </w:pPr>
+      <w:r>
+        <w:rPr>
+          <w:i/>
+          <w:sz w:val="18"/>
+        </w:rPr>
+        <w:t>Le due composizioni sono funzioni diverse.</w:t>
+      </w:r>
+    </w:p>
+    <w:p>
       <w:r>
         <w:t>Questo è forse il primo esempio di operazione non commutativa che si incontra: il vecchio detto "l'ordine dei fattori non cambia il prodotto" vale per i numeri, ma non per oggetti di natura diversa come le funzioni. Nel corso di Algebra e Geometria compariranno altri oggetti che si possono moltiplicare ma con un'operazione non commutativa.</w:t>
       </w:r>
@@ -10693,6 +12723,59 @@
     <w:p>
       <w:r>
         <w:t>Non si può dire di più: con f : {0} → {0, 1}, f(0) = 0 e g : {0, 1} → {0} costante, g ∘ f è biettiva ma g non è iniettiva e f non è suriettiva.</w:t>
+      </w:r>
+    </w:p>
+    <w:p>
+      <w:pPr>
+        <w:keepNext/>
+        <w:spacing w:before="120"/>
+        <w:jc w:val="center"/>
+      </w:pPr>
+      <w:r>
+        <w:drawing>
+          <wp:inline xmlns:a="http://schemas.openxmlformats.org/drawingml/2006/main" xmlns:pic="http://schemas.openxmlformats.org/drawingml/2006/picture">
+            <wp:extent cx="3960000" cy="1922845"/>
+            <wp:docPr id="1" name="Picture 1"/>
+            <wp:cNvGraphicFramePr>
+              <a:graphicFrameLocks noChangeAspect="1"/>
+            </wp:cNvGraphicFramePr>
+            <a:graphic>
+              <a:graphicData uri="http://schemas.openxmlformats.org/drawingml/2006/picture">
+                <pic:pic>
+                  <pic:nvPicPr>
+                    <pic:cNvPr id="0" name="ch19_controesempio.png"/>
+                    <pic:cNvPicPr/>
+                  </pic:nvPicPr>
+                  <pic:blipFill>
+                    <a:blip r:embed="rId7"/>
+                    <a:stretch>
+                      <a:fillRect/>
+                    </a:stretch>
+                  </pic:blipFill>
+                  <pic:spPr>
+                    <a:xfrm>
+                      <a:off x="0" y="0"/>
+                      <a:ext cx="3960000" cy="1922845"/>
+                    </a:xfrm>
+                    <a:prstGeom prst="rect"/>
+                  </pic:spPr>
+                </pic:pic>
+              </a:graphicData>
+            </a:graphic>
+          </wp:inline>
+        </w:drawing>
+      </w:r>
+    </w:p>
+    <w:p>
+      <w:pPr>
+        <w:jc w:val="center"/>
+      </w:pPr>
+      <w:r>
+        <w:rPr>
+          <w:i/>
+          <w:sz w:val="18"/>
+        </w:rPr>
+        <w:t>Il controesempio: g ∘ f biettiva senza che f sia suriettiva né g iniettiva.</w:t>
       </w:r>
     </w:p>
     <w:p>

</xml_diff>

<commit_message>
Mate cap. 7: figura generale dell'insieme quoziente
Co-Authored-By: Claude Sonnet 5.5 <noreply@anthropic.com>
</commit_message>
<xml_diff>
--- a/Riassunto Matematica discreta.docx
+++ b/Riassunto Matematica discreta.docx
@@ -4491,7 +4491,15 @@
         <w:jc w:val="center"/>
       </w:pPr>
       <w:r>
-        <w:t>P(n):   1</w:t>
+        <w:t>P(n</w:t>
+      </w:r>
+      <w:proofErr w:type="gramStart"/>
+      <w:r>
+        <w:t xml:space="preserve">):   </w:t>
+      </w:r>
+      <w:proofErr w:type="gramEnd"/>
+      <w:r>
+        <w:t>1</w:t>
       </w:r>
       <w:r>
         <w:rPr>
@@ -4527,7 +4535,23 @@
         <w:t>2</w:t>
       </w:r>
       <w:r>
-        <w:t xml:space="preserve"> = (1/6)n(n+1)(2n+1)   ∀ n ≥ 1</w:t>
+        <w:t xml:space="preserve"> = (1/</w:t>
+      </w:r>
+      <w:proofErr w:type="gramStart"/>
+      <w:r>
+        <w:t>6)n</w:t>
+      </w:r>
+      <w:proofErr w:type="gramEnd"/>
+      <w:r>
+        <w:t>(n+</w:t>
+      </w:r>
+      <w:proofErr w:type="gramStart"/>
+      <w:r>
+        <w:t>1)(</w:t>
+      </w:r>
+      <w:proofErr w:type="gramEnd"/>
+      <w:r>
+        <w:t>2n+1)   ∀ n ≥ 1</w:t>
       </w:r>
     </w:p>
     <w:p>
@@ -4554,7 +4578,13 @@
         <w:t>2</w:t>
       </w:r>
       <w:r>
-        <w:t xml:space="preserve"> = 1. A destra sostituiamo n=1: 1/6 · 1 · (1+1) · (2· 1 + 1) = 1/6 · 1 · 2 · 3 = 1. La base è verificata.</w:t>
+        <w:t xml:space="preserve"> = 1. A destra sostituiamo n=1: 1/6 · 1 · (1+1) · (2· 1 + 1) = 1/6 · 1 · 2 · 3 = 1. </w:t>
+      </w:r>
+      <w:r>
+        <w:rPr>
+          <w:highlight w:val="yellow"/>
+        </w:rPr>
+        <w:t>La base è verificata.</w:t>
       </w:r>
     </w:p>
     <w:p>
@@ -6299,7 +6329,16 @@
     </w:p>
     <w:p>
       <w:r>
-        <w:t xml:space="preserve">Una volta suddiviso un insieme S mediante una partizione 𝒫, la teoria degli insiemi permette di effettuare un importante salto di astrazione: considerare i singoli blocchi non più come insiemi di elementi, ma come </w:t>
+        <w:t xml:space="preserve">Una volta suddiviso un insieme S mediante una partizione </w:t>
+      </w:r>
+      <w:r>
+        <w:rPr>
+          <w:rFonts w:ascii="Cambria Math" w:hAnsi="Cambria Math" w:cs="Cambria Math"/>
+        </w:rPr>
+        <w:t>𝒫</w:t>
+      </w:r>
+      <w:r>
+        <w:t xml:space="preserve">, la teoria degli insiemi permette di effettuare un importante salto di astrazione: considerare i singoli blocchi non più come insiemi di elementi, ma come </w:t>
       </w:r>
       <w:r>
         <w:rPr>
@@ -6359,7 +6398,18 @@
         <w:rPr>
           <w:highlight w:val="yellow"/>
         </w:rPr>
-        <w:t xml:space="preserve"> (denotato</w:t>
+        <w:t xml:space="preserve"> </w:t>
+      </w:r>
+      <w:proofErr w:type="gramStart"/>
+      <w:r>
+        <w:t>\</w:t>
+      </w:r>
+      <w:r>
+        <w:t>(</w:t>
+      </w:r>
+      <w:proofErr w:type="gramEnd"/>
+      <w:r>
+        <w:t>denotato</w:t>
       </w:r>
       <w:r>
         <w:t xml:space="preserve"> comunemente con Q o con la notazione S/𝒫) </w:t>
@@ -6389,6 +6439,59 @@
       </w:r>
       <w:r>
         <w:t xml:space="preserve"> | i ∈ I}</w:t>
+      </w:r>
+    </w:p>
+    <w:p>
+      <w:pPr>
+        <w:keepNext/>
+        <w:spacing w:before="120"/>
+        <w:jc w:val="center"/>
+      </w:pPr>
+      <w:r>
+        <w:drawing>
+          <wp:inline xmlns:a="http://schemas.openxmlformats.org/drawingml/2006/main" xmlns:pic="http://schemas.openxmlformats.org/drawingml/2006/picture">
+            <wp:extent cx="3780000" cy="2235946"/>
+            <wp:docPr id="40" name="Picture 40"/>
+            <wp:cNvGraphicFramePr>
+              <a:graphicFrameLocks noChangeAspect="1"/>
+            </wp:cNvGraphicFramePr>
+            <a:graphic>
+              <a:graphicData uri="http://schemas.openxmlformats.org/drawingml/2006/picture">
+                <pic:pic>
+                  <pic:nvPicPr>
+                    <pic:cNvPr id="0" name="ch07_quoziente_generale.png"/>
+                    <pic:cNvPicPr/>
+                  </pic:nvPicPr>
+                  <pic:blipFill>
+                    <a:blip r:embed="rId46"/>
+                    <a:stretch>
+                      <a:fillRect/>
+                    </a:stretch>
+                  </pic:blipFill>
+                  <pic:spPr>
+                    <a:xfrm>
+                      <a:off x="0" y="0"/>
+                      <a:ext cx="3780000" cy="2235946"/>
+                    </a:xfrm>
+                    <a:prstGeom prst="rect"/>
+                  </pic:spPr>
+                </pic:pic>
+              </a:graphicData>
+            </a:graphic>
+          </wp:inline>
+        </w:drawing>
+      </w:r>
+    </w:p>
+    <w:p>
+      <w:pPr>
+        <w:jc w:val="center"/>
+      </w:pPr>
+      <w:r>
+        <w:rPr>
+          <w:i/>
+          <w:sz w:val="18"/>
+        </w:rPr>
+        <w:t>Dall'insieme S diviso in blocchi all'insieme quoziente Q: ogni blocco A_i diventa un elemento di Q.</w:t>
       </w:r>
     </w:p>
     <w:p>

</xml_diff>

<commit_message>
Quaderno: nei quiz si possono scegliere più temi insieme
Co-Authored-By: Claude Sonnet 5.5 <noreply@anthropic.com>
</commit_message>
<xml_diff>
--- a/Riassunto Matematica discreta.docx
+++ b/Riassunto Matematica discreta.docx
@@ -6400,16 +6400,8 @@
         </w:rPr>
         <w:t xml:space="preserve"> </w:t>
       </w:r>
-      <w:proofErr w:type="gramStart"/>
-      <w:r>
-        <w:t>\</w:t>
-      </w:r>
-      <w:r>
-        <w:t>(</w:t>
-      </w:r>
-      <w:proofErr w:type="gramEnd"/>
-      <w:r>
-        <w:t>denotato</w:t>
+      <w:r>
+        <w:t>(denotato</w:t>
       </w:r>
       <w:r>
         <w:t xml:space="preserve"> comunemente con Q o con la notazione S/𝒫) </w:t>
@@ -6448,22 +6440,26 @@
         <w:jc w:val="center"/>
       </w:pPr>
       <w:r>
+        <w:rPr>
+          <w:noProof/>
+        </w:rPr>
         <w:drawing>
-          <wp:inline xmlns:a="http://schemas.openxmlformats.org/drawingml/2006/main" xmlns:pic="http://schemas.openxmlformats.org/drawingml/2006/picture">
+          <wp:inline distT="0" distB="0" distL="0" distR="0" wp14:anchorId="1AFF3D8A" wp14:editId="4CE891A7">
             <wp:extent cx="3780000" cy="2235946"/>
+            <wp:effectExtent l="0" t="0" r="0" b="0"/>
             <wp:docPr id="40" name="Picture 40"/>
             <wp:cNvGraphicFramePr>
-              <a:graphicFrameLocks noChangeAspect="1"/>
+              <a:graphicFrameLocks xmlns:a="http://schemas.openxmlformats.org/drawingml/2006/main" noChangeAspect="1"/>
             </wp:cNvGraphicFramePr>
-            <a:graphic>
+            <a:graphic xmlns:a="http://schemas.openxmlformats.org/drawingml/2006/main">
               <a:graphicData uri="http://schemas.openxmlformats.org/drawingml/2006/picture">
-                <pic:pic>
+                <pic:pic xmlns:pic="http://schemas.openxmlformats.org/drawingml/2006/picture">
                   <pic:nvPicPr>
                     <pic:cNvPr id="0" name="ch07_quoziente_generale.png"/>
                     <pic:cNvPicPr/>
                   </pic:nvPicPr>
                   <pic:blipFill>
-                    <a:blip r:embed="rId46"/>
+                    <a:blip r:embed="rId18"/>
                     <a:stretch>
                       <a:fillRect/>
                     </a:stretch>
@@ -6473,7 +6469,9 @@
                       <a:off x="0" y="0"/>
                       <a:ext cx="3780000" cy="2235946"/>
                     </a:xfrm>
-                    <a:prstGeom prst="rect"/>
+                    <a:prstGeom prst="rect">
+                      <a:avLst/>
+                    </a:prstGeom>
                   </pic:spPr>
                 </pic:pic>
               </a:graphicData>
@@ -6509,6 +6507,7 @@
           <w:bCs/>
           <w:color w:val="E97132" w:themeColor="accent2"/>
         </w:rPr>
+        <w:lastRenderedPageBreak/>
         <w:t>Collocazione Gerarchica e Insieme delle Parti</w:t>
       </w:r>
     </w:p>
@@ -6541,12 +6540,19 @@
         <w:t>i</w:t>
       </w:r>
       <w:r>
-        <w:t xml:space="preserve"> ∈ 𝒫(S)). Di conseguenza, l'insieme quoziente Q figura come un </w:t>
-      </w:r>
-      <w:r>
-        <w:rPr>
-          <w:b/>
-          <w:bCs/>
+        <w:t xml:space="preserve"> ∈ 𝒫(S)). Di conseguenza</w:t>
+      </w:r>
+      <w:r>
+        <w:rPr>
+          <w:highlight w:val="yellow"/>
+        </w:rPr>
+        <w:t xml:space="preserve">, l'insieme quoziente Q figura come un </w:t>
+      </w:r>
+      <w:r>
+        <w:rPr>
+          <w:b/>
+          <w:bCs/>
+          <w:highlight w:val="yellow"/>
         </w:rPr>
         <w:t>sottoinsieme dell'insieme delle parti</w:t>
       </w:r>
@@ -6653,7 +6659,6 @@
         <w:rPr>
           <w:noProof/>
         </w:rPr>
-        <w:lastRenderedPageBreak/>
         <w:drawing>
           <wp:inline distT="0" distB="0" distL="0" distR="0" wp14:anchorId="4BFE7722" wp14:editId="7C2D3AE6">
             <wp:extent cx="3960000" cy="2320176"/>
@@ -6670,7 +6675,7 @@
                     <pic:cNvPicPr/>
                   </pic:nvPicPr>
                   <pic:blipFill>
-                    <a:blip r:embed="rId18"/>
+                    <a:blip r:embed="rId19"/>
                     <a:stretch>
                       <a:fillRect/>
                     </a:stretch>
@@ -6758,22 +6763,62 @@
     </w:p>
     <w:p>
       <w:r>
-        <w:t>Nelle applicazioni matematiche e informatiche si avverte spesso l'esigenza di confrontare tra loro due elementi appartenenti a un medesimo insieme S (ad esempio per verificare quale numero sia minore di un altro, per stabilire la divisibilità tra interi, o per confrontare entità astratte come comuni italiani in base alla popolazione).</w:t>
-      </w:r>
-    </w:p>
-    <w:p>
-      <w:r>
-        <w:t xml:space="preserve">Nel linguaggio formale della teoria degli insiemi, effettuare un confronto tra due elementi richiede necessariamente di considerare una </w:t>
-      </w:r>
-      <w:r>
-        <w:rPr>
-          <w:b/>
-          <w:bCs/>
+        <w:t xml:space="preserve">Nelle applicazioni matematiche e informatiche si avverte spesso l'esigenza di </w:t>
+      </w:r>
+      <w:r>
+        <w:rPr>
+          <w:highlight w:val="yellow"/>
+        </w:rPr>
+        <w:t>confrontare tra loro due elementi appartenenti a un medesimo insieme S</w:t>
+      </w:r>
+      <w:r>
+        <w:t xml:space="preserve"> (ad esempio per verificare quale numero sia minore di un altro, per stabilire la divisibilità tra interi, o per confrontare entità astratte come comuni italiani in base alla popolazione).</w:t>
+      </w:r>
+    </w:p>
+    <w:p>
+      <w:r>
+        <w:t xml:space="preserve">Nel linguaggio formale della teoria degli insiemi, </w:t>
+      </w:r>
+      <w:r>
+        <w:rPr>
+          <w:highlight w:val="yellow"/>
+        </w:rPr>
+        <w:t xml:space="preserve">effettuare un confronto tra due elementi richiede necessariamente di considerare una </w:t>
+      </w:r>
+      <w:r>
+        <w:rPr>
+          <w:b/>
+          <w:bCs/>
+          <w:highlight w:val="yellow"/>
         </w:rPr>
         <w:t>coppia ordinata</w:t>
       </w:r>
       <w:r>
-        <w:t xml:space="preserve"> (x, y) appartenente al prodotto cartesiano S × S. L'ordine è vincolante: scambiare la posizione degli elementi modifica la natura del confronto (ad esempio, l'affermazione 3 ≤ 7 è vera, mentre 7 ≤ 3 è falsa).</w:t>
+        <w:rPr>
+          <w:highlight w:val="yellow"/>
+        </w:rPr>
+        <w:t xml:space="preserve"> (x, y)</w:t>
+      </w:r>
+      <w:r>
+        <w:t xml:space="preserve"> appartenente al prodotto cartesiano S × S. </w:t>
+      </w:r>
+      <w:r>
+        <w:rPr>
+          <w:highlight w:val="yellow"/>
+        </w:rPr>
+        <w:t>L'ordine è vincolante</w:t>
+      </w:r>
+      <w:r>
+        <w:t xml:space="preserve">: scambiare la posizione degli elementi modifica la natura del confronto (ad esempio, </w:t>
+      </w:r>
+      <w:r>
+        <w:rPr>
+          <w:highlight w:val="yellow"/>
+        </w:rPr>
+        <w:t>l'affermazione 3 ≤ 7 è vera, mentre 7 ≤ 3 è falsa</w:t>
+      </w:r>
+      <w:r>
+        <w:t>).</w:t>
       </w:r>
     </w:p>
     <w:p>
@@ -6797,11 +6842,18 @@
         <w:rPr>
           <w:b/>
           <w:bCs/>
+          <w:highlight w:val="yellow"/>
         </w:rPr>
         <w:t>relazione binaria</w:t>
       </w:r>
       <w:r>
-        <w:t xml:space="preserve"> R su S è un qualsiasi sottoinsieme del prodotto cartesiano S × S: </w:t>
+        <w:rPr>
+          <w:highlight w:val="yellow"/>
+        </w:rPr>
+        <w:t xml:space="preserve"> R su S è un qualsiasi sottoinsieme del prodotto cartesiano S × S</w:t>
+      </w:r>
+      <w:r>
+        <w:t xml:space="preserve">: </w:t>
       </w:r>
     </w:p>
     <w:p>
@@ -6809,6 +6861,10 @@
         <w:jc w:val="center"/>
       </w:pPr>
       <w:r>
+        <w:rPr>
+          <w:highlight w:val="yellow"/>
+        </w:rPr>
+        <w:lastRenderedPageBreak/>
         <w:t>R ⊆ S × S</w:t>
       </w:r>
     </w:p>
@@ -6818,6 +6874,9 @@
           <w:ilvl w:val="0"/>
           <w:numId w:val="36"/>
         </w:numPr>
+        <w:rPr>
+          <w:highlight w:val="yellow"/>
+        </w:rPr>
       </w:pPr>
       <w:r>
         <w:rPr>
@@ -6827,7 +6886,13 @@
         <w:t>Notazione Infissa</w:t>
       </w:r>
       <w:r>
-        <w:t xml:space="preserve">: Se la coppia ordinata (x, y) appartiene al sottoinsieme R (ossia (x, y) ∈ R), si dice che x è in relazione con y e si scrive in forma infissa: </w:t>
+        <w:t xml:space="preserve">: Se la coppia ordinata (x, y) appartiene al sottoinsieme R (ossia (x, y) ∈ R), si dice che </w:t>
+      </w:r>
+      <w:r>
+        <w:rPr>
+          <w:highlight w:val="yellow"/>
+        </w:rPr>
+        <w:t xml:space="preserve">x è in relazione con y e si scrive in forma infissa: </w:t>
       </w:r>
     </w:p>
     <w:p>
@@ -6835,6 +6900,9 @@
         <w:jc w:val="center"/>
       </w:pPr>
       <w:r>
+        <w:rPr>
+          <w:highlight w:val="yellow"/>
+        </w:rPr>
         <w:t>x R y</w:t>
       </w:r>
     </w:p>
@@ -6907,7 +6975,6 @@
         <w:rPr>
           <w:noProof/>
         </w:rPr>
-        <w:lastRenderedPageBreak/>
         <w:drawing>
           <wp:inline distT="0" distB="0" distL="0" distR="0" wp14:anchorId="6E398ACE" wp14:editId="308EE76A">
             <wp:extent cx="3240000" cy="2999125"/>
@@ -6924,7 +6991,7 @@
                     <pic:cNvPicPr/>
                   </pic:nvPicPr>
                   <pic:blipFill>
-                    <a:blip r:embed="rId19"/>
+                    <a:blip r:embed="rId20"/>
                     <a:stretch>
                       <a:fillRect/>
                     </a:stretch>
@@ -6995,7 +7062,16 @@
     </w:p>
     <w:p>
       <w:r>
-        <w:t>Non tutti i sottoinsiemi di S × S risultano matematicamente interessanti. Per isolare le relazioni più utili, la matematica definisce quattro proprietà strutturali fondamentali che una relazione R ⊆ S × S può soddisfare:</w:t>
+        <w:t xml:space="preserve">Non tutti i sottoinsiemi di S × S risultano matematicamente interessanti. Per isolare le relazioni più utili, la matematica definisce </w:t>
+      </w:r>
+      <w:r>
+        <w:rPr>
+          <w:highlight w:val="yellow"/>
+        </w:rPr>
+        <w:t>quattro proprietà strutturali fondamentali che una relazione R ⊆ S × S può soddisfare</w:t>
+      </w:r>
+      <w:r>
+        <w:t>:</w:t>
       </w:r>
     </w:p>
     <w:p>
@@ -7013,7 +7089,16 @@
         <w:t>Riflessività</w:t>
       </w:r>
       <w:r>
-        <w:t xml:space="preserve">: Ogni elemento dell'insieme è in relazione con se stesso: </w:t>
+        <w:t xml:space="preserve">: </w:t>
+      </w:r>
+      <w:r>
+        <w:rPr>
+          <w:highlight w:val="yellow"/>
+        </w:rPr>
+        <w:t>Ogni elemento dell'insieme è in relazione con se stesso</w:t>
+      </w:r>
+      <w:r>
+        <w:t xml:space="preserve">: </w:t>
       </w:r>
     </w:p>
     <w:p>
@@ -7057,7 +7142,16 @@
         <w:t>Simmetria</w:t>
       </w:r>
       <w:r>
-        <w:t xml:space="preserve">: Se un elemento x è in relazione con y, allora anche y è in relazione con x: </w:t>
+        <w:t xml:space="preserve">: </w:t>
+      </w:r>
+      <w:r>
+        <w:rPr>
+          <w:highlight w:val="yellow"/>
+        </w:rPr>
+        <w:t>Se un elemento x è in relazione con y, allora anche y è in relazione con x</w:t>
+      </w:r>
+      <w:r>
+        <w:t xml:space="preserve">: </w:t>
       </w:r>
     </w:p>
     <w:p>
@@ -7065,7 +7159,15 @@
         <w:jc w:val="center"/>
       </w:pPr>
       <w:r>
-        <w:t>∀ x, y ∈ S,   x R y ⟹ y R x</w:t>
+        <w:t xml:space="preserve">∀ x, y ∈ </w:t>
+      </w:r>
+      <w:proofErr w:type="gramStart"/>
+      <w:r>
+        <w:t xml:space="preserve">S,   </w:t>
+      </w:r>
+      <w:proofErr w:type="gramEnd"/>
+      <w:r>
+        <w:t>x R y ⟹ y R x</w:t>
       </w:r>
     </w:p>
     <w:p>
@@ -7080,20 +7182,34 @@
           <w:i/>
           <w:iCs/>
         </w:rPr>
+        <w:lastRenderedPageBreak/>
         <w:t>Esempio</w:t>
       </w:r>
       <w:r>
-        <w:t xml:space="preserve">: L'uguaglianza (=), il parallelismo (∥) e la perpendicolarità (⊥) sono simmetriche. La relazione ≤ </w:t>
-      </w:r>
-      <w:r>
-        <w:rPr>
-          <w:b/>
-          <w:bCs/>
+        <w:t xml:space="preserve">: L'uguaglianza (=), il parallelismo (∥) e la perpendicolarità (⊥) sono simmetriche. </w:t>
+      </w:r>
+      <w:r>
+        <w:rPr>
+          <w:highlight w:val="yellow"/>
+        </w:rPr>
+        <w:t xml:space="preserve">La relazione ≤ </w:t>
+      </w:r>
+      <w:r>
+        <w:rPr>
+          <w:b/>
+          <w:bCs/>
+          <w:highlight w:val="yellow"/>
         </w:rPr>
         <w:t>non</w:t>
       </w:r>
       <w:r>
-        <w:t xml:space="preserve"> è simmetrica (2 ≤ 4 ma 4 ≰ 2).</w:t>
+        <w:rPr>
+          <w:highlight w:val="yellow"/>
+        </w:rPr>
+        <w:t xml:space="preserve"> è simmetrica</w:t>
+      </w:r>
+      <w:r>
+        <w:t xml:space="preserve"> (2 ≤ 4 ma 4 ≰ 2).</w:t>
       </w:r>
     </w:p>
     <w:p>
@@ -7111,7 +7227,16 @@
         <w:t>Antisimmetria</w:t>
       </w:r>
       <w:r>
-        <w:t xml:space="preserve">: L'unico modo in cui due elementi possano essere in relazione simmetrica reciproca è che essi coincidano: </w:t>
+        <w:t xml:space="preserve">: </w:t>
+      </w:r>
+      <w:r>
+        <w:rPr>
+          <w:highlight w:val="yellow"/>
+        </w:rPr>
+        <w:t>L'unico modo in cui due elementi possano essere in relazione simmetrica reciproca è che essi coincidano</w:t>
+      </w:r>
+      <w:r>
+        <w:t xml:space="preserve">: </w:t>
       </w:r>
     </w:p>
     <w:p>
@@ -7152,7 +7277,16 @@
         <w:t>Esempio</w:t>
       </w:r>
       <w:r>
-        <w:t>: La relazione ≤ è antisimmetrica (se a ≤ b e b ≤ a, allora a = b).</w:t>
+        <w:t xml:space="preserve">: </w:t>
+      </w:r>
+      <w:r>
+        <w:rPr>
+          <w:highlight w:val="yellow"/>
+        </w:rPr>
+        <w:t>La relazione ≤ è antisimmetrica</w:t>
+      </w:r>
+      <w:r>
+        <w:t xml:space="preserve"> (se a ≤ b e b ≤ a, allora a = b).</w:t>
       </w:r>
     </w:p>
     <w:p>
@@ -7175,7 +7309,13 @@
     </w:p>
     <w:p>
       <w:r>
-        <w:t>La validità di una proprietà non dipende soltanto dalla regola della relazione, ma anche dall'insieme S su cui viene definita.</w:t>
+        <w:rPr>
+          <w:highlight w:val="yellow"/>
+        </w:rPr>
+        <w:t>La validità di una proprietà non dipende soltanto dalla regola della relazione, ma anche dall'insieme S su cui viene definita</w:t>
+      </w:r>
+      <w:r>
+        <w:t>.</w:t>
       </w:r>
     </w:p>
     <w:p>
@@ -7204,28 +7344,104 @@
         </w:numPr>
       </w:pPr>
       <w:r>
-        <w:lastRenderedPageBreak/>
+        <w:rPr>
+          <w:highlight w:val="yellow"/>
+        </w:rPr>
         <w:t xml:space="preserve">Nell'insieme dei </w:t>
       </w:r>
       <w:r>
         <w:rPr>
           <w:b/>
           <w:bCs/>
+          <w:highlight w:val="yellow"/>
         </w:rPr>
         <w:t>numeri naturali</w:t>
       </w:r>
       <w:r>
+        <w:rPr>
+          <w:highlight w:val="yellow"/>
+        </w:rPr>
         <w:t xml:space="preserve"> ℕ, la divisibilità è </w:t>
       </w:r>
       <w:r>
         <w:rPr>
           <w:b/>
           <w:bCs/>
+          <w:highlight w:val="yellow"/>
         </w:rPr>
         <w:t>antisimmetrica</w:t>
       </w:r>
       <w:r>
-        <w:t>: se a | b e b | a, allora a = b.</w:t>
+        <w:t xml:space="preserve">: se </w:t>
+      </w:r>
+      <m:oMath>
+        <m:f>
+          <m:fPr>
+            <m:ctrlPr>
+              <w:rPr>
+                <w:rFonts w:ascii="Cambria Math" w:hAnsi="Cambria Math"/>
+                <w:i/>
+              </w:rPr>
+            </m:ctrlPr>
+          </m:fPr>
+          <m:num>
+            <m:r>
+              <w:rPr>
+                <w:rFonts w:ascii="Cambria Math" w:hAnsi="Cambria Math"/>
+              </w:rPr>
+              <m:t>a</m:t>
+            </m:r>
+          </m:num>
+          <m:den>
+            <m:r>
+              <w:rPr>
+                <w:rFonts w:ascii="Cambria Math" w:hAnsi="Cambria Math"/>
+              </w:rPr>
+              <m:t>b</m:t>
+            </m:r>
+          </m:den>
+        </m:f>
+        <m:r>
+          <w:rPr>
+            <w:rFonts w:ascii="Cambria Math" w:hAnsi="Cambria Math"/>
+          </w:rPr>
+          <m:t>e</m:t>
+        </m:r>
+        <m:f>
+          <m:fPr>
+            <m:ctrlPr>
+              <w:rPr>
+                <w:rFonts w:ascii="Cambria Math" w:hAnsi="Cambria Math"/>
+                <w:i/>
+              </w:rPr>
+            </m:ctrlPr>
+          </m:fPr>
+          <m:num>
+            <m:r>
+              <w:rPr>
+                <w:rFonts w:ascii="Cambria Math" w:hAnsi="Cambria Math"/>
+              </w:rPr>
+              <m:t>b</m:t>
+            </m:r>
+          </m:num>
+          <m:den>
+            <m:r>
+              <w:rPr>
+                <w:rFonts w:ascii="Cambria Math" w:hAnsi="Cambria Math"/>
+              </w:rPr>
+              <m:t>a</m:t>
+            </m:r>
+          </m:den>
+        </m:f>
+        <m:r>
+          <w:rPr>
+            <w:rFonts w:ascii="Cambria Math" w:hAnsi="Cambria Math"/>
+          </w:rPr>
+          <m:t xml:space="preserve"> </m:t>
+        </m:r>
+      </m:oMath>
+      <w:r>
+        <w:t xml:space="preserve"> a, allora a = b.</w:t>
       </w:r>
     </w:p>
     <w:p>
@@ -7559,6 +7775,7 @@
           <w:bCs/>
           <w:color w:val="EE0000"/>
         </w:rPr>
+        <w:lastRenderedPageBreak/>
         <w:t>9. Classi di Equivalenza, Teorema Fondamentale e Concetto Insiemistico di Funzione</w:t>
       </w:r>
     </w:p>
@@ -7661,7 +7878,6 @@
           <w:b/>
           <w:bCs/>
         </w:rPr>
-        <w:lastRenderedPageBreak/>
         <w:t>Rappresentante della Classe</w:t>
       </w:r>
       <w:r>
@@ -7948,6 +8164,7 @@
         <w:rPr>
           <w:noProof/>
         </w:rPr>
+        <w:lastRenderedPageBreak/>
         <w:drawing>
           <wp:inline distT="0" distB="0" distL="0" distR="0" wp14:anchorId="75509A9B" wp14:editId="304828FE">
             <wp:extent cx="4140000" cy="1398573"/>
@@ -7964,7 +8181,7 @@
                     <pic:cNvPicPr/>
                   </pic:nvPicPr>
                   <pic:blipFill>
-                    <a:blip r:embed="rId20"/>
+                    <a:blip r:embed="rId21"/>
                     <a:stretch>
                       <a:fillRect/>
                     </a:stretch>
@@ -8174,7 +8391,6 @@
         </w:numPr>
       </w:pPr>
       <w:r>
-        <w:lastRenderedPageBreak/>
         <w:t>Consideriamo ora un generico elemento w ∈ C</w:t>
       </w:r>
       <w:r>
@@ -8454,6 +8670,7 @@
           <w:b/>
           <w:bCs/>
         </w:rPr>
+        <w:lastRenderedPageBreak/>
         <w:t>Ristrettezza del Dominio</w:t>
       </w:r>
       <w:r>
@@ -8642,7 +8859,6 @@
           <w:bCs/>
           <w:color w:val="E97132" w:themeColor="accent2"/>
         </w:rPr>
-        <w:lastRenderedPageBreak/>
         <w:t>Interpretazione Grafica del Vincolo di Esistenza ed Unicità</w:t>
       </w:r>
     </w:p>
@@ -8723,7 +8939,7 @@
                     <pic:cNvPicPr/>
                   </pic:nvPicPr>
                   <pic:blipFill>
-                    <a:blip r:embed="rId21"/>
+                    <a:blip r:embed="rId22"/>
                     <a:stretch>
                       <a:fillRect/>
                     </a:stretch>
@@ -8827,7 +9043,11 @@
         <w:t>grafico</w:t>
       </w:r>
       <w:r>
-        <w:t xml:space="preserve"> Γ ⊆ A × B con la condizione di esistenza e unicità ∀ a ∈ A, ∃! b ∈ B tale che (a, b) ∈ Γ; dare una funzione significa dare la tripla (A, B, Γ). Quando (a, b) ∈ Γ si scrive f(a) = b, e le due scritture sono equivalenti. Lettere come f, g, h sono la scelta abituale per i nomi delle funzioni, ma non c'è alcun obbligo. Va notato che A e B possono anche essere lo stesso insieme: fa parte della definizione e capiterà spesso, con lo stesso insieme che una volta gioca da dominio e una volta da codominio.</w:t>
+        <w:t xml:space="preserve"> Γ ⊆ A × B con la condizione di esistenza e unicità ∀ a ∈ A, ∃! b ∈ B tale che (a, b) ∈ Γ; dare una </w:t>
+      </w:r>
+      <w:r>
+        <w:lastRenderedPageBreak/>
+        <w:t>funzione significa dare la tripla (A, B, Γ). Quando (a, b) ∈ Γ si scrive f(a) = b, e le due scritture sono equivalenti. Lettere come f, g, h sono la scelta abituale per i nomi delle funzioni, ma non c'è alcun obbligo. Va notato che A e B possono anche essere lo stesso insieme: fa parte della definizione e capiterà spesso, con lo stesso insieme che una volta gioca da dominio e una volta da codominio.</w:t>
       </w:r>
     </w:p>
     <w:p>
@@ -8862,7 +9082,6 @@
         <w:rPr>
           <w:noProof/>
         </w:rPr>
-        <w:lastRenderedPageBreak/>
         <w:drawing>
           <wp:inline distT="0" distB="0" distL="0" distR="0" wp14:anchorId="6352B8A0" wp14:editId="7781D04D">
             <wp:extent cx="2880000" cy="2320734"/>
@@ -8879,7 +9098,7 @@
                     <pic:cNvPicPr/>
                   </pic:nvPicPr>
                   <pic:blipFill>
-                    <a:blip r:embed="rId22"/>
+                    <a:blip r:embed="rId23"/>
                     <a:stretch>
                       <a:fillRect/>
                     </a:stretch>
@@ -8960,7 +9179,7 @@
                     <pic:cNvPicPr/>
                   </pic:nvPicPr>
                   <pic:blipFill>
-                    <a:blip r:embed="rId23"/>
+                    <a:blip r:embed="rId24"/>
                     <a:stretch>
                       <a:fillRect/>
                     </a:stretch>
@@ -9002,6 +9221,7 @@
           <w:b/>
           <w:color w:val="E97132"/>
         </w:rPr>
+        <w:lastRenderedPageBreak/>
         <w:t>Differenza rispetto alla funzione di analisi</w:t>
       </w:r>
     </w:p>
@@ -9056,7 +9276,6 @@
     </w:p>
     <w:p>
       <w:r>
-        <w:lastRenderedPageBreak/>
         <w:t>Per descrivere il singolo elemento si usa la freccia con il trattino, x ↦ f(x), che si legge "x va in f(x)": per esempio n ↦ a</w:t>
       </w:r>
       <w:r>
@@ -9121,7 +9340,7 @@
                     <pic:cNvPicPr/>
                   </pic:nvPicPr>
                   <pic:blipFill>
-                    <a:blip r:embed="rId24"/>
+                    <a:blip r:embed="rId25"/>
                     <a:stretch>
                       <a:fillRect/>
                     </a:stretch>
@@ -9220,6 +9439,7 @@
     </w:p>
     <w:p>
       <w:r>
+        <w:lastRenderedPageBreak/>
         <w:t xml:space="preserve">Hanno lo stesso dominio, lo stesso codominio e lo stesso grafico, quindi </w:t>
       </w:r>
       <w:r>
@@ -9242,7 +9462,6 @@
         <w:rPr>
           <w:noProof/>
         </w:rPr>
-        <w:lastRenderedPageBreak/>
         <w:drawing>
           <wp:inline distT="0" distB="0" distL="0" distR="0" wp14:anchorId="00A25E3F" wp14:editId="70063993">
             <wp:extent cx="3420000" cy="2746304"/>
@@ -9259,7 +9478,7 @@
                     <pic:cNvPicPr/>
                   </pic:nvPicPr>
                   <pic:blipFill>
-                    <a:blip r:embed="rId25"/>
+                    <a:blip r:embed="rId26"/>
                     <a:stretch>
                       <a:fillRect/>
                     </a:stretch>
@@ -9417,7 +9636,7 @@
                     <pic:cNvPicPr/>
                   </pic:nvPicPr>
                   <pic:blipFill>
-                    <a:blip r:embed="rId26"/>
+                    <a:blip r:embed="rId27"/>
                     <a:stretch>
                       <a:fillRect/>
                     </a:stretch>
@@ -9520,7 +9739,7 @@
                     <pic:cNvPicPr/>
                   </pic:nvPicPr>
                   <pic:blipFill>
-                    <a:blip r:embed="rId27"/>
+                    <a:blip r:embed="rId28"/>
                     <a:stretch>
                       <a:fillRect/>
                     </a:stretch>
@@ -9696,7 +9915,7 @@
                     <pic:cNvPicPr/>
                   </pic:nvPicPr>
                   <pic:blipFill>
-                    <a:blip r:embed="rId28"/>
+                    <a:blip r:embed="rId29"/>
                     <a:stretch>
                       <a:fillRect/>
                     </a:stretch>
@@ -9983,7 +10202,7 @@
                     <pic:cNvPicPr/>
                   </pic:nvPicPr>
                   <pic:blipFill>
-                    <a:blip r:embed="rId29"/>
+                    <a:blip r:embed="rId30"/>
                     <a:stretch>
                       <a:fillRect/>
                     </a:stretch>
@@ -10184,7 +10403,7 @@
                     <pic:cNvPicPr/>
                   </pic:nvPicPr>
                   <pic:blipFill>
-                    <a:blip r:embed="rId30"/>
+                    <a:blip r:embed="rId31"/>
                     <a:stretch>
                       <a:fillRect/>
                     </a:stretch>
@@ -10369,7 +10588,7 @@
                     <pic:cNvPicPr/>
                   </pic:nvPicPr>
                   <pic:blipFill>
-                    <a:blip r:embed="rId31"/>
+                    <a:blip r:embed="rId32"/>
                     <a:stretch>
                       <a:fillRect/>
                     </a:stretch>
@@ -10695,7 +10914,7 @@
                     <pic:cNvPicPr/>
                   </pic:nvPicPr>
                   <pic:blipFill>
-                    <a:blip r:embed="rId32"/>
+                    <a:blip r:embed="rId33"/>
                     <a:stretch>
                       <a:fillRect/>
                     </a:stretch>
@@ -10949,7 +11168,7 @@
                     <pic:cNvPicPr/>
                   </pic:nvPicPr>
                   <pic:blipFill>
-                    <a:blip r:embed="rId33"/>
+                    <a:blip r:embed="rId34"/>
                     <a:stretch>
                       <a:fillRect/>
                     </a:stretch>
@@ -11056,7 +11275,7 @@
                     <pic:cNvPicPr/>
                   </pic:nvPicPr>
                   <pic:blipFill>
-                    <a:blip r:embed="rId34"/>
+                    <a:blip r:embed="rId35"/>
                     <a:stretch>
                       <a:fillRect/>
                     </a:stretch>
@@ -11246,7 +11465,7 @@
                     <pic:cNvPicPr/>
                   </pic:nvPicPr>
                   <pic:blipFill>
-                    <a:blip r:embed="rId35"/>
+                    <a:blip r:embed="rId36"/>
                     <a:stretch>
                       <a:fillRect/>
                     </a:stretch>
@@ -11478,7 +11697,7 @@
                     <pic:cNvPicPr/>
                   </pic:nvPicPr>
                   <pic:blipFill>
-                    <a:blip r:embed="rId36"/>
+                    <a:blip r:embed="rId37"/>
                     <a:stretch>
                       <a:fillRect/>
                     </a:stretch>
@@ -11721,7 +11940,7 @@
                     <pic:cNvPicPr/>
                   </pic:nvPicPr>
                   <pic:blipFill>
-                    <a:blip r:embed="rId37"/>
+                    <a:blip r:embed="rId38"/>
                     <a:stretch>
                       <a:fillRect/>
                     </a:stretch>
@@ -11862,7 +12081,7 @@
                     <pic:cNvPicPr/>
                   </pic:nvPicPr>
                   <pic:blipFill>
-                    <a:blip r:embed="rId38"/>
+                    <a:blip r:embed="rId39"/>
                     <a:stretch>
                       <a:fillRect/>
                     </a:stretch>
@@ -11962,7 +12181,7 @@
                     <pic:cNvPicPr/>
                   </pic:nvPicPr>
                   <pic:blipFill>
-                    <a:blip r:embed="rId39"/>
+                    <a:blip r:embed="rId40"/>
                     <a:stretch>
                       <a:fillRect/>
                     </a:stretch>
@@ -12210,7 +12429,7 @@
                     <pic:cNvPicPr/>
                   </pic:nvPicPr>
                   <pic:blipFill>
-                    <a:blip r:embed="rId40"/>
+                    <a:blip r:embed="rId41"/>
                     <a:stretch>
                       <a:fillRect/>
                     </a:stretch>
@@ -12328,7 +12547,7 @@
                     <pic:cNvPicPr/>
                   </pic:nvPicPr>
                   <pic:blipFill>
-                    <a:blip r:embed="rId41"/>
+                    <a:blip r:embed="rId42"/>
                     <a:stretch>
                       <a:fillRect/>
                     </a:stretch>
@@ -12678,7 +12897,7 @@
                     <pic:cNvPicPr/>
                   </pic:nvPicPr>
                   <pic:blipFill>
-                    <a:blip r:embed="rId42"/>
+                    <a:blip r:embed="rId43"/>
                     <a:stretch>
                       <a:fillRect/>
                     </a:stretch>
@@ -13112,7 +13331,7 @@
                     <pic:cNvPicPr/>
                   </pic:nvPicPr>
                   <pic:blipFill>
-                    <a:blip r:embed="rId43"/>
+                    <a:blip r:embed="rId44"/>
                     <a:stretch>
                       <a:fillRect/>
                     </a:stretch>
@@ -20978,6 +21197,16 @@
       <w:spacing w:val="5"/>
     </w:rPr>
   </w:style>
+  <w:style w:type="character" w:styleId="Testosegnaposto">
+    <w:name w:val="Placeholder Text"/>
+    <w:basedOn w:val="Carpredefinitoparagrafo"/>
+    <w:uiPriority w:val="99"/>
+    <w:semiHidden/>
+    <w:rsid w:val="00933433"/>
+    <w:rPr>
+      <w:color w:val="666666"/>
+    </w:rPr>
+  </w:style>
 </w:styles>
 </file>
 

</xml_diff>

<commit_message>
Mate cap. 9: figura partizioni e relazioni di equivalenza
Co-Authored-By: Claude Sonnet 5.5 <noreply@anthropic.com>
</commit_message>
<xml_diff>
--- a/Riassunto Matematica discreta.docx
+++ b/Riassunto Matematica discreta.docx
@@ -7401,6 +7401,12 @@
             </m:r>
           </m:den>
         </m:f>
+        <m:r>
+          <w:rPr>
+            <w:rFonts w:ascii="Cambria Math" w:hAnsi="Cambria Math"/>
+          </w:rPr>
+          <m:t xml:space="preserve"> </m:t>
+        </m:r>
         <m:r>
           <w:rPr>
             <w:rFonts w:ascii="Cambria Math" w:hAnsi="Cambria Math"/>
@@ -7441,7 +7447,7 @@
         </m:r>
       </m:oMath>
       <w:r>
-        <w:t xml:space="preserve"> a, allora a = b.</w:t>
+        <w:t xml:space="preserve"> , allora a = b.</w:t>
       </w:r>
     </w:p>
     <w:p>
@@ -7472,7 +7478,19 @@
         <w:t>NON è antisimmetrica</w:t>
       </w:r>
       <w:r>
-        <w:t>: infatti 1 | -1 e -1 | 1, ma 1 ≠ -1.</w:t>
+        <w:t xml:space="preserve">: infatti 1 </w:t>
+      </w:r>
+      <w:r>
+        <w:t>/</w:t>
+      </w:r>
+      <w:r>
+        <w:t xml:space="preserve"> -1 e -1 </w:t>
+      </w:r>
+      <w:r>
+        <w:t>/</w:t>
+      </w:r>
+      <w:r>
+        <w:t xml:space="preserve"> 1, ma 1 ≠ -1.</w:t>
       </w:r>
     </w:p>
     <w:p>
@@ -7490,7 +7508,16 @@
         <w:t>Transitività</w:t>
       </w:r>
       <w:r>
-        <w:t xml:space="preserve">: Se x è in relazione con y e y è in relazione con z, allora x è in relazione con z: </w:t>
+        <w:t xml:space="preserve">: </w:t>
+      </w:r>
+      <w:r>
+        <w:rPr>
+          <w:highlight w:val="yellow"/>
+        </w:rPr>
+        <w:t>Se x è in relazione con y e y è in relazione con z, allora x è in relazione con z</w:t>
+      </w:r>
+      <w:r>
+        <w:t xml:space="preserve">: </w:t>
       </w:r>
     </w:p>
     <w:p>
@@ -7564,7 +7591,27 @@
     </w:p>
     <w:p>
       <w:r>
-        <w:t>Quando si lavora con insiemi complessi, spesso si desidera raggruppare elementi distinti che, sotto un determinato punto di vista, si comportano in modo identico e possono essere considerati "intercambiabili".</w:t>
+        <w:t xml:space="preserve">Quando si lavora con insiemi complessi, spesso </w:t>
+      </w:r>
+      <w:r>
+        <w:rPr>
+          <w:highlight w:val="yellow"/>
+        </w:rPr>
+        <w:t>si desidera raggruppare elementi distinti che, sotto un determinato punto di vista, si comportano in modo identico e possono essere considerati "</w:t>
+      </w:r>
+      <w:r>
+        <w:rPr>
+          <w:b/>
+          <w:bCs/>
+          <w:highlight w:val="yellow"/>
+        </w:rPr>
+        <w:t>intercambiabili</w:t>
+      </w:r>
+      <w:r>
+        <w:rPr>
+          <w:highlight w:val="yellow"/>
+        </w:rPr>
+        <w:t>".</w:t>
       </w:r>
     </w:p>
     <w:p>
@@ -7582,17 +7629,30 @@
         <w:t>Definizione Formale</w:t>
       </w:r>
       <w:r>
-        <w:t xml:space="preserve">: Sia S un insieme non vuoto. Una relazione R ⊆ S × S si dice </w:t>
-      </w:r>
-      <w:r>
-        <w:rPr>
-          <w:b/>
-          <w:bCs/>
+        <w:t xml:space="preserve">: Sia S un insieme non vuoto. </w:t>
+      </w:r>
+      <w:r>
+        <w:rPr>
+          <w:highlight w:val="yellow"/>
+        </w:rPr>
+        <w:t xml:space="preserve">Una relazione R ⊆ S × S si dice </w:t>
+      </w:r>
+      <w:r>
+        <w:rPr>
+          <w:b/>
+          <w:bCs/>
+          <w:highlight w:val="yellow"/>
         </w:rPr>
         <w:t>relazione di equivalenza</w:t>
       </w:r>
       <w:r>
-        <w:t xml:space="preserve"> se e solo se soddisfa contemporaneamente le tre seguenti proprietà: </w:t>
+        <w:rPr>
+          <w:highlight w:val="yellow"/>
+        </w:rPr>
+        <w:t xml:space="preserve"> se e solo se</w:t>
+      </w:r>
+      <w:r>
+        <w:t xml:space="preserve"> soddisfa contemporaneamente le tre seguenti proprietà: </w:t>
       </w:r>
     </w:p>
     <w:p>
@@ -7799,17 +7859,48 @@
     </w:p>
     <w:p>
       <w:r>
-        <w:t xml:space="preserve">Quando su un insieme non vuoto S è definita una relazione di equivalenza R (ossia una relazione riflessiva, simmetrica e transitiva), gli elementi di S possono essere raggruppati in sottoinsiemi chiamati </w:t>
-      </w:r>
-      <w:r>
-        <w:rPr>
-          <w:b/>
-          <w:bCs/>
+        <w:rPr>
+          <w:highlight w:val="yellow"/>
+        </w:rPr>
+        <w:t xml:space="preserve">Quando su un insieme </w:t>
+      </w:r>
+      <w:r>
+        <w:t>non vuoto</w:t>
+      </w:r>
+      <w:r>
+        <w:rPr>
+          <w:highlight w:val="yellow"/>
+        </w:rPr>
+        <w:t xml:space="preserve"> S è definita una relazione di equivalenza R</w:t>
+      </w:r>
+      <w:r>
+        <w:t xml:space="preserve"> (ossia una relazione riflessiva, simmetrica e transitiva), </w:t>
+      </w:r>
+      <w:r>
+        <w:rPr>
+          <w:highlight w:val="yellow"/>
+        </w:rPr>
+        <w:t xml:space="preserve">gli elementi di S possono essere raggruppati in sottoinsiemi chiamati </w:t>
+      </w:r>
+      <w:r>
+        <w:rPr>
+          <w:b/>
+          <w:bCs/>
+          <w:highlight w:val="yellow"/>
         </w:rPr>
         <w:t>classi di equivalenza</w:t>
       </w:r>
       <w:r>
-        <w:t>. Ciascuna classe raccoglie tutti gli elementi tra loro equivalenti rispetto alla proprietà considerata.</w:t>
+        <w:t xml:space="preserve">. </w:t>
+      </w:r>
+      <w:r>
+        <w:rPr>
+          <w:highlight w:val="yellow"/>
+        </w:rPr>
+        <w:t>Ciascuna classe raccoglie tutti gli elementi tra loro equivalenti rispetto alla proprietà considerata</w:t>
+      </w:r>
+      <w:r>
+        <w:t>.</w:t>
       </w:r>
     </w:p>
     <w:p>
@@ -7827,12 +7918,22 @@
         <w:t>Definizione Formale</w:t>
       </w:r>
       <w:r>
-        <w:t xml:space="preserve">: Sia R una relazione di equivalenza su S e sia x ∈ S un generico elemento. Si definisce </w:t>
-      </w:r>
-      <w:r>
-        <w:rPr>
-          <w:b/>
-          <w:bCs/>
+        <w:t xml:space="preserve">: Sia </w:t>
+      </w:r>
+      <w:r>
+        <w:rPr>
+          <w:highlight w:val="yellow"/>
+        </w:rPr>
+        <w:t>R una relazione di equivalenza su S e sia x ∈ S un generico elemento</w:t>
+      </w:r>
+      <w:r>
+        <w:t xml:space="preserve">. Si definisce </w:t>
+      </w:r>
+      <w:r>
+        <w:rPr>
+          <w:b/>
+          <w:bCs/>
+          <w:highlight w:val="yellow"/>
         </w:rPr>
         <w:t>classe di equivalenza di x</w:t>
       </w:r>
@@ -7846,7 +7947,16 @@
         <w:t>x</w:t>
       </w:r>
       <w:r>
-        <w:t xml:space="preserve">, [x] o x̄) l'insieme costituito da tutti gli elementi y ∈ S che sono in relazione con x: </w:t>
+        <w:t xml:space="preserve">, [x] o x̄) </w:t>
+      </w:r>
+      <w:r>
+        <w:rPr>
+          <w:highlight w:val="yellow"/>
+        </w:rPr>
+        <w:t>l'insieme costituito da tutti gli elementi y ∈ S che sono in relazione con x</w:t>
+      </w:r>
+      <w:r>
+        <w:t xml:space="preserve">: </w:t>
       </w:r>
     </w:p>
     <w:p>
@@ -7854,15 +7964,22 @@
         <w:jc w:val="center"/>
       </w:pPr>
       <w:r>
+        <w:rPr>
+          <w:highlight w:val="yellow"/>
+        </w:rPr>
         <w:t>C</w:t>
       </w:r>
       <w:r>
         <w:rPr>
+          <w:highlight w:val="yellow"/>
           <w:vertAlign w:val="subscript"/>
         </w:rPr>
         <w:t>x</w:t>
       </w:r>
       <w:r>
+        <w:rPr>
+          <w:highlight w:val="yellow"/>
+        </w:rPr>
         <w:t xml:space="preserve"> = [x] = {y ∈ S | x R y}</w:t>
       </w:r>
     </w:p>
@@ -7881,20 +7998,31 @@
         <w:t>Rappresentante della Classe</w:t>
       </w:r>
       <w:r>
-        <w:t xml:space="preserve">: L'elemento x utilizzato per costruire l'insieme prende il nome di </w:t>
-      </w:r>
-      <w:r>
-        <w:rPr>
-          <w:b/>
-          <w:bCs/>
+        <w:t xml:space="preserve">: </w:t>
+      </w:r>
+      <w:r>
+        <w:rPr>
+          <w:highlight w:val="yellow"/>
+        </w:rPr>
+        <w:t xml:space="preserve">L'elemento x utilizzato per costruire l'insieme prende il nome di </w:t>
+      </w:r>
+      <w:r>
+        <w:rPr>
+          <w:b/>
+          <w:bCs/>
+          <w:highlight w:val="yellow"/>
         </w:rPr>
         <w:t>rappresentante</w:t>
       </w:r>
       <w:r>
+        <w:rPr>
+          <w:highlight w:val="yellow"/>
+        </w:rPr>
         <w:t xml:space="preserve"> della classe di equivalenza C</w:t>
       </w:r>
       <w:r>
         <w:rPr>
+          <w:highlight w:val="yellow"/>
           <w:vertAlign w:val="subscript"/>
         </w:rPr>
         <w:t>x</w:t>
@@ -7945,7 +8073,25 @@
         <w:t>Non Vuotezza dei Blocchi</w:t>
       </w:r>
       <w:r>
-        <w:t>: Poiché R gode della proprietà riflessiva (x R x per ogni x ∈ S), l'elemento x appartiene sempre alla propria classe di equivalenza (x ∈ C</w:t>
+        <w:t xml:space="preserve">: </w:t>
+      </w:r>
+      <w:r>
+        <w:rPr>
+          <w:highlight w:val="yellow"/>
+        </w:rPr>
+        <w:t>Poiché R gode della proprietà riflessiva</w:t>
+      </w:r>
+      <w:r>
+        <w:t xml:space="preserve"> (x R x per ogni x ∈ S), </w:t>
+      </w:r>
+      <w:r>
+        <w:rPr>
+          <w:highlight w:val="yellow"/>
+        </w:rPr>
+        <w:t>l'elemento x appartiene sempre alla propria classe di equivalenza</w:t>
+      </w:r>
+      <w:r>
+        <w:t xml:space="preserve"> (x ∈ C</w:t>
       </w:r>
       <w:r>
         <w:rPr>
@@ -7962,16 +8108,26 @@
         <w:jc w:val="center"/>
       </w:pPr>
       <w:r>
+        <w:rPr>
+          <w:highlight w:val="yellow"/>
+        </w:rPr>
         <w:t>C</w:t>
       </w:r>
       <w:r>
         <w:rPr>
+          <w:highlight w:val="yellow"/>
           <w:vertAlign w:val="subscript"/>
         </w:rPr>
         <w:t>x</w:t>
       </w:r>
       <w:r>
-        <w:t xml:space="preserve"> ≠ ∅   ∀ x ∈ S</w:t>
+        <w:rPr>
+          <w:highlight w:val="yellow"/>
+        </w:rPr>
+        <w:t xml:space="preserve"> ≠ ∅</w:t>
+      </w:r>
+      <w:r>
+        <w:t xml:space="preserve">   ∀ x ∈ S</w:t>
       </w:r>
     </w:p>
     <w:p>
@@ -7989,7 +8145,16 @@
         <w:t>Ricoprimento dell'Insieme</w:t>
       </w:r>
       <w:r>
-        <w:t>: Poiché ogni elemento x ∈ S appartiene ad almeno un blocco (la propria classe C</w:t>
+        <w:t xml:space="preserve">: Poiché </w:t>
+      </w:r>
+      <w:r>
+        <w:rPr>
+          <w:highlight w:val="yellow"/>
+        </w:rPr>
+        <w:t>ogni elemento x ∈ S appartiene ad almeno un blocco</w:t>
+      </w:r>
+      <w:r>
+        <w:t xml:space="preserve"> (la propria classe C</w:t>
       </w:r>
       <w:r>
         <w:rPr>
@@ -7998,7 +8163,16 @@
         <w:t>x</w:t>
       </w:r>
       <w:r>
-        <w:t xml:space="preserve">), l'unione globale di tutte le classi di equivalenza ricostruisce l'intero insieme universale S: </w:t>
+        <w:t xml:space="preserve">), </w:t>
+      </w:r>
+      <w:r>
+        <w:rPr>
+          <w:highlight w:val="yellow"/>
+        </w:rPr>
+        <w:t>l'unione globale di tutte le classi di equivalenza ricostruisce l'intero insieme universale S</w:t>
+      </w:r>
+      <w:r>
+        <w:t xml:space="preserve">: </w:t>
       </w:r>
     </w:p>
     <w:p>
@@ -8047,7 +8221,44 @@
     </w:p>
     <w:p>
       <w:r>
-        <w:t>Il risultato centrale della teoria delle relazioni stabilisce la perfetta equivalenza concettuale tra le relazioni di equivalenza e le partizioni di un insieme.</w:t>
+        <w:t xml:space="preserve">Il risultato centrale della teoria delle </w:t>
+      </w:r>
+      <w:r>
+        <w:rPr>
+          <w:highlight w:val="yellow"/>
+        </w:rPr>
+        <w:t xml:space="preserve">relazioni stabilisce la perfetta equivalenza concettuale tra le </w:t>
+      </w:r>
+      <w:r>
+        <w:rPr>
+          <w:b/>
+          <w:bCs/>
+          <w:highlight w:val="yellow"/>
+        </w:rPr>
+        <w:t xml:space="preserve">relazioni di equivalenza </w:t>
+      </w:r>
+      <w:r>
+        <w:rPr>
+          <w:highlight w:val="yellow"/>
+        </w:rPr>
+        <w:t xml:space="preserve">e le </w:t>
+      </w:r>
+      <w:r>
+        <w:rPr>
+          <w:b/>
+          <w:bCs/>
+          <w:highlight w:val="yellow"/>
+        </w:rPr>
+        <w:t>partizioni</w:t>
+      </w:r>
+      <w:r>
+        <w:rPr>
+          <w:highlight w:val="yellow"/>
+        </w:rPr>
+        <w:t xml:space="preserve"> di un insieme</w:t>
+      </w:r>
+      <w:r>
+        <w:t>.</w:t>
       </w:r>
     </w:p>
     <w:p>
@@ -8070,30 +8281,45 @@
     </w:p>
     <w:p>
       <w:r>
-        <w:t>Sia R una relazione di equivalenza su un insieme S. Per ogni coppia di elementi x, y ∈ S, per le relative classi di equivalenza C</w:t>
-      </w:r>
-      <w:r>
-        <w:rPr>
+        <w:t xml:space="preserve">Sia R una relazione di equivalenza su un insieme S. </w:t>
+      </w:r>
+      <w:r>
+        <w:rPr>
+          <w:highlight w:val="yellow"/>
+        </w:rPr>
+        <w:t>Per ogni coppia di elementi x, y ∈ S, per le relative classi di equivalenza C</w:t>
+      </w:r>
+      <w:r>
+        <w:rPr>
+          <w:highlight w:val="yellow"/>
           <w:vertAlign w:val="subscript"/>
         </w:rPr>
         <w:t>x</w:t>
       </w:r>
       <w:r>
+        <w:rPr>
+          <w:highlight w:val="yellow"/>
+        </w:rPr>
         <w:t xml:space="preserve"> e C</w:t>
       </w:r>
       <w:r>
         <w:rPr>
+          <w:highlight w:val="yellow"/>
           <w:vertAlign w:val="subscript"/>
         </w:rPr>
         <w:t>y</w:t>
       </w:r>
       <w:r>
+        <w:rPr>
+          <w:highlight w:val="yellow"/>
+        </w:rPr>
         <w:t xml:space="preserve"> sussistono soltanto </w:t>
       </w:r>
       <w:r>
         <w:rPr>
           <w:b/>
           <w:bCs/>
+          <w:highlight w:val="yellow"/>
         </w:rPr>
         <w:t>due possibilità mutuamente esclusive</w:t>
       </w:r>
@@ -8106,37 +8332,62 @@
         <w:jc w:val="center"/>
       </w:pPr>
       <w:r>
+        <w:rPr>
+          <w:highlight w:val="yellow"/>
+        </w:rPr>
         <w:t>C</w:t>
       </w:r>
       <w:r>
         <w:rPr>
+          <w:highlight w:val="yellow"/>
           <w:vertAlign w:val="subscript"/>
         </w:rPr>
         <w:t>x</w:t>
       </w:r>
       <w:r>
+        <w:rPr>
+          <w:highlight w:val="yellow"/>
+        </w:rPr>
         <w:t xml:space="preserve"> ∩ C</w:t>
       </w:r>
       <w:r>
         <w:rPr>
+          <w:highlight w:val="yellow"/>
           <w:vertAlign w:val="subscript"/>
         </w:rPr>
         <w:t>y</w:t>
       </w:r>
       <w:r>
-        <w:t xml:space="preserve"> = ∅   oppure   C</w:t>
-      </w:r>
-      <w:r>
-        <w:rPr>
+        <w:rPr>
+          <w:highlight w:val="yellow"/>
+        </w:rPr>
+        <w:t xml:space="preserve"> = ∅</w:t>
+      </w:r>
+      <w:r>
+        <w:t xml:space="preserve">   oppure   </w:t>
+      </w:r>
+      <w:r>
+        <w:rPr>
+          <w:highlight w:val="yellow"/>
+        </w:rPr>
+        <w:t>C</w:t>
+      </w:r>
+      <w:r>
+        <w:rPr>
+          <w:highlight w:val="yellow"/>
           <w:vertAlign w:val="subscript"/>
         </w:rPr>
         <w:t>x</w:t>
       </w:r>
       <w:r>
+        <w:rPr>
+          <w:highlight w:val="yellow"/>
+        </w:rPr>
         <w:t xml:space="preserve"> = C</w:t>
       </w:r>
       <w:r>
         <w:rPr>
+          <w:highlight w:val="yellow"/>
           <w:vertAlign w:val="subscript"/>
         </w:rPr>
         <w:t>y</w:t>
@@ -8148,7 +8399,37 @@
           <w:i/>
           <w:iCs/>
         </w:rPr>
-        <w:t>In altre parole: due classi di equivalenza o sono completamente disgiunte (non condividono alcun elemento) oppure coincidono perfettamente e sono la stessa identica classe</w:t>
+        <w:t xml:space="preserve">In altre parole: </w:t>
+      </w:r>
+      <w:r>
+        <w:rPr>
+          <w:i/>
+          <w:iCs/>
+          <w:highlight w:val="yellow"/>
+        </w:rPr>
+        <w:t>due classi di equivalenza o sono completamente disgiunte</w:t>
+      </w:r>
+      <w:r>
+        <w:rPr>
+          <w:i/>
+          <w:iCs/>
+        </w:rPr>
+        <w:t xml:space="preserve"> (non condividono alcun elemento) </w:t>
+      </w:r>
+      <w:r>
+        <w:rPr>
+          <w:i/>
+          <w:iCs/>
+          <w:highlight w:val="yellow"/>
+        </w:rPr>
+        <w:t>oppure coincidono perfettamente</w:t>
+      </w:r>
+      <w:r>
+        <w:rPr>
+          <w:i/>
+          <w:iCs/>
+        </w:rPr>
+        <w:t xml:space="preserve"> e sono la stessa identica classe</w:t>
       </w:r>
       <w:r>
         <w:t>.</w:t>
@@ -8514,6 +8795,7 @@
         <w:rPr>
           <w:b/>
           <w:bCs/>
+          <w:highlight w:val="yellow"/>
         </w:rPr>
         <w:t>la famiglia delle classi di equivalenza {C</w:t>
       </w:r>
@@ -8521,6 +8803,7 @@
         <w:rPr>
           <w:b/>
           <w:bCs/>
+          <w:highlight w:val="yellow"/>
           <w:vertAlign w:val="subscript"/>
         </w:rPr>
         <w:t>x</w:t>
@@ -8529,6 +8812,7 @@
         <w:rPr>
           <w:b/>
           <w:bCs/>
+          <w:highlight w:val="yellow"/>
         </w:rPr>
         <w:t xml:space="preserve"> | x ∈ S} forma una partizione dell'insieme S</w:t>
       </w:r>
@@ -8544,12 +8828,16 @@
         </w:numPr>
       </w:pPr>
       <w:r>
+        <w:rPr>
+          <w:highlight w:val="yellow"/>
+        </w:rPr>
         <w:t xml:space="preserve">L'insieme formato da tutte le classi di equivalenza prende il nome di </w:t>
       </w:r>
       <w:r>
         <w:rPr>
           <w:b/>
           <w:bCs/>
+          <w:highlight w:val="yellow"/>
         </w:rPr>
         <w:t>insieme quoziente di S rispetto alla relazione R</w:t>
       </w:r>
@@ -8583,7 +8871,16 @@
         <w:t>Il Viceversa (Dalla Partizione alla Relazione)</w:t>
       </w:r>
       <w:r>
-        <w:t>: Data una qualsiasi partizione {A</w:t>
+        <w:t xml:space="preserve">: </w:t>
+      </w:r>
+      <w:r>
+        <w:rPr>
+          <w:highlight w:val="yellow"/>
+        </w:rPr>
+        <w:t>Data una qualsiasi partizione</w:t>
+      </w:r>
+      <w:r>
+        <w:t xml:space="preserve"> {A</w:t>
       </w:r>
       <w:r>
         <w:rPr>
@@ -8601,16 +8898,29 @@
         <w:t>i ∈ I</w:t>
       </w:r>
       <w:r>
-        <w:t xml:space="preserve"> dell'insieme S, è sempre possibile definire su S una relazione di equivalenza R ponendo che due elementi x, y ∈ S sono in relazione (x R y) se e solo se appartengono al medesimo blocco A</w:t>
-      </w:r>
-      <w:r>
-        <w:rPr>
+        <w:t xml:space="preserve"> dell'insieme S, </w:t>
+      </w:r>
+      <w:r>
+        <w:rPr>
+          <w:highlight w:val="yellow"/>
+        </w:rPr>
+        <w:t>è sempre possibile definire su S una relazione di equivalenza R ponendo che due elementi x, y ∈ S sono in relazione (x R y) se e solo se appartengono al medesimo blocco A</w:t>
+      </w:r>
+      <w:r>
+        <w:rPr>
+          <w:highlight w:val="yellow"/>
           <w:vertAlign w:val="subscript"/>
         </w:rPr>
         <w:t>i</w:t>
       </w:r>
       <w:r>
-        <w:t xml:space="preserve"> della partizione.</w:t>
+        <w:rPr>
+          <w:highlight w:val="yellow"/>
+        </w:rPr>
+        <w:t xml:space="preserve"> della partizione</w:t>
+      </w:r>
+      <w:r>
+        <w:t>.</w:t>
       </w:r>
     </w:p>
     <w:p>
@@ -8628,11 +8938,71 @@
         <w:rPr>
           <w:b/>
           <w:bCs/>
+          <w:highlight w:val="yellow"/>
         </w:rPr>
         <w:t>corrispondenza biunivoca perfetta</w:t>
       </w:r>
       <w:r>
-        <w:t xml:space="preserve"> tra le relazioni di equivalenza su un insieme S e le partizioni di S.</w:t>
+        <w:rPr>
+          <w:highlight w:val="yellow"/>
+        </w:rPr>
+        <w:t xml:space="preserve"> tra le relazioni di equivalenza su un insieme S e le partizioni di S</w:t>
+      </w:r>
+      <w:r>
+        <w:t>.</w:t>
+      </w:r>
+    </w:p>
+    <w:p>
+      <w:pPr>
+        <w:keepNext/>
+        <w:spacing w:before="120"/>
+        <w:jc w:val="center"/>
+      </w:pPr>
+      <w:r>
+        <w:drawing>
+          <wp:inline xmlns:a="http://schemas.openxmlformats.org/drawingml/2006/main" xmlns:pic="http://schemas.openxmlformats.org/drawingml/2006/picture">
+            <wp:extent cx="4680000" cy="2546992"/>
+            <wp:docPr id="41" name="Picture 41"/>
+            <wp:cNvGraphicFramePr>
+              <a:graphicFrameLocks noChangeAspect="1"/>
+            </wp:cNvGraphicFramePr>
+            <a:graphic>
+              <a:graphicData uri="http://schemas.openxmlformats.org/drawingml/2006/picture">
+                <pic:pic>
+                  <pic:nvPicPr>
+                    <pic:cNvPr id="0" name="ch09_partizione_relazione.png"/>
+                    <pic:cNvPicPr/>
+                  </pic:nvPicPr>
+                  <pic:blipFill>
+                    <a:blip r:embed="rId47"/>
+                    <a:stretch>
+                      <a:fillRect/>
+                    </a:stretch>
+                  </pic:blipFill>
+                  <pic:spPr>
+                    <a:xfrm>
+                      <a:off x="0" y="0"/>
+                      <a:ext cx="4680000" cy="2546992"/>
+                    </a:xfrm>
+                    <a:prstGeom prst="rect"/>
+                  </pic:spPr>
+                </pic:pic>
+              </a:graphicData>
+            </a:graphic>
+          </wp:inline>
+        </w:drawing>
+      </w:r>
+    </w:p>
+    <w:p>
+      <w:pPr>
+        <w:jc w:val="center"/>
+      </w:pPr>
+      <w:r>
+        <w:rPr>
+          <w:i/>
+          <w:sz w:val="18"/>
+        </w:rPr>
+        <w:t>Partizioni e relazioni di equivalenza si corrispondono: x R y se e solo se x e y stanno nello stesso blocco.</w:t>
       </w:r>
     </w:p>
     <w:p>

</xml_diff>

<commit_message>
Mate cap. 10: figura inclusione canonica
Co-Authored-By: Claude Sonnet 5.5 <noreply@anthropic.com>
</commit_message>
<xml_diff>
--- a/Riassunto Matematica discreta.docx
+++ b/Riassunto Matematica discreta.docx
@@ -7405,13 +7405,7 @@
           <w:rPr>
             <w:rFonts w:ascii="Cambria Math" w:hAnsi="Cambria Math"/>
           </w:rPr>
-          <m:t xml:space="preserve"> </m:t>
-        </m:r>
-        <m:r>
-          <w:rPr>
-            <w:rFonts w:ascii="Cambria Math" w:hAnsi="Cambria Math"/>
-          </w:rPr>
-          <m:t>e</m:t>
+          <m:t xml:space="preserve"> e</m:t>
         </m:r>
         <m:f>
           <m:fPr>
@@ -8959,22 +8953,27 @@
         <w:jc w:val="center"/>
       </w:pPr>
       <w:r>
+        <w:rPr>
+          <w:noProof/>
+        </w:rPr>
+        <w:lastRenderedPageBreak/>
         <w:drawing>
-          <wp:inline xmlns:a="http://schemas.openxmlformats.org/drawingml/2006/main" xmlns:pic="http://schemas.openxmlformats.org/drawingml/2006/picture">
+          <wp:inline distT="0" distB="0" distL="0" distR="0" wp14:anchorId="799EF2FB" wp14:editId="61DC88F5">
             <wp:extent cx="4680000" cy="2546992"/>
+            <wp:effectExtent l="0" t="0" r="0" b="0"/>
             <wp:docPr id="41" name="Picture 41"/>
             <wp:cNvGraphicFramePr>
-              <a:graphicFrameLocks noChangeAspect="1"/>
+              <a:graphicFrameLocks xmlns:a="http://schemas.openxmlformats.org/drawingml/2006/main" noChangeAspect="1"/>
             </wp:cNvGraphicFramePr>
-            <a:graphic>
+            <a:graphic xmlns:a="http://schemas.openxmlformats.org/drawingml/2006/main">
               <a:graphicData uri="http://schemas.openxmlformats.org/drawingml/2006/picture">
-                <pic:pic>
+                <pic:pic xmlns:pic="http://schemas.openxmlformats.org/drawingml/2006/picture">
                   <pic:nvPicPr>
                     <pic:cNvPr id="0" name="ch09_partizione_relazione.png"/>
                     <pic:cNvPicPr/>
                   </pic:nvPicPr>
                   <pic:blipFill>
-                    <a:blip r:embed="rId47"/>
+                    <a:blip r:embed="rId22"/>
                     <a:stretch>
                       <a:fillRect/>
                     </a:stretch>
@@ -8984,7 +8983,9 @@
                       <a:off x="0" y="0"/>
                       <a:ext cx="4680000" cy="2546992"/>
                     </a:xfrm>
-                    <a:prstGeom prst="rect"/>
+                    <a:prstGeom prst="rect">
+                      <a:avLst/>
+                    </a:prstGeom>
                   </pic:spPr>
                 </pic:pic>
               </a:graphicData>
@@ -9025,7 +9026,25 @@
     </w:p>
     <w:p>
       <w:r>
-        <w:t>Nel percorso scolastico tradizionale, una funzione viene solitamente introdotta come un'espressione algebrica o una formula di calcolo reale y = f(x). Tuttavia, in matematica discreta e in computer science questa impostazione presenta due gravi limiti concettuali:</w:t>
+        <w:t xml:space="preserve">Nel percorso scolastico tradizionale, una </w:t>
+      </w:r>
+      <w:r>
+        <w:rPr>
+          <w:highlight w:val="yellow"/>
+        </w:rPr>
+        <w:t>funzione viene solitamente introdotta come un'espressione algebrica o una formula di calcolo reale y = f(x)</w:t>
+      </w:r>
+      <w:r>
+        <w:t xml:space="preserve">. Tuttavia, in </w:t>
+      </w:r>
+      <w:r>
+        <w:rPr>
+          <w:highlight w:val="yellow"/>
+        </w:rPr>
+        <w:t>matematica discreta e in computer science questa impostazione presenta due gravi limiti concettuali</w:t>
+      </w:r>
+      <w:r>
+        <w:t>:</w:t>
       </w:r>
     </w:p>
     <w:p>
@@ -9040,11 +9059,19 @@
           <w:b/>
           <w:bCs/>
         </w:rPr>
-        <w:lastRenderedPageBreak/>
         <w:t>Ristrettezza del Dominio</w:t>
       </w:r>
       <w:r>
-        <w:t>: Limita l'applicazione ai soli numeri reali (ℝ → ℝ), laddove gli algoritmi informatici necessitano di elaborare insiemi discreti, stringhe, grafi o oggetti astratti.</w:t>
+        <w:t xml:space="preserve">: </w:t>
+      </w:r>
+      <w:r>
+        <w:rPr>
+          <w:highlight w:val="yellow"/>
+        </w:rPr>
+        <w:t>Limita l'applicazione ai soli numeri reali (ℝ → ℝ), laddove gli algoritmi informatici necessitano di elaborare insiemi discreti, stringhe, grafi o oggetti astratti</w:t>
+      </w:r>
+      <w:r>
+        <w:t>.</w:t>
       </w:r>
     </w:p>
     <w:p>
@@ -9062,13 +9089,17 @@
         <w:t>Vincolo della Formula</w:t>
       </w:r>
       <w:r>
-        <w:t>: Richiede l'esistenza di un'espressione analitica esplicita per il calcolo dei valori, ma moltissime relazioni di corrispondenza empiriche o teoriche non dispongono di alcuna formula chiusa.</w:t>
-      </w:r>
-    </w:p>
-    <w:p>
-      <w:pPr>
-        <w:ind w:left="720"/>
-      </w:pPr>
+        <w:t xml:space="preserve">: </w:t>
+      </w:r>
+      <w:r>
+        <w:rPr>
+          <w:highlight w:val="yellow"/>
+        </w:rPr>
+        <w:t>Richiede l'esistenza di un'espressione analitica esplicita per il calcolo dei valori, ma moltissime relazioni di corrispondenza empiriche o teoriche non dispongono di alcuna formula chiusa</w:t>
+      </w:r>
+      <w:r>
+        <w:t>.</w:t>
+      </w:r>
     </w:p>
     <w:p>
       <w:pPr>
@@ -9110,12 +9141,19 @@
         <w:t>applicazione</w:t>
       </w:r>
       <w:r>
-        <w:t xml:space="preserve">) all'interno della sola teoria degli insiemi, si ribalta l'approccio classico: non si costruisce il grafico a partire dalla formula, ma </w:t>
-      </w:r>
-      <w:r>
-        <w:rPr>
-          <w:b/>
-          <w:bCs/>
+        <w:t xml:space="preserve">) all'interno della sola teoria degli insiemi, si ribalta l'approccio classico: </w:t>
+      </w:r>
+      <w:r>
+        <w:rPr>
+          <w:highlight w:val="yellow"/>
+        </w:rPr>
+        <w:t xml:space="preserve">non si costruisce il grafico a partire dalla formula, ma </w:t>
+      </w:r>
+      <w:r>
+        <w:rPr>
+          <w:b/>
+          <w:bCs/>
+          <w:highlight w:val="yellow"/>
         </w:rPr>
         <w:t>si definisce la funzione direttamente a partire dal suo grafico</w:t>
       </w:r>
@@ -9138,52 +9176,84 @@
         <w:t>Definizione Formale (Cap. 2, Def. 2.1 Mori)</w:t>
       </w:r>
       <w:r>
-        <w:t xml:space="preserve">: Siano A e B due insiemi non vuoti. Una </w:t>
-      </w:r>
-      <w:r>
-        <w:rPr>
-          <w:b/>
-          <w:bCs/>
+        <w:t xml:space="preserve">: </w:t>
+      </w:r>
+      <w:r>
+        <w:rPr>
+          <w:highlight w:val="yellow"/>
+        </w:rPr>
+        <w:t xml:space="preserve">Siano A e B due insiemi non vuoti. Una </w:t>
+      </w:r>
+      <w:r>
+        <w:rPr>
+          <w:b/>
+          <w:bCs/>
+          <w:highlight w:val="yellow"/>
         </w:rPr>
         <w:t>funzione</w:t>
       </w:r>
       <w:r>
+        <w:rPr>
+          <w:highlight w:val="yellow"/>
+        </w:rPr>
         <w:t xml:space="preserve"> f con </w:t>
       </w:r>
       <w:r>
         <w:rPr>
           <w:b/>
           <w:bCs/>
+          <w:highlight w:val="yellow"/>
         </w:rPr>
         <w:t>dominio</w:t>
       </w:r>
       <w:r>
+        <w:rPr>
+          <w:highlight w:val="yellow"/>
+        </w:rPr>
         <w:t xml:space="preserve"> A e </w:t>
       </w:r>
       <w:r>
         <w:rPr>
           <w:b/>
           <w:bCs/>
+          <w:highlight w:val="yellow"/>
         </w:rPr>
         <w:t>codominio</w:t>
       </w:r>
       <w:r>
-        <w:t xml:space="preserve"> B (indicata simbolicamente con la notazione f: A → B) è definita dall'assegnazione di un sottoinsieme Γ ⊆ A × B del prodotto cartesiano, detto </w:t>
-      </w:r>
-      <w:r>
-        <w:rPr>
-          <w:b/>
-          <w:bCs/>
+        <w:rPr>
+          <w:highlight w:val="yellow"/>
+        </w:rPr>
+        <w:t xml:space="preserve"> B</w:t>
+      </w:r>
+      <w:r>
+        <w:t xml:space="preserve"> (indicata simbolicamente con la notazione f: A → B) </w:t>
+      </w:r>
+      <w:r>
+        <w:rPr>
+          <w:highlight w:val="yellow"/>
+        </w:rPr>
+        <w:t xml:space="preserve">è definita dall'assegnazione di un sottoinsieme Γ ⊆ A × B del prodotto cartesiano, detto </w:t>
+      </w:r>
+      <w:r>
+        <w:rPr>
+          <w:b/>
+          <w:bCs/>
+          <w:highlight w:val="yellow"/>
         </w:rPr>
         <w:t>grafico della funzione</w:t>
       </w:r>
       <w:r>
+        <w:rPr>
+          <w:highlight w:val="yellow"/>
+        </w:rPr>
         <w:t xml:space="preserve">, che soddisfa la seguente </w:t>
       </w:r>
       <w:r>
         <w:rPr>
           <w:b/>
           <w:bCs/>
+          <w:highlight w:val="yellow"/>
         </w:rPr>
         <w:t>condizione di esistenza ed unicità dell'immagine</w:t>
       </w:r>
@@ -9196,6 +9266,9 @@
         <w:jc w:val="center"/>
       </w:pPr>
       <w:r>
+        <w:rPr>
+          <w:highlight w:val="yellow"/>
+        </w:rPr>
         <w:t>∀ a ∈ A,   ∃! b ∈ B   tale che   (a, b) ∈ Γ</w:t>
       </w:r>
     </w:p>
@@ -9234,7 +9307,13 @@
     </w:p>
     <w:p>
       <w:r>
-        <w:t>Nel piano cartesiano o nei diagrammi ad albero, il requisito ∃! b ∈ B impone una rigida restrizione strutturale:</w:t>
+        <w:rPr>
+          <w:highlight w:val="yellow"/>
+        </w:rPr>
+        <w:t>Nel piano cartesiano o nei diagrammi ad albero, il requisito ∃! b ∈ B impone una rigida restrizione strutturale</w:t>
+      </w:r>
+      <w:r>
+        <w:t>:</w:t>
       </w:r>
     </w:p>
     <w:p>
@@ -9252,7 +9331,16 @@
         <w:t>Esistenza</w:t>
       </w:r>
       <w:r>
-        <w:t>: Da ogni elemento a del dominio A deve partire almeno una linea/corrispondenza verso il codominio B (la funzione è definita su tutto A).</w:t>
+        <w:t xml:space="preserve">: </w:t>
+      </w:r>
+      <w:r>
+        <w:rPr>
+          <w:highlight w:val="yellow"/>
+        </w:rPr>
+        <w:t>Da ogni elemento a del dominio A deve partire almeno una linea/corrispondenza verso il codominio B</w:t>
+      </w:r>
+      <w:r>
+        <w:t xml:space="preserve"> (la funzione è definita su tutto A).</w:t>
       </w:r>
     </w:p>
     <w:p>
@@ -9267,10 +9355,20 @@
           <w:b/>
           <w:bCs/>
         </w:rPr>
+        <w:lastRenderedPageBreak/>
         <w:t>Unicità</w:t>
       </w:r>
       <w:r>
-        <w:t xml:space="preserve">: Da ciascun elemento a ∈ A non può partire più di una linea verso B. Graficamente, questo significa che </w:t>
+        <w:t xml:space="preserve">: </w:t>
+      </w:r>
+      <w:r>
+        <w:rPr>
+          <w:highlight w:val="yellow"/>
+        </w:rPr>
+        <w:t>Da ciascun elemento a ∈ A non può partire più di una linea verso B</w:t>
+      </w:r>
+      <w:r>
+        <w:t xml:space="preserve">. Graficamente, questo significa che </w:t>
       </w:r>
       <w:r>
         <w:rPr>
@@ -9309,7 +9407,7 @@
                     <pic:cNvPicPr/>
                   </pic:nvPicPr>
                   <pic:blipFill>
-                    <a:blip r:embed="rId22"/>
+                    <a:blip r:embed="rId23"/>
                     <a:stretch>
                       <a:fillRect/>
                     </a:stretch>
@@ -9413,11 +9511,10 @@
         <w:t>grafico</w:t>
       </w:r>
       <w:r>
-        <w:t xml:space="preserve"> Γ ⊆ A × B con la condizione di esistenza e unicità ∀ a ∈ A, ∃! b ∈ B tale che (a, b) ∈ Γ; dare una </w:t>
-      </w:r>
-      <w:r>
-        <w:lastRenderedPageBreak/>
-        <w:t>funzione significa dare la tripla (A, B, Γ). Quando (a, b) ∈ Γ si scrive f(a) = b, e le due scritture sono equivalenti. Lettere come f, g, h sono la scelta abituale per i nomi delle funzioni, ma non c'è alcun obbligo. Va notato che A e B possono anche essere lo stesso insieme: fa parte della definizione e capiterà spesso, con lo stesso insieme che una volta gioca da dominio e una volta da codominio.</w:t>
+        <w:t xml:space="preserve"> Γ ⊆ A × B con la condizione</w:t>
+      </w:r>
+      <w:r>
+        <w:t xml:space="preserve"> di esistenza e unicità ∀ a ∈ A, ∃! b ∈ B tale che (a, b) ∈ Γ; dare una funzione significa dare la tripla (A, B, Γ). Quando (a, b) ∈ Γ si scrive f(a) = b, e le due scritture sono equivalenti. Lettere come f, g, h sono la scelta abituale per i nomi delle funzioni, ma non c'è alcun obbligo. Va notato che A e B possono anche essere lo stesso insieme: fa parte della definizione e capiterà spesso, con lo stesso insieme che una volta gioca da dominio e una volta da codominio.</w:t>
       </w:r>
     </w:p>
     <w:p>
@@ -9453,8 +9550,8 @@
           <w:noProof/>
         </w:rPr>
         <w:drawing>
-          <wp:inline distT="0" distB="0" distL="0" distR="0" wp14:anchorId="6352B8A0" wp14:editId="7781D04D">
-            <wp:extent cx="2880000" cy="2320734"/>
+          <wp:inline distT="0" distB="0" distL="0" distR="0" wp14:anchorId="6352B8A0" wp14:editId="769C93FA">
+            <wp:extent cx="2270760" cy="1829802"/>
             <wp:effectExtent l="0" t="0" r="0" b="0"/>
             <wp:docPr id="22" name="Picture 22"/>
             <wp:cNvGraphicFramePr>
@@ -9468,7 +9565,7 @@
                     <pic:cNvPicPr/>
                   </pic:nvPicPr>
                   <pic:blipFill>
-                    <a:blip r:embed="rId23"/>
+                    <a:blip r:embed="rId24"/>
                     <a:stretch>
                       <a:fillRect/>
                     </a:stretch>
@@ -9476,7 +9573,7 @@
                   <pic:spPr>
                     <a:xfrm>
                       <a:off x="0" y="0"/>
-                      <a:ext cx="2880000" cy="2320734"/>
+                      <a:ext cx="2274698" cy="1832976"/>
                     </a:xfrm>
                     <a:prstGeom prst="rect">
                       <a:avLst/>
@@ -9502,87 +9599,6 @@
       </w:r>
     </w:p>
     <w:p>
-      <w:r>
-        <w:t>Questa descrizione a scacchiera serve a capire la definizione, ma nella pratica non si scrive così: se non c'è una formula che esprima la funzione, il modo più rapido è assegnare direttamente a ogni elemento del dominio il suo valore.</w:t>
-      </w:r>
-    </w:p>
-    <w:p>
-      <w:pPr>
-        <w:pStyle w:val="Titolo2"/>
-      </w:pPr>
-      <w:r>
-        <w:rPr>
-          <w:b/>
-          <w:color w:val="E97132"/>
-        </w:rPr>
-        <w:t>Cosa NON è una funzione</w:t>
-      </w:r>
-    </w:p>
-    <w:p>
-      <w:r>
-        <w:t>Sulla scacchiera la condizione di esistenza e unicità può fallire in due modi: se sopra un elemento di A non c'è nessuna casella segnata manca l'esistenza, se ce ne sono due o più manca l'unicità. Nell'esempio precedente, se avessimo segnato due caselle sopra l'elemento b, il valore di f in b sarebbe ambiguo e Γ non definirebbe una funzione.</w:t>
-      </w:r>
-    </w:p>
-    <w:p>
-      <w:pPr>
-        <w:keepNext/>
-        <w:spacing w:before="120"/>
-        <w:jc w:val="center"/>
-      </w:pPr>
-      <w:r>
-        <w:rPr>
-          <w:noProof/>
-        </w:rPr>
-        <w:drawing>
-          <wp:inline distT="0" distB="0" distL="0" distR="0" wp14:anchorId="4A2115AE" wp14:editId="724989DA">
-            <wp:extent cx="4320000" cy="1708277"/>
-            <wp:effectExtent l="0" t="0" r="0" b="0"/>
-            <wp:docPr id="21" name="Picture 21"/>
-            <wp:cNvGraphicFramePr>
-              <a:graphicFrameLocks xmlns:a="http://schemas.openxmlformats.org/drawingml/2006/main" noChangeAspect="1"/>
-            </wp:cNvGraphicFramePr>
-            <a:graphic xmlns:a="http://schemas.openxmlformats.org/drawingml/2006/main">
-              <a:graphicData uri="http://schemas.openxmlformats.org/drawingml/2006/picture">
-                <pic:pic xmlns:pic="http://schemas.openxmlformats.org/drawingml/2006/picture">
-                  <pic:nvPicPr>
-                    <pic:cNvPr id="0" name="ch10_non_funzione.png"/>
-                    <pic:cNvPicPr/>
-                  </pic:nvPicPr>
-                  <pic:blipFill>
-                    <a:blip r:embed="rId24"/>
-                    <a:stretch>
-                      <a:fillRect/>
-                    </a:stretch>
-                  </pic:blipFill>
-                  <pic:spPr>
-                    <a:xfrm>
-                      <a:off x="0" y="0"/>
-                      <a:ext cx="4320000" cy="1708277"/>
-                    </a:xfrm>
-                    <a:prstGeom prst="rect">
-                      <a:avLst/>
-                    </a:prstGeom>
-                  </pic:spPr>
-                </pic:pic>
-              </a:graphicData>
-            </a:graphic>
-          </wp:inline>
-        </w:drawing>
-      </w:r>
-    </w:p>
-    <w:p>
-      <w:pPr>
-        <w:jc w:val="center"/>
-      </w:pPr>
-      <w:r>
-        <w:rPr>
-          <w:i/>
-          <w:sz w:val="18"/>
-        </w:rPr>
-        <w:t>Due modi in cui Γ non definisce una funzione (caselle in rosso: l'unicità fallisce).</w:t>
-      </w:r>
-    </w:p>
-    <w:p>
       <w:pPr>
         <w:pStyle w:val="Titolo2"/>
       </w:pPr>
@@ -9597,16 +9613,29 @@
     </w:p>
     <w:p>
       <w:r>
-        <w:t xml:space="preserve">Chi è abituato alle funzioni reali di variabile reale parte sempre dal calcolare il dominio come insieme dei punti in cui l'espressione ha senso (denominatore diverso da zero, radicando maggiore o uguale a zero e così via). Qui questo passo non esiste: il dominio </w:t>
-      </w:r>
-      <w:r>
-        <w:rPr>
-          <w:b/>
+        <w:t xml:space="preserve">Chi è abituato alle funzioni reali di variabile reale parte sempre dal calcolare il dominio come insieme dei punti in cui l'espressione ha senso (denominatore diverso da zero, radicando maggiore o uguale a zero e così via). Qui questo passo non esiste: il </w:t>
+      </w:r>
+      <w:r>
+        <w:rPr>
+          <w:highlight w:val="yellow"/>
+        </w:rPr>
+        <w:t xml:space="preserve">dominio </w:t>
+      </w:r>
+      <w:r>
+        <w:rPr>
+          <w:b/>
+          <w:highlight w:val="yellow"/>
         </w:rPr>
         <w:t>viene assegnato</w:t>
       </w:r>
       <w:r>
-        <w:t xml:space="preserve"> insieme alla funzione, e si richiede che il valore f(a) esista per ogni a del dominio scelto. Dire "f(a) = b" deve essere sempre possibile, qualunque sia a ∈ A.</w:t>
+        <w:rPr>
+          <w:highlight w:val="yellow"/>
+        </w:rPr>
+        <w:t xml:space="preserve"> insieme alla funzione, e si richiede che il valore f(a) esista per ogni a del dominio scelto</w:t>
+      </w:r>
+      <w:r>
+        <w:t>. Dire "f(a) = b" deve essere sempre possibile, qualunque sia a ∈ A.</w:t>
       </w:r>
     </w:p>
     <w:p>
@@ -9623,30 +9652,95 @@
     </w:p>
     <w:p>
       <w:r>
-        <w:t xml:space="preserve">Una funzione si scrive quasi sempre f : A → B, che dice in un colpo solo dominio e codominio. Il nome si può anche mettere sopra la freccia, A →(f) B: è comodo quando si hanno più funzioni nello stesso diagramma, per esempio due funzioni f e g entrambe da A in B. Per questo motivo si parla spesso di </w:t>
-      </w:r>
-      <w:r>
-        <w:rPr>
-          <w:b/>
+        <w:t xml:space="preserve">Una funzione si scrive quasi sempre </w:t>
+      </w:r>
+      <w:r>
+        <w:rPr>
+          <w:highlight w:val="yellow"/>
+        </w:rPr>
+        <w:t>f : A → B</w:t>
+      </w:r>
+      <w:r>
+        <w:t xml:space="preserve"> (f definita in A ha valori in B)</w:t>
+      </w:r>
+      <w:r>
+        <w:t xml:space="preserve">, che dice </w:t>
+      </w:r>
+      <w:r>
+        <w:rPr>
+          <w:highlight w:val="yellow"/>
+        </w:rPr>
+        <w:t>in un colpo solo dominio e codominio</w:t>
+      </w:r>
+      <w:r>
+        <w:t xml:space="preserve">. Il nome si può anche mettere sopra la freccia, A →(f) B: è comodo quando si hanno più funzioni nello stesso diagramma, per esempio due funzioni f e g entrambe da A in B. </w:t>
+      </w:r>
+      <w:r>
+        <w:rPr>
+          <w:highlight w:val="yellow"/>
+        </w:rPr>
+        <w:t xml:space="preserve">Per questo motivo si parla spesso di </w:t>
+      </w:r>
+      <w:r>
+        <w:rPr>
+          <w:b/>
+          <w:highlight w:val="yellow"/>
         </w:rPr>
         <w:t>freccia</w:t>
       </w:r>
       <w:r>
+        <w:rPr>
+          <w:highlight w:val="yellow"/>
+        </w:rPr>
         <w:t xml:space="preserve"> (o di </w:t>
       </w:r>
       <w:r>
         <w:rPr>
           <w:b/>
+          <w:highlight w:val="yellow"/>
         </w:rPr>
         <w:t>mappa</w:t>
       </w:r>
       <w:r>
-        <w:t>) per indicare una funzione.</w:t>
-      </w:r>
-    </w:p>
-    <w:p>
-      <w:r>
-        <w:t>Per descrivere il singolo elemento si usa la freccia con il trattino, x ↦ f(x), che si legge "x va in f(x)": per esempio n ↦ a</w:t>
+        <w:rPr>
+          <w:highlight w:val="yellow"/>
+        </w:rPr>
+        <w:t>) per indicare una funzione</w:t>
+      </w:r>
+      <w:r>
+        <w:t>.</w:t>
+      </w:r>
+    </w:p>
+    <w:p>
+      <w:r>
+        <w:t xml:space="preserve">Per </w:t>
+      </w:r>
+      <w:r>
+        <w:rPr>
+          <w:highlight w:val="yellow"/>
+        </w:rPr>
+        <w:t>descrivere il singolo elemento</w:t>
+      </w:r>
+      <w:r>
+        <w:t xml:space="preserve"> si usa la freccia con il trattino, </w:t>
+      </w:r>
+      <w:r>
+        <w:rPr>
+          <w:highlight w:val="yellow"/>
+        </w:rPr>
+        <w:t>x ↦ f(x)</w:t>
+      </w:r>
+      <w:r>
+        <w:t>, che si legge "</w:t>
+      </w:r>
+      <w:r>
+        <w:rPr>
+          <w:highlight w:val="yellow"/>
+        </w:rPr>
+        <w:t>x va in f(x)</w:t>
+      </w:r>
+      <w:r>
+        <w:t>": per esempio n ↦ a</w:t>
       </w:r>
       <w:r>
         <w:rPr>
@@ -9667,97 +9761,18 @@
           <w:b/>
           <w:color w:val="E97132"/>
         </w:rPr>
-        <w:t>Rappresentazione con i diagrammi di Venn</w:t>
-      </w:r>
-    </w:p>
-    <w:p>
-      <w:r>
-        <w:t xml:space="preserve">Una funzione si può rappresentare con due ovali, uno per A e uno per B, e una freccia da ogni punto x del dominio al punto y = f(x) del codominio. Anche quando A = B conviene </w:t>
-      </w:r>
-      <w:r>
-        <w:rPr>
-          <w:b/>
-        </w:rPr>
-        <w:t>disegnare due copie separate</w:t>
-      </w:r>
-      <w:r>
-        <w:t xml:space="preserve"> dell'insieme, una come dominio e una come codominio. Un modo intuitivo di pensare a una funzione è come a una scatola con un'entrata e un'uscita: dentro entra un elemento del dominio e ne esce uno del codominio.</w:t>
-      </w:r>
-    </w:p>
-    <w:p>
-      <w:pPr>
-        <w:keepNext/>
-        <w:spacing w:before="120"/>
-        <w:jc w:val="center"/>
-      </w:pPr>
-      <w:r>
-        <w:rPr>
-          <w:noProof/>
-        </w:rPr>
-        <w:drawing>
-          <wp:inline distT="0" distB="0" distL="0" distR="0" wp14:anchorId="0A3A61A4" wp14:editId="7CC0845A">
-            <wp:extent cx="3060000" cy="2076170"/>
-            <wp:effectExtent l="0" t="0" r="0" b="0"/>
-            <wp:docPr id="20" name="Picture 20"/>
-            <wp:cNvGraphicFramePr>
-              <a:graphicFrameLocks xmlns:a="http://schemas.openxmlformats.org/drawingml/2006/main" noChangeAspect="1"/>
-            </wp:cNvGraphicFramePr>
-            <a:graphic xmlns:a="http://schemas.openxmlformats.org/drawingml/2006/main">
-              <a:graphicData uri="http://schemas.openxmlformats.org/drawingml/2006/picture">
-                <pic:pic xmlns:pic="http://schemas.openxmlformats.org/drawingml/2006/picture">
-                  <pic:nvPicPr>
-                    <pic:cNvPr id="0" name="ch10_frecce.png"/>
-                    <pic:cNvPicPr/>
-                  </pic:nvPicPr>
-                  <pic:blipFill>
-                    <a:blip r:embed="rId25"/>
-                    <a:stretch>
-                      <a:fillRect/>
-                    </a:stretch>
-                  </pic:blipFill>
-                  <pic:spPr>
-                    <a:xfrm>
-                      <a:off x="0" y="0"/>
-                      <a:ext cx="3060000" cy="2076170"/>
-                    </a:xfrm>
-                    <a:prstGeom prst="rect">
-                      <a:avLst/>
-                    </a:prstGeom>
-                  </pic:spPr>
-                </pic:pic>
-              </a:graphicData>
-            </a:graphic>
-          </wp:inline>
-        </w:drawing>
-      </w:r>
-    </w:p>
-    <w:p>
-      <w:pPr>
-        <w:jc w:val="center"/>
-      </w:pPr>
-      <w:r>
-        <w:rPr>
-          <w:i/>
-          <w:sz w:val="18"/>
-        </w:rPr>
-        <w:t>La stessa funzione con il diagramma a frecce.</w:t>
-      </w:r>
-    </w:p>
-    <w:p>
-      <w:pPr>
-        <w:pStyle w:val="Titolo2"/>
-      </w:pPr>
-      <w:r>
-        <w:rPr>
-          <w:b/>
-          <w:color w:val="E97132"/>
-        </w:rPr>
         <w:t>Quando due funzioni sono uguali</w:t>
       </w:r>
     </w:p>
     <w:p>
       <w:r>
-        <w:t xml:space="preserve">Dare una funzione significa dare tutti e tre gli oggetti (A, B, Γ), quindi f = (A, B, Γ) e g = (A′, B′, Γ′) sono </w:t>
+        <w:rPr>
+          <w:highlight w:val="yellow"/>
+        </w:rPr>
+        <w:t>Dare una funzione significa dare tutti e tre gli oggetti</w:t>
+      </w:r>
+      <w:r>
+        <w:t xml:space="preserve"> (A, B, Γ), quindi f = (A, B, Γ) e g = (A′, B′, Γ′) sono </w:t>
       </w:r>
       <w:r>
         <w:rPr>
@@ -9766,7 +9781,16 @@
         <w:t>uguali</w:t>
       </w:r>
       <w:r>
-        <w:t xml:space="preserve"> se e solo se coincidono tutti e tre: A = A′, B = B′ e Γ = Γ′. Non basta avere la stessa espressione, e non basta nemmeno avere gli stessi valori: servono anche lo stesso dominio e lo stesso codominio.</w:t>
+        <w:t xml:space="preserve"> </w:t>
+      </w:r>
+      <w:r>
+        <w:rPr>
+          <w:highlight w:val="yellow"/>
+        </w:rPr>
+        <w:t>se e solo se coincidono tutti e tre: A = A′, B = B′ e Γ = Γ′.</w:t>
+      </w:r>
+      <w:r>
+        <w:t xml:space="preserve"> Non basta avere la stessa espressione, e non basta nemmeno avere gli stessi valori: servono anche lo stesso dominio e lo stesso codominio.</w:t>
       </w:r>
     </w:p>
     <w:p>
@@ -9809,7 +9833,6 @@
     </w:p>
     <w:p>
       <w:r>
-        <w:lastRenderedPageBreak/>
         <w:t xml:space="preserve">Hanno lo stesso dominio, lo stesso codominio e lo stesso grafico, quindi </w:t>
       </w:r>
       <w:r>
@@ -9848,7 +9871,7 @@
                     <pic:cNvPicPr/>
                   </pic:nvPicPr>
                   <pic:blipFill>
-                    <a:blip r:embed="rId26"/>
+                    <a:blip r:embed="rId25"/>
                     <a:stretch>
                       <a:fillRect/>
                     </a:stretch>
@@ -9886,6 +9909,7 @@
         <w:rPr>
           <w:b/>
         </w:rPr>
+        <w:lastRenderedPageBreak/>
         <w:t>Trabocchetto d'esame:</w:t>
       </w:r>
       <w:r>
@@ -9923,7 +9947,22 @@
     </w:p>
     <w:p>
       <w:r>
-        <w:t>Esiste un piccolo elenco di funzioni standard che conviene conoscere, perché compaiono continuamente, spesso in modo implicito. Per definirle indichiamo a parole come si comporta il valore invece di scrivere esplicitamente il grafico Γ, che sarebbe macchinoso: è però importante ricordare che dietro c'è sempre la tripla (A, B, Γ).</w:t>
+        <w:rPr>
+          <w:highlight w:val="yellow"/>
+        </w:rPr>
+        <w:t>Esiste un piccolo elenco di funzioni standard che conviene conoscere, perché compaiono continuamente</w:t>
+      </w:r>
+      <w:r>
+        <w:t xml:space="preserve">, spesso in modo implicito. </w:t>
+      </w:r>
+      <w:r>
+        <w:rPr>
+          <w:highlight w:val="yellow"/>
+        </w:rPr>
+        <w:t>Per definirle indichiamo a parole come si comporta il valore invece di scrivere esplicitamente il grafico Γ</w:t>
+      </w:r>
+      <w:r>
+        <w:t>, che sarebbe macchinoso: è però importante ricordare che dietro c'è sempre la tripla (A, B, Γ).</w:t>
       </w:r>
     </w:p>
     <w:p>
@@ -9940,34 +9979,52 @@
     </w:p>
     <w:p>
       <w:r>
+        <w:rPr>
+          <w:highlight w:val="yellow"/>
+        </w:rPr>
         <w:t xml:space="preserve">Per ogni insieme A, la </w:t>
       </w:r>
       <w:r>
         <w:rPr>
           <w:b/>
+          <w:highlight w:val="yellow"/>
         </w:rPr>
         <w:t>funzione identità</w:t>
       </w:r>
       <w:r>
+        <w:rPr>
+          <w:highlight w:val="yellow"/>
+        </w:rPr>
         <w:t xml:space="preserve"> id</w:t>
       </w:r>
       <w:r>
         <w:rPr>
+          <w:highlight w:val="yellow"/>
           <w:vertAlign w:val="subscript"/>
         </w:rPr>
         <w:t>A</w:t>
       </w:r>
       <w:r>
+        <w:rPr>
+          <w:highlight w:val="yellow"/>
+        </w:rPr>
         <w:t xml:space="preserve"> : A → A è definita da id</w:t>
       </w:r>
       <w:r>
         <w:rPr>
+          <w:highlight w:val="yellow"/>
           <w:vertAlign w:val="subscript"/>
         </w:rPr>
         <w:t>A</w:t>
       </w:r>
       <w:r>
-        <w:t xml:space="preserve">(a) = a per ogni a ∈ A. Il pedice A serve perché l'identità esiste per qualunque insieme. Nell'immagine della scatola è quella che restituisce l'oggetto in entrata tale e quale, senza fargli nulla. Il suo grafico è la </w:t>
+        <w:rPr>
+          <w:highlight w:val="yellow"/>
+        </w:rPr>
+        <w:t>(a) = a per ogni a ∈ A</w:t>
+      </w:r>
+      <w:r>
+        <w:t xml:space="preserve">. Il pedice A serve perché l'identità esiste per qualunque insieme. Nell'immagine della scatola è quella che restituisce l'oggetto in entrata tale e quale, senza fargli nulla. Il suo grafico è la </w:t>
       </w:r>
       <w:r>
         <w:rPr>
@@ -9977,6 +10034,14 @@
       </w:r>
       <w:r>
         <w:t xml:space="preserve"> Δ = {(a, a) | a ∈ A}.</w:t>
+      </w:r>
+    </w:p>
+    <w:p>
+      <w:r>
+        <w:rPr>
+          <w:highlight w:val="yellow"/>
+        </w:rPr>
+        <w:t>es: f(a) = a</w:t>
       </w:r>
     </w:p>
     <w:p>
@@ -9989,7 +10054,6 @@
         <w:rPr>
           <w:noProof/>
         </w:rPr>
-        <w:lastRenderedPageBreak/>
         <w:drawing>
           <wp:inline distT="0" distB="0" distL="0" distR="0" wp14:anchorId="39DBC06E" wp14:editId="3E71FCED">
             <wp:extent cx="3060000" cy="2178167"/>
@@ -10006,7 +10070,7 @@
                     <pic:cNvPicPr/>
                   </pic:nvPicPr>
                   <pic:blipFill>
-                    <a:blip r:embed="rId27"/>
+                    <a:blip r:embed="rId26"/>
                     <a:stretch>
                       <a:fillRect/>
                     </a:stretch>
@@ -10053,34 +10117,55 @@
     </w:p>
     <w:p>
       <w:r>
-        <w:t xml:space="preserve">Si scelgono due insiemi A e B e un elemento β ∈ B fissato. La </w:t>
-      </w:r>
-      <w:r>
-        <w:rPr>
-          <w:b/>
+        <w:t xml:space="preserve">Si scelgono due insiemi A e B e un elemento β ∈ B fissato. </w:t>
+      </w:r>
+      <w:r>
+        <w:rPr>
+          <w:highlight w:val="yellow"/>
+        </w:rPr>
+        <w:t xml:space="preserve">La </w:t>
+      </w:r>
+      <w:r>
+        <w:rPr>
+          <w:b/>
+          <w:highlight w:val="yellow"/>
         </w:rPr>
         <w:t>funzione costante</w:t>
       </w:r>
       <w:r>
+        <w:rPr>
+          <w:highlight w:val="yellow"/>
+        </w:rPr>
         <w:t xml:space="preserve"> f</w:t>
       </w:r>
       <w:r>
         <w:rPr>
+          <w:highlight w:val="yellow"/>
           <w:vertAlign w:val="subscript"/>
         </w:rPr>
         <w:t>β</w:t>
       </w:r>
       <w:r>
+        <w:rPr>
+          <w:highlight w:val="yellow"/>
+        </w:rPr>
         <w:t xml:space="preserve"> : A → B è definita da f</w:t>
       </w:r>
       <w:r>
         <w:rPr>
+          <w:highlight w:val="yellow"/>
           <w:vertAlign w:val="subscript"/>
         </w:rPr>
         <w:t>β</w:t>
       </w:r>
       <w:r>
-        <w:t>(a) = β per ogni a ∈ A: qualunque cosa si inserisca nella scatola, esce sempre β. Per le funzioni numeriche il grafico è una retta orizzontale.</w:t>
+        <w:rPr>
+          <w:highlight w:val="yellow"/>
+        </w:rPr>
+        <w:t>(a) = β per ogni a ∈ A: qualunque cosa si inserisca nella scatola, esce sempre β</w:t>
+      </w:r>
+      <w:r>
+        <w:t>. Per le funzioni numeriche il grafico è una retta orizzontale.</w:t>
       </w:r>
     </w:p>
     <w:p>
@@ -10093,6 +10178,7 @@
         <w:rPr>
           <w:noProof/>
         </w:rPr>
+        <w:lastRenderedPageBreak/>
         <w:drawing>
           <wp:inline distT="0" distB="0" distL="0" distR="0" wp14:anchorId="3600D615" wp14:editId="5921B021">
             <wp:extent cx="3060000" cy="2365100"/>
@@ -10109,7 +10195,7 @@
                     <pic:cNvPicPr/>
                   </pic:nvPicPr>
                   <pic:blipFill>
-                    <a:blip r:embed="rId28"/>
+                    <a:blip r:embed="rId27"/>
                     <a:stretch>
                       <a:fillRect/>
                     </a:stretch>
@@ -10156,7 +10242,13 @@
     </w:p>
     <w:p>
       <w:r>
-        <w:t>Dati A e B, sul prodotto cartesiano A × B si definiscono due funzioni:</w:t>
+        <w:rPr>
+          <w:highlight w:val="yellow"/>
+        </w:rPr>
+        <w:t>Dati A e B, sul prodotto cartesiano A × B si definiscono due funzioni</w:t>
+      </w:r>
+      <w:r>
+        <w:t>:</w:t>
       </w:r>
     </w:p>
     <w:p>
@@ -10176,25 +10268,42 @@
         <w:t>prima proiezione</w:t>
       </w:r>
       <w:r>
-        <w:t xml:space="preserve"> p</w:t>
-      </w:r>
-      <w:r>
-        <w:rPr>
+        <w:t xml:space="preserve"> </w:t>
+      </w:r>
+      <w:r>
+        <w:rPr>
+          <w:highlight w:val="yellow"/>
+        </w:rPr>
+        <w:t>p</w:t>
+      </w:r>
+      <w:r>
+        <w:rPr>
+          <w:highlight w:val="yellow"/>
           <w:vertAlign w:val="subscript"/>
         </w:rPr>
         <w:t>1</w:t>
       </w:r>
       <w:r>
+        <w:rPr>
+          <w:highlight w:val="yellow"/>
+        </w:rPr>
         <w:t xml:space="preserve"> : A × B → A, con p</w:t>
       </w:r>
       <w:r>
         <w:rPr>
+          <w:highlight w:val="yellow"/>
           <w:vertAlign w:val="subscript"/>
         </w:rPr>
         <w:t>1</w:t>
       </w:r>
       <w:r>
-        <w:t>(a, b) = a (restituisce la prima componente della coppia);</w:t>
+        <w:rPr>
+          <w:highlight w:val="yellow"/>
+        </w:rPr>
+        <w:t>(a, b) = a (</w:t>
+      </w:r>
+      <w:r>
+        <w:t>restituisce la prima componente della coppia);</w:t>
       </w:r>
     </w:p>
     <w:p>
@@ -10214,25 +10323,42 @@
         <w:t>seconda proiezione</w:t>
       </w:r>
       <w:r>
-        <w:t xml:space="preserve"> p</w:t>
-      </w:r>
-      <w:r>
-        <w:rPr>
+        <w:t xml:space="preserve"> </w:t>
+      </w:r>
+      <w:r>
+        <w:rPr>
+          <w:highlight w:val="yellow"/>
+        </w:rPr>
+        <w:t>p</w:t>
+      </w:r>
+      <w:r>
+        <w:rPr>
+          <w:highlight w:val="yellow"/>
           <w:vertAlign w:val="subscript"/>
         </w:rPr>
         <w:t>2</w:t>
       </w:r>
       <w:r>
+        <w:rPr>
+          <w:highlight w:val="yellow"/>
+        </w:rPr>
         <w:t xml:space="preserve"> : A × B → B, con p</w:t>
       </w:r>
       <w:r>
         <w:rPr>
+          <w:highlight w:val="yellow"/>
           <w:vertAlign w:val="subscript"/>
         </w:rPr>
         <w:t>2</w:t>
       </w:r>
       <w:r>
-        <w:t>(a, b) = b (restituisce la seconda componente).</w:t>
+        <w:rPr>
+          <w:highlight w:val="yellow"/>
+        </w:rPr>
+        <w:t>(a, b) = b</w:t>
+      </w:r>
+      <w:r>
+        <w:t xml:space="preserve"> (restituisce la seconda componente).</w:t>
       </w:r>
     </w:p>
     <w:p>
@@ -10268,7 +10394,6 @@
         <w:rPr>
           <w:noProof/>
         </w:rPr>
-        <w:lastRenderedPageBreak/>
         <w:drawing>
           <wp:inline distT="0" distB="0" distL="0" distR="0" wp14:anchorId="7C6ECD48" wp14:editId="41C6478E">
             <wp:extent cx="2880000" cy="2494523"/>
@@ -10285,7 +10410,7 @@
                     <pic:cNvPicPr/>
                   </pic:nvPicPr>
                   <pic:blipFill>
-                    <a:blip r:embed="rId29"/>
+                    <a:blip r:embed="rId28"/>
                     <a:stretch>
                       <a:fillRect/>
                     </a:stretch>
@@ -10332,16 +10457,44 @@
     </w:p>
     <w:p>
       <w:r>
+        <w:rPr>
+          <w:highlight w:val="yellow"/>
+        </w:rPr>
         <w:t>Se S ⊆ A, l'</w:t>
       </w:r>
       <w:r>
         <w:rPr>
           <w:b/>
+          <w:highlight w:val="yellow"/>
         </w:rPr>
         <w:t>inclusione canonica</w:t>
       </w:r>
       <w:r>
-        <w:t xml:space="preserve"> j : S → A è definita da j(s) = s per ogni s ∈ S. Manda ogni s in sé stesso; se S = A coincide con id</w:t>
+        <w:rPr>
+          <w:highlight w:val="yellow"/>
+        </w:rPr>
+        <w:t xml:space="preserve"> </w:t>
+      </w:r>
+      <w:proofErr w:type="gramStart"/>
+      <w:r>
+        <w:rPr>
+          <w:highlight w:val="yellow"/>
+        </w:rPr>
+        <w:t>j :</w:t>
+      </w:r>
+      <w:proofErr w:type="gramEnd"/>
+      <w:r>
+        <w:rPr>
+          <w:highlight w:val="yellow"/>
+        </w:rPr>
+        <w:t xml:space="preserve"> S → A è definita da j(s) = s per ogni s ∈ S</w:t>
+      </w:r>
+      <w:r>
+        <w:t xml:space="preserve">. Manda ogni s in sé stesso; se S = A coincide con </w:t>
+      </w:r>
+      <w:proofErr w:type="spellStart"/>
+      <w:r>
+        <w:t>id</w:t>
       </w:r>
       <w:r>
         <w:rPr>
@@ -10349,6 +10502,7 @@
         </w:rPr>
         <w:t>A</w:t>
       </w:r>
+      <w:proofErr w:type="spellEnd"/>
       <w:r>
         <w:t>.</w:t>
       </w:r>
@@ -10362,6 +10516,7 @@
           <w:b/>
           <w:color w:val="E97132"/>
         </w:rPr>
+        <w:lastRenderedPageBreak/>
         <w:t>Le successioni come funzioni</w:t>
       </w:r>
     </w:p>
@@ -10418,131 +10573,6 @@
       </w:r>
       <w:r>
         <w:t>.</w:t>
-      </w:r>
-    </w:p>
-    <w:p>
-      <w:r>
-        <w:t>Dunque una successione non è altro che una funzione con dominio ℕ e codominio ℝ. Un esempio di successione è quella di Fibonacci.</w:t>
-      </w:r>
-    </w:p>
-    <w:p>
-      <w:pPr>
-        <w:pStyle w:val="Titolo2"/>
-      </w:pPr>
-      <w:r>
-        <w:rPr>
-          <w:b/>
-          <w:color w:val="E97132"/>
-        </w:rPr>
-        <w:t>La restrizione di una funzione</w:t>
-      </w:r>
-    </w:p>
-    <w:p>
-      <w:r>
-        <w:t xml:space="preserve">Sia f : A → B una funzione e sia S ⊆ A un sottoinsieme del dominio. Poiché gli elementi di S sono particolari elementi di A, f assume un valore anche su di essi. Possiamo allora definire una </w:t>
-      </w:r>
-      <w:r>
-        <w:rPr>
-          <w:b/>
-        </w:rPr>
-        <w:t>nuova funzione</w:t>
-      </w:r>
-      <w:r>
-        <w:t xml:space="preserve"> f|</w:t>
-      </w:r>
-      <w:r>
-        <w:rPr>
-          <w:vertAlign w:val="subscript"/>
-        </w:rPr>
-        <w:t>S</w:t>
-      </w:r>
-      <w:r>
-        <w:t xml:space="preserve"> : S → B, la </w:t>
-      </w:r>
-      <w:r>
-        <w:rPr>
-          <w:b/>
-        </w:rPr>
-        <w:t>restrizione di f a S</w:t>
-      </w:r>
-      <w:r>
-        <w:t>, con la stessa regola di prima: f|</w:t>
-      </w:r>
-      <w:r>
-        <w:rPr>
-          <w:vertAlign w:val="subscript"/>
-        </w:rPr>
-        <w:t>S</w:t>
-      </w:r>
-      <w:r>
-        <w:t>(s) = f(s) per ogni s ∈ S.</w:t>
-      </w:r>
-    </w:p>
-    <w:p>
-      <w:r>
-        <w:t xml:space="preserve">Si sta restringendo il dominio, lasciando invariati i valori; ma dal punto di vista concettuale </w:t>
-      </w:r>
-      <w:r>
-        <w:rPr>
-          <w:b/>
-        </w:rPr>
-        <w:t>f|</w:t>
-      </w:r>
-      <w:r>
-        <w:rPr>
-          <w:b/>
-          <w:vertAlign w:val="subscript"/>
-        </w:rPr>
-        <w:t>S</w:t>
-      </w:r>
-      <w:r>
-        <w:rPr>
-          <w:b/>
-        </w:rPr>
-        <w:t xml:space="preserve"> è una funzione diversa da f</w:t>
-      </w:r>
-      <w:r>
-        <w:t>, perché ha un dominio diverso (si ricordi il criterio di uguaglianza del capitolo 10).</w:t>
-      </w:r>
-    </w:p>
-    <w:p>
-      <w:pPr>
-        <w:pStyle w:val="Titolo2"/>
-      </w:pPr>
-      <w:r>
-        <w:rPr>
-          <w:b/>
-          <w:color w:val="E97132"/>
-        </w:rPr>
-        <w:t>Funzioni diverse con restrizioni uguali</w:t>
-      </w:r>
-    </w:p>
-    <w:p>
-      <w:r>
-        <w:t>Non è vero che due funzioni diverse restano diverse dopo la restrizione. Riprendiamo l'esempio del capitolo 10: le espressioni f(x) = 3x² − 1 e g(x) = x³ + 2x − 1 sono definite per ogni numero reale e, come funzioni su ℝ, sono diverse (hanno grafici diversi). Se però le restringiamo a S = {0, 1, 2}, diventano uguali: f|</w:t>
-      </w:r>
-      <w:r>
-        <w:rPr>
-          <w:vertAlign w:val="subscript"/>
-        </w:rPr>
-        <w:t>S</w:t>
-      </w:r>
-      <w:r>
-        <w:t xml:space="preserve"> = g|</w:t>
-      </w:r>
-      <w:r>
-        <w:rPr>
-          <w:vertAlign w:val="subscript"/>
-        </w:rPr>
-        <w:t>S</w:t>
-      </w:r>
-      <w:r>
-        <w:t>.</w:t>
-      </w:r>
-    </w:p>
-    <w:p>
-      <w:r>
-        <w:t>Lo stesso accade graficamente con due funzioni reali i cui grafici coincidono solo su un intervallo [a, b]: sono diverse su ℝ, ma se le restringiamo a S = [a, b] si ottengono due funzioni uguali. Non è detto che succeda: è una possibilità, e vedremo più avanti perché a volte conviene restringere il dominio apposta.</w:t>
       </w:r>
     </w:p>
     <w:p>
@@ -10552,10 +10582,187 @@
         <w:jc w:val="center"/>
       </w:pPr>
       <w:r>
+        <w:drawing>
+          <wp:inline xmlns:a="http://schemas.openxmlformats.org/drawingml/2006/main" xmlns:pic="http://schemas.openxmlformats.org/drawingml/2006/picture">
+            <wp:extent cx="3420000" cy="2438061"/>
+            <wp:docPr id="42" name="Picture 42"/>
+            <wp:cNvGraphicFramePr>
+              <a:graphicFrameLocks noChangeAspect="1"/>
+            </wp:cNvGraphicFramePr>
+            <a:graphic>
+              <a:graphicData uri="http://schemas.openxmlformats.org/drawingml/2006/picture">
+                <pic:pic>
+                  <pic:nvPicPr>
+                    <pic:cNvPr id="0" name="ch10_inclusione_canonica.png"/>
+                    <pic:cNvPicPr/>
+                  </pic:nvPicPr>
+                  <pic:blipFill>
+                    <a:blip r:embed="rId46"/>
+                    <a:stretch>
+                      <a:fillRect/>
+                    </a:stretch>
+                  </pic:blipFill>
+                  <pic:spPr>
+                    <a:xfrm>
+                      <a:off x="0" y="0"/>
+                      <a:ext cx="3420000" cy="2438061"/>
+                    </a:xfrm>
+                    <a:prstGeom prst="rect"/>
+                  </pic:spPr>
+                </pic:pic>
+              </a:graphicData>
+            </a:graphic>
+          </wp:inline>
+        </w:drawing>
+      </w:r>
+    </w:p>
+    <w:p>
+      <w:pPr>
+        <w:jc w:val="center"/>
+      </w:pPr>
+      <w:r>
+        <w:rPr>
+          <w:i/>
+          <w:sz w:val="18"/>
+        </w:rPr>
+        <w:t>Inclusione canonica j : S → A: ogni elemento di S va in sé stesso, visto come elemento di A.</w:t>
+      </w:r>
+    </w:p>
+    <w:p>
+      <w:r>
+        <w:t>Dunque una successione non è altro che una funzione con dominio ℕ e codominio ℝ. Un esempio di successione è quella di Fibonacci.</w:t>
+      </w:r>
+    </w:p>
+    <w:p>
+      <w:pPr>
+        <w:pStyle w:val="Titolo2"/>
+      </w:pPr>
+      <w:r>
+        <w:rPr>
+          <w:b/>
+          <w:color w:val="E97132"/>
+        </w:rPr>
+        <w:t>La restrizione di una funzione</w:t>
+      </w:r>
+    </w:p>
+    <w:p>
+      <w:r>
+        <w:t xml:space="preserve">Sia f : A → B una funzione e sia S ⊆ A un sottoinsieme del dominio. Poiché gli elementi di S sono particolari elementi di A, f assume un valore anche su di essi. Possiamo allora definire una </w:t>
+      </w:r>
+      <w:r>
+        <w:rPr>
+          <w:b/>
+        </w:rPr>
+        <w:t>nuova funzione</w:t>
+      </w:r>
+      <w:r>
+        <w:t xml:space="preserve"> f|</w:t>
+      </w:r>
+      <w:r>
+        <w:rPr>
+          <w:vertAlign w:val="subscript"/>
+        </w:rPr>
+        <w:t>S</w:t>
+      </w:r>
+      <w:r>
+        <w:t xml:space="preserve"> : S → B, la </w:t>
+      </w:r>
+      <w:r>
+        <w:rPr>
+          <w:b/>
+        </w:rPr>
+        <w:t>restrizione di f a S</w:t>
+      </w:r>
+      <w:r>
+        <w:t>, con la stessa regola di prima: f|</w:t>
+      </w:r>
+      <w:r>
+        <w:rPr>
+          <w:vertAlign w:val="subscript"/>
+        </w:rPr>
+        <w:t>S</w:t>
+      </w:r>
+      <w:r>
+        <w:t>(s) = f(s) per ogni s ∈ S.</w:t>
+      </w:r>
+    </w:p>
+    <w:p>
+      <w:r>
+        <w:t xml:space="preserve">Si sta restringendo il dominio, lasciando invariati i valori; ma dal punto di vista concettuale </w:t>
+      </w:r>
+      <w:r>
+        <w:rPr>
+          <w:b/>
+        </w:rPr>
+        <w:t>f|</w:t>
+      </w:r>
+      <w:r>
+        <w:rPr>
+          <w:b/>
+          <w:vertAlign w:val="subscript"/>
+        </w:rPr>
+        <w:t>S</w:t>
+      </w:r>
+      <w:r>
+        <w:rPr>
+          <w:b/>
+        </w:rPr>
+        <w:t xml:space="preserve"> è una funzione diversa da f</w:t>
+      </w:r>
+      <w:r>
+        <w:t>, perché ha un dominio diverso (si ricordi il criterio di uguaglianza del capitolo 10).</w:t>
+      </w:r>
+    </w:p>
+    <w:p>
+      <w:pPr>
+        <w:pStyle w:val="Titolo2"/>
+      </w:pPr>
+      <w:r>
+        <w:rPr>
+          <w:b/>
+          <w:color w:val="E97132"/>
+        </w:rPr>
+        <w:t>Funzioni diverse con restrizioni uguali</w:t>
+      </w:r>
+    </w:p>
+    <w:p>
+      <w:r>
+        <w:t>Non è vero che due funzioni diverse restano diverse dopo la restrizione. Riprendiamo l'esempio del capitolo 10: le espressioni f(x) = 3x² − 1 e g(x) = x³ + 2x − 1 sono definite per ogni numero reale e, come funzioni su ℝ, sono diverse (hanno grafici diversi). Se però le restringiamo a S = {0, 1, 2}, diventano uguali: f|</w:t>
+      </w:r>
+      <w:r>
+        <w:rPr>
+          <w:vertAlign w:val="subscript"/>
+        </w:rPr>
+        <w:t>S</w:t>
+      </w:r>
+      <w:r>
+        <w:t xml:space="preserve"> = g|</w:t>
+      </w:r>
+      <w:r>
+        <w:rPr>
+          <w:vertAlign w:val="subscript"/>
+        </w:rPr>
+        <w:t>S</w:t>
+      </w:r>
+      <w:r>
+        <w:t>.</w:t>
+      </w:r>
+    </w:p>
+    <w:p>
+      <w:r>
+        <w:t>Lo stesso accade graficamente con due funzioni reali i cui grafici coincidono solo su un intervallo [a, b]: sono diverse su ℝ, ma se le restringiamo a S = [a, b] si ottengono due funzioni uguali. Non è detto che succeda: è una possibilità, e vedremo più avanti perché a volte conviene restringere il dominio apposta.</w:t>
+      </w:r>
+    </w:p>
+    <w:p>
+      <w:pPr>
+        <w:keepNext/>
+        <w:spacing w:before="120"/>
+        <w:jc w:val="center"/>
+      </w:pPr>
+      <w:r>
         <w:rPr>
           <w:noProof/>
         </w:rPr>
-        <w:lastRenderedPageBreak/>
         <w:drawing>
           <wp:inline distT="0" distB="0" distL="0" distR="0" wp14:anchorId="6EB3EAED" wp14:editId="074865DC">
             <wp:extent cx="3420000" cy="2486480"/>
@@ -10572,7 +10779,7 @@
                     <pic:cNvPicPr/>
                   </pic:nvPicPr>
                   <pic:blipFill>
-                    <a:blip r:embed="rId30"/>
+                    <a:blip r:embed="rId29"/>
                     <a:stretch>
                       <a:fillRect/>
                     </a:stretch>
@@ -10619,6 +10826,7 @@
           <w:b/>
           <w:color w:val="EE0000"/>
         </w:rPr>
+        <w:lastRenderedPageBreak/>
         <w:t>12. Funzioni sull'Insieme Quoziente e Dipendenza dal Rappresentante</w:t>
       </w:r>
     </w:p>
@@ -10738,7 +10946,6 @@
         </w:numPr>
       </w:pPr>
       <w:r>
-        <w:lastRenderedPageBreak/>
         <w:t>F([8]) = [16] (due cifre).</w:t>
       </w:r>
     </w:p>
@@ -10773,7 +10980,7 @@
                     <pic:cNvPicPr/>
                   </pic:nvPicPr>
                   <pic:blipFill>
-                    <a:blip r:embed="rId31"/>
+                    <a:blip r:embed="rId30"/>
                     <a:stretch>
                       <a:fillRect/>
                     </a:stretch>
@@ -10815,6 +11022,7 @@
           <w:b/>
           <w:color w:val="E97132"/>
         </w:rPr>
+        <w:lastRenderedPageBreak/>
         <w:t>Che cosa bisogna verificare</w:t>
       </w:r>
     </w:p>
@@ -10941,7 +11149,6 @@
         <w:rPr>
           <w:noProof/>
         </w:rPr>
-        <w:lastRenderedPageBreak/>
         <w:drawing>
           <wp:inline distT="0" distB="0" distL="0" distR="0" wp14:anchorId="39742F3D" wp14:editId="394507EF">
             <wp:extent cx="4320000" cy="1923077"/>
@@ -10958,7 +11165,7 @@
                     <pic:cNvPicPr/>
                   </pic:nvPicPr>
                   <pic:blipFill>
-                    <a:blip r:embed="rId32"/>
+                    <a:blip r:embed="rId31"/>
                     <a:stretch>
                       <a:fillRect/>
                     </a:stretch>
@@ -11127,6 +11334,7 @@
     </w:p>
     <w:p>
       <w:r>
+        <w:lastRenderedPageBreak/>
         <w:t>Due proprietà legate a questo fatto vanno ricordate bene:</w:t>
       </w:r>
     </w:p>
@@ -11267,7 +11475,6 @@
         <w:rPr>
           <w:noProof/>
         </w:rPr>
-        <w:lastRenderedPageBreak/>
         <w:drawing>
           <wp:inline distT="0" distB="0" distL="0" distR="0" wp14:anchorId="284E2E52" wp14:editId="5A53D91A">
             <wp:extent cx="3240000" cy="2750012"/>
@@ -11284,7 +11491,7 @@
                     <pic:cNvPicPr/>
                   </pic:nvPicPr>
                   <pic:blipFill>
-                    <a:blip r:embed="rId33"/>
+                    <a:blip r:embed="rId32"/>
                     <a:stretch>
                       <a:fillRect/>
                     </a:stretch>
@@ -11357,6 +11564,7 @@
           <w:b/>
           <w:color w:val="EE0000"/>
         </w:rPr>
+        <w:lastRenderedPageBreak/>
         <w:t>14. Funzioni Suriettive, Iniettive e Biettive</w:t>
       </w:r>
     </w:p>
@@ -11485,7 +11693,6 @@
           <w:b/>
           <w:color w:val="E97132"/>
         </w:rPr>
-        <w:lastRenderedPageBreak/>
         <w:t>Biettività</w:t>
       </w:r>
     </w:p>
@@ -11538,7 +11745,7 @@
                     <pic:cNvPicPr/>
                   </pic:nvPicPr>
                   <pic:blipFill>
-                    <a:blip r:embed="rId34"/>
+                    <a:blip r:embed="rId33"/>
                     <a:stretch>
                       <a:fillRect/>
                     </a:stretch>
@@ -11629,6 +11836,7 @@
         <w:rPr>
           <w:noProof/>
         </w:rPr>
+        <w:lastRenderedPageBreak/>
         <w:drawing>
           <wp:inline distT="0" distB="0" distL="0" distR="0" wp14:anchorId="70731253" wp14:editId="0992DE8F">
             <wp:extent cx="3240000" cy="2647783"/>
@@ -11645,7 +11853,7 @@
                     <pic:cNvPicPr/>
                   </pic:nvPicPr>
                   <pic:blipFill>
-                    <a:blip r:embed="rId35"/>
+                    <a:blip r:embed="rId34"/>
                     <a:stretch>
                       <a:fillRect/>
                     </a:stretch>
@@ -11732,7 +11940,6 @@
         </w:numPr>
       </w:pPr>
       <w:r>
-        <w:lastRenderedPageBreak/>
         <w:t xml:space="preserve">k : ℝ → ℝ, k(x) = x³ è </w:t>
       </w:r>
       <w:r>
@@ -11819,6 +12026,7 @@
         <w:rPr>
           <w:noProof/>
         </w:rPr>
+        <w:lastRenderedPageBreak/>
         <w:drawing>
           <wp:inline distT="0" distB="0" distL="0" distR="0" wp14:anchorId="6270D6B5" wp14:editId="1DE9D7E4">
             <wp:extent cx="4140000" cy="2328492"/>
@@ -11835,7 +12043,7 @@
                     <pic:cNvPicPr/>
                   </pic:nvPicPr>
                   <pic:blipFill>
-                    <a:blip r:embed="rId36"/>
+                    <a:blip r:embed="rId35"/>
                     <a:stretch>
                       <a:fillRect/>
                     </a:stretch>
@@ -12050,7 +12258,6 @@
         <w:rPr>
           <w:noProof/>
         </w:rPr>
-        <w:lastRenderedPageBreak/>
         <w:drawing>
           <wp:inline distT="0" distB="0" distL="0" distR="0" wp14:anchorId="2F0BFC27" wp14:editId="79D53217">
             <wp:extent cx="3240000" cy="2198571"/>
@@ -12067,7 +12274,7 @@
                     <pic:cNvPicPr/>
                   </pic:nvPicPr>
                   <pic:blipFill>
-                    <a:blip r:embed="rId37"/>
+                    <a:blip r:embed="rId36"/>
                     <a:stretch>
                       <a:fillRect/>
                     </a:stretch>
@@ -12132,6 +12339,7 @@
           <w:b/>
           <w:color w:val="EE0000"/>
         </w:rPr>
+        <w:lastRenderedPageBreak/>
         <w:t>16. Verificare Iniettività e Suriettività: Esempi</w:t>
       </w:r>
     </w:p>
@@ -12293,7 +12501,6 @@
         <w:rPr>
           <w:noProof/>
         </w:rPr>
-        <w:lastRenderedPageBreak/>
         <w:drawing>
           <wp:inline distT="0" distB="0" distL="0" distR="0" wp14:anchorId="02EF98F7" wp14:editId="3CCBF1E7">
             <wp:extent cx="2880000" cy="2302384"/>
@@ -12310,7 +12517,7 @@
                     <pic:cNvPicPr/>
                   </pic:nvPicPr>
                   <pic:blipFill>
-                    <a:blip r:embed="rId38"/>
+                    <a:blip r:embed="rId37"/>
                     <a:stretch>
                       <a:fillRect/>
                     </a:stretch>
@@ -12408,6 +12615,7 @@
         <w:rPr>
           <w:b/>
         </w:rPr>
+        <w:lastRenderedPageBreak/>
         <w:t>Iniettività.</w:t>
       </w:r>
       <w:r>
@@ -12451,7 +12659,7 @@
                     <pic:cNvPicPr/>
                   </pic:nvPicPr>
                   <pic:blipFill>
-                    <a:blip r:embed="rId39"/>
+                    <a:blip r:embed="rId38"/>
                     <a:stretch>
                       <a:fillRect/>
                     </a:stretch>
@@ -12493,7 +12701,6 @@
           <w:b/>
           <w:color w:val="E97132"/>
         </w:rPr>
-        <w:lastRenderedPageBreak/>
         <w:t>Gli stessi calcoli su ℤ: la suriettività cade</w:t>
       </w:r>
     </w:p>
@@ -12551,7 +12758,7 @@
                     <pic:cNvPicPr/>
                   </pic:nvPicPr>
                   <pic:blipFill>
-                    <a:blip r:embed="rId40"/>
+                    <a:blip r:embed="rId39"/>
                     <a:stretch>
                       <a:fillRect/>
                     </a:stretch>
@@ -12598,6 +12805,7 @@
           <w:b/>
           <w:color w:val="EE0000"/>
         </w:rPr>
+        <w:lastRenderedPageBreak/>
         <w:t>17. Rendere Biettiva una Funzione: Cambiare Codominio e Dominio</w:t>
       </w:r>
     </w:p>
@@ -12712,7 +12920,6 @@
         <w:rPr>
           <w:b/>
         </w:rPr>
-        <w:lastRenderedPageBreak/>
         <w:t>Passo 2: restringere il dominio.</w:t>
       </w:r>
       <w:r>
@@ -12799,7 +13006,7 @@
                     <pic:cNvPicPr/>
                   </pic:nvPicPr>
                   <pic:blipFill>
-                    <a:blip r:embed="rId41"/>
+                    <a:blip r:embed="rId40"/>
                     <a:stretch>
                       <a:fillRect/>
                     </a:stretch>
@@ -12857,6 +13064,7 @@
         </w:numPr>
       </w:pPr>
       <w:r>
+        <w:lastRenderedPageBreak/>
         <w:t>sen : ℝ → ℝ non è suriettiva (il grafico è tutto contenuto tra −1 e 1, quindi un valore come 2 non viene mai raggiunto) e non è iniettiva (una retta orizzontale a quota tra −1 e 1 incontra la curva in tanti punti: tanti valori di x danno lo stesso valore del seno).</w:t>
       </w:r>
     </w:p>
@@ -12917,7 +13125,7 @@
                     <pic:cNvPicPr/>
                   </pic:nvPicPr>
                   <pic:blipFill>
-                    <a:blip r:embed="rId42"/>
+                    <a:blip r:embed="rId41"/>
                     <a:stretch>
                       <a:fillRect/>
                     </a:stretch>
@@ -12952,25 +13160,101 @@
     </w:p>
     <w:p>
       <w:r>
+        <w:t>Un discorso analogo si fa per il coseno (che ha lo stesso grafico traslato) e per la tangente. Nella tangente, che ha asintoti, non si prende un intervallo chiuso ma l'intervallo aperto (−π/2, π/2) come dominio e tutta la retta come codominio: la funzione risulta biettiva.</w:t>
+      </w:r>
+    </w:p>
+    <w:p>
+      <w:r>
+        <w:t>Sono costruzioni che si conoscono già, anche se non in questa forma. Funzioni iniettive e suriettive le incontreremo man mano nel corso.</w:t>
+      </w:r>
+    </w:p>
+    <w:p>
+      <w:pPr>
+        <w:pStyle w:val="Titolo1"/>
+      </w:pPr>
+      <w:r>
+        <w:rPr>
+          <w:b/>
+          <w:color w:val="EE0000"/>
+        </w:rPr>
+        <w:t>18. La Composizione di Funzioni: Ordine, Associatività e Identità</w:t>
+      </w:r>
+    </w:p>
+    <w:p>
+      <w:pPr>
+        <w:pStyle w:val="Titolo2"/>
+      </w:pPr>
+      <w:r>
+        <w:rPr>
+          <w:b/>
+          <w:color w:val="E97132"/>
+        </w:rPr>
+        <w:t>Costruire una nuova funzione</w:t>
+      </w:r>
+    </w:p>
+    <w:p>
+      <w:r>
+        <w:t xml:space="preserve">Siano f : A → B e g : B → C due funzioni. Dato un elemento a ∈ A possiamo calcolare la sua immagine f(a) ∈ B; questo elemento sta nel dominio di g, quindi possiamo calcolare g(f(a)) ∈ C. Dimenticando il passaggio intermedio abbiamo costruito una funzione con dominio A e codominio C: è la </w:t>
+      </w:r>
+      <w:r>
+        <w:rPr>
+          <w:b/>
+        </w:rPr>
+        <w:t>composizione</w:t>
+      </w:r>
+      <w:r>
+        <w:t xml:space="preserve"> di f e g, indicata con g ∘ f, e vale</w:t>
+      </w:r>
+    </w:p>
+    <w:p>
+      <w:r>
+        <w:t>(g ∘ f)(a) = g(f(a)).</w:t>
+      </w:r>
+    </w:p>
+    <w:p>
+      <w:r>
+        <w:t>Gli insiemi A, B, C possono essere diversi, ma nulla esclude che alcuni di essi, o tutti, coincidano. La definizione è già nel capitolo 15; qui si vedono le proprietà con le dimostrazioni.</w:t>
+      </w:r>
+    </w:p>
+    <w:p>
+      <w:pPr>
+        <w:pStyle w:val="Titolo2"/>
+      </w:pPr>
+      <w:r>
+        <w:rPr>
+          <w:b/>
+          <w:color w:val="E97132"/>
+        </w:rPr>
+        <w:t>L'ordine di scrittura</w:t>
+      </w:r>
+    </w:p>
+    <w:p>
+      <w:r>
+        <w:t xml:space="preserve">Questo è un punto che all'inizio confonde: </w:t>
+      </w:r>
+      <w:r>
+        <w:rPr>
+          <w:b/>
+        </w:rPr>
+        <w:t>la funzione che si applica per prima si scrive per seconda</w:t>
+      </w:r>
+      <w:r>
+        <w:t>. In g ∘ f si calcola prima f e poi g, perché nell'espressione g(f(a)) la funzione più vicina all'elemento a è f. Si legge "g composto f", oppure "g tondino f".</w:t>
+      </w:r>
+    </w:p>
+    <w:p>
+      <w:r>
         <w:lastRenderedPageBreak/>
-        <w:t>Un discorso analogo si fa per il coseno (che ha lo stesso grafico traslato) e per la tangente. Nella tangente, che ha asintoti, non si prende un intervallo chiuso ma l'intervallo aperto (−π/2, π/2) come dominio e tutta la retta come codominio: la funzione risulta biettiva.</w:t>
-      </w:r>
-    </w:p>
-    <w:p>
-      <w:r>
-        <w:t>Sono costruzioni che si conoscono già, anche se non in questa forma. Funzioni iniettive e suriettive le incontreremo man mano nel corso.</w:t>
-      </w:r>
-    </w:p>
-    <w:p>
-      <w:pPr>
-        <w:pStyle w:val="Titolo1"/>
-      </w:pPr>
-      <w:r>
-        <w:rPr>
-          <w:b/>
-          <w:color w:val="EE0000"/>
-        </w:rPr>
-        <w:t>18. La Composizione di Funzioni: Ordine, Associatività e Identità</w:t>
+        <w:t xml:space="preserve">La composizione si può fare solo se c'è </w:t>
+      </w:r>
+      <w:r>
+        <w:rPr>
+          <w:b/>
+        </w:rPr>
+        <w:t>concordanza</w:t>
+      </w:r>
+      <w:r>
+        <w:t xml:space="preserve"> tra il codominio della prima funzione e il dominio della seconda (a lezione si prende il caso in cui coincidono): l'elemento f(a) deve appartenere al dominio di g, altrimenti non sappiamo dove calcolare g.</w:t>
       </w:r>
     </w:p>
     <w:p>
@@ -12982,82 +13266,6 @@
           <w:b/>
           <w:color w:val="E97132"/>
         </w:rPr>
-        <w:t>Costruire una nuova funzione</w:t>
-      </w:r>
-    </w:p>
-    <w:p>
-      <w:r>
-        <w:t xml:space="preserve">Siano f : A → B e g : B → C due funzioni. Dato un elemento a ∈ A possiamo calcolare la sua immagine f(a) ∈ B; questo elemento sta nel dominio di g, quindi possiamo calcolare g(f(a)) ∈ C. Dimenticando il passaggio intermedio abbiamo costruito una funzione con dominio A e codominio C: è la </w:t>
-      </w:r>
-      <w:r>
-        <w:rPr>
-          <w:b/>
-        </w:rPr>
-        <w:t>composizione</w:t>
-      </w:r>
-      <w:r>
-        <w:t xml:space="preserve"> di f e g, indicata con g ∘ f, e vale</w:t>
-      </w:r>
-    </w:p>
-    <w:p>
-      <w:r>
-        <w:t>(g ∘ f)(a) = g(f(a)).</w:t>
-      </w:r>
-    </w:p>
-    <w:p>
-      <w:r>
-        <w:t>Gli insiemi A, B, C possono essere diversi, ma nulla esclude che alcuni di essi, o tutti, coincidano. La definizione è già nel capitolo 15; qui si vedono le proprietà con le dimostrazioni.</w:t>
-      </w:r>
-    </w:p>
-    <w:p>
-      <w:pPr>
-        <w:pStyle w:val="Titolo2"/>
-      </w:pPr>
-      <w:r>
-        <w:rPr>
-          <w:b/>
-          <w:color w:val="E97132"/>
-        </w:rPr>
-        <w:t>L'ordine di scrittura</w:t>
-      </w:r>
-    </w:p>
-    <w:p>
-      <w:r>
-        <w:t xml:space="preserve">Questo è un punto che all'inizio confonde: </w:t>
-      </w:r>
-      <w:r>
-        <w:rPr>
-          <w:b/>
-        </w:rPr>
-        <w:t>la funzione che si applica per prima si scrive per seconda</w:t>
-      </w:r>
-      <w:r>
-        <w:t>. In g ∘ f si calcola prima f e poi g, perché nell'espressione g(f(a)) la funzione più vicina all'elemento a è f. Si legge "g composto f", oppure "g tondino f".</w:t>
-      </w:r>
-    </w:p>
-    <w:p>
-      <w:r>
-        <w:t xml:space="preserve">La composizione si può fare solo se c'è </w:t>
-      </w:r>
-      <w:r>
-        <w:rPr>
-          <w:b/>
-        </w:rPr>
-        <w:t>concordanza</w:t>
-      </w:r>
-      <w:r>
-        <w:t xml:space="preserve"> tra il codominio della prima funzione e il dominio della seconda (a lezione si prende il caso in cui coincidono): l'elemento f(a) deve appartenere al dominio di g, altrimenti non sappiamo dove calcolare g.</w:t>
-      </w:r>
-    </w:p>
-    <w:p>
-      <w:pPr>
-        <w:pStyle w:val="Titolo2"/>
-      </w:pPr>
-      <w:r>
-        <w:rPr>
-          <w:b/>
-          <w:color w:val="E97132"/>
-        </w:rPr>
         <w:t>Più di due funzioni e associatività</w:t>
       </w:r>
     </w:p>
@@ -13118,7 +13326,6 @@
     </w:p>
     <w:p>
       <w:r>
-        <w:lastRenderedPageBreak/>
         <w:t xml:space="preserve">I due risultati coincidono per ogni a, quindi le due funzioni sono uguali. L'associatività permette di comporre a coppie come si preferisce, purché si </w:t>
       </w:r>
       <w:r>
@@ -13251,6 +13458,7 @@
         <w:rPr>
           <w:noProof/>
         </w:rPr>
+        <w:lastRenderedPageBreak/>
         <w:drawing>
           <wp:inline distT="0" distB="0" distL="0" distR="0" wp14:anchorId="0F03B902" wp14:editId="1CDD2BEA">
             <wp:extent cx="3240000" cy="2342036"/>
@@ -13267,7 +13475,7 @@
                     <pic:cNvPicPr/>
                   </pic:nvPicPr>
                   <pic:blipFill>
-                    <a:blip r:embed="rId43"/>
+                    <a:blip r:embed="rId42"/>
                     <a:stretch>
                       <a:fillRect/>
                     </a:stretch>
@@ -13400,7 +13608,6 @@
     </w:p>
     <w:p>
       <w:r>
-        <w:lastRenderedPageBreak/>
         <w:t>Dunque f ∘ id</w:t>
       </w:r>
       <w:r>
@@ -13529,6 +13736,7 @@
         <w:rPr>
           <w:b/>
         </w:rPr>
+        <w:lastRenderedPageBreak/>
         <w:t>Dimostrazione (suriettività).</w:t>
       </w:r>
       <w:r>
@@ -13655,7 +13863,6 @@
     </w:p>
     <w:p>
       <w:r>
-        <w:lastRenderedPageBreak/>
         <w:t>3. Quindi ogni y ∈ C è immagine tramite g di un elemento di B: g è suriettiva.</w:t>
       </w:r>
     </w:p>
@@ -13701,7 +13908,7 @@
                     <pic:cNvPicPr/>
                   </pic:nvPicPr>
                   <pic:blipFill>
-                    <a:blip r:embed="rId44"/>
+                    <a:blip r:embed="rId43"/>
                     <a:stretch>
                       <a:fillRect/>
                     </a:stretch>
@@ -13776,6 +13983,7 @@
     </w:p>
     <w:p>
       <w:r>
+        <w:lastRenderedPageBreak/>
         <w:t>Applichiamo (∗) a ciascuna delle due uguaglianze:</w:t>
       </w:r>
     </w:p>

</xml_diff>

<commit_message>
Mate cap. 10: figura inclusione canonica spostata dopo il suo paragrafo; inserisci_figure.py: controllo dell'ancora
Co-Authored-By: Claude Sonnet 5.5 <noreply@anthropic.com>
</commit_message>
<xml_diff>
--- a/Riassunto Matematica discreta.docx
+++ b/Riassunto Matematica discreta.docx
@@ -10509,74 +10509,6 @@
     </w:p>
     <w:p>
       <w:pPr>
-        <w:pStyle w:val="Titolo2"/>
-      </w:pPr>
-      <w:r>
-        <w:rPr>
-          <w:b/>
-          <w:color w:val="E97132"/>
-        </w:rPr>
-        <w:lastRenderedPageBreak/>
-        <w:t>Le successioni come funzioni</w:t>
-      </w:r>
-    </w:p>
-    <w:p>
-      <w:r>
-        <w:t xml:space="preserve">Una </w:t>
-      </w:r>
-      <w:r>
-        <w:rPr>
-          <w:b/>
-        </w:rPr>
-        <w:t>successione</w:t>
-      </w:r>
-      <w:r>
-        <w:t xml:space="preserve"> è una lista di numeri a</w:t>
-      </w:r>
-      <w:r>
-        <w:rPr>
-          <w:vertAlign w:val="subscript"/>
-        </w:rPr>
-        <w:t>0</w:t>
-      </w:r>
-      <w:r>
-        <w:t>, a</w:t>
-      </w:r>
-      <w:r>
-        <w:rPr>
-          <w:vertAlign w:val="subscript"/>
-        </w:rPr>
-        <w:t>1</w:t>
-      </w:r>
-      <w:r>
-        <w:t>, a</w:t>
-      </w:r>
-      <w:r>
-        <w:rPr>
-          <w:vertAlign w:val="subscript"/>
-        </w:rPr>
-        <w:t>2</w:t>
-      </w:r>
-      <w:r>
-        <w:t>, … (si può partire da 0 o da 1, è irrilevante). Assegnare una successione di numeri reali significa assegnare un valore reale a 0, uno a 1, uno a 2 e così via, cioè definire una funzione</w:t>
-      </w:r>
-    </w:p>
-    <w:p>
-      <w:r>
-        <w:t>a : ℕ → ℝ, n ↦ a</w:t>
-      </w:r>
-      <w:r>
-        <w:rPr>
-          <w:vertAlign w:val="subscript"/>
-        </w:rPr>
-        <w:t>n</w:t>
-      </w:r>
-      <w:r>
-        <w:t>.</w:t>
-      </w:r>
-    </w:p>
-    <w:p>
-      <w:pPr>
         <w:keepNext/>
         <w:spacing w:before="120"/>
         <w:jc w:val="center"/>
@@ -10626,6 +10558,74 @@
           <w:sz w:val="18"/>
         </w:rPr>
         <w:t>Inclusione canonica j : S → A: ogni elemento di S va in sé stesso, visto come elemento di A.</w:t>
+      </w:r>
+    </w:p>
+    <w:p>
+      <w:pPr>
+        <w:pStyle w:val="Titolo2"/>
+      </w:pPr>
+      <w:r>
+        <w:rPr>
+          <w:b/>
+          <w:color w:val="E97132"/>
+        </w:rPr>
+        <w:lastRenderedPageBreak/>
+        <w:t>Le successioni come funzioni</w:t>
+      </w:r>
+    </w:p>
+    <w:p>
+      <w:r>
+        <w:t xml:space="preserve">Una </w:t>
+      </w:r>
+      <w:r>
+        <w:rPr>
+          <w:b/>
+        </w:rPr>
+        <w:t>successione</w:t>
+      </w:r>
+      <w:r>
+        <w:t xml:space="preserve"> è una lista di numeri a</w:t>
+      </w:r>
+      <w:r>
+        <w:rPr>
+          <w:vertAlign w:val="subscript"/>
+        </w:rPr>
+        <w:t>0</w:t>
+      </w:r>
+      <w:r>
+        <w:t>, a</w:t>
+      </w:r>
+      <w:r>
+        <w:rPr>
+          <w:vertAlign w:val="subscript"/>
+        </w:rPr>
+        <w:t>1</w:t>
+      </w:r>
+      <w:r>
+        <w:t>, a</w:t>
+      </w:r>
+      <w:r>
+        <w:rPr>
+          <w:vertAlign w:val="subscript"/>
+        </w:rPr>
+        <w:t>2</w:t>
+      </w:r>
+      <w:r>
+        <w:t>, … (si può partire da 0 o da 1, è irrilevante). Assegnare una successione di numeri reali significa assegnare un valore reale a 0, uno a 1, uno a 2 e così via, cioè definire una funzione</w:t>
+      </w:r>
+    </w:p>
+    <w:p>
+      <w:r>
+        <w:t>a : ℕ → ℝ, n ↦ a</w:t>
+      </w:r>
+      <w:r>
+        <w:rPr>
+          <w:vertAlign w:val="subscript"/>
+        </w:rPr>
+        <w:t>n</w:t>
+      </w:r>
+      <w:r>
+        <w:t>.</w:t>
       </w:r>
     </w:p>
     <w:p>

</xml_diff>

<commit_message>
Mate cap. 10: figura restrizione; Quaderno aggiornato
Co-Authored-By: Claude Sonnet 5.5 <noreply@anthropic.com>
</commit_message>
<xml_diff>
--- a/Riassunto Matematica discreta.docx
+++ b/Riassunto Matematica discreta.docx
@@ -10514,22 +10514,27 @@
         <w:jc w:val="center"/>
       </w:pPr>
       <w:r>
+        <w:rPr>
+          <w:noProof/>
+        </w:rPr>
+        <w:lastRenderedPageBreak/>
         <w:drawing>
-          <wp:inline xmlns:a="http://schemas.openxmlformats.org/drawingml/2006/main" xmlns:pic="http://schemas.openxmlformats.org/drawingml/2006/picture">
+          <wp:inline distT="0" distB="0" distL="0" distR="0" wp14:anchorId="22956EC9" wp14:editId="59C7D89B">
             <wp:extent cx="3420000" cy="2438061"/>
+            <wp:effectExtent l="0" t="0" r="0" b="0"/>
             <wp:docPr id="42" name="Picture 42"/>
             <wp:cNvGraphicFramePr>
-              <a:graphicFrameLocks noChangeAspect="1"/>
+              <a:graphicFrameLocks xmlns:a="http://schemas.openxmlformats.org/drawingml/2006/main" noChangeAspect="1"/>
             </wp:cNvGraphicFramePr>
-            <a:graphic>
+            <a:graphic xmlns:a="http://schemas.openxmlformats.org/drawingml/2006/main">
               <a:graphicData uri="http://schemas.openxmlformats.org/drawingml/2006/picture">
-                <pic:pic>
+                <pic:pic xmlns:pic="http://schemas.openxmlformats.org/drawingml/2006/picture">
                   <pic:nvPicPr>
                     <pic:cNvPr id="0" name="ch10_inclusione_canonica.png"/>
                     <pic:cNvPicPr/>
                   </pic:nvPicPr>
                   <pic:blipFill>
-                    <a:blip r:embed="rId46"/>
+                    <a:blip r:embed="rId29"/>
                     <a:stretch>
                       <a:fillRect/>
                     </a:stretch>
@@ -10539,6 +10544,295 @@
                       <a:off x="0" y="0"/>
                       <a:ext cx="3420000" cy="2438061"/>
                     </a:xfrm>
+                    <a:prstGeom prst="rect">
+                      <a:avLst/>
+                    </a:prstGeom>
+                  </pic:spPr>
+                </pic:pic>
+              </a:graphicData>
+            </a:graphic>
+          </wp:inline>
+        </w:drawing>
+      </w:r>
+    </w:p>
+    <w:p>
+      <w:pPr>
+        <w:jc w:val="center"/>
+      </w:pPr>
+      <w:r>
+        <w:rPr>
+          <w:i/>
+          <w:sz w:val="18"/>
+        </w:rPr>
+        <w:t>Inclusione canonica j : S → A: ogni elemento di S va in sé stesso, visto come elemento di A.</w:t>
+      </w:r>
+    </w:p>
+    <w:p>
+      <w:pPr>
+        <w:pStyle w:val="Titolo2"/>
+      </w:pPr>
+      <w:r>
+        <w:rPr>
+          <w:b/>
+          <w:color w:val="E97132"/>
+        </w:rPr>
+        <w:t>Le successioni come funzioni</w:t>
+      </w:r>
+    </w:p>
+    <w:p>
+      <w:r>
+        <w:t xml:space="preserve">Una </w:t>
+      </w:r>
+      <w:r>
+        <w:rPr>
+          <w:b/>
+          <w:highlight w:val="yellow"/>
+        </w:rPr>
+        <w:t>successione</w:t>
+      </w:r>
+      <w:r>
+        <w:t xml:space="preserve"> è una </w:t>
+      </w:r>
+      <w:r>
+        <w:rPr>
+          <w:highlight w:val="yellow"/>
+        </w:rPr>
+        <w:t>lista di numeri a</w:t>
+      </w:r>
+      <w:r>
+        <w:rPr>
+          <w:highlight w:val="yellow"/>
+          <w:vertAlign w:val="subscript"/>
+        </w:rPr>
+        <w:t>0</w:t>
+      </w:r>
+      <w:r>
+        <w:rPr>
+          <w:highlight w:val="yellow"/>
+        </w:rPr>
+        <w:t>, a</w:t>
+      </w:r>
+      <w:r>
+        <w:rPr>
+          <w:highlight w:val="yellow"/>
+          <w:vertAlign w:val="subscript"/>
+        </w:rPr>
+        <w:t>1</w:t>
+      </w:r>
+      <w:r>
+        <w:rPr>
+          <w:highlight w:val="yellow"/>
+        </w:rPr>
+        <w:t>, a</w:t>
+      </w:r>
+      <w:r>
+        <w:rPr>
+          <w:highlight w:val="yellow"/>
+          <w:vertAlign w:val="subscript"/>
+        </w:rPr>
+        <w:t>2</w:t>
+      </w:r>
+      <w:r>
+        <w:rPr>
+          <w:highlight w:val="yellow"/>
+        </w:rPr>
+        <w:t>,</w:t>
+      </w:r>
+      <w:r>
+        <w:t xml:space="preserve"> … (si può partire da 0 o da 1, è irrilevante). </w:t>
+      </w:r>
+      <w:r>
+        <w:rPr>
+          <w:highlight w:val="yellow"/>
+        </w:rPr>
+        <w:t>Assegnare una successione di numeri reali significa assegnare un valore reale a 0, uno a 1, uno a 2 e così via, cioè definire una funzione</w:t>
+      </w:r>
+    </w:p>
+    <w:p>
+      <w:r>
+        <w:t>a : ℕ → ℝ, n ↦ a</w:t>
+      </w:r>
+      <w:r>
+        <w:rPr>
+          <w:vertAlign w:val="subscript"/>
+        </w:rPr>
+        <w:t>n</w:t>
+      </w:r>
+      <w:r>
+        <w:t>.</w:t>
+      </w:r>
+    </w:p>
+    <w:p>
+      <w:r>
+        <w:t>Dunque una successione non è altro che una funzione con dominio ℕ e codominio ℝ. Un esempio di successione è quella di Fibonacci.</w:t>
+      </w:r>
+    </w:p>
+    <w:p>
+      <w:pPr>
+        <w:pStyle w:val="Titolo2"/>
+      </w:pPr>
+      <w:r>
+        <w:rPr>
+          <w:b/>
+          <w:color w:val="E97132"/>
+        </w:rPr>
+        <w:t>La restrizione di una funzione</w:t>
+      </w:r>
+    </w:p>
+    <w:p>
+      <w:r>
+        <w:t xml:space="preserve">Sia </w:t>
+      </w:r>
+      <w:proofErr w:type="gramStart"/>
+      <w:r>
+        <w:t>f :</w:t>
+      </w:r>
+      <w:proofErr w:type="gramEnd"/>
+      <w:r>
+        <w:t xml:space="preserve"> A → B una funzione e </w:t>
+      </w:r>
+      <w:r>
+        <w:rPr>
+          <w:highlight w:val="yellow"/>
+        </w:rPr>
+        <w:t>sia S ⊆ A un sottoinsieme del dominio</w:t>
+      </w:r>
+      <w:r>
+        <w:t xml:space="preserve">. Poiché gli elementi di S sono particolari elementi di A, f assume un valore anche su di essi. </w:t>
+      </w:r>
+      <w:r>
+        <w:rPr>
+          <w:highlight w:val="yellow"/>
+        </w:rPr>
+        <w:t xml:space="preserve">Possiamo allora definire una </w:t>
+      </w:r>
+      <w:r>
+        <w:rPr>
+          <w:b/>
+          <w:highlight w:val="yellow"/>
+        </w:rPr>
+        <w:t>nuova funzione</w:t>
+      </w:r>
+      <w:r>
+        <w:rPr>
+          <w:highlight w:val="yellow"/>
+        </w:rPr>
+        <w:t xml:space="preserve"> f|</w:t>
+      </w:r>
+      <w:r>
+        <w:rPr>
+          <w:highlight w:val="yellow"/>
+          <w:vertAlign w:val="subscript"/>
+        </w:rPr>
+        <w:t>S</w:t>
+      </w:r>
+      <w:r>
+        <w:rPr>
+          <w:highlight w:val="yellow"/>
+        </w:rPr>
+        <w:t xml:space="preserve"> : S → B, la </w:t>
+      </w:r>
+      <w:r>
+        <w:rPr>
+          <w:b/>
+          <w:highlight w:val="yellow"/>
+        </w:rPr>
+        <w:t>restrizione di f a S</w:t>
+      </w:r>
+      <w:r>
+        <w:rPr>
+          <w:highlight w:val="yellow"/>
+        </w:rPr>
+        <w:t>, con la stessa regola di prima: f|</w:t>
+      </w:r>
+      <w:r>
+        <w:rPr>
+          <w:highlight w:val="yellow"/>
+          <w:vertAlign w:val="subscript"/>
+        </w:rPr>
+        <w:t>S</w:t>
+      </w:r>
+      <w:r>
+        <w:rPr>
+          <w:highlight w:val="yellow"/>
+        </w:rPr>
+        <w:t>(s) = f(s) per ogni s ∈ S</w:t>
+      </w:r>
+      <w:r>
+        <w:t>.</w:t>
+      </w:r>
+    </w:p>
+    <w:p>
+      <w:r>
+        <w:rPr>
+          <w:highlight w:val="yellow"/>
+        </w:rPr>
+        <w:t xml:space="preserve">Si sta restringendo il dominio, lasciando invariati i valori; ma dal punto di vista concettuale </w:t>
+      </w:r>
+      <w:r>
+        <w:rPr>
+          <w:b/>
+          <w:highlight w:val="yellow"/>
+        </w:rPr>
+        <w:t>f|</w:t>
+      </w:r>
+      <w:r>
+        <w:rPr>
+          <w:b/>
+          <w:highlight w:val="yellow"/>
+          <w:vertAlign w:val="subscript"/>
+        </w:rPr>
+        <w:t>S</w:t>
+      </w:r>
+      <w:r>
+        <w:rPr>
+          <w:b/>
+          <w:highlight w:val="yellow"/>
+        </w:rPr>
+        <w:t xml:space="preserve"> è una funzione diversa da f</w:t>
+      </w:r>
+      <w:r>
+        <w:rPr>
+          <w:highlight w:val="yellow"/>
+        </w:rPr>
+        <w:t>, perché ha un dominio diverso</w:t>
+      </w:r>
+      <w:r>
+        <w:t xml:space="preserve"> (si ricordi il criterio di uguaglianza del capitolo 10).</w:t>
+      </w:r>
+    </w:p>
+    <w:p>
+      <w:pPr>
+        <w:keepNext/>
+        <w:spacing w:before="120"/>
+        <w:jc w:val="center"/>
+      </w:pPr>
+      <w:r>
+        <w:drawing>
+          <wp:inline xmlns:a="http://schemas.openxmlformats.org/drawingml/2006/main" xmlns:pic="http://schemas.openxmlformats.org/drawingml/2006/picture">
+            <wp:extent cx="3600000" cy="2512201"/>
+            <wp:docPr id="43" name="Picture 43"/>
+            <wp:cNvGraphicFramePr>
+              <a:graphicFrameLocks noChangeAspect="1"/>
+            </wp:cNvGraphicFramePr>
+            <a:graphic>
+              <a:graphicData uri="http://schemas.openxmlformats.org/drawingml/2006/picture">
+                <pic:pic>
+                  <pic:nvPicPr>
+                    <pic:cNvPr id="0" name="ch10_restrizione_frecce.png"/>
+                    <pic:cNvPicPr/>
+                  </pic:nvPicPr>
+                  <pic:blipFill>
+                    <a:blip r:embed="rId47"/>
+                    <a:stretch>
+                      <a:fillRect/>
+                    </a:stretch>
+                  </pic:blipFill>
+                  <pic:spPr>
+                    <a:xfrm>
+                      <a:off x="0" y="0"/>
+                      <a:ext cx="3600000" cy="2512201"/>
+                    </a:xfrm>
                     <a:prstGeom prst="rect"/>
                   </pic:spPr>
                 </pic:pic>
@@ -10557,7 +10851,7 @@
           <w:i/>
           <w:sz w:val="18"/>
         </w:rPr>
-        <w:t>Inclusione canonica j : S → A: ogni elemento di S va in sé stesso, visto come elemento di A.</w:t>
+        <w:t>La restrizione f|S: stesse regole di f, ma il dominio è solo S (frecce blu).</w:t>
       </w:r>
     </w:p>
     <w:p>
@@ -10569,182 +10863,52 @@
           <w:b/>
           <w:color w:val="E97132"/>
         </w:rPr>
-        <w:lastRenderedPageBreak/>
-        <w:t>Le successioni come funzioni</w:t>
-      </w:r>
-    </w:p>
-    <w:p>
-      <w:r>
-        <w:t xml:space="preserve">Una </w:t>
-      </w:r>
-      <w:r>
-        <w:rPr>
-          <w:b/>
-        </w:rPr>
-        <w:t>successione</w:t>
-      </w:r>
-      <w:r>
-        <w:t xml:space="preserve"> è una lista di numeri a</w:t>
-      </w:r>
-      <w:r>
-        <w:rPr>
+        <w:t>Funzioni diverse con restrizioni uguali</w:t>
+      </w:r>
+    </w:p>
+    <w:p>
+      <w:r>
+        <w:t xml:space="preserve">Non è vero che due funzioni diverse restano diverse dopo la </w:t>
+      </w:r>
+      <w:r>
+        <w:rPr>
+          <w:highlight w:val="yellow"/>
+        </w:rPr>
+        <w:t>restrizione</w:t>
+      </w:r>
+      <w:r>
+        <w:t>. Riprendiamo l'esempio del capitolo 10: le espressioni f(x) = 3x² − 1 e g(x) = x³ + 2x − 1 sono definite per ogni numero reale e, come funzioni su ℝ, sono diverse (hanno grafici diversi</w:t>
+      </w:r>
+      <w:r>
+        <w:rPr>
+          <w:highlight w:val="yellow"/>
+        </w:rPr>
+        <w:t>). Se però le restringiamo a S = {0, 1, 2}, diventano uguali: f|</w:t>
+      </w:r>
+      <w:r>
+        <w:rPr>
+          <w:highlight w:val="yellow"/>
           <w:vertAlign w:val="subscript"/>
         </w:rPr>
-        <w:t>0</w:t>
-      </w:r>
-      <w:r>
-        <w:t>, a</w:t>
-      </w:r>
-      <w:r>
-        <w:rPr>
+        <w:t>S</w:t>
+      </w:r>
+      <w:r>
+        <w:rPr>
+          <w:highlight w:val="yellow"/>
+        </w:rPr>
+        <w:t xml:space="preserve"> = g|</w:t>
+      </w:r>
+      <w:r>
+        <w:rPr>
+          <w:highlight w:val="yellow"/>
           <w:vertAlign w:val="subscript"/>
         </w:rPr>
-        <w:t>1</w:t>
-      </w:r>
-      <w:r>
-        <w:t>, a</w:t>
-      </w:r>
-      <w:r>
-        <w:rPr>
-          <w:vertAlign w:val="subscript"/>
-        </w:rPr>
-        <w:t>2</w:t>
-      </w:r>
-      <w:r>
-        <w:t>, … (si può partire da 0 o da 1, è irrilevante). Assegnare una successione di numeri reali significa assegnare un valore reale a 0, uno a 1, uno a 2 e così via, cioè definire una funzione</w:t>
-      </w:r>
-    </w:p>
-    <w:p>
-      <w:r>
-        <w:t>a : ℕ → ℝ, n ↦ a</w:t>
-      </w:r>
-      <w:r>
-        <w:rPr>
-          <w:vertAlign w:val="subscript"/>
-        </w:rPr>
-        <w:t>n</w:t>
-      </w:r>
-      <w:r>
-        <w:t>.</w:t>
-      </w:r>
-    </w:p>
-    <w:p>
-      <w:r>
-        <w:t>Dunque una successione non è altro che una funzione con dominio ℕ e codominio ℝ. Un esempio di successione è quella di Fibonacci.</w:t>
-      </w:r>
-    </w:p>
-    <w:p>
-      <w:pPr>
-        <w:pStyle w:val="Titolo2"/>
-      </w:pPr>
-      <w:r>
-        <w:rPr>
-          <w:b/>
-          <w:color w:val="E97132"/>
-        </w:rPr>
-        <w:t>La restrizione di una funzione</w:t>
-      </w:r>
-    </w:p>
-    <w:p>
-      <w:r>
-        <w:t xml:space="preserve">Sia f : A → B una funzione e sia S ⊆ A un sottoinsieme del dominio. Poiché gli elementi di S sono particolari elementi di A, f assume un valore anche su di essi. Possiamo allora definire una </w:t>
-      </w:r>
-      <w:r>
-        <w:rPr>
-          <w:b/>
-        </w:rPr>
-        <w:t>nuova funzione</w:t>
-      </w:r>
-      <w:r>
-        <w:t xml:space="preserve"> f|</w:t>
-      </w:r>
-      <w:r>
-        <w:rPr>
-          <w:vertAlign w:val="subscript"/>
-        </w:rPr>
         <w:t>S</w:t>
       </w:r>
       <w:r>
-        <w:t xml:space="preserve"> : S → B, la </w:t>
-      </w:r>
-      <w:r>
-        <w:rPr>
-          <w:b/>
-        </w:rPr>
-        <w:t>restrizione di f a S</w:t>
-      </w:r>
-      <w:r>
-        <w:t>, con la stessa regola di prima: f|</w:t>
-      </w:r>
-      <w:r>
-        <w:rPr>
-          <w:vertAlign w:val="subscript"/>
-        </w:rPr>
-        <w:t>S</w:t>
-      </w:r>
-      <w:r>
-        <w:t>(s) = f(s) per ogni s ∈ S.</w:t>
-      </w:r>
-    </w:p>
-    <w:p>
-      <w:r>
-        <w:t xml:space="preserve">Si sta restringendo il dominio, lasciando invariati i valori; ma dal punto di vista concettuale </w:t>
-      </w:r>
-      <w:r>
-        <w:rPr>
-          <w:b/>
-        </w:rPr>
-        <w:t>f|</w:t>
-      </w:r>
-      <w:r>
-        <w:rPr>
-          <w:b/>
-          <w:vertAlign w:val="subscript"/>
-        </w:rPr>
-        <w:t>S</w:t>
-      </w:r>
-      <w:r>
-        <w:rPr>
-          <w:b/>
-        </w:rPr>
-        <w:t xml:space="preserve"> è una funzione diversa da f</w:t>
-      </w:r>
-      <w:r>
-        <w:t>, perché ha un dominio diverso (si ricordi il criterio di uguaglianza del capitolo 10).</w:t>
-      </w:r>
-    </w:p>
-    <w:p>
-      <w:pPr>
-        <w:pStyle w:val="Titolo2"/>
-      </w:pPr>
-      <w:r>
-        <w:rPr>
-          <w:b/>
-          <w:color w:val="E97132"/>
-        </w:rPr>
-        <w:t>Funzioni diverse con restrizioni uguali</w:t>
-      </w:r>
-    </w:p>
-    <w:p>
-      <w:r>
-        <w:t>Non è vero che due funzioni diverse restano diverse dopo la restrizione. Riprendiamo l'esempio del capitolo 10: le espressioni f(x) = 3x² − 1 e g(x) = x³ + 2x − 1 sono definite per ogni numero reale e, come funzioni su ℝ, sono diverse (hanno grafici diversi). Se però le restringiamo a S = {0, 1, 2}, diventano uguali: f|</w:t>
-      </w:r>
-      <w:r>
-        <w:rPr>
-          <w:vertAlign w:val="subscript"/>
-        </w:rPr>
-        <w:t>S</w:t>
-      </w:r>
-      <w:r>
-        <w:t xml:space="preserve"> = g|</w:t>
-      </w:r>
-      <w:r>
-        <w:rPr>
-          <w:vertAlign w:val="subscript"/>
-        </w:rPr>
-        <w:t>S</w:t>
-      </w:r>
-      <w:r>
+        <w:rPr>
+          <w:highlight w:val="yellow"/>
+        </w:rPr>
         <w:t>.</w:t>
       </w:r>
     </w:p>
@@ -10763,6 +10927,7 @@
         <w:rPr>
           <w:noProof/>
         </w:rPr>
+        <w:lastRenderedPageBreak/>
         <w:drawing>
           <wp:inline distT="0" distB="0" distL="0" distR="0" wp14:anchorId="6EB3EAED" wp14:editId="074865DC">
             <wp:extent cx="3420000" cy="2486480"/>
@@ -10779,7 +10944,7 @@
                     <pic:cNvPicPr/>
                   </pic:nvPicPr>
                   <pic:blipFill>
-                    <a:blip r:embed="rId29"/>
+                    <a:blip r:embed="rId30"/>
                     <a:stretch>
                       <a:fillRect/>
                     </a:stretch>
@@ -10826,7 +10991,6 @@
           <w:b/>
           <w:color w:val="EE0000"/>
         </w:rPr>
-        <w:lastRenderedPageBreak/>
         <w:t>12. Funzioni sull'Insieme Quoziente e Dipendenza dal Rappresentante</w:t>
       </w:r>
     </w:p>
@@ -10946,6 +11110,7 @@
         </w:numPr>
       </w:pPr>
       <w:r>
+        <w:lastRenderedPageBreak/>
         <w:t>F([8]) = [16] (due cifre).</w:t>
       </w:r>
     </w:p>
@@ -10980,7 +11145,7 @@
                     <pic:cNvPicPr/>
                   </pic:nvPicPr>
                   <pic:blipFill>
-                    <a:blip r:embed="rId30"/>
+                    <a:blip r:embed="rId31"/>
                     <a:stretch>
                       <a:fillRect/>
                     </a:stretch>
@@ -11022,7 +11187,6 @@
           <w:b/>
           <w:color w:val="E97132"/>
         </w:rPr>
-        <w:lastRenderedPageBreak/>
         <w:t>Che cosa bisogna verificare</w:t>
       </w:r>
     </w:p>
@@ -11149,6 +11313,7 @@
         <w:rPr>
           <w:noProof/>
         </w:rPr>
+        <w:lastRenderedPageBreak/>
         <w:drawing>
           <wp:inline distT="0" distB="0" distL="0" distR="0" wp14:anchorId="39742F3D" wp14:editId="394507EF">
             <wp:extent cx="4320000" cy="1923077"/>
@@ -11165,7 +11330,7 @@
                     <pic:cNvPicPr/>
                   </pic:nvPicPr>
                   <pic:blipFill>
-                    <a:blip r:embed="rId31"/>
+                    <a:blip r:embed="rId32"/>
                     <a:stretch>
                       <a:fillRect/>
                     </a:stretch>
@@ -11334,7 +11499,6 @@
     </w:p>
     <w:p>
       <w:r>
-        <w:lastRenderedPageBreak/>
         <w:t>Due proprietà legate a questo fatto vanno ricordate bene:</w:t>
       </w:r>
     </w:p>
@@ -11475,6 +11639,7 @@
         <w:rPr>
           <w:noProof/>
         </w:rPr>
+        <w:lastRenderedPageBreak/>
         <w:drawing>
           <wp:inline distT="0" distB="0" distL="0" distR="0" wp14:anchorId="284E2E52" wp14:editId="5A53D91A">
             <wp:extent cx="3240000" cy="2750012"/>
@@ -11491,7 +11656,7 @@
                     <pic:cNvPicPr/>
                   </pic:nvPicPr>
                   <pic:blipFill>
-                    <a:blip r:embed="rId32"/>
+                    <a:blip r:embed="rId33"/>
                     <a:stretch>
                       <a:fillRect/>
                     </a:stretch>
@@ -11564,7 +11729,6 @@
           <w:b/>
           <w:color w:val="EE0000"/>
         </w:rPr>
-        <w:lastRenderedPageBreak/>
         <w:t>14. Funzioni Suriettive, Iniettive e Biettive</w:t>
       </w:r>
     </w:p>
@@ -11693,6 +11857,7 @@
           <w:b/>
           <w:color w:val="E97132"/>
         </w:rPr>
+        <w:lastRenderedPageBreak/>
         <w:t>Biettività</w:t>
       </w:r>
     </w:p>
@@ -11745,7 +11910,7 @@
                     <pic:cNvPicPr/>
                   </pic:nvPicPr>
                   <pic:blipFill>
-                    <a:blip r:embed="rId33"/>
+                    <a:blip r:embed="rId34"/>
                     <a:stretch>
                       <a:fillRect/>
                     </a:stretch>
@@ -11836,7 +12001,6 @@
         <w:rPr>
           <w:noProof/>
         </w:rPr>
-        <w:lastRenderedPageBreak/>
         <w:drawing>
           <wp:inline distT="0" distB="0" distL="0" distR="0" wp14:anchorId="70731253" wp14:editId="0992DE8F">
             <wp:extent cx="3240000" cy="2647783"/>
@@ -11853,7 +12017,7 @@
                     <pic:cNvPicPr/>
                   </pic:nvPicPr>
                   <pic:blipFill>
-                    <a:blip r:embed="rId34"/>
+                    <a:blip r:embed="rId35"/>
                     <a:stretch>
                       <a:fillRect/>
                     </a:stretch>
@@ -11940,6 +12104,7 @@
         </w:numPr>
       </w:pPr>
       <w:r>
+        <w:lastRenderedPageBreak/>
         <w:t xml:space="preserve">k : ℝ → ℝ, k(x) = x³ è </w:t>
       </w:r>
       <w:r>
@@ -12026,7 +12191,6 @@
         <w:rPr>
           <w:noProof/>
         </w:rPr>
-        <w:lastRenderedPageBreak/>
         <w:drawing>
           <wp:inline distT="0" distB="0" distL="0" distR="0" wp14:anchorId="6270D6B5" wp14:editId="1DE9D7E4">
             <wp:extent cx="4140000" cy="2328492"/>
@@ -12043,7 +12207,7 @@
                     <pic:cNvPicPr/>
                   </pic:nvPicPr>
                   <pic:blipFill>
-                    <a:blip r:embed="rId35"/>
+                    <a:blip r:embed="rId36"/>
                     <a:stretch>
                       <a:fillRect/>
                     </a:stretch>
@@ -12258,6 +12422,7 @@
         <w:rPr>
           <w:noProof/>
         </w:rPr>
+        <w:lastRenderedPageBreak/>
         <w:drawing>
           <wp:inline distT="0" distB="0" distL="0" distR="0" wp14:anchorId="2F0BFC27" wp14:editId="79D53217">
             <wp:extent cx="3240000" cy="2198571"/>
@@ -12274,7 +12439,7 @@
                     <pic:cNvPicPr/>
                   </pic:nvPicPr>
                   <pic:blipFill>
-                    <a:blip r:embed="rId36"/>
+                    <a:blip r:embed="rId37"/>
                     <a:stretch>
                       <a:fillRect/>
                     </a:stretch>
@@ -12339,7 +12504,6 @@
           <w:b/>
           <w:color w:val="EE0000"/>
         </w:rPr>
-        <w:lastRenderedPageBreak/>
         <w:t>16. Verificare Iniettività e Suriettività: Esempi</w:t>
       </w:r>
     </w:p>
@@ -12501,6 +12665,7 @@
         <w:rPr>
           <w:noProof/>
         </w:rPr>
+        <w:lastRenderedPageBreak/>
         <w:drawing>
           <wp:inline distT="0" distB="0" distL="0" distR="0" wp14:anchorId="02EF98F7" wp14:editId="3CCBF1E7">
             <wp:extent cx="2880000" cy="2302384"/>
@@ -12517,7 +12682,7 @@
                     <pic:cNvPicPr/>
                   </pic:nvPicPr>
                   <pic:blipFill>
-                    <a:blip r:embed="rId37"/>
+                    <a:blip r:embed="rId38"/>
                     <a:stretch>
                       <a:fillRect/>
                     </a:stretch>
@@ -12615,7 +12780,6 @@
         <w:rPr>
           <w:b/>
         </w:rPr>
-        <w:lastRenderedPageBreak/>
         <w:t>Iniettività.</w:t>
       </w:r>
       <w:r>
@@ -12659,7 +12823,7 @@
                     <pic:cNvPicPr/>
                   </pic:nvPicPr>
                   <pic:blipFill>
-                    <a:blip r:embed="rId38"/>
+                    <a:blip r:embed="rId39"/>
                     <a:stretch>
                       <a:fillRect/>
                     </a:stretch>
@@ -12701,6 +12865,7 @@
           <w:b/>
           <w:color w:val="E97132"/>
         </w:rPr>
+        <w:lastRenderedPageBreak/>
         <w:t>Gli stessi calcoli su ℤ: la suriettività cade</w:t>
       </w:r>
     </w:p>
@@ -12758,7 +12923,7 @@
                     <pic:cNvPicPr/>
                   </pic:nvPicPr>
                   <pic:blipFill>
-                    <a:blip r:embed="rId39"/>
+                    <a:blip r:embed="rId40"/>
                     <a:stretch>
                       <a:fillRect/>
                     </a:stretch>
@@ -12805,121 +12970,121 @@
           <w:b/>
           <w:color w:val="EE0000"/>
         </w:rPr>
+        <w:t>17. Rendere Biettiva una Funzione: Cambiare Codominio e Dominio</w:t>
+      </w:r>
+    </w:p>
+    <w:p>
+      <w:pPr>
+        <w:pStyle w:val="Titolo2"/>
+      </w:pPr>
+      <w:r>
+        <w:rPr>
+          <w:b/>
+          <w:color w:val="E97132"/>
+        </w:rPr>
+        <w:t>L'idea generale</w:t>
+      </w:r>
+    </w:p>
+    <w:p>
+      <w:r>
+        <w:t xml:space="preserve">Una funzione definita da un'espressione può non essere né iniettiva né suriettiva, ma spesso si può </w:t>
+      </w:r>
+      <w:r>
+        <w:rPr>
+          <w:b/>
+        </w:rPr>
+        <w:t>ritoccare</w:t>
+      </w:r>
+      <w:r>
+        <w:t xml:space="preserve"> la funzione, cambiando l'insieme di arrivo e quello di partenza, fino a ottenerne una biettiva. Si procede in due passi: prima si </w:t>
+      </w:r>
+      <w:r>
+        <w:rPr>
+          <w:b/>
+        </w:rPr>
+        <w:t>riduce il codominio</w:t>
+      </w:r>
+      <w:r>
+        <w:t xml:space="preserve"> a ciò che la funzione raggiunge davvero, e la funzione diventa suriettiva; poi si </w:t>
+      </w:r>
+      <w:r>
+        <w:rPr>
+          <w:b/>
+        </w:rPr>
+        <w:t>restringe il dominio</w:t>
+      </w:r>
+      <w:r>
+        <w:t>, scartando alcuni elementi in modo consistente, fino a rendere la funzione iniettiva.</w:t>
+      </w:r>
+    </w:p>
+    <w:p>
+      <w:r>
+        <w:t>In linea di principio questo si può fare per qualsiasi funzione. Il prezzo è che a ogni passo si ottiene una funzione diversa da quella di partenza (capitolo 10), con le stesse regole di calcolo ma con proprietà diverse.</w:t>
+      </w:r>
+    </w:p>
+    <w:p>
+      <w:pPr>
+        <w:pStyle w:val="Titolo2"/>
+      </w:pPr>
+      <w:r>
+        <w:rPr>
+          <w:b/>
+          <w:color w:val="E97132"/>
+        </w:rPr>
+        <w:t>Esempio: f(x) = x²</w:t>
+      </w:r>
+    </w:p>
+    <w:p>
+      <w:r>
+        <w:t xml:space="preserve">Come già visto nel capitolo 14, f : ℝ → ℝ, f(x) = x² non è suriettiva: l'equazione x² = −1 non ha soluzioni, quindi i numeri negativi non sono mai immagine di nulla. Basta trovare </w:t>
+      </w:r>
+      <w:r>
+        <w:rPr>
+          <w:b/>
+        </w:rPr>
+        <w:t>un solo</w:t>
+      </w:r>
+      <w:r>
+        <w:t xml:space="preserve"> elemento fuori dall'immagine per concludere che una funzione non è suriettiva.</w:t>
+      </w:r>
+    </w:p>
+    <w:p>
+      <w:r>
+        <w:rPr>
+          <w:b/>
+        </w:rPr>
+        <w:t>Passo 1: ridurre il codominio.</w:t>
+      </w:r>
+      <w:r>
+        <w:t xml:space="preserve"> Poiché i quadrati sono sempre maggiori o uguali a zero, possiamo pensare f come funzione da ℝ in ℝ</w:t>
+      </w:r>
+      <w:r>
+        <w:rPr>
+          <w:vertAlign w:val="superscript"/>
+        </w:rPr>
+        <w:t>≥0</w:t>
+      </w:r>
+      <w:r>
+        <w:t xml:space="preserve"> = [0, +∞). Ora è suriettiva: se y ≥ 0, l'equazione x² = y ha soluzione, per esempio x = √y (la radice quadrata esiste sempre per y ≥ 0).</w:t>
+      </w:r>
+    </w:p>
+    <w:p>
+      <w:r>
+        <w:rPr>
+          <w:b/>
+        </w:rPr>
+        <w:t>Non è ancora iniettiva:</w:t>
+      </w:r>
+      <w:r>
+        <w:t xml:space="preserve"> (−1)² = 1² = 1, quindi due numeri diversi come −1 e 1 hanno la stessa immagine, in contrasto con la definizione.</w:t>
+      </w:r>
+    </w:p>
+    <w:p>
+      <w:r>
+        <w:rPr>
+          <w:b/>
+        </w:rPr>
         <w:lastRenderedPageBreak/>
-        <w:t>17. Rendere Biettiva una Funzione: Cambiare Codominio e Dominio</w:t>
-      </w:r>
-    </w:p>
-    <w:p>
-      <w:pPr>
-        <w:pStyle w:val="Titolo2"/>
-      </w:pPr>
-      <w:r>
-        <w:rPr>
-          <w:b/>
-          <w:color w:val="E97132"/>
-        </w:rPr>
-        <w:t>L'idea generale</w:t>
-      </w:r>
-    </w:p>
-    <w:p>
-      <w:r>
-        <w:t xml:space="preserve">Una funzione definita da un'espressione può non essere né iniettiva né suriettiva, ma spesso si può </w:t>
-      </w:r>
-      <w:r>
-        <w:rPr>
-          <w:b/>
-        </w:rPr>
-        <w:t>ritoccare</w:t>
-      </w:r>
-      <w:r>
-        <w:t xml:space="preserve"> la funzione, cambiando l'insieme di arrivo e quello di partenza, fino a ottenerne una biettiva. Si procede in due passi: prima si </w:t>
-      </w:r>
-      <w:r>
-        <w:rPr>
-          <w:b/>
-        </w:rPr>
-        <w:t>riduce il codominio</w:t>
-      </w:r>
-      <w:r>
-        <w:t xml:space="preserve"> a ciò che la funzione raggiunge davvero, e la funzione diventa suriettiva; poi si </w:t>
-      </w:r>
-      <w:r>
-        <w:rPr>
-          <w:b/>
-        </w:rPr>
-        <w:t>restringe il dominio</w:t>
-      </w:r>
-      <w:r>
-        <w:t>, scartando alcuni elementi in modo consistente, fino a rendere la funzione iniettiva.</w:t>
-      </w:r>
-    </w:p>
-    <w:p>
-      <w:r>
-        <w:t>In linea di principio questo si può fare per qualsiasi funzione. Il prezzo è che a ogni passo si ottiene una funzione diversa da quella di partenza (capitolo 10), con le stesse regole di calcolo ma con proprietà diverse.</w:t>
-      </w:r>
-    </w:p>
-    <w:p>
-      <w:pPr>
-        <w:pStyle w:val="Titolo2"/>
-      </w:pPr>
-      <w:r>
-        <w:rPr>
-          <w:b/>
-          <w:color w:val="E97132"/>
-        </w:rPr>
-        <w:t>Esempio: f(x) = x²</w:t>
-      </w:r>
-    </w:p>
-    <w:p>
-      <w:r>
-        <w:t xml:space="preserve">Come già visto nel capitolo 14, f : ℝ → ℝ, f(x) = x² non è suriettiva: l'equazione x² = −1 non ha soluzioni, quindi i numeri negativi non sono mai immagine di nulla. Basta trovare </w:t>
-      </w:r>
-      <w:r>
-        <w:rPr>
-          <w:b/>
-        </w:rPr>
-        <w:t>un solo</w:t>
-      </w:r>
-      <w:r>
-        <w:t xml:space="preserve"> elemento fuori dall'immagine per concludere che una funzione non è suriettiva.</w:t>
-      </w:r>
-    </w:p>
-    <w:p>
-      <w:r>
-        <w:rPr>
-          <w:b/>
-        </w:rPr>
-        <w:t>Passo 1: ridurre il codominio.</w:t>
-      </w:r>
-      <w:r>
-        <w:t xml:space="preserve"> Poiché i quadrati sono sempre maggiori o uguali a zero, possiamo pensare f come funzione da ℝ in ℝ</w:t>
-      </w:r>
-      <w:r>
-        <w:rPr>
-          <w:vertAlign w:val="superscript"/>
-        </w:rPr>
-        <w:t>≥0</w:t>
-      </w:r>
-      <w:r>
-        <w:t xml:space="preserve"> = [0, +∞). Ora è suriettiva: se y ≥ 0, l'equazione x² = y ha soluzione, per esempio x = √y (la radice quadrata esiste sempre per y ≥ 0).</w:t>
-      </w:r>
-    </w:p>
-    <w:p>
-      <w:r>
-        <w:rPr>
-          <w:b/>
-        </w:rPr>
-        <w:t>Non è ancora iniettiva:</w:t>
-      </w:r>
-      <w:r>
-        <w:t xml:space="preserve"> (−1)² = 1² = 1, quindi due numeri diversi come −1 e 1 hanno la stessa immagine, in contrasto con la definizione.</w:t>
-      </w:r>
-    </w:p>
-    <w:p>
-      <w:r>
-        <w:rPr>
-          <w:b/>
-        </w:rPr>
         <w:t>Passo 2: restringere il dominio.</w:t>
       </w:r>
       <w:r>
@@ -13006,7 +13171,7 @@
                     <pic:cNvPicPr/>
                   </pic:nvPicPr>
                   <pic:blipFill>
-                    <a:blip r:embed="rId40"/>
+                    <a:blip r:embed="rId41"/>
                     <a:stretch>
                       <a:fillRect/>
                     </a:stretch>
@@ -13064,7 +13229,6 @@
         </w:numPr>
       </w:pPr>
       <w:r>
-        <w:lastRenderedPageBreak/>
         <w:t>sen : ℝ → ℝ non è suriettiva (il grafico è tutto contenuto tra −1 e 1, quindi un valore come 2 non viene mai raggiunto) e non è iniettiva (una retta orizzontale a quota tra −1 e 1 incontra la curva in tanti punti: tanti valori di x danno lo stesso valore del seno).</w:t>
       </w:r>
     </w:p>
@@ -13125,7 +13289,7 @@
                     <pic:cNvPicPr/>
                   </pic:nvPicPr>
                   <pic:blipFill>
-                    <a:blip r:embed="rId41"/>
+                    <a:blip r:embed="rId42"/>
                     <a:stretch>
                       <a:fillRect/>
                     </a:stretch>
@@ -13160,6 +13324,7 @@
     </w:p>
     <w:p>
       <w:r>
+        <w:lastRenderedPageBreak/>
         <w:t>Un discorso analogo si fa per il coseno (che ha lo stesso grafico traslato) e per la tangente. Nella tangente, che ha asintoti, non si prende un intervallo chiuso ma l'intervallo aperto (−π/2, π/2) come dominio e tutta la retta come codominio: la funzione risulta biettiva.</w:t>
       </w:r>
     </w:p>
@@ -13244,88 +13409,88 @@
     </w:p>
     <w:p>
       <w:r>
+        <w:t xml:space="preserve">La composizione si può fare solo se c'è </w:t>
+      </w:r>
+      <w:r>
+        <w:rPr>
+          <w:b/>
+        </w:rPr>
+        <w:t>concordanza</w:t>
+      </w:r>
+      <w:r>
+        <w:t xml:space="preserve"> tra il codominio della prima funzione e il dominio della seconda (a lezione si prende il caso in cui coincidono): l'elemento f(a) deve appartenere al dominio di g, altrimenti non sappiamo dove calcolare g.</w:t>
+      </w:r>
+    </w:p>
+    <w:p>
+      <w:pPr>
+        <w:pStyle w:val="Titolo2"/>
+      </w:pPr>
+      <w:r>
+        <w:rPr>
+          <w:b/>
+          <w:color w:val="E97132"/>
+        </w:rPr>
+        <w:t>Più di due funzioni e associatività</w:t>
+      </w:r>
+    </w:p>
+    <w:p>
+      <w:r>
+        <w:t xml:space="preserve">Se la situazione lo permette si possono concatenare più funzioni, per esempio f : A → B, g : B → C, h : C → D: si porta a in f(a), poi in g(f(a)), poi in h(g(f(a))). Ma l'operazione di base è sempre tra due funzioni, quindi per scrivere h ∘ g ∘ f senza parentesi bisogna verificare la </w:t>
+      </w:r>
+      <w:r>
+        <w:rPr>
+          <w:b/>
+        </w:rPr>
+        <w:t>proprietà associativa</w:t>
+      </w:r>
+      <w:r>
+        <w:t>:</w:t>
+      </w:r>
+    </w:p>
+    <w:p>
+      <w:r>
+        <w:t>h ∘ (g ∘ f) = (h ∘ g) ∘ f.</w:t>
+      </w:r>
+    </w:p>
+    <w:p>
+      <w:r>
+        <w:t>È la stessa esigenza che si ha sommando tre numeri: si sommano due alla volta, e perché la somma sia ben posta il risultato non deve dipendere da quali due si sommano per primi. Due funzioni sono uguali quando hanno stesso dominio, stesso codominio e stesso grafico (capitolo 10). Qui il dominio è A e il codominio è D per entrambe le scritture; resta da controllare che su ogni a ∈ A diano lo stesso valore.</w:t>
+      </w:r>
+    </w:p>
+    <w:p>
+      <w:r>
+        <w:rPr>
+          <w:b/>
+        </w:rPr>
+        <w:t>Dimostrazione</w:t>
+      </w:r>
+      <w:r>
+        <w:t xml:space="preserve"> (passaggi ricostruiti dalla spiegazione a voce). Sia a ∈ A.</w:t>
+      </w:r>
+    </w:p>
+    <w:p>
+      <w:r>
+        <w:t>1. (h ∘ (g ∘ f))(a) = h((g ∘ f)(a)), perché h ∘ (g ∘ f) è la composizione di g ∘ f (prima funzione) e h (seconda).</w:t>
+      </w:r>
+    </w:p>
+    <w:p>
+      <w:r>
+        <w:t>2. (g ∘ f)(a) = g(f(a)), quindi il risultato è h(g(f(a))).</w:t>
+      </w:r>
+    </w:p>
+    <w:p>
+      <w:r>
+        <w:t>3. ((h ∘ g) ∘ f)(a) = (h ∘ g)(f(a)), perché si compone f (prima funzione) con h ∘ g (seconda), calcolata sull'immagine di a tramite f.</w:t>
+      </w:r>
+    </w:p>
+    <w:p>
+      <w:r>
+        <w:t>4. (h ∘ g)(f(a)) = h(g(f(a))).</w:t>
+      </w:r>
+    </w:p>
+    <w:p>
+      <w:r>
         <w:lastRenderedPageBreak/>
-        <w:t xml:space="preserve">La composizione si può fare solo se c'è </w:t>
-      </w:r>
-      <w:r>
-        <w:rPr>
-          <w:b/>
-        </w:rPr>
-        <w:t>concordanza</w:t>
-      </w:r>
-      <w:r>
-        <w:t xml:space="preserve"> tra il codominio della prima funzione e il dominio della seconda (a lezione si prende il caso in cui coincidono): l'elemento f(a) deve appartenere al dominio di g, altrimenti non sappiamo dove calcolare g.</w:t>
-      </w:r>
-    </w:p>
-    <w:p>
-      <w:pPr>
-        <w:pStyle w:val="Titolo2"/>
-      </w:pPr>
-      <w:r>
-        <w:rPr>
-          <w:b/>
-          <w:color w:val="E97132"/>
-        </w:rPr>
-        <w:t>Più di due funzioni e associatività</w:t>
-      </w:r>
-    </w:p>
-    <w:p>
-      <w:r>
-        <w:t xml:space="preserve">Se la situazione lo permette si possono concatenare più funzioni, per esempio f : A → B, g : B → C, h : C → D: si porta a in f(a), poi in g(f(a)), poi in h(g(f(a))). Ma l'operazione di base è sempre tra due funzioni, quindi per scrivere h ∘ g ∘ f senza parentesi bisogna verificare la </w:t>
-      </w:r>
-      <w:r>
-        <w:rPr>
-          <w:b/>
-        </w:rPr>
-        <w:t>proprietà associativa</w:t>
-      </w:r>
-      <w:r>
-        <w:t>:</w:t>
-      </w:r>
-    </w:p>
-    <w:p>
-      <w:r>
-        <w:t>h ∘ (g ∘ f) = (h ∘ g) ∘ f.</w:t>
-      </w:r>
-    </w:p>
-    <w:p>
-      <w:r>
-        <w:t>È la stessa esigenza che si ha sommando tre numeri: si sommano due alla volta, e perché la somma sia ben posta il risultato non deve dipendere da quali due si sommano per primi. Due funzioni sono uguali quando hanno stesso dominio, stesso codominio e stesso grafico (capitolo 10). Qui il dominio è A e il codominio è D per entrambe le scritture; resta da controllare che su ogni a ∈ A diano lo stesso valore.</w:t>
-      </w:r>
-    </w:p>
-    <w:p>
-      <w:r>
-        <w:rPr>
-          <w:b/>
-        </w:rPr>
-        <w:t>Dimostrazione</w:t>
-      </w:r>
-      <w:r>
-        <w:t xml:space="preserve"> (passaggi ricostruiti dalla spiegazione a voce). Sia a ∈ A.</w:t>
-      </w:r>
-    </w:p>
-    <w:p>
-      <w:r>
-        <w:t>1. (h ∘ (g ∘ f))(a) = h((g ∘ f)(a)), perché h ∘ (g ∘ f) è la composizione di g ∘ f (prima funzione) e h (seconda).</w:t>
-      </w:r>
-    </w:p>
-    <w:p>
-      <w:r>
-        <w:t>2. (g ∘ f)(a) = g(f(a)), quindi il risultato è h(g(f(a))).</w:t>
-      </w:r>
-    </w:p>
-    <w:p>
-      <w:r>
-        <w:t>3. ((h ∘ g) ∘ f)(a) = (h ∘ g)(f(a)), perché si compone f (prima funzione) con h ∘ g (seconda), calcolata sull'immagine di a tramite f.</w:t>
-      </w:r>
-    </w:p>
-    <w:p>
-      <w:r>
-        <w:t>4. (h ∘ g)(f(a)) = h(g(f(a))).</w:t>
-      </w:r>
-    </w:p>
-    <w:p>
-      <w:r>
         <w:t xml:space="preserve">I due risultati coincidono per ogni a, quindi le due funzioni sono uguali. L'associatività permette di comporre a coppie come si preferisce, purché si </w:t>
       </w:r>
       <w:r>
@@ -13458,7 +13623,6 @@
         <w:rPr>
           <w:noProof/>
         </w:rPr>
-        <w:lastRenderedPageBreak/>
         <w:drawing>
           <wp:inline distT="0" distB="0" distL="0" distR="0" wp14:anchorId="0F03B902" wp14:editId="1CDD2BEA">
             <wp:extent cx="3240000" cy="2342036"/>
@@ -13475,7 +13639,7 @@
                     <pic:cNvPicPr/>
                   </pic:nvPicPr>
                   <pic:blipFill>
-                    <a:blip r:embed="rId42"/>
+                    <a:blip r:embed="rId43"/>
                     <a:stretch>
                       <a:fillRect/>
                     </a:stretch>
@@ -13608,6 +13772,7 @@
     </w:p>
     <w:p>
       <w:r>
+        <w:lastRenderedPageBreak/>
         <w:t>Dunque f ∘ id</w:t>
       </w:r>
       <w:r>
@@ -13736,7 +13901,6 @@
         <w:rPr>
           <w:b/>
         </w:rPr>
-        <w:lastRenderedPageBreak/>
         <w:t>Dimostrazione (suriettività).</w:t>
       </w:r>
       <w:r>
@@ -13863,6 +14027,7 @@
     </w:p>
     <w:p>
       <w:r>
+        <w:lastRenderedPageBreak/>
         <w:t>3. Quindi ogni y ∈ C è immagine tramite g di un elemento di B: g è suriettiva.</w:t>
       </w:r>
     </w:p>
@@ -13908,7 +14073,7 @@
                     <pic:cNvPicPr/>
                   </pic:nvPicPr>
                   <pic:blipFill>
-                    <a:blip r:embed="rId43"/>
+                    <a:blip r:embed="rId44"/>
                     <a:stretch>
                       <a:fillRect/>
                     </a:stretch>
@@ -13983,7 +14148,6 @@
     </w:p>
     <w:p>
       <w:r>
-        <w:lastRenderedPageBreak/>
         <w:t>Applichiamo (∗) a ciascuna delle due uguaglianze:</w:t>
       </w:r>
     </w:p>

</xml_diff>

<commit_message>
Moodle 15 ott: Riassunto lezione 3 di Mate, log
</commit_message>
<xml_diff>
--- a/Riassunto Matematica discreta.docx
+++ b/Riassunto Matematica discreta.docx
@@ -10808,22 +10808,26 @@
         <w:jc w:val="center"/>
       </w:pPr>
       <w:r>
+        <w:rPr>
+          <w:noProof/>
+        </w:rPr>
         <w:drawing>
-          <wp:inline xmlns:a="http://schemas.openxmlformats.org/drawingml/2006/main" xmlns:pic="http://schemas.openxmlformats.org/drawingml/2006/picture">
+          <wp:inline distT="0" distB="0" distL="0" distR="0" wp14:anchorId="10E5CF81" wp14:editId="5B563F3C">
             <wp:extent cx="3600000" cy="2512201"/>
+            <wp:effectExtent l="0" t="0" r="0" b="0"/>
             <wp:docPr id="43" name="Picture 43"/>
             <wp:cNvGraphicFramePr>
-              <a:graphicFrameLocks noChangeAspect="1"/>
+              <a:graphicFrameLocks xmlns:a="http://schemas.openxmlformats.org/drawingml/2006/main" noChangeAspect="1"/>
             </wp:cNvGraphicFramePr>
-            <a:graphic>
+            <a:graphic xmlns:a="http://schemas.openxmlformats.org/drawingml/2006/main">
               <a:graphicData uri="http://schemas.openxmlformats.org/drawingml/2006/picture">
-                <pic:pic>
+                <pic:pic xmlns:pic="http://schemas.openxmlformats.org/drawingml/2006/picture">
                   <pic:nvPicPr>
                     <pic:cNvPr id="0" name="ch10_restrizione_frecce.png"/>
                     <pic:cNvPicPr/>
                   </pic:nvPicPr>
                   <pic:blipFill>
-                    <a:blip r:embed="rId47"/>
+                    <a:blip r:embed="rId30"/>
                     <a:stretch>
                       <a:fillRect/>
                     </a:stretch>
@@ -10833,7 +10837,9 @@
                       <a:off x="0" y="0"/>
                       <a:ext cx="3600000" cy="2512201"/>
                     </a:xfrm>
-                    <a:prstGeom prst="rect"/>
+                    <a:prstGeom prst="rect">
+                      <a:avLst/>
+                    </a:prstGeom>
                   </pic:spPr>
                 </pic:pic>
               </a:graphicData>
@@ -10863,6 +10869,7 @@
           <w:b/>
           <w:color w:val="E97132"/>
         </w:rPr>
+        <w:lastRenderedPageBreak/>
         <w:t>Funzioni diverse con restrizioni uguali</w:t>
       </w:r>
     </w:p>
@@ -10927,7 +10934,6 @@
         <w:rPr>
           <w:noProof/>
         </w:rPr>
-        <w:lastRenderedPageBreak/>
         <w:drawing>
           <wp:inline distT="0" distB="0" distL="0" distR="0" wp14:anchorId="6EB3EAED" wp14:editId="074865DC">
             <wp:extent cx="3420000" cy="2486480"/>
@@ -10944,7 +10950,7 @@
                     <pic:cNvPicPr/>
                   </pic:nvPicPr>
                   <pic:blipFill>
-                    <a:blip r:embed="rId30"/>
+                    <a:blip r:embed="rId31"/>
                     <a:stretch>
                       <a:fillRect/>
                     </a:stretch>
@@ -10985,12 +10991,21 @@
     <w:p>
       <w:pPr>
         <w:pStyle w:val="Titolo1"/>
-      </w:pPr>
-      <w:r>
         <w:rPr>
           <w:b/>
           <w:color w:val="EE0000"/>
         </w:rPr>
+      </w:pPr>
+    </w:p>
+    <w:p>
+      <w:pPr>
+        <w:pStyle w:val="Titolo1"/>
+      </w:pPr>
+      <w:r>
+        <w:rPr>
+          <w:b/>
+          <w:color w:val="EE0000"/>
+        </w:rPr>
         <w:t>12. Funzioni sull'Insieme Quoziente e Dipendenza dal Rappresentante</w:t>
       </w:r>
     </w:p>
@@ -11078,6 +11093,7 @@
           <w:b/>
           <w:color w:val="E97132"/>
         </w:rPr>
+        <w:lastRenderedPageBreak/>
         <w:t>Un esempio che non funziona</w:t>
       </w:r>
     </w:p>
@@ -11110,7 +11126,6 @@
         </w:numPr>
       </w:pPr>
       <w:r>
-        <w:lastRenderedPageBreak/>
         <w:t>F([8]) = [16] (due cifre).</w:t>
       </w:r>
     </w:p>
@@ -11145,7 +11160,7 @@
                     <pic:cNvPicPr/>
                   </pic:nvPicPr>
                   <pic:blipFill>
-                    <a:blip r:embed="rId31"/>
+                    <a:blip r:embed="rId32"/>
                     <a:stretch>
                       <a:fillRect/>
                     </a:stretch>
@@ -11330,7 +11345,7 @@
                     <pic:cNvPicPr/>
                   </pic:nvPicPr>
                   <pic:blipFill>
-                    <a:blip r:embed="rId32"/>
+                    <a:blip r:embed="rId33"/>
                     <a:stretch>
                       <a:fillRect/>
                     </a:stretch>
@@ -11656,7 +11671,7 @@
                     <pic:cNvPicPr/>
                   </pic:nvPicPr>
                   <pic:blipFill>
-                    <a:blip r:embed="rId33"/>
+                    <a:blip r:embed="rId34"/>
                     <a:stretch>
                       <a:fillRect/>
                     </a:stretch>
@@ -11910,7 +11925,7 @@
                     <pic:cNvPicPr/>
                   </pic:nvPicPr>
                   <pic:blipFill>
-                    <a:blip r:embed="rId34"/>
+                    <a:blip r:embed="rId35"/>
                     <a:stretch>
                       <a:fillRect/>
                     </a:stretch>
@@ -12017,7 +12032,7 @@
                     <pic:cNvPicPr/>
                   </pic:nvPicPr>
                   <pic:blipFill>
-                    <a:blip r:embed="rId35"/>
+                    <a:blip r:embed="rId36"/>
                     <a:stretch>
                       <a:fillRect/>
                     </a:stretch>
@@ -12207,7 +12222,7 @@
                     <pic:cNvPicPr/>
                   </pic:nvPicPr>
                   <pic:blipFill>
-                    <a:blip r:embed="rId36"/>
+                    <a:blip r:embed="rId37"/>
                     <a:stretch>
                       <a:fillRect/>
                     </a:stretch>
@@ -12439,7 +12454,7 @@
                     <pic:cNvPicPr/>
                   </pic:nvPicPr>
                   <pic:blipFill>
-                    <a:blip r:embed="rId37"/>
+                    <a:blip r:embed="rId38"/>
                     <a:stretch>
                       <a:fillRect/>
                     </a:stretch>
@@ -12682,7 +12697,7 @@
                     <pic:cNvPicPr/>
                   </pic:nvPicPr>
                   <pic:blipFill>
-                    <a:blip r:embed="rId38"/>
+                    <a:blip r:embed="rId39"/>
                     <a:stretch>
                       <a:fillRect/>
                     </a:stretch>
@@ -12823,7 +12838,7 @@
                     <pic:cNvPicPr/>
                   </pic:nvPicPr>
                   <pic:blipFill>
-                    <a:blip r:embed="rId39"/>
+                    <a:blip r:embed="rId40"/>
                     <a:stretch>
                       <a:fillRect/>
                     </a:stretch>
@@ -12923,7 +12938,7 @@
                     <pic:cNvPicPr/>
                   </pic:nvPicPr>
                   <pic:blipFill>
-                    <a:blip r:embed="rId40"/>
+                    <a:blip r:embed="rId41"/>
                     <a:stretch>
                       <a:fillRect/>
                     </a:stretch>
@@ -13171,7 +13186,7 @@
                     <pic:cNvPicPr/>
                   </pic:nvPicPr>
                   <pic:blipFill>
-                    <a:blip r:embed="rId41"/>
+                    <a:blip r:embed="rId42"/>
                     <a:stretch>
                       <a:fillRect/>
                     </a:stretch>
@@ -13289,7 +13304,7 @@
                     <pic:cNvPicPr/>
                   </pic:nvPicPr>
                   <pic:blipFill>
-                    <a:blip r:embed="rId42"/>
+                    <a:blip r:embed="rId43"/>
                     <a:stretch>
                       <a:fillRect/>
                     </a:stretch>
@@ -13639,7 +13654,7 @@
                     <pic:cNvPicPr/>
                   </pic:nvPicPr>
                   <pic:blipFill>
-                    <a:blip r:embed="rId43"/>
+                    <a:blip r:embed="rId44"/>
                     <a:stretch>
                       <a:fillRect/>
                     </a:stretch>
@@ -14073,7 +14088,7 @@
                     <pic:cNvPicPr/>
                   </pic:nvPicPr>
                   <pic:blipFill>
-                    <a:blip r:embed="rId44"/>
+                    <a:blip r:embed="rId45"/>
                     <a:stretch>
                       <a:fillRect/>
                     </a:stretch>

</xml_diff>

<commit_message>
Mate discreta: capitoli 20-24 (inversa, inclusione-esclusione, scelte successive, ordinamenti e anagrammi, disposizioni) + figure e fonti L7-L8
Co-Authored-By: Claude Sonnet 5.5 <noreply@anthropic.com>
</commit_message>
<xml_diff>
--- a/Riassunto Matematica discreta.docx
+++ b/Riassunto Matematica discreta.docx
@@ -14232,6 +14232,2328 @@
     <w:p>
       <w:r>
         <w:t>Questo spiega il teorema del capitolo 15: una funzione invertibile è necessariamente biettiva. Il verso opposto (una funzione biettiva è sempre invertibile) è enunciato nel capitolo 15; qui sopra è dimostrata solo la necessità della biettività.</w:t>
+      </w:r>
+    </w:p>
+    <w:p>
+      <w:pPr>
+        <w:pStyle w:val="Titolo1"/>
+      </w:pPr>
+      <w:r>
+        <w:rPr>
+          <w:b/>
+          <w:color w:val="EE0000"/>
+        </w:rPr>
+        <w:t>20. Funzioni Inverse: Esistenza e Unicità</w:t>
+      </w:r>
+    </w:p>
+    <w:p>
+      <w:pPr>
+        <w:pStyle w:val="Titolo2"/>
+      </w:pPr>
+      <w:r>
+        <w:rPr>
+          <w:b/>
+          <w:color w:val="E97132"/>
+        </w:rPr>
+        <w:t>Una sola composizione non basta</w:t>
+      </w:r>
+    </w:p>
+    <w:p>
+      <w:r>
+        <w:rPr/>
+        <w:t xml:space="preserve">Due funzioni f : A → B e g : B → A sono una l'inversa dell'altra quando valgono </w:t>
+      </w:r>
+      <w:r>
+        <w:rPr>
+          <w:b/>
+        </w:rPr>
+        <w:t>entrambe</w:t>
+      </w:r>
+      <w:r>
+        <w:rPr/>
+        <w:t xml:space="preserve"> le uguaglianze g ∘ f = id</w:t>
+      </w:r>
+      <w:r>
+        <w:rPr>
+          <w:vertAlign w:val="subscript"/>
+        </w:rPr>
+        <w:t>A</w:t>
+      </w:r>
+      <w:r>
+        <w:rPr/>
+        <w:t xml:space="preserve"> e f ∘ g = id</w:t>
+      </w:r>
+      <w:r>
+        <w:rPr>
+          <w:vertAlign w:val="subscript"/>
+        </w:rPr>
+        <w:t>B</w:t>
+      </w:r>
+      <w:r>
+        <w:rPr/>
+        <w:t>. Non è un dettaglio: può succedere che una delle due composizioni sia l'identità e l'altra no, e allora f e g non sono inverse. Due esempi lo mostrano.</w:t>
+      </w:r>
+    </w:p>
+    <w:p>
+      <w:r>
+        <w:rPr>
+          <w:b/>
+        </w:rPr>
+        <w:t>Esempio 1: la proiezione.</w:t>
+      </w:r>
+      <w:r>
+        <w:rPr/>
+        <w:t xml:space="preserve"> Sia π₁ : ℤ × ℤ → ℤ la prima proiezione, π₁(m, n) = m, e sia f : ℤ → ℤ × ℤ la funzione f(n) = (n, 0). Componendo nell'ordine π₁ ∘ f, cioè prima f e poi π₁, si ha (π₁ ∘ f)(n) = π₁(n, 0) = n: è l'identità di ℤ. Nell'ordine opposto, invece, (f ∘ π₁)(m, n) = f(m) = (m, 0), che è diversa dalla coppia (m, n) appena n ≠ 0, quindi f ∘ π₁ non è l'identità di ℤ × ℤ. Era prevedibile: la proiezione non è biettiva, e due funzioni inverse devono esserlo entrambe.</w:t>
+      </w:r>
+    </w:p>
+    <w:p>
+      <w:r>
+        <w:rPr>
+          <w:b/>
+        </w:rPr>
+        <w:t>Esempio 2: una partizione.</w:t>
+      </w:r>
+      <w:r>
+        <w:rPr/>
+        <w:t xml:space="preserve"> Sia A = {a, b, c, d} con la partizione {a, b}, {c, d}. L'insieme quoziente Q ha due elementi, Q = {{a, b}, {c, d}}. Definiamo f : A → Q mandando ogni elemento nella propria classe (f(a) = f(b) = {a, b}, f(c) = f(d) = {c, d}) e g : Q → A scegliendo un rappresentante per classe: g({a, b}) = a e g({c, d}) = c. Allora g ∘ f manda a e b in a, c e d in c: non è l'identità di A, e non è nemmeno iniettiva. Invece f ∘ g manda {a, b} in a e poi in {a, b}, e {c, d} in c e poi in {c, d}: è l'identità di Q.</w:t>
+      </w:r>
+    </w:p>
+    <w:p>
+      <w:pPr>
+        <w:keepNext/>
+        <w:jc w:val="center"/>
+      </w:pPr>
+      <w:r>
+        <w:drawing>
+          <wp:inline xmlns:a="http://schemas.openxmlformats.org/drawingml/2006/main" xmlns:pic="http://schemas.openxmlformats.org/drawingml/2006/picture">
+            <wp:extent cx="4680000" cy="2024529"/>
+            <wp:docPr id="44" name="Picture 44"/>
+            <wp:cNvGraphicFramePr>
+              <a:graphicFrameLocks noChangeAspect="1"/>
+            </wp:cNvGraphicFramePr>
+            <a:graphic>
+              <a:graphicData uri="http://schemas.openxmlformats.org/drawingml/2006/picture">
+                <pic:pic>
+                  <pic:nvPicPr>
+                    <pic:cNvPr id="0" name="ch20_una_composizione.png"/>
+                    <pic:cNvPicPr/>
+                  </pic:nvPicPr>
+                  <pic:blipFill>
+                    <a:blip r:embed="rId48"/>
+                    <a:stretch>
+                      <a:fillRect/>
+                    </a:stretch>
+                  </pic:blipFill>
+                  <pic:spPr>
+                    <a:xfrm>
+                      <a:off x="0" y="0"/>
+                      <a:ext cx="4680000" cy="2024529"/>
+                    </a:xfrm>
+                    <a:prstGeom prst="rect"/>
+                  </pic:spPr>
+                </pic:pic>
+              </a:graphicData>
+            </a:graphic>
+          </wp:inline>
+        </w:drawing>
+      </w:r>
+    </w:p>
+    <w:p>
+      <w:pPr>
+        <w:jc w:val="center"/>
+      </w:pPr>
+      <w:r>
+        <w:rPr>
+          <w:i/>
+          <w:sz w:val="18"/>
+        </w:rPr>
+        <w:t>Nei due esempi una composizione è l'identità e l'altra no: nel primo esempio f non è suriettiva, nel secondo f non è iniettiva.</w:t>
+      </w:r>
+    </w:p>
+    <w:p>
+      <w:r>
+        <w:rPr/>
+        <w:t xml:space="preserve">La lezione è pratica: per verificare che due funzioni sono una l'inversa dell'altra bisogna controllare </w:t>
+      </w:r>
+      <w:r>
+        <w:rPr>
+          <w:b/>
+        </w:rPr>
+        <w:t>tutte e due</w:t>
+      </w:r>
+      <w:r>
+        <w:rPr/>
+        <w:t xml:space="preserve"> le composizioni.</w:t>
+      </w:r>
+    </w:p>
+    <w:p>
+      <w:pPr>
+        <w:pStyle w:val="Titolo2"/>
+      </w:pPr>
+      <w:r>
+        <w:rPr>
+          <w:b/>
+          <w:color w:val="E97132"/>
+        </w:rPr>
+        <w:t>Ogni funzione biettiva è invertibile</w:t>
+      </w:r>
+    </w:p>
+    <w:p>
+      <w:r>
+        <w:rPr/>
+        <w:t>Nel capitolo 19 si è visto che una funzione invertibile deve essere biettiva. Ora si dimostra il verso opposto, e si dimostra anche che l'inversa è unica.</w:t>
+      </w:r>
+    </w:p>
+    <w:p>
+      <w:r>
+        <w:rPr>
+          <w:b/>
+        </w:rPr>
+        <w:t>Teorema.</w:t>
+      </w:r>
+      <w:r>
+        <w:rPr/>
+        <w:t xml:space="preserve"> Sia f : A → B una funzione biettiva. Allora esiste una funzione g : B → A tale che f e g sono una l'inversa dell'altra, e questa g è unica.</w:t>
+      </w:r>
+    </w:p>
+    <w:p>
+      <w:r>
+        <w:rPr/>
+        <w:t xml:space="preserve">Dimostrare l'esistenza vuol dire </w:t>
+      </w:r>
+      <w:r>
+        <w:rPr>
+          <w:b/>
+        </w:rPr>
+        <w:t>costruire</w:t>
+      </w:r>
+      <w:r>
+        <w:rPr/>
+        <w:t xml:space="preserve"> g, cioè dire quanto vale g(y) per ogni y ∈ B. L'idea è di rovesciare il grafico di f, scambiando il ruolo di dominio e codominio. Non basta però usare una sola delle ipotesi.</w:t>
+      </w:r>
+    </w:p>
+    <w:p>
+      <w:r>
+        <w:rPr>
+          <w:b/>
+        </w:rPr>
+        <w:t>Dimostrazione dell'esistenza.</w:t>
+      </w:r>
+      <w:r>
+        <w:rPr/>
+        <w:t xml:space="preserve"> Si fissa y ∈ B.</w:t>
+      </w:r>
+    </w:p>
+    <w:p>
+      <w:r>
+        <w:rPr/>
+        <w:t>1. Poiché f è suriettiva, esiste x ∈ A con f(x) = y.</w:t>
+      </w:r>
+    </w:p>
+    <w:p>
+      <w:r>
+        <w:rPr/>
+        <w:t>2. Per avere una vera funzione bisogna definire g(y) = x, ma x deve essere scelto in modo non ambiguo: con la sola suriettività y potrebbe avere molte controimmagini, e rovesciando il grafico si otterrebbe una situazione vietata per le funzioni, un elemento del dominio con più valori.</w:t>
+      </w:r>
+    </w:p>
+    <w:p>
+      <w:r>
+        <w:rPr/>
+        <w:t>3. Qui si usa l'iniettività: poiché f è iniettiva, la controimmagine di y è un solo elemento. Si pone allora g(y) = l'unico x ∈ A tale che f(x) = y.</w:t>
+      </w:r>
+    </w:p>
+    <w:p>
+      <w:r>
+        <w:rPr/>
+        <w:t>Ora si controllano le due composizioni.</w:t>
+      </w:r>
+    </w:p>
+    <w:p>
+      <w:pPr>
+        <w:numPr>
+          <w:ilvl w:val="0"/>
+          <w:numId w:val="1"/>
+        </w:numPr>
+      </w:pPr>
+      <w:r>
+        <w:rPr/>
+        <w:t>Sia y ∈ B e sia x = g(y). Per definizione di g, x è proprio un elemento con f(x) = y, quindi (f ∘ g)(y) = f(g(y)) = f(x) = y, e f ∘ g = id</w:t>
+      </w:r>
+      <w:r>
+        <w:rPr>
+          <w:vertAlign w:val="subscript"/>
+        </w:rPr>
+        <w:t>B</w:t>
+      </w:r>
+      <w:r>
+        <w:rPr/>
+        <w:t>.</w:t>
+      </w:r>
+    </w:p>
+    <w:p>
+      <w:pPr>
+        <w:numPr>
+          <w:ilvl w:val="0"/>
+          <w:numId w:val="1"/>
+        </w:numPr>
+      </w:pPr>
+      <w:r>
+        <w:rPr/>
+        <w:t>Sia x ∈ A e sia y = f(x). L'unico elemento che f manda in y è x, quindi g(y) = x, cioè (g ∘ f)(x) = g(f(x)) = x, e g ∘ f = id</w:t>
+      </w:r>
+      <w:r>
+        <w:rPr>
+          <w:vertAlign w:val="subscript"/>
+        </w:rPr>
+        <w:t>A</w:t>
+      </w:r>
+      <w:r>
+        <w:rPr/>
+        <w:t>.</w:t>
+      </w:r>
+    </w:p>
+    <w:p>
+      <w:r>
+        <w:rPr>
+          <w:b/>
+        </w:rPr>
+        <w:t>Dimostrazione dell'unicità.</w:t>
+      </w:r>
+      <w:r>
+        <w:rPr/>
+        <w:t xml:space="preserve"> Supponiamo che g e h siano due funzioni da B in A, entrambe inverse di f: g ∘ f = id</w:t>
+      </w:r>
+      <w:r>
+        <w:rPr>
+          <w:vertAlign w:val="subscript"/>
+        </w:rPr>
+        <w:t>A</w:t>
+      </w:r>
+      <w:r>
+        <w:rPr/>
+        <w:t xml:space="preserve"> = h ∘ f e f ∘ g = id</w:t>
+      </w:r>
+      <w:r>
+        <w:rPr>
+          <w:vertAlign w:val="subscript"/>
+        </w:rPr>
+        <w:t>B</w:t>
+      </w:r>
+      <w:r>
+        <w:rPr/>
+        <w:t xml:space="preserve"> = f ∘ h. Si considera la composizione di tre funzioni g ∘ f ∘ h : B → A → B → A, che ha senso perché i domini e i codomini si concatenano, e la si calcola in due modi, sfruttando l'associatività della composizione.</w:t>
+      </w:r>
+    </w:p>
+    <w:p>
+      <w:r>
+        <w:rPr/>
+        <w:t>1. Raggruppando le prime due funzioni, (g ∘ f) ∘ h = id</w:t>
+      </w:r>
+      <w:r>
+        <w:rPr>
+          <w:vertAlign w:val="subscript"/>
+        </w:rPr>
+        <w:t>A</w:t>
+      </w:r>
+      <w:r>
+        <w:rPr/>
+        <w:t xml:space="preserve"> ∘ h = h, perché l'identità è neutra per la composizione.</w:t>
+      </w:r>
+    </w:p>
+    <w:p>
+      <w:r>
+        <w:rPr/>
+        <w:t>2. Raggruppando le ultime due, g ∘ (f ∘ h) = g ∘ id</w:t>
+      </w:r>
+      <w:r>
+        <w:rPr>
+          <w:vertAlign w:val="subscript"/>
+        </w:rPr>
+        <w:t>B</w:t>
+      </w:r>
+      <w:r>
+        <w:rPr/>
+        <w:t xml:space="preserve"> = g, ancora per la neutralità dell'identità.</w:t>
+      </w:r>
+    </w:p>
+    <w:p>
+      <w:r>
+        <w:rPr/>
+        <w:t>3. Poiché è la stessa espressione, h = g.</w:t>
+      </w:r>
+    </w:p>
+    <w:p>
+      <w:r>
+        <w:rPr/>
+        <w:t>Il trucco di calcolare la stessa espressione in due modi diversi è frequente in matematica e porta quasi sempre a qualcosa di interessante.</w:t>
+      </w:r>
+    </w:p>
+    <w:p>
+      <w:pPr>
+        <w:pStyle w:val="Titolo2"/>
+      </w:pPr>
+      <w:r>
+        <w:rPr>
+          <w:b/>
+          <w:color w:val="E97132"/>
+        </w:rPr>
+        <w:t>Funzione biettiva e funzione invertibile sono la stessa cosa</w:t>
+      </w:r>
+    </w:p>
+    <w:p>
+      <w:r>
+        <w:rPr/>
+        <w:t xml:space="preserve">Mettendo insieme il capitolo 19 e questo teorema, per una funzione </w:t>
+      </w:r>
+      <w:r>
+        <w:rPr>
+          <w:b/>
+        </w:rPr>
+        <w:t>essere biettiva ed essere invertibile equivale</w:t>
+      </w:r>
+      <w:r>
+        <w:rPr/>
+        <w:t>. L'unica inversa si chiama funzione inversa e si indica con f</w:t>
+      </w:r>
+      <w:r>
+        <w:rPr>
+          <w:vertAlign w:val="superscript"/>
+        </w:rPr>
+        <w:t>-1</w:t>
+      </w:r>
+      <w:r>
+        <w:rPr/>
+        <w:t>, come nel capitolo 15.</w:t>
+      </w:r>
+    </w:p>
+    <w:p>
+      <w:r>
+        <w:rPr/>
+        <w:t>Questo spiega perché nel capitolo 17 conveniva rendere biettiva una funzione prima di invertirla: la funzione x² da ℝ in ℝ non è invertibile, ma ristretta a una funzione da [0, +∞) in [0, +∞) diventa biettiva e la sua inversa è la radice quadrata. Infatti, partendo da un numero non negativo, elevare al quadrato e poi estrarre la radice (o fare il contrario) riporta al numero di partenza: le due composizioni sono l'identità.</w:t>
+      </w:r>
+    </w:p>
+    <w:p>
+      <w:r>
+        <w:rPr/>
+        <w:t>Lo stesso accade per l'esponenziale e il logaritmo: l'esponenziale va ristretta nel codominio ai numeri positivi, ed è per questo che il logaritmo è definito solo per i numeri maggiori di zero.</w:t>
+      </w:r>
+    </w:p>
+    <w:p>
+      <w:pPr>
+        <w:pStyle w:val="Titolo1"/>
+      </w:pPr>
+      <w:r>
+        <w:rPr>
+          <w:b/>
+          <w:color w:val="EE0000"/>
+        </w:rPr>
+        <w:t>21. Il Principio di Inclusione-Esclusione</w:t>
+      </w:r>
+    </w:p>
+    <w:p>
+      <w:pPr>
+        <w:pStyle w:val="Titolo2"/>
+      </w:pPr>
+      <w:r>
+        <w:rPr>
+          <w:b/>
+          <w:color w:val="E97132"/>
+        </w:rPr>
+        <w:t>Contare gli elementi di un'unione</w:t>
+      </w:r>
+    </w:p>
+    <w:p>
+      <w:r>
+        <w:rPr/>
+        <w:t xml:space="preserve">Il problema è questo: due insiemi finiti A e B, di cui si conosce il numero di elementi, e si vuole contare gli elementi della loro unione. Il primo tentativo è contare separatamente gli elementi di A e quelli di B e sommarli, |A ∪ B| = |A| + |B|, ma questa uguaglianza è in generale falsa. Per capire dove sbaglia basta guardare il </w:t>
+      </w:r>
+      <w:r>
+        <w:rPr>
+          <w:b/>
+        </w:rPr>
+        <w:t>contributo</w:t>
+      </w:r>
+      <w:r>
+        <w:rPr/>
+        <w:t xml:space="preserve"> di ciascun elemento ai due membri.</w:t>
+      </w:r>
+    </w:p>
+    <w:p>
+      <w:r>
+        <w:rPr/>
+        <w:t>Un elemento a che sta solo in A contribuisce 1 a |A ∪ B| e 1 a |A| + |B| (1 da |A| e 0 da |B|). Lo stesso vale per un elemento b che sta solo in B. Un elemento x che sta in entrambi gli insiemi contribuisce 1 a |A ∪ B| perché appartiene all'unione, ma 2 a |A| + |B|, perché viene contato in A e di nuovo in B. L'errore sta tutto negli elementi comuni, contati due volte, e si corregge sottraendo una volta l'intersezione.</w:t>
+      </w:r>
+    </w:p>
+    <w:p>
+      <w:pPr>
+        <w:keepNext/>
+        <w:jc w:val="center"/>
+      </w:pPr>
+      <w:r>
+        <w:drawing>
+          <wp:inline xmlns:a="http://schemas.openxmlformats.org/drawingml/2006/main" xmlns:pic="http://schemas.openxmlformats.org/drawingml/2006/picture">
+            <wp:extent cx="4140000" cy="1749070"/>
+            <wp:docPr id="45" name="Picture 45"/>
+            <wp:cNvGraphicFramePr>
+              <a:graphicFrameLocks noChangeAspect="1"/>
+            </wp:cNvGraphicFramePr>
+            <a:graphic>
+              <a:graphicData uri="http://schemas.openxmlformats.org/drawingml/2006/picture">
+                <pic:pic>
+                  <pic:nvPicPr>
+                    <pic:cNvPr id="0" name="ch21_contributi_due.png"/>
+                    <pic:cNvPicPr/>
+                  </pic:nvPicPr>
+                  <pic:blipFill>
+                    <a:blip r:embed="rId49"/>
+                    <a:stretch>
+                      <a:fillRect/>
+                    </a:stretch>
+                  </pic:blipFill>
+                  <pic:spPr>
+                    <a:xfrm>
+                      <a:off x="0" y="0"/>
+                      <a:ext cx="4140000" cy="1749070"/>
+                    </a:xfrm>
+                    <a:prstGeom prst="rect"/>
+                  </pic:spPr>
+                </pic:pic>
+              </a:graphicData>
+            </a:graphic>
+          </wp:inline>
+        </w:drawing>
+      </w:r>
+    </w:p>
+    <w:p>
+      <w:pPr>
+        <w:jc w:val="center"/>
+      </w:pPr>
+      <w:r>
+        <w:rPr>
+          <w:i/>
+          <w:sz w:val="18"/>
+        </w:rPr>
+        <w:t>Il contributo di ogni elemento a |A ∪ B| e a |A| + |B|: gli elementi comuni sono contati due volte.</w:t>
+      </w:r>
+    </w:p>
+    <w:p>
+      <w:r>
+        <w:rPr>
+          <w:b/>
+        </w:rPr>
+        <w:t>Proposizione (principio di inclusione-esclusione per due insiemi).</w:t>
+      </w:r>
+      <w:r>
+        <w:rPr/>
+        <w:t xml:space="preserve"> Se A e B sono insiemi finiti, allora</w:t>
+      </w:r>
+    </w:p>
+    <w:p>
+      <w:r>
+        <w:rPr/>
+        <w:t>|A ∪ B| = |A| + |B| − |A ∩ B|,</w:t>
+      </w:r>
+    </w:p>
+    <w:p>
+      <w:r>
+        <w:rPr/>
+        <w:t>o, in forma equivalente, |A ∪ B| + |A ∩ B| = |A| + |B|.</w:t>
+      </w:r>
+    </w:p>
+    <w:p>
+      <w:r>
+        <w:rPr/>
+        <w:t>La seconda forma mostra bene che la formula lega quattro quantità: note tre qualunque di esse, si ricava la quarta. Se A e B sono disgiunti, cioè A ∩ B = ∅, la formula si riduce a |A ∪ B| = |A| + |B|.</w:t>
+      </w:r>
+    </w:p>
+    <w:p>
+      <w:pPr>
+        <w:pStyle w:val="Titolo2"/>
+      </w:pPr>
+      <w:r>
+        <w:rPr>
+          <w:b/>
+          <w:color w:val="E97132"/>
+        </w:rPr>
+        <w:t>Esempi con due insiemi</w:t>
+      </w:r>
+    </w:p>
+    <w:p>
+      <w:r>
+        <w:rPr/>
+        <w:t>Alla fine di una sessione d'esame, 152 matricole hanno superato matematica, 144 hanno superato fisica e 89 hanno superato entrambi gli esami. Se M e F sono gli insiemi di chi ha superato matematica e di chi ha superato fisica, gli studenti che hanno superato almeno un esame sono |M ∪ F| = 152 + 144 − 89 = 207.</w:t>
+      </w:r>
+    </w:p>
+    <w:p>
+      <w:r>
+        <w:rPr/>
+        <w:t>Quanti sono i numeri naturali tra 1 e 3000 che non sono divisibili né per 3 né per 5? Sia I₃₀₀₀ = {1, 2, …, 3000} e siano D₃ e D₅ i sottoinsiemi dei numeri divisibili per 3 e per 5. Il problema chiede |I₃₀₀₀| − |D₃ ∪ D₅|, cioè quanti elementi restano togliendo l'unione. Si ha |D₃| = 3000/3 = 1000 e |D₅| = 3000/5 = 600, perché tra ogni k numeri consecutivi ce n'è uno divisibile per k (e qui k divide 3000, quindi il conteggio è esatto). Un numero è divisibile per 3 e per 5 se e solo se è divisibile per 15, quindi D₃ ∩ D₅ = D₁₅ e |D₁₅| = 3000/15 = 200. Allora |D₃ ∪ D₅| = 1000 + 600 − 200 = 1400 e la risposta è 3000 − 1400 = 1600.</w:t>
+      </w:r>
+    </w:p>
+    <w:p>
+      <w:pPr>
+        <w:keepNext/>
+        <w:jc w:val="center"/>
+      </w:pPr>
+      <w:r>
+        <w:drawing>
+          <wp:inline xmlns:a="http://schemas.openxmlformats.org/drawingml/2006/main" xmlns:pic="http://schemas.openxmlformats.org/drawingml/2006/picture">
+            <wp:extent cx="3240000" cy="2470552"/>
+            <wp:docPr id="46" name="Picture 46"/>
+            <wp:cNvGraphicFramePr>
+              <a:graphicFrameLocks noChangeAspect="1"/>
+            </wp:cNvGraphicFramePr>
+            <a:graphic>
+              <a:graphicData uri="http://schemas.openxmlformats.org/drawingml/2006/picture">
+                <pic:pic>
+                  <pic:nvPicPr>
+                    <pic:cNvPr id="0" name="ch21_numeri_3000.png"/>
+                    <pic:cNvPicPr/>
+                  </pic:nvPicPr>
+                  <pic:blipFill>
+                    <a:blip r:embed="rId50"/>
+                    <a:stretch>
+                      <a:fillRect/>
+                    </a:stretch>
+                  </pic:blipFill>
+                  <pic:spPr>
+                    <a:xfrm>
+                      <a:off x="0" y="0"/>
+                      <a:ext cx="3240000" cy="2470552"/>
+                    </a:xfrm>
+                    <a:prstGeom prst="rect"/>
+                  </pic:spPr>
+                </pic:pic>
+              </a:graphicData>
+            </a:graphic>
+          </wp:inline>
+        </w:drawing>
+      </w:r>
+    </w:p>
+    <w:p>
+      <w:pPr>
+        <w:jc w:val="center"/>
+      </w:pPr>
+      <w:r>
+        <w:rPr>
+          <w:i/>
+          <w:sz w:val="18"/>
+        </w:rPr>
+        <w:t>I numeri da 1 a 3000: i divisibili per 3 e per 5 si sovrappongono nei multipli di 15.</w:t>
+      </w:r>
+    </w:p>
+    <w:p>
+      <w:pPr>
+        <w:pStyle w:val="Titolo2"/>
+      </w:pPr>
+      <w:r>
+        <w:rPr>
+          <w:b/>
+          <w:color w:val="E97132"/>
+        </w:rPr>
+        <w:t>Il caso di tre insiemi</w:t>
+      </w:r>
+    </w:p>
+    <w:p>
+      <w:r>
+        <w:rPr/>
+        <w:t>Con tre insiemi A, B e C, sommando |A| + |B| + |C| gli elementi comuni a due insiemi sono contati due volte e quelli comuni a tutti e tre tre volte. La formula si ottiene correggendo a passi.</w:t>
+      </w:r>
+    </w:p>
+    <w:p>
+      <w:r>
+        <w:rPr>
+          <w:b/>
+        </w:rPr>
+        <w:t>Proposizione (inclusione-esclusione per tre insiemi).</w:t>
+      </w:r>
+    </w:p>
+    <w:p>
+      <w:r>
+        <w:rPr/>
+        <w:t>|A ∪ B ∪ C| = |A| + |B| + |C| − |A ∩ B| − |A ∩ C| − |B ∩ C| + |A ∩ B ∩ C|.</w:t>
+      </w:r>
+    </w:p>
+    <w:p>
+      <w:r>
+        <w:rPr>
+          <w:b/>
+        </w:rPr>
+        <w:t>Dimostrazione.</w:t>
+      </w:r>
+    </w:p>
+    <w:p>
+      <w:r>
+        <w:rPr/>
+        <w:t>1. Si sommano le cardinalità dei tre insiemi, |A| + |B| + |C|.</w:t>
+      </w:r>
+    </w:p>
+    <w:p>
+      <w:r>
+        <w:rPr/>
+        <w:t>2. Un elemento comune a due insiemi (per esempio in A ∩ B) è contato due volte, quindi si sottraggono le tre intersezioni a due a due.</w:t>
+      </w:r>
+    </w:p>
+    <w:p>
+      <w:r>
+        <w:rPr/>
+        <w:t>3. Un elemento comune a tutti e tre, invece, è contato 3 volte nel primo passo e viene tolto 3 volte nel secondo, perché sta in A ∩ B, in A ∩ C e in B ∩ C: alla fine non è contato per niente. Bisogna quindi aggiungere |A ∩ B ∩ C|, e allora torna a essere contato una volta.</w:t>
+      </w:r>
+    </w:p>
+    <w:p>
+      <w:pPr>
+        <w:keepNext/>
+        <w:jc w:val="center"/>
+      </w:pPr>
+      <w:r>
+        <w:drawing>
+          <wp:inline xmlns:a="http://schemas.openxmlformats.org/drawingml/2006/main" xmlns:pic="http://schemas.openxmlformats.org/drawingml/2006/picture">
+            <wp:extent cx="4500000" cy="1969538"/>
+            <wp:docPr id="47" name="Picture 47"/>
+            <wp:cNvGraphicFramePr>
+              <a:graphicFrameLocks noChangeAspect="1"/>
+            </wp:cNvGraphicFramePr>
+            <a:graphic>
+              <a:graphicData uri="http://schemas.openxmlformats.org/drawingml/2006/picture">
+                <pic:pic>
+                  <pic:nvPicPr>
+                    <pic:cNvPr id="0" name="ch21_venn3.png"/>
+                    <pic:cNvPicPr/>
+                  </pic:nvPicPr>
+                  <pic:blipFill>
+                    <a:blip r:embed="rId51"/>
+                    <a:stretch>
+                      <a:fillRect/>
+                    </a:stretch>
+                  </pic:blipFill>
+                  <pic:spPr>
+                    <a:xfrm>
+                      <a:off x="0" y="0"/>
+                      <a:ext cx="4500000" cy="1969538"/>
+                    </a:xfrm>
+                    <a:prstGeom prst="rect"/>
+                  </pic:spPr>
+                </pic:pic>
+              </a:graphicData>
+            </a:graphic>
+          </wp:inline>
+        </w:drawing>
+      </w:r>
+    </w:p>
+    <w:p>
+      <w:pPr>
+        <w:jc w:val="center"/>
+      </w:pPr>
+      <w:r>
+        <w:rPr>
+          <w:i/>
+          <w:sz w:val="18"/>
+        </w:rPr>
+        <w:t>Un elemento del centro del diagramma ha contributo 3 − 3 + 1 = 1 (tabella dei contributi).</w:t>
+      </w:r>
+    </w:p>
+    <w:p>
+      <w:r>
+        <w:rPr/>
+        <w:t>Un'altra dimostrazione applica due volte il caso di due insiemi, a (A ∪ B) ∪ C e poi ai singoli addendi.</w:t>
+      </w:r>
+    </w:p>
+    <w:p>
+      <w:pPr>
+        <w:pStyle w:val="Titolo2"/>
+      </w:pPr>
+      <w:r>
+        <w:rPr>
+          <w:b/>
+          <w:color w:val="E97132"/>
+        </w:rPr>
+        <w:t>Esempi con tre insiemi</w:t>
+      </w:r>
+    </w:p>
+    <w:p>
+      <w:r>
+        <w:rPr/>
+        <w:t>Un cinema proietta la trilogia di *Matrix* e con un unico biglietto si può vedere un qualunque numero dei tre film. Alla fine della giornata sono stati venduti 129 biglietti. Il primo film ha avuto 109 spettatori, il secondo 76 e il terzo 55; 52 persone hanno visto i primi due film, 44 gli ultimi due e 28 spettatori erano presenti sia al primo sia all'ultimo. Quante persone hanno visto tutti e tre i film? Con S</w:t>
+      </w:r>
+      <w:r>
+        <w:rPr>
+          <w:vertAlign w:val="subscript"/>
+        </w:rPr>
+        <w:t>i</w:t>
+      </w:r>
+      <w:r>
+        <w:rPr/>
+        <w:t xml:space="preserve"> l'insieme degli spettatori del film i, la formula dà 129 = 109 + 76 + 55 − 52 − 44 − 28 + |S₁ ∩ S₂ ∩ S₃|, da cui |S₁ ∩ S₂ ∩ S₃| = 13.</w:t>
+      </w:r>
+    </w:p>
+    <w:p>
+      <w:r>
+        <w:rPr/>
+        <w:t>Quanti numeri da 1 a 660 sono divisibili per almeno uno tra 5, 6 e 11? Con D₅, D₆ e D₁₁ i tre insiemi, si ha |D₅| = 660/5 = 132, |D₆| = 660/6 = 110 e |D₁₁| = 660/11 = 60. Un numero divisibile per 5 e per 6 lo è per 30, perché 5 e 6 non hanno divisori comuni, quindi |D₅ ∩ D₆| = 660/30 = 22; analogamente |D₅ ∩ D₁₁| = 660/55 = 12 e |D₆ ∩ D₁₁| = 660/66 = 10. L'intersezione dei tre è D₃₃₀ e ha 660/330 = 2 elementi. Quindi</w:t>
+      </w:r>
+    </w:p>
+    <w:p>
+      <w:r>
+        <w:rPr/>
+        <w:t>|D₅ ∪ D₆ ∪ D₁₁| = 132 + 110 + 60 − 22 − 12 − 10 + 2 = 260.</w:t>
+      </w:r>
+    </w:p>
+    <w:p>
+      <w:pPr>
+        <w:pStyle w:val="Titolo2"/>
+      </w:pPr>
+      <w:r>
+        <w:rPr>
+          <w:b/>
+          <w:color w:val="E97132"/>
+        </w:rPr>
+        <w:t>Più di tre insiemi</w:t>
+      </w:r>
+    </w:p>
+    <w:p>
+      <w:r>
+        <w:rPr/>
+        <w:t>La stessa idea funziona con quattro, cinque o più insiemi: si sommano le cardinalità, si tolgono le intersezioni a due a due, si aggiungono quelle a tre a tre, e così via alternando i segni. Il principio resta valido, ma il numero di termini cresce in fretta (con 4 insiemi sono 15, con 5 sono 31) e la formula perde praticità. Esistono semplificazioni in casi particolari, per esempio quando gli insiemi sono a due a due disgiunti: in quel caso |A₁ ∪ … ∪ A</w:t>
+      </w:r>
+      <w:r>
+        <w:rPr>
+          <w:vertAlign w:val="subscript"/>
+        </w:rPr>
+        <w:t>n</w:t>
+      </w:r>
+      <w:r>
+        <w:rPr/>
+        <w:t>| = |A₁| + … + |A</w:t>
+      </w:r>
+      <w:r>
+        <w:rPr>
+          <w:vertAlign w:val="subscript"/>
+        </w:rPr>
+        <w:t>n</w:t>
+      </w:r>
+      <w:r>
+        <w:rPr/>
+        <w:t>|, perché non ci sono ripetizioni da correggere.</w:t>
+      </w:r>
+    </w:p>
+    <w:p>
+      <w:pPr>
+        <w:pStyle w:val="Titolo1"/>
+      </w:pPr>
+      <w:r>
+        <w:rPr>
+          <w:b/>
+          <w:color w:val="EE0000"/>
+        </w:rPr>
+        <w:t>22. Il Metodo delle Scelte Successive</w:t>
+      </w:r>
+    </w:p>
+    <w:p>
+      <w:pPr>
+        <w:pStyle w:val="Titolo2"/>
+      </w:pPr>
+      <w:r>
+        <w:rPr>
+          <w:b/>
+          <w:color w:val="E97132"/>
+        </w:rPr>
+        <w:t>Il prodotto cartesiano conta le scelte indipendenti</w:t>
+      </w:r>
+    </w:p>
+    <w:p>
+      <w:r>
+        <w:rPr/>
+        <w:t>Nel capitolo 3 si è visto che se |A| = m e |B| = n allora |A × B| = m · n. La ragione si vede elencando gli elementi, A = {a₁, …, a</w:t>
+      </w:r>
+      <w:r>
+        <w:rPr>
+          <w:vertAlign w:val="subscript"/>
+        </w:rPr>
+        <w:t>m</w:t>
+      </w:r>
+      <w:r>
+        <w:rPr/>
+        <w:t>} e B = {b₁, …, b</w:t>
+      </w:r>
+      <w:r>
+        <w:rPr>
+          <w:vertAlign w:val="subscript"/>
+        </w:rPr>
+        <w:t>n</w:t>
+      </w:r>
+      <w:r>
+        <w:rPr/>
+        <w:t>}: le coppie si dispongono in una griglia rettangolare, con una riga per ogni elemento di A, che contiene tutte le coppie con quel primo elemento, e una colonna per ogni elemento di B. La griglia ha m righe e n colonne, quindi m · n caselle, una per ciascuna coppia.</w:t>
+      </w:r>
+    </w:p>
+    <w:p>
+      <w:pPr>
+        <w:keepNext/>
+        <w:jc w:val="center"/>
+      </w:pPr>
+      <w:r>
+        <w:drawing>
+          <wp:inline xmlns:a="http://schemas.openxmlformats.org/drawingml/2006/main" xmlns:pic="http://schemas.openxmlformats.org/drawingml/2006/picture">
+            <wp:extent cx="3600000" cy="2355066"/>
+            <wp:docPr id="48" name="Picture 48"/>
+            <wp:cNvGraphicFramePr>
+              <a:graphicFrameLocks noChangeAspect="1"/>
+            </wp:cNvGraphicFramePr>
+            <a:graphic>
+              <a:graphicData uri="http://schemas.openxmlformats.org/drawingml/2006/picture">
+                <pic:pic>
+                  <pic:nvPicPr>
+                    <pic:cNvPr id="0" name="ch22_griglia.png"/>
+                    <pic:cNvPicPr/>
+                  </pic:nvPicPr>
+                  <pic:blipFill>
+                    <a:blip r:embed="rId52"/>
+                    <a:stretch>
+                      <a:fillRect/>
+                    </a:stretch>
+                  </pic:blipFill>
+                  <pic:spPr>
+                    <a:xfrm>
+                      <a:off x="0" y="0"/>
+                      <a:ext cx="3600000" cy="2355066"/>
+                    </a:xfrm>
+                    <a:prstGeom prst="rect"/>
+                  </pic:spPr>
+                </pic:pic>
+              </a:graphicData>
+            </a:graphic>
+          </wp:inline>
+        </w:drawing>
+      </w:r>
+    </w:p>
+    <w:p>
+      <w:pPr>
+        <w:jc w:val="center"/>
+      </w:pPr>
+      <w:r>
+        <w:rPr>
+          <w:i/>
+          <w:sz w:val="18"/>
+        </w:rPr>
+        <w:t>Le coppie di A × B in una griglia con m righe e n colonne: in tutto m · n.</w:t>
+      </w:r>
+    </w:p>
+    <w:p>
+      <w:r>
+        <w:rPr/>
+        <w:t>Il prodotto cartesiano modella una situazione in cui si fa una scelta arbitraria in un insieme e un'altra scelta, indipendente, in un secondo insieme. La stessa idea vale con tre, quattro o più insiemi.</w:t>
+      </w:r>
+    </w:p>
+    <w:p>
+      <w:r>
+        <w:rPr>
+          <w:b/>
+        </w:rPr>
+        <w:t>Proposizione.</w:t>
+      </w:r>
+      <w:r>
+        <w:rPr/>
+        <w:t xml:space="preserve"> Se A₁, A₂, …, A</w:t>
+      </w:r>
+      <w:r>
+        <w:rPr>
+          <w:vertAlign w:val="subscript"/>
+        </w:rPr>
+        <w:t>k</w:t>
+      </w:r>
+      <w:r>
+        <w:rPr/>
+        <w:t xml:space="preserve"> sono insiemi finiti con |A</w:t>
+      </w:r>
+      <w:r>
+        <w:rPr>
+          <w:vertAlign w:val="subscript"/>
+        </w:rPr>
+        <w:t>i</w:t>
+      </w:r>
+      <w:r>
+        <w:rPr/>
+        <w:t>| = n</w:t>
+      </w:r>
+      <w:r>
+        <w:rPr>
+          <w:vertAlign w:val="subscript"/>
+        </w:rPr>
+        <w:t>i</w:t>
+      </w:r>
+      <w:r>
+        <w:rPr/>
+        <w:t>, allora |A₁ × A₂ × … × A</w:t>
+      </w:r>
+      <w:r>
+        <w:rPr>
+          <w:vertAlign w:val="subscript"/>
+        </w:rPr>
+        <w:t>k</w:t>
+      </w:r>
+      <w:r>
+        <w:rPr/>
+        <w:t>| = n₁ · n₂ · … · n</w:t>
+      </w:r>
+      <w:r>
+        <w:rPr>
+          <w:vertAlign w:val="subscript"/>
+        </w:rPr>
+        <w:t>k</w:t>
+      </w:r>
+      <w:r>
+        <w:rPr/>
+        <w:t>.</w:t>
+      </w:r>
+    </w:p>
+    <w:p>
+      <w:r>
+        <w:rPr/>
+        <w:t>Si dimostra per induzione su k: il caso k = 2 è quello già noto, e per k &gt; 2 gli insiemi (A₁ × … × A</w:t>
+      </w:r>
+      <w:r>
+        <w:rPr>
+          <w:vertAlign w:val="subscript"/>
+        </w:rPr>
+        <w:t>k−1</w:t>
+      </w:r>
+      <w:r>
+        <w:rPr/>
+        <w:t>) × A</w:t>
+      </w:r>
+      <w:r>
+        <w:rPr>
+          <w:vertAlign w:val="subscript"/>
+        </w:rPr>
+        <w:t>k</w:t>
+      </w:r>
+      <w:r>
+        <w:rPr/>
+        <w:t xml:space="preserve"> e A₁ × … × A</w:t>
+      </w:r>
+      <w:r>
+        <w:rPr>
+          <w:vertAlign w:val="subscript"/>
+        </w:rPr>
+        <w:t>k−1</w:t>
+      </w:r>
+      <w:r>
+        <w:rPr/>
+        <w:t xml:space="preserve"> × A</w:t>
+      </w:r>
+      <w:r>
+        <w:rPr>
+          <w:vertAlign w:val="subscript"/>
+        </w:rPr>
+        <w:t>k</w:t>
+      </w:r>
+      <w:r>
+        <w:rPr/>
+        <w:t xml:space="preserve"> si corrispondono uno a uno (una biiezione ovvia riordina le parentesi), quindi |A₁ × … × A</w:t>
+      </w:r>
+      <w:r>
+        <w:rPr>
+          <w:vertAlign w:val="subscript"/>
+        </w:rPr>
+        <w:t>k</w:t>
+      </w:r>
+      <w:r>
+        <w:rPr/>
+        <w:t>| = |A₁ × … × A</w:t>
+      </w:r>
+      <w:r>
+        <w:rPr>
+          <w:vertAlign w:val="subscript"/>
+        </w:rPr>
+        <w:t>k−1</w:t>
+      </w:r>
+      <w:r>
+        <w:rPr/>
+        <w:t>| · |A</w:t>
+      </w:r>
+      <w:r>
+        <w:rPr>
+          <w:vertAlign w:val="subscript"/>
+        </w:rPr>
+        <w:t>k</w:t>
+      </w:r>
+      <w:r>
+        <w:rPr/>
+        <w:t>| = (n₁ · … · n</w:t>
+      </w:r>
+      <w:r>
+        <w:rPr>
+          <w:vertAlign w:val="subscript"/>
+        </w:rPr>
+        <w:t>k−1</w:t>
+      </w:r>
+      <w:r>
+        <w:rPr/>
+        <w:t>) · n</w:t>
+      </w:r>
+      <w:r>
+        <w:rPr>
+          <w:vertAlign w:val="subscript"/>
+        </w:rPr>
+        <w:t>k</w:t>
+      </w:r>
+      <w:r>
+        <w:rPr/>
+        <w:t>.</w:t>
+      </w:r>
+    </w:p>
+    <w:p>
+      <w:pPr>
+        <w:pStyle w:val="Titolo2"/>
+      </w:pPr>
+      <w:r>
+        <w:rPr>
+          <w:b/>
+          <w:color w:val="E97132"/>
+        </w:rPr>
+        <w:t>Un esempio: il menù</w:t>
+      </w:r>
+    </w:p>
+    <w:p>
+      <w:r>
+        <w:rPr/>
+        <w:t>Un ristorante offre un menù composto da un panino, una bibita e un dolce. Qualunque panino, qualunque bibita e qualunque dolce si scelga, si ottiene un menù valido. Se ci sono 12 panini, 5 bibite e 4 dolci, ogni menù è una terna ordinata (panino, bibita, dolce), cioè un elemento del prodotto cartesiano P × B × D dei tre insiemi. Il numero di menù possibili è quindi</w:t>
+      </w:r>
+    </w:p>
+    <w:p>
+      <w:r>
+        <w:rPr/>
+        <w:t>|P| · |B| · |D| = 12 · 5 · 4 = 240.</w:t>
+      </w:r>
+    </w:p>
+    <w:p>
+      <w:r>
+        <w:rPr/>
+        <w:t>Questo vuol dire che si può andare al ristorante per 240 giorni di seguito senza mai ripetere lo stesso menù.</w:t>
+      </w:r>
+    </w:p>
+    <w:p>
+      <w:pPr>
+        <w:pStyle w:val="Titolo2"/>
+      </w:pPr>
+      <w:r>
+        <w:rPr>
+          <w:b/>
+          <w:color w:val="E97132"/>
+        </w:rPr>
+        <w:t>L'albero delle scelte</w:t>
+      </w:r>
+    </w:p>
+    <w:p>
+      <w:r>
+        <w:rPr/>
+        <w:t xml:space="preserve">Lo stesso risultato si può vedere con un </w:t>
+      </w:r>
+      <w:r>
+        <w:rPr>
+          <w:b/>
+        </w:rPr>
+        <w:t>albero</w:t>
+      </w:r>
+      <w:r>
+        <w:rPr/>
+        <w:t>. Si parte dalla radice e si disegna un ramo per ogni possibile prima scelta (12 panini); dalla fine di ciascun ramo partono altri 5 rami, uno per ogni bibita; dalla fine di questi partono 4 rami, uno per ogni dolce. I punti finali dell'albero rappresentano tutte le possibili scelte complete, e il loro numero è il prodotto 12 · 5 · 4.</w:t>
+      </w:r>
+    </w:p>
+    <w:p>
+      <w:pPr>
+        <w:keepNext/>
+        <w:jc w:val="center"/>
+      </w:pPr>
+      <w:r>
+        <w:drawing>
+          <wp:inline xmlns:a="http://schemas.openxmlformats.org/drawingml/2006/main" xmlns:pic="http://schemas.openxmlformats.org/drawingml/2006/picture">
+            <wp:extent cx="4680000" cy="2600371"/>
+            <wp:docPr id="49" name="Picture 49"/>
+            <wp:cNvGraphicFramePr>
+              <a:graphicFrameLocks noChangeAspect="1"/>
+            </wp:cNvGraphicFramePr>
+            <a:graphic>
+              <a:graphicData uri="http://schemas.openxmlformats.org/drawingml/2006/picture">
+                <pic:pic>
+                  <pic:nvPicPr>
+                    <pic:cNvPr id="0" name="ch22_albero_menu.png"/>
+                    <pic:cNvPicPr/>
+                  </pic:nvPicPr>
+                  <pic:blipFill>
+                    <a:blip r:embed="rId53"/>
+                    <a:stretch>
+                      <a:fillRect/>
+                    </a:stretch>
+                  </pic:blipFill>
+                  <pic:spPr>
+                    <a:xfrm>
+                      <a:off x="0" y="0"/>
+                      <a:ext cx="4680000" cy="2600371"/>
+                    </a:xfrm>
+                    <a:prstGeom prst="rect"/>
+                  </pic:spPr>
+                </pic:pic>
+              </a:graphicData>
+            </a:graphic>
+          </wp:inline>
+        </w:drawing>
+      </w:r>
+    </w:p>
+    <w:p>
+      <w:pPr>
+        <w:jc w:val="center"/>
+      </w:pPr>
+      <w:r>
+        <w:rPr>
+          <w:i/>
+          <w:sz w:val="18"/>
+        </w:rPr>
+        <w:t>L'albero delle scelte per il menù: a ogni livello le scelte sono nello stesso insieme.</w:t>
+      </w:r>
+    </w:p>
+    <w:p>
+      <w:r>
+        <w:rPr/>
+        <w:t xml:space="preserve">Il </w:t>
+      </w:r>
+      <w:r>
+        <w:rPr>
+          <w:b/>
+        </w:rPr>
+        <w:t>metodo delle scelte successive</w:t>
+      </w:r>
+      <w:r>
+        <w:rPr/>
+        <w:t xml:space="preserve"> si può così enunciare: se una situazione si ottiene con una successione di k scelte indipendenti, e per la prima ci sono n₁ possibilità, per la seconda n₂, per la terza n₃ e così via, il numero totale di situazioni è n = n₁ · n₂ · … · n</w:t>
+      </w:r>
+      <w:r>
+        <w:rPr>
+          <w:vertAlign w:val="subscript"/>
+        </w:rPr>
+        <w:t>k</w:t>
+      </w:r>
+      <w:r>
+        <w:rPr/>
+        <w:t>.</w:t>
+      </w:r>
+    </w:p>
+    <w:p>
+      <w:r>
+        <w:rPr/>
+        <w:t xml:space="preserve">C'è una differenza importante con il prodotto cartesiano. Nel caso del menù le scelte avvengono sempre negli stessi insiemi, quali che siano le scelte precedenti. In generale invece l'insieme in cui si sceglie a un certo passo può </w:t>
+      </w:r>
+      <w:r>
+        <w:rPr>
+          <w:b/>
+        </w:rPr>
+        <w:t>dipendere</w:t>
+      </w:r>
+      <w:r>
+        <w:rPr/>
+        <w:t xml:space="preserve"> dalle scelte fatte prima: se, per esempio, scegliendo un certo panino cambiano le bibite disponibili, le bibite tra cui scegliere sono diverse, ma è sufficiente che il loro </w:t>
+      </w:r>
+      <w:r>
+        <w:rPr>
+          <w:b/>
+        </w:rPr>
+        <w:t>numero</w:t>
+      </w:r>
+      <w:r>
+        <w:rPr/>
+        <w:t xml:space="preserve"> sia sempre lo stesso a quel livello perché la formula continui a valere. Si vedrà tra poco un caso del genere con gli ordinamenti.</w:t>
+      </w:r>
+    </w:p>
+    <w:p>
+      <w:pPr>
+        <w:pStyle w:val="Titolo2"/>
+      </w:pPr>
+      <w:r>
+        <w:rPr>
+          <w:b/>
+          <w:color w:val="E97132"/>
+        </w:rPr>
+        <w:t>Altri esempi</w:t>
+      </w:r>
+    </w:p>
+    <w:p>
+      <w:pPr>
+        <w:numPr>
+          <w:ilvl w:val="0"/>
+          <w:numId w:val="1"/>
+        </w:numPr>
+      </w:pPr>
+      <w:r>
+        <w:rPr>
+          <w:b/>
+        </w:rPr>
+        <w:t>Le targhe.</w:t>
+      </w:r>
+      <w:r>
+        <w:rPr/>
+        <w:t xml:space="preserve"> Se una targa è formata da 3 lettere dell'alfabeto inglese (26 lettere) seguite da 4 cifre, con ripetizioni ammesse, i modi sono 26 · 26 · 26 · 10 · 10 · 10 · 10 = 175 760 000.</w:t>
+      </w:r>
+    </w:p>
+    <w:p>
+      <w:pPr>
+        <w:numPr>
+          <w:ilvl w:val="0"/>
+          <w:numId w:val="1"/>
+        </w:numPr>
+      </w:pPr>
+      <w:r>
+        <w:rPr>
+          <w:b/>
+        </w:rPr>
+        <w:t>I PIN.</w:t>
+      </w:r>
+      <w:r>
+        <w:rPr/>
+        <w:t xml:space="preserve"> Un PIN di 4 cifre ha 10 · 10 · 10 · 10 = 10⁴ = 10 000 possibilità. Se si hanno 10 001 smartphone, per il principio delle gabbie dei piccioni almeno due devono avere lo stesso PIN.</w:t>
+      </w:r>
+    </w:p>
+    <w:p>
+      <w:pPr>
+        <w:numPr>
+          <w:ilvl w:val="0"/>
+          <w:numId w:val="1"/>
+        </w:numPr>
+      </w:pPr>
+      <w:r>
+        <w:rPr>
+          <w:b/>
+        </w:rPr>
+        <w:t>Le funzioni da A in B.</w:t>
+      </w:r>
+      <w:r>
+        <w:rPr/>
+        <w:t xml:space="preserve"> Se |A| = m e |B| = n, per definire una funzione f : A → B bisogna dire quanto vale f(a) per ognuno degli m elementi di A, e ogni valore si può scegliere tra gli n elementi di B, senza vincoli sugli altri. Quindi le funzioni da A in B sono n · n · … · n = n</w:t>
+      </w:r>
+      <w:r>
+        <w:rPr>
+          <w:vertAlign w:val="superscript"/>
+        </w:rPr>
+        <w:t>m</w:t>
+      </w:r>
+      <w:r>
+        <w:rPr/>
+        <w:t>.</w:t>
+      </w:r>
+    </w:p>
+    <w:p>
+      <w:pPr>
+        <w:pStyle w:val="Titolo1"/>
+      </w:pPr>
+      <w:r>
+        <w:rPr>
+          <w:b/>
+          <w:color w:val="EE0000"/>
+        </w:rPr>
+        <w:t>23. Ordinamenti, Fattoriale e Anagrammi</w:t>
+      </w:r>
+    </w:p>
+    <w:p>
+      <w:pPr>
+        <w:pStyle w:val="Titolo2"/>
+      </w:pPr>
+      <w:r>
+        <w:rPr>
+          <w:b/>
+          <w:color w:val="E97132"/>
+        </w:rPr>
+        <w:t>Ordinare un insieme</w:t>
+      </w:r>
+    </w:p>
+    <w:p>
+      <w:r>
+        <w:rPr/>
+        <w:t>Dato un insieme finito A con n elementi, ci si chiede in quanti modi diversi se ne possono ordinare gli elementi, cioè metterli in fila: pensate a un mazzo di carte da riordinare o a un gruppo di libri da sistemare in uno scaffale. Un insieme non ha un ordine naturale, ma quando serve lo si può scegliere, e i modi sono molti.</w:t>
+      </w:r>
+    </w:p>
+    <w:p>
+      <w:r>
+        <w:rPr/>
+        <w:t>Ordinare significa dire quale elemento è il primo, quale il secondo, e così via. Chiamiamo I</w:t>
+      </w:r>
+      <w:r>
+        <w:rPr>
+          <w:vertAlign w:val="subscript"/>
+        </w:rPr>
+        <w:t>n</w:t>
+      </w:r>
+      <w:r>
+        <w:rPr/>
+        <w:t xml:space="preserve"> = {1, 2, …, n} l'insieme dei primi n numeri naturali: scegliere un ordinamento vuol dire associare un elemento di A a ciascun numero 1, 2, …, n, in modo che ogni elemento di A compaia una e una sola volta. Un </w:t>
+      </w:r>
+      <w:r>
+        <w:rPr>
+          <w:b/>
+        </w:rPr>
+        <w:t>ordinamento</w:t>
+      </w:r>
+      <w:r>
+        <w:rPr/>
+        <w:t xml:space="preserve"> di A è dunque una </w:t>
+      </w:r>
+      <w:r>
+        <w:rPr>
+          <w:b/>
+        </w:rPr>
+        <w:t>funzione biettiva</w:t>
+      </w:r>
+      <w:r>
+        <w:rPr/>
+        <w:t xml:space="preserve"> I</w:t>
+      </w:r>
+      <w:r>
+        <w:rPr>
+          <w:vertAlign w:val="subscript"/>
+        </w:rPr>
+        <w:t>n</w:t>
+      </w:r>
+      <w:r>
+        <w:rPr/>
+        <w:t xml:space="preserve"> → A, e contare gli ordinamenti equivale a contare le funzioni biettive.</w:t>
+      </w:r>
+    </w:p>
+    <w:p>
+      <w:pPr>
+        <w:pStyle w:val="Titolo2"/>
+      </w:pPr>
+      <w:r>
+        <w:rPr>
+          <w:b/>
+          <w:color w:val="E97132"/>
+        </w:rPr>
+        <w:t>L'albero e il numero degli ordinamenti</w:t>
+      </w:r>
+    </w:p>
+    <w:p>
+      <w:r>
+        <w:rPr/>
+        <w:t>Si costruisce la funzione scegliendo un elemento alla volta. Per la posizione 1 ci sono n scelte, perché si può scegliere qualunque elemento di A. Per la posizione 2 ce ne sono n − 1: l'elemento già scelto non si può usare di nuovo, altrimenti la funzione non sarebbe iniettiva. Per la posizione 3 ne restano n − 2, e così via, finché alla penultima posizione restano 2 scelte e all'ultima una sola: l'unico elemento non ancora scelto.</w:t>
+      </w:r>
+    </w:p>
+    <w:p>
+      <w:pPr>
+        <w:keepNext/>
+        <w:jc w:val="center"/>
+      </w:pPr>
+      <w:r>
+        <w:drawing>
+          <wp:inline xmlns:a="http://schemas.openxmlformats.org/drawingml/2006/main" xmlns:pic="http://schemas.openxmlformats.org/drawingml/2006/picture">
+            <wp:extent cx="4680000" cy="2874089"/>
+            <wp:docPr id="50" name="Picture 50"/>
+            <wp:cNvGraphicFramePr>
+              <a:graphicFrameLocks noChangeAspect="1"/>
+            </wp:cNvGraphicFramePr>
+            <a:graphic>
+              <a:graphicData uri="http://schemas.openxmlformats.org/drawingml/2006/picture">
+                <pic:pic>
+                  <pic:nvPicPr>
+                    <pic:cNvPr id="0" name="ch23_albero_permutazioni.png"/>
+                    <pic:cNvPicPr/>
+                  </pic:nvPicPr>
+                  <pic:blipFill>
+                    <a:blip r:embed="rId54"/>
+                    <a:stretch>
+                      <a:fillRect/>
+                    </a:stretch>
+                  </pic:blipFill>
+                  <pic:spPr>
+                    <a:xfrm>
+                      <a:off x="0" y="0"/>
+                      <a:ext cx="4680000" cy="2874089"/>
+                    </a:xfrm>
+                    <a:prstGeom prst="rect"/>
+                  </pic:spPr>
+                </pic:pic>
+              </a:graphicData>
+            </a:graphic>
+          </wp:inline>
+        </w:drawing>
+      </w:r>
+    </w:p>
+    <w:p>
+      <w:pPr>
+        <w:jc w:val="center"/>
+      </w:pPr>
+      <w:r>
+        <w:rPr>
+          <w:i/>
+          <w:sz w:val="18"/>
+        </w:rPr>
+        <w:t>L'albero degli ordinamenti di {a, b, c}: 3 scelte, poi 2, poi 1, in tutto 6.</w:t>
+      </w:r>
+    </w:p>
+    <w:p>
+      <w:r>
+        <w:rPr/>
+        <w:t xml:space="preserve">Qui le scelte possibili al secondo livello </w:t>
+      </w:r>
+      <w:r>
+        <w:rPr>
+          <w:b/>
+        </w:rPr>
+        <w:t>dipendono</w:t>
+      </w:r>
+      <w:r>
+        <w:rPr/>
+        <w:t xml:space="preserve"> da dove ci si trova al primo (se si è scelto a, si sceglie tra b e c; se si è scelto b, tra a e c), ma il loro numero è lo stesso, e per questo basta moltiplicare. Con n = 3 si hanno 3 · 2 · 1 = 6 ordinamenti, che si possono scrivere tutti: (a, b, c), (a, c, b), (b, a, c), (b, c, a), (c, a, b), (c, b, a).</w:t>
+      </w:r>
+    </w:p>
+    <w:p>
+      <w:r>
+        <w:rPr/>
+        <w:t xml:space="preserve">Il numero totale di ordinamenti è il prodotto n · (n − 1) · (n − 2) · … · 3 · 2 · 1. Questo numero si chiama </w:t>
+      </w:r>
+      <w:r>
+        <w:rPr>
+          <w:b/>
+        </w:rPr>
+        <w:t>n fattoriale</w:t>
+      </w:r>
+      <w:r>
+        <w:rPr/>
+        <w:t xml:space="preserve"> e si scrive n!.</w:t>
+      </w:r>
+    </w:p>
+    <w:p>
+      <w:r>
+        <w:rPr>
+          <w:b/>
+        </w:rPr>
+        <w:t>Definizione.</w:t>
+      </w:r>
+      <w:r>
+        <w:rPr/>
+        <w:t xml:space="preserve"> Per n ∈ ℕ si pone 0! = 1 e n! = 1 · 2 · 3 · … · n per n ≥ 1.</w:t>
+      </w:r>
+    </w:p>
+    <w:p>
+      <w:r>
+        <w:rPr>
+          <w:b/>
+        </w:rPr>
+        <w:t>Proposizione.</w:t>
+      </w:r>
+      <w:r>
+        <w:rPr/>
+        <w:t xml:space="preserve"> Se A è un insieme finito con n elementi, gli ordinamenti di A sono n!.</w:t>
+      </w:r>
+    </w:p>
+    <w:p>
+      <w:r>
+        <w:rPr/>
+        <w:t>Qualche valore: 1! = 1, 2! = 2, 3! = 6, 4! = 24, 5! = 120, 6! = 720, 7! = 5040, 8! = 40 320. Il fattoriale cresce molto in fretta: le 8 persone che partecipano alla finale dei 100 metri possono arrivare in 8! = 40 320 ordini diversi, e i modi di riordinare un mazzo di 52 carte sono 52!, un numero enorme.</w:t>
+      </w:r>
+    </w:p>
+    <w:p>
+      <w:r>
+        <w:rPr/>
+        <w:t xml:space="preserve">Due osservazioni sulla definizione. Primo, 0! = 1 è una </w:t>
+      </w:r>
+      <w:r>
+        <w:rPr>
+          <w:b/>
+        </w:rPr>
+        <w:t>convenzione</w:t>
+      </w:r>
+      <w:r>
+        <w:rPr/>
+        <w:t xml:space="preserve">: il prodotto 1 · 2 · … · n non ha senso per n = 0, e si pone 0! = 1 perché così certe formule si scrivono senza dover trattare a parte il caso 0. Secondo, vale n! = n · (n − 1)! per ogni n ≥ 1, perché i fattori da n − 1 in giù formano esattamente (n − 1)!. È una </w:t>
+      </w:r>
+      <w:r>
+        <w:rPr>
+          <w:b/>
+        </w:rPr>
+        <w:t>definizione ricorsiva</w:t>
+      </w:r>
+      <w:r>
+        <w:rPr/>
+        <w:t xml:space="preserve"> del fattoriale, come si userebbe in un linguaggio di programmazione che permette le funzioni ricorsive.</w:t>
+      </w:r>
+    </w:p>
+    <w:p>
+      <w:pPr>
+        <w:pStyle w:val="Titolo2"/>
+      </w:pPr>
+      <w:r>
+        <w:rPr>
+          <w:b/>
+          <w:color w:val="E97132"/>
+        </w:rPr>
+        <w:t>Gli anagrammi</w:t>
+      </w:r>
+    </w:p>
+    <w:p>
+      <w:r>
+        <w:rPr/>
+        <w:t>Un caso particolare di riordinamento è l'</w:t>
+      </w:r>
+      <w:r>
+        <w:rPr>
+          <w:b/>
+        </w:rPr>
+        <w:t>anagramma</w:t>
+      </w:r>
+      <w:r>
+        <w:rPr/>
+        <w:t xml:space="preserve">. Si parte da un insieme di simboli A, che chiamiamo </w:t>
+      </w:r>
+      <w:r>
+        <w:rPr>
+          <w:b/>
+        </w:rPr>
+        <w:t>alfabeto</w:t>
+      </w:r>
+      <w:r>
+        <w:rPr/>
+        <w:t xml:space="preserve"> (le lettere dalla A alla Z, ma anche cifre e simboli speciali: in una password l'alfabeto è l'insieme di tutti i caratteri ammessi). Una </w:t>
+      </w:r>
+      <w:r>
+        <w:rPr>
+          <w:b/>
+        </w:rPr>
+        <w:t>parola</w:t>
+      </w:r>
+      <w:r>
+        <w:rPr/>
+        <w:t xml:space="preserve"> è una successione finita di simboli di A, come TUZAAB, che non deve avere alcun senso compiuto. Fissare una parola di lunghezza ℓ vuol dire fissare una funzione P : I</w:t>
+      </w:r>
+      <w:r>
+        <w:rPr>
+          <w:vertAlign w:val="subscript"/>
+        </w:rPr>
+        <w:t>ℓ</w:t>
+      </w:r>
+      <w:r>
+        <w:rPr/>
+        <w:t xml:space="preserve"> → A, che dice quale lettera sta al primo posto, al secondo e così via.</w:t>
+      </w:r>
+    </w:p>
+    <w:p>
+      <w:r>
+        <w:rPr/>
+        <w:t xml:space="preserve">In generale questa funzione non è biettiva: non è detto che compaiano tutte le lettere dell'alfabeto, e una lettera può comparire più volte. Un </w:t>
+      </w:r>
+      <w:r>
+        <w:rPr>
+          <w:b/>
+        </w:rPr>
+        <w:t>anagramma</w:t>
+      </w:r>
+      <w:r>
+        <w:rPr/>
+        <w:t xml:space="preserve"> di P è un rimescolamento delle lettere della parola, cioè una parola ottenuta riordinando le stesse lettere, con le ripetizioni incluse (la parola stessa conta come uno dei suoi anagrammi).</w:t>
+      </w:r>
+    </w:p>
+    <w:p>
+      <w:r>
+        <w:rPr/>
+        <w:t xml:space="preserve">Se la parola ha </w:t>
+      </w:r>
+      <w:r>
+        <w:rPr>
+          <w:b/>
+        </w:rPr>
+        <w:t>tutte lettere diverse</w:t>
+      </w:r>
+      <w:r>
+        <w:rPr/>
+        <w:t>, riordinarla significa riordinare l'insieme delle sue lettere, e gli anagrammi sono ℓ!. Gli anagrammi di AGO sono 3! = 6: AGO, AOG, GAO, GOA, OAG, OGA. LUNA, con 4 lettere diverse, ha 4! = 24 anagrammi; PORTA ne ha 5! = 120.</w:t>
+      </w:r>
+    </w:p>
+    <w:p>
+      <w:r>
+        <w:rPr/>
+        <w:t xml:space="preserve">Il problema nasce quando alcune lettere si </w:t>
+      </w:r>
+      <w:r>
+        <w:rPr>
+          <w:b/>
+        </w:rPr>
+        <w:t>ripetono</w:t>
+      </w:r>
+      <w:r>
+        <w:rPr/>
+        <w:t>. La parola ORO non ha 3! = 6 anagrammi, ma solo 3: ORO, OOR, ROO. Rimescolare le due O fra loro, infatti, formalmente è un riordinamento, ma la parola resta la stessa e non conta come anagramma nuovo.</w:t>
+      </w:r>
+    </w:p>
+    <w:p>
+      <w:r>
+        <w:rPr/>
+        <w:t>Il ragionamento generale è il seguente: si parte dai ℓ! riordinamenti possibili e, per ogni lettera ripetuta, si divide per il numero di modi in cui si possono scambiare tra loro le sue copie, che non cambiano la parola.</w:t>
+      </w:r>
+    </w:p>
+    <w:p>
+      <w:r>
+        <w:rPr>
+          <w:b/>
+        </w:rPr>
+        <w:t>Proposizione.</w:t>
+      </w:r>
+      <w:r>
+        <w:rPr/>
+        <w:t xml:space="preserve"> Sia P una parola di lunghezza ℓ in cui k simboli compaiono più volte, il j-esimo simbolo compare r</w:t>
+      </w:r>
+      <w:r>
+        <w:rPr>
+          <w:vertAlign w:val="subscript"/>
+        </w:rPr>
+        <w:t>j</w:t>
+      </w:r>
+      <w:r>
+        <w:rPr/>
+        <w:t xml:space="preserve"> volte. Allora il numero degli anagrammi di P è</w:t>
+      </w:r>
+    </w:p>
+    <w:p>
+      <w:r>
+        <w:rPr/>
+        <w:t>ℓ! / (r₁! · r₂! · … · r</w:t>
+      </w:r>
+      <w:r>
+        <w:rPr>
+          <w:vertAlign w:val="subscript"/>
+        </w:rPr>
+        <w:t>k</w:t>
+      </w:r>
+      <w:r>
+        <w:rPr/>
+        <w:t>!).</w:t>
+      </w:r>
+    </w:p>
+    <w:p>
+      <w:r>
+        <w:rPr/>
+        <w:t>Per ogni simbolo che si ripete r volte, i riordinamenti delle sue r copie sono r!, e tutti producono la stessa parola: bisogna quindi dividere per r!, e così per ogni simbolo ripetuto.</w:t>
+      </w:r>
+    </w:p>
+    <w:p>
+      <w:r>
+        <w:rPr>
+          <w:b/>
+        </w:rPr>
+        <w:t>Esempi.</w:t>
+      </w:r>
+    </w:p>
+    <w:p>
+      <w:pPr>
+        <w:numPr>
+          <w:ilvl w:val="0"/>
+          <w:numId w:val="1"/>
+        </w:numPr>
+      </w:pPr>
+      <w:r>
+        <w:rPr/>
+        <w:t>ORO: ℓ = 3, la O compare 2 volte, quindi 3!/2! = 6/2 = 3.</w:t>
+      </w:r>
+    </w:p>
+    <w:p>
+      <w:pPr>
+        <w:numPr>
+          <w:ilvl w:val="0"/>
+          <w:numId w:val="1"/>
+        </w:numPr>
+      </w:pPr>
+      <w:r>
+        <w:rPr/>
+        <w:t>POZZO: ℓ = 5, la O e la Z compaiono due volte ciascuna, quindi 5!/(2! · 2!) = 120/4 = 30.</w:t>
+      </w:r>
+    </w:p>
+    <w:p>
+      <w:pPr>
+        <w:numPr>
+          <w:ilvl w:val="0"/>
+          <w:numId w:val="1"/>
+        </w:numPr>
+      </w:pPr>
+      <w:r>
+        <w:rPr/>
+        <w:t>MATEMATICA: ℓ = 10; la M compare 2 volte, la T 2 volte, la A 3 volte, mentre E, I e C compaiono una sola volta (e non contano nel prodotto, perché 1! = 1). Gli anagrammi sono 10!/(2! · 2! · 3!) = 3 628 800/24 = 151 200. Il numero importa poco, conta il metodo.</w:t>
+      </w:r>
+    </w:p>
+    <w:p>
+      <w:pPr>
+        <w:pStyle w:val="Titolo1"/>
+      </w:pPr>
+      <w:r>
+        <w:rPr>
+          <w:b/>
+          <w:color w:val="EE0000"/>
+        </w:rPr>
+        <w:t>24. Le Disposizioni: con Ripetizione e Semplici</w:t>
+      </w:r>
+    </w:p>
+    <w:p>
+      <w:pPr>
+        <w:pStyle w:val="Titolo2"/>
+      </w:pPr>
+      <w:r>
+        <w:rPr>
+          <w:b/>
+          <w:color w:val="E97132"/>
+        </w:rPr>
+        <w:t>Scelte ordinate di alcuni elementi</w:t>
+      </w:r>
+    </w:p>
+    <w:p>
+      <w:r>
+        <w:rPr/>
+        <w:t xml:space="preserve">Con gli ordinamenti si prendono </w:t>
+      </w:r>
+      <w:r>
+        <w:rPr>
+          <w:b/>
+        </w:rPr>
+        <w:t>tutti</w:t>
+      </w:r>
+      <w:r>
+        <w:rPr/>
+        <w:t xml:space="preserve"> gli elementi di un insieme e li si mette in fila. Nella realtà spesso interessa scegliere solo alcuni elementi, sempre tenendo conto dell'ordine. Alle Olimpiadi, per esempio, vengono premiati i primi tre: nella finale dei 100 metri con 8 atleti si vuole sapere quante sono le possibili assegnazioni di oro, argento e bronzo, quindi si ordinano solo tre degli otto, mentre gli altri possono arrivare in qualunque ordine e non interessano. Un altro problema: un falegname ha prodotto 5 oggetti diversi e dispone di smalti di 4 colori, e vuole sapere in quanti modi può colorare gli oggetti.</w:t>
+      </w:r>
+    </w:p>
+    <w:p>
+      <w:r>
+        <w:rPr/>
+        <w:t xml:space="preserve">Entrambe le situazioni sono </w:t>
+      </w:r>
+      <w:r>
+        <w:rPr>
+          <w:b/>
+        </w:rPr>
+        <w:t>disposizioni</w:t>
+      </w:r>
+      <w:r>
+        <w:rPr/>
+        <w:t xml:space="preserve">. Una </w:t>
+      </w:r>
+      <w:r>
+        <w:rPr>
+          <w:b/>
+        </w:rPr>
+        <w:t>disposizione</w:t>
+      </w:r>
+      <w:r>
+        <w:rPr/>
+        <w:t xml:space="preserve"> di elementi di un insieme A è una scelta </w:t>
+      </w:r>
+      <w:r>
+        <w:rPr>
+          <w:b/>
+        </w:rPr>
+        <w:t>ordinata</w:t>
+      </w:r>
+      <w:r>
+        <w:rPr/>
+        <w:t xml:space="preserve"> di elementi di A: l'ordine conta, perché il primo scelto e il secondo scelto hanno ruoli diversi (arrivare primo e secondo non è la stessa cosa che arrivare secondo e primo; e nei colori, colorare l'oggetto a di bianco e l'oggetto b di rosso è diverso dal contrario).</w:t>
+      </w:r>
+    </w:p>
+    <w:p>
+      <w:r>
+        <w:rPr/>
+        <w:t xml:space="preserve">I due problemi però non sono uguali, e vanno trattati con formule diverse. Un atleta non può vincere due medaglie nella stessa gara, quindi non ci sono ripetizioni nella scelta. Invece il falegname può colorare tutti e cinque gli oggetti di bianco, e la scelta del colore può ripetersi. Per questo si distinguono le </w:t>
+      </w:r>
+      <w:r>
+        <w:rPr>
+          <w:b/>
+        </w:rPr>
+        <w:t>disposizioni con ripetizione</w:t>
+      </w:r>
+      <w:r>
+        <w:rPr/>
+        <w:t xml:space="preserve">, in cui lo stesso elemento si può scegliere più volte, e le </w:t>
+      </w:r>
+      <w:r>
+        <w:rPr>
+          <w:b/>
+        </w:rPr>
+        <w:t>disposizioni semplici</w:t>
+      </w:r>
+      <w:r>
+        <w:rPr/>
+        <w:t>, in cui no.</w:t>
+      </w:r>
+    </w:p>
+    <w:p>
+      <w:r>
+        <w:rPr/>
+        <w:t>Come sottolineato a lezione, la parte più difficile è leggere il problema e capire di che tipo è; le formule sono semplici. I due indizi principali sono: se le scelte possono ripetersi oppure no, e se l'ordine conta oppure no.</w:t>
+      </w:r>
+    </w:p>
+    <w:p>
+      <w:pPr>
+        <w:pStyle w:val="Titolo2"/>
+      </w:pPr>
+      <w:r>
+        <w:rPr>
+          <w:b/>
+          <w:color w:val="E97132"/>
+        </w:rPr>
+        <w:t>Disposizioni con ripetizione</w:t>
+      </w:r>
+    </w:p>
+    <w:p>
+      <w:r>
+        <w:rPr/>
+        <w:t xml:space="preserve">Sia A un insieme con n elementi (nel problema dei colori, l'insieme dei 4 smalti) e si devono fare k scelte ordinate in A. Una </w:t>
+      </w:r>
+      <w:r>
+        <w:rPr>
+          <w:b/>
+        </w:rPr>
+        <w:t>disposizione con ripetizione</w:t>
+      </w:r>
+      <w:r>
+        <w:rPr/>
+        <w:t xml:space="preserve"> di ordine k in A è quindi una successione di k elementi di A non necessariamente distinti. In termini di funzioni, si tratta di assegnare a ciascuno dei numeri 1, 2, …, k un elemento di A: una </w:t>
+      </w:r>
+      <w:r>
+        <w:rPr>
+          <w:b/>
+        </w:rPr>
+        <w:t>funzione qualunque</w:t>
+      </w:r>
+      <w:r>
+        <w:rPr/>
+        <w:t xml:space="preserve"> da I</w:t>
+      </w:r>
+      <w:r>
+        <w:rPr>
+          <w:vertAlign w:val="subscript"/>
+        </w:rPr>
+        <w:t>k</w:t>
+      </w:r>
+      <w:r>
+        <w:rPr/>
+        <w:t xml:space="preserve"> = {1, …, k} in A, perché non c'è alcuna condizione (si può scegliere sempre lo stesso elemento).</w:t>
+      </w:r>
+    </w:p>
+    <w:p>
+      <w:r>
+        <w:rPr/>
+        <w:t>Nell'albero, alla prima scelta ci sono n possibilità; alla seconda ce ne sono di nuovo n, perché l'elemento già scelto si può scegliere ancora; e così a ogni livello. Con n = 4 il primo livello ha 4 rami, il secondo 4 · 4 = 16, il terzo 4 · 4 · 4 = 64, e al livello k ci sono 4</w:t>
+      </w:r>
+      <w:r>
+        <w:rPr>
+          <w:vertAlign w:val="superscript"/>
+        </w:rPr>
+        <w:t>k</w:t>
+      </w:r>
+      <w:r>
+        <w:rPr/>
+        <w:t xml:space="preserve"> punti finali.</w:t>
+      </w:r>
+    </w:p>
+    <w:p>
+      <w:pPr>
+        <w:keepNext/>
+        <w:jc w:val="center"/>
+      </w:pPr>
+      <w:r>
+        <w:drawing>
+          <wp:inline xmlns:a="http://schemas.openxmlformats.org/drawingml/2006/main" xmlns:pic="http://schemas.openxmlformats.org/drawingml/2006/picture">
+            <wp:extent cx="4680000" cy="2993202"/>
+            <wp:docPr id="51" name="Picture 51"/>
+            <wp:cNvGraphicFramePr>
+              <a:graphicFrameLocks noChangeAspect="1"/>
+            </wp:cNvGraphicFramePr>
+            <a:graphic>
+              <a:graphicData uri="http://schemas.openxmlformats.org/drawingml/2006/picture">
+                <pic:pic>
+                  <pic:nvPicPr>
+                    <pic:cNvPr id="0" name="ch24_albero_ripetizione.png"/>
+                    <pic:cNvPicPr/>
+                  </pic:nvPicPr>
+                  <pic:blipFill>
+                    <a:blip r:embed="rId55"/>
+                    <a:stretch>
+                      <a:fillRect/>
+                    </a:stretch>
+                  </pic:blipFill>
+                  <pic:spPr>
+                    <a:xfrm>
+                      <a:off x="0" y="0"/>
+                      <a:ext cx="4680000" cy="2993202"/>
+                    </a:xfrm>
+                    <a:prstGeom prst="rect"/>
+                  </pic:spPr>
+                </pic:pic>
+              </a:graphicData>
+            </a:graphic>
+          </wp:inline>
+        </w:drawing>
+      </w:r>
+    </w:p>
+    <w:p>
+      <w:pPr>
+        <w:jc w:val="center"/>
+      </w:pPr>
+      <w:r>
+        <w:rPr>
+          <w:i/>
+          <w:sz w:val="18"/>
+        </w:rPr>
+        <w:t>L'albero delle disposizioni con ripetizione per n = 4: a ogni livello 4 scelte, quindi 4, 16, 64, …</w:t>
+      </w:r>
+    </w:p>
+    <w:p>
+      <w:r>
+        <w:rPr>
+          <w:b/>
+        </w:rPr>
+        <w:t>Proposizione.</w:t>
+      </w:r>
+      <w:r>
+        <w:rPr/>
+        <w:t xml:space="preserve"> Il numero delle disposizioni con ripetizione di k scelte tra n oggetti è n</w:t>
+      </w:r>
+      <w:r>
+        <w:rPr>
+          <w:vertAlign w:val="superscript"/>
+        </w:rPr>
+        <w:t>k</w:t>
+      </w:r>
+      <w:r>
+        <w:rPr/>
+        <w:t>.</w:t>
+      </w:r>
+    </w:p>
+    <w:p>
+      <w:r>
+        <w:rPr/>
+        <w:t>Si indica con D</w:t>
+      </w:r>
+      <w:r>
+        <w:rPr>
+          <w:vertAlign w:val="superscript"/>
+        </w:rPr>
+        <w:t>r</w:t>
+      </w:r>
+      <w:r>
+        <w:rPr>
+          <w:vertAlign w:val="subscript"/>
+        </w:rPr>
+        <w:t>n,k</w:t>
+      </w:r>
+      <w:r>
+        <w:rPr/>
+        <w:t>, dove la r sta per «ripetizione» (non è un esponente), e vale D</w:t>
+      </w:r>
+      <w:r>
+        <w:rPr>
+          <w:vertAlign w:val="superscript"/>
+        </w:rPr>
+        <w:t>r</w:t>
+      </w:r>
+      <w:r>
+        <w:rPr>
+          <w:vertAlign w:val="subscript"/>
+        </w:rPr>
+        <w:t>n,k</w:t>
+      </w:r>
+      <w:r>
+        <w:rPr/>
+        <w:t xml:space="preserve"> = n</w:t>
+      </w:r>
+      <w:r>
+        <w:rPr>
+          <w:vertAlign w:val="superscript"/>
+        </w:rPr>
+        <w:t>k</w:t>
+      </w:r>
+      <w:r>
+        <w:rPr/>
+        <w:t>. Per il falegname, con n = 4 colori e k = 5 oggetti, ci sono 4⁵ = 1024 colorazioni. Altri esempi: la prova scritta di 15 candidati con voti da 0 a 10 ha 11 voti possibili per candidato, quindi 11</w:t>
+      </w:r>
+      <w:r>
+        <w:rPr>
+          <w:vertAlign w:val="superscript"/>
+        </w:rPr>
+        <w:t>15</w:t>
+      </w:r>
+      <w:r>
+        <w:rPr/>
+        <w:t xml:space="preserve"> esiti complessivi; 7 oggetti con 4 smalti si possono colorare in 4⁷ modi.</w:t>
+      </w:r>
+    </w:p>
+    <w:p>
+      <w:r>
+        <w:rPr/>
+        <w:t xml:space="preserve">Un chiarimento sul modello: le scelte si fanno </w:t>
+      </w:r>
+      <w:r>
+        <w:rPr>
+          <w:b/>
+        </w:rPr>
+        <w:t>nell'insieme dei colori</w:t>
+      </w:r>
+      <w:r>
+        <w:rPr/>
+        <w:t xml:space="preserve">, a ogni oggetto si associa un colore, ma non a ogni colore un oggetto (lo stesso colore può servire a più oggetti). Per questo la scelta è una funzione dall'insieme degli oggetti, numerati da 1 a k, nell'insieme dei colori, non il contrario. La numerazione ha senso perché gli oggetti sono </w:t>
+      </w:r>
+      <w:r>
+        <w:rPr>
+          <w:b/>
+        </w:rPr>
+        <w:t>diversi tra loro</w:t>
+      </w:r>
+      <w:r>
+        <w:rPr/>
+        <w:t>, quindi distinguibili: se invece fossero 5 sedie identiche, scegliere bianco per la prima e rosso per la seconda sarebbe la stessa cosa che il contrario, l'ordine non conterebbe più e il problema sarebbe un altro.</w:t>
+      </w:r>
+    </w:p>
+    <w:p>
+      <w:pPr>
+        <w:pStyle w:val="Titolo2"/>
+      </w:pPr>
+      <w:r>
+        <w:rPr>
+          <w:b/>
+          <w:color w:val="E97132"/>
+        </w:rPr>
+        <w:t>Disposizioni semplici</w:t>
+      </w:r>
+    </w:p>
+    <w:p>
+      <w:r>
+        <w:rPr/>
+        <w:t xml:space="preserve">Una </w:t>
+      </w:r>
+      <w:r>
+        <w:rPr>
+          <w:b/>
+        </w:rPr>
+        <w:t>disposizione semplice</w:t>
+      </w:r>
+      <w:r>
+        <w:rPr/>
+        <w:t xml:space="preserve"> di ordine k in A è una successione di k elementi di A a due a due distinti, cioè una scelta ordinata senza ripetizioni. Equivale a una </w:t>
+      </w:r>
+      <w:r>
+        <w:rPr>
+          <w:b/>
+        </w:rPr>
+        <w:t>funzione iniettiva</w:t>
+      </w:r>
+      <w:r>
+        <w:rPr/>
+        <w:t xml:space="preserve"> da I</w:t>
+      </w:r>
+      <w:r>
+        <w:rPr>
+          <w:vertAlign w:val="subscript"/>
+        </w:rPr>
+        <w:t>k</w:t>
+      </w:r>
+      <w:r>
+        <w:rPr/>
+        <w:t xml:space="preserve"> in A, perché due numeri diversi non possono avere lo stesso elemento.</w:t>
+      </w:r>
+    </w:p>
+    <w:p>
+      <w:r>
+        <w:rPr/>
+        <w:t>Una conseguenza immediata: per il principio dei cassetti (o delle gabbie dei piccioni) non si possono associare in modo iniettivo più elementi di quanti ce ne siano nell'insieme di arrivo, quindi deve essere k ≤ n. Con k &gt; n non esistono disposizioni semplici. Con k = n la disposizione semplice è un ordinamento di tutto A, e il numero è n!. Se k &lt; n la funzione non è suriettiva (si usano solo alcuni elementi di A), ma questo non è richiesto.</w:t>
+      </w:r>
+    </w:p>
+    <w:p>
+      <w:r>
+        <w:rPr/>
+        <w:t>Il conteggio procede come per gli ordinamenti, ma ci si ferma prima. Alla prima scelta ci sono n possibilità, alla seconda n − 1 (non si può ripetere l'elemento già scelto), alla terza n − 2, e così via. All'ultima scelta, la k-esima, ci sono n − (k − 1) = n − k + 1 possibilità: i fattori sono k in tutto e il primo non toglie niente, il secondo toglie 1, il terzo toglie 2, il k-esimo toglie k − 1.</w:t>
+      </w:r>
+    </w:p>
+    <w:p>
+      <w:pPr>
+        <w:keepNext/>
+        <w:jc w:val="center"/>
+      </w:pPr>
+      <w:r>
+        <w:drawing>
+          <wp:inline xmlns:a="http://schemas.openxmlformats.org/drawingml/2006/main" xmlns:pic="http://schemas.openxmlformats.org/drawingml/2006/picture">
+            <wp:extent cx="4680000" cy="2797943"/>
+            <wp:docPr id="52" name="Picture 52"/>
+            <wp:cNvGraphicFramePr>
+              <a:graphicFrameLocks noChangeAspect="1"/>
+            </wp:cNvGraphicFramePr>
+            <a:graphic>
+              <a:graphicData uri="http://schemas.openxmlformats.org/drawingml/2006/picture">
+                <pic:pic>
+                  <pic:nvPicPr>
+                    <pic:cNvPr id="0" name="ch24_albero_podio.png"/>
+                    <pic:cNvPicPr/>
+                  </pic:nvPicPr>
+                  <pic:blipFill>
+                    <a:blip r:embed="rId56"/>
+                    <a:stretch>
+                      <a:fillRect/>
+                    </a:stretch>
+                  </pic:blipFill>
+                  <pic:spPr>
+                    <a:xfrm>
+                      <a:off x="0" y="0"/>
+                      <a:ext cx="4680000" cy="2797943"/>
+                    </a:xfrm>
+                    <a:prstGeom prst="rect"/>
+                  </pic:spPr>
+                </pic:pic>
+              </a:graphicData>
+            </a:graphic>
+          </wp:inline>
+        </w:drawing>
+      </w:r>
+    </w:p>
+    <w:p>
+      <w:pPr>
+        <w:jc w:val="center"/>
+      </w:pPr>
+      <w:r>
+        <w:rPr>
+          <w:i/>
+          <w:sz w:val="18"/>
+        </w:rPr>
+        <w:t>L'albero delle disposizioni semplici per n = 5 e k = 3: 5 scelte, poi 4, poi 3, in tutto 60.</w:t>
+      </w:r>
+    </w:p>
+    <w:p>
+      <w:r>
+        <w:rPr>
+          <w:b/>
+        </w:rPr>
+        <w:t>Proposizione.</w:t>
+      </w:r>
+      <w:r>
+        <w:rPr/>
+        <w:t xml:space="preserve"> Per 1 ≤ k ≤ n, il numero delle disposizioni semplici di k elementi scelti tra n, indicato con D</w:t>
+      </w:r>
+      <w:r>
+        <w:rPr>
+          <w:vertAlign w:val="subscript"/>
+        </w:rPr>
+        <w:t>n,k</w:t>
+      </w:r>
+      <w:r>
+        <w:rPr/>
+        <w:t>, è</w:t>
+      </w:r>
+    </w:p>
+    <w:p>
+      <w:r>
+        <w:rPr/>
+        <w:t>D</w:t>
+      </w:r>
+      <w:r>
+        <w:rPr>
+          <w:vertAlign w:val="subscript"/>
+        </w:rPr>
+        <w:t>n,k</w:t>
+      </w:r>
+      <w:r>
+        <w:rPr/>
+        <w:t xml:space="preserve"> = n · (n − 1) · … · (n − k + 1).</w:t>
+      </w:r>
+    </w:p>
+    <w:p>
+      <w:r>
+        <w:rPr/>
+        <w:t>Nell'albero con n = 5 e k = 3 si hanno 5 · 4 · 3 = 60 punti finali. Per la finale dei 100 metri con 8 atleti i podi possibili sono D</w:t>
+      </w:r>
+      <w:r>
+        <w:rPr>
+          <w:vertAlign w:val="subscript"/>
+        </w:rPr>
+        <w:t>8,3</w:t>
+      </w:r>
+      <w:r>
+        <w:rPr/>
+        <w:t xml:space="preserve"> = 8 · 7 · 6 = 336, e con 12 atleti D</w:t>
+      </w:r>
+      <w:r>
+        <w:rPr>
+          <w:vertAlign w:val="subscript"/>
+        </w:rPr>
+        <w:t>12,3</w:t>
+      </w:r>
+      <w:r>
+        <w:rPr/>
+        <w:t xml:space="preserve"> = 12 · 11 · 10 = 1320.</w:t>
+      </w:r>
+    </w:p>
+    <w:p>
+      <w:r>
+        <w:rPr/>
+        <w:t>Esiste una scrittura più compatta con il fattoriale. Scrivendo n! = n · (n − 1) · … · (n − k + 1) · (n − k) · (n − k − 1) · … · 3 · 2 · 1, i fattori dopo (n − k + 1) formano (n − k)!. Quindi, dividendo n! per (n − k)!, restano solo i primi k fattori:</w:t>
+      </w:r>
+    </w:p>
+    <w:p>
+      <w:r>
+        <w:rPr/>
+        <w:t>D</w:t>
+      </w:r>
+      <w:r>
+        <w:rPr>
+          <w:vertAlign w:val="subscript"/>
+        </w:rPr>
+        <w:t>n,k</w:t>
+      </w:r>
+      <w:r>
+        <w:rPr/>
+        <w:t xml:space="preserve"> = n! / (n − k)!.</w:t>
+      </w:r>
+    </w:p>
+    <w:p>
+      <w:r>
+        <w:rPr/>
+        <w:t>Con k = n si ottiene n!/0! = n!, coerente con gli ordinamenti, ed è qui che la convenzione 0! = 1 è utile.</w:t>
+      </w:r>
+    </w:p>
+    <w:p>
+      <w:pPr>
+        <w:pStyle w:val="Titolo2"/>
+      </w:pPr>
+      <w:r>
+        <w:rPr>
+          <w:b/>
+          <w:color w:val="E97132"/>
+        </w:rPr>
+        <w:t>Verso le combinazioni</w:t>
+      </w:r>
+    </w:p>
+    <w:p>
+      <w:r>
+        <w:rPr/>
+        <w:t xml:space="preserve">Non sempre l'ordine conta. In una gelateria con 15 gusti, un cono grande contiene tre gusti: cioccolato, nocciola, pistacchio è lo stesso cono di pistacchio, cioccolato, nocciola. Sono scelte </w:t>
+      </w:r>
+      <w:r>
+        <w:rPr>
+          <w:b/>
+        </w:rPr>
+        <w:t>non ordinate</w:t>
+      </w:r>
+      <w:r>
+        <w:rPr/>
+        <w:t xml:space="preserve">, e il modello matematico non è una funzione ma un </w:t>
+      </w:r>
+      <w:r>
+        <w:rPr>
+          <w:b/>
+        </w:rPr>
+        <w:t>sottoinsieme</w:t>
+      </w:r>
+      <w:r>
+        <w:rPr/>
+        <w:t xml:space="preserve">: scegliere un cono equivale a scegliere un sottoinsieme di 3 gusti dai 15. Anche una vaschetta di pasticcini non dipende dall'ordine in cui li si mettono, ma lì lo stesso tipo di pasticcino si può prendere più volte: è un caso con ripetizione, che si tratterà a parte. Una </w:t>
+      </w:r>
+      <w:r>
+        <w:rPr>
+          <w:b/>
+        </w:rPr>
+        <w:t>combinazione</w:t>
+      </w:r>
+      <w:r>
+        <w:rPr/>
+        <w:t xml:space="preserve"> di ordine k in un insieme A con n elementi è la scelta di un sottoinsieme S di A con k elementi, con k ≤ n. Quante siano si vedrà nella prossima lezione, insieme ai coefficienti binomiali.</w:t>
       </w:r>
     </w:p>
     <w:sectPr>

</xml_diff>

<commit_message>
Mate discreta: cap. 25 (insiemi finiti, cardinalita', principio dei cassetti) dal libro; confronto cap. 1-19 col libro
Co-Authored-By: Claude Sonnet 5.5 <noreply@anthropic.com>
</commit_message>
<xml_diff>
--- a/Riassunto Matematica discreta.docx
+++ b/Riassunto Matematica discreta.docx
@@ -16554,6 +16554,665 @@
       <w:r>
         <w:rPr/>
         <w:t xml:space="preserve"> di ordine k in un insieme A con n elementi è la scelta di un sottoinsieme S di A con k elementi, con k ≤ n. Quante siano si vedrà nella prossima lezione, insieme ai coefficienti binomiali.</w:t>
+      </w:r>
+    </w:p>
+    <w:p>
+      <w:pPr>
+        <w:pStyle w:val="Titolo1"/>
+      </w:pPr>
+      <w:r>
+        <w:rPr>
+          <w:b/>
+          <w:color w:val="EE0000"/>
+        </w:rPr>
+        <w:t>25. Insiemi Finiti, Cardinalità e Principio dei Cassetti</w:t>
+      </w:r>
+    </w:p>
+    <w:p>
+      <w:pPr>
+        <w:pStyle w:val="Titolo2"/>
+      </w:pPr>
+      <w:r>
+        <w:rPr>
+          <w:b/>
+          <w:color w:val="E97132"/>
+        </w:rPr>
+        <w:t>Contare gli elementi di un insieme</w:t>
+      </w:r>
+    </w:p>
+    <w:p>
+      <w:r>
+        <w:rPr/>
+        <w:t>Contare gli elementi di un insieme A significa, intuitivamente, dare l'etichetta «1» a un elemento, «2» a un altro, e così via fino a esaurirli: nel linguaggio degli insiemi è una funzione iniettiva α : A → ℕ. Per questo approccio ci sono due problemi. Il risultato finale potrebbe dipendere da come si conta, cioè dalla funzione α scelta, e non è detto che una tale funzione esista. La definizione corretta parte da un criterio che dice quando due insiemi hanno lo stesso numero di elementi, senza contarli.</w:t>
+      </w:r>
+    </w:p>
+    <w:p>
+      <w:r>
+        <w:rPr>
+          <w:b/>
+        </w:rPr>
+        <w:t>Definizione.</w:t>
+      </w:r>
+      <w:r>
+        <w:rPr/>
+        <w:t xml:space="preserve"> Due insiemi A e B si dicono </w:t>
+      </w:r>
+      <w:r>
+        <w:rPr>
+          <w:b/>
+        </w:rPr>
+        <w:t>equipollenti</w:t>
+      </w:r>
+      <w:r>
+        <w:rPr/>
+        <w:t xml:space="preserve"> se esiste una funzione biettiva f : A → B. In questo caso si dice che hanno la stessa </w:t>
+      </w:r>
+      <w:r>
+        <w:rPr>
+          <w:b/>
+        </w:rPr>
+        <w:t>cardinalità</w:t>
+      </w:r>
+      <w:r>
+        <w:rPr/>
+        <w:t xml:space="preserve"> e si scrive |A| = |B|.</w:t>
+      </w:r>
+    </w:p>
+    <w:p>
+      <w:r>
+        <w:rPr/>
+        <w:t>Poiché la composizione di biiezioni è una biiezione, se |A| = |B| e |B| = |C| allora |A| = |C|. La definizione può però dare risultati controintuitivi quando gli insiemi sono infiniti:</w:t>
+      </w:r>
+    </w:p>
+    <w:p>
+      <w:pPr>
+        <w:numPr>
+          <w:ilvl w:val="0"/>
+          <w:numId w:val="1"/>
+        </w:numPr>
+      </w:pPr>
+      <w:r>
+        <w:rPr/>
+        <w:t>la funzione f : ℕ → 2ℕ, f(n) = 2n, è una biiezione (ha come inversa g(m) = m/2), quindi ℕ e 2ℕ, l'insieme dei numeri pari, sono equipollenti, anche se i pari sono solo una parte dei naturali;</w:t>
+      </w:r>
+    </w:p>
+    <w:p>
+      <w:pPr>
+        <w:numPr>
+          <w:ilvl w:val="0"/>
+          <w:numId w:val="1"/>
+        </w:numPr>
+      </w:pPr>
+      <w:r>
+        <w:rPr/>
+        <w:t>anche ℕ × ℕ è equipollente a ℕ: si elencano le coppie (a, b) in ordine crescente di a + b e, a parità di somma, per a crescente, cioè (0, 0), (0, 1), (1, 0), (0, 2), (1, 1), (2, 0), … ; ogni coppia compare in questa lista, e il posto occupato nella lista è una biiezione con ℕ.</w:t>
+      </w:r>
+    </w:p>
+    <w:p>
+      <w:pPr>
+        <w:keepNext/>
+        <w:jc w:val="center"/>
+      </w:pPr>
+      <w:r>
+        <w:drawing>
+          <wp:inline xmlns:a="http://schemas.openxmlformats.org/drawingml/2006/main" xmlns:pic="http://schemas.openxmlformats.org/drawingml/2006/picture">
+            <wp:extent cx="3240000" cy="2901619"/>
+            <wp:docPr id="53" name="Picture 53"/>
+            <wp:cNvGraphicFramePr>
+              <a:graphicFrameLocks noChangeAspect="1"/>
+            </wp:cNvGraphicFramePr>
+            <a:graphic>
+              <a:graphicData uri="http://schemas.openxmlformats.org/drawingml/2006/picture">
+                <pic:pic>
+                  <pic:nvPicPr>
+                    <pic:cNvPr id="0" name="ch25_diagonali.png"/>
+                    <pic:cNvPicPr/>
+                  </pic:nvPicPr>
+                  <pic:blipFill>
+                    <a:blip r:embed="rId57"/>
+                    <a:stretch>
+                      <a:fillRect/>
+                    </a:stretch>
+                  </pic:blipFill>
+                  <pic:spPr>
+                    <a:xfrm>
+                      <a:off x="0" y="0"/>
+                      <a:ext cx="3240000" cy="2901619"/>
+                    </a:xfrm>
+                    <a:prstGeom prst="rect"/>
+                  </pic:spPr>
+                </pic:pic>
+              </a:graphicData>
+            </a:graphic>
+          </wp:inline>
+        </w:drawing>
+      </w:r>
+    </w:p>
+    <w:p>
+      <w:pPr>
+        <w:jc w:val="center"/>
+      </w:pPr>
+      <w:r>
+        <w:rPr>
+          <w:i/>
+          <w:sz w:val="18"/>
+        </w:rPr>
+        <w:t>Le coppie di ℕ × ℕ elencate lungo le diagonali a + b = costante: il numero nella casella è il posto nella lista.</w:t>
+      </w:r>
+    </w:p>
+    <w:p>
+      <w:r>
+        <w:rPr>
+          <w:b/>
+        </w:rPr>
+        <w:t>Definizione.</w:t>
+      </w:r>
+      <w:r>
+        <w:rPr/>
+        <w:t xml:space="preserve"> Si scrive |A| ≤ |B| se esiste una funzione </w:t>
+      </w:r>
+      <w:r>
+        <w:rPr>
+          <w:b/>
+        </w:rPr>
+        <w:t>iniettiva</w:t>
+      </w:r>
+      <w:r>
+        <w:rPr/>
+        <w:t xml:space="preserve"> A → B. In modo equivalente (per A non vuoto), se esiste una funzione suriettiva B → A. Per esempio, se A ⊆ B l'inclusione è una funzione iniettiva e quindi |A| ≤ |B|; e per ogni insieme X la funzione x ↦ {x} da X in P(X) è iniettiva, quindi |X| ≤ |P(X)|.</w:t>
+      </w:r>
+    </w:p>
+    <w:p>
+      <w:r>
+        <w:rPr/>
+        <w:t>Si accettano senza dimostrazione due fatti, intuitivamente chiari: tra due insiemi A e B vale sempre |A| ≤ |B| oppure |B| ≤ |A|; e se |A| ≤ |B| e |B| ≤ |A| allora |A| = |B| (teorema di Schröder-Bernstein).</w:t>
+      </w:r>
+    </w:p>
+    <w:p>
+      <w:pPr>
+        <w:pStyle w:val="Titolo2"/>
+      </w:pPr>
+      <w:r>
+        <w:rPr>
+          <w:b/>
+          <w:color w:val="E97132"/>
+        </w:rPr>
+        <w:t>Insiemi finiti e infiniti</w:t>
+      </w:r>
+    </w:p>
+    <w:p>
+      <w:r>
+        <w:rPr>
+          <w:b/>
+        </w:rPr>
+        <w:t>Definizione.</w:t>
+      </w:r>
+      <w:r>
+        <w:rPr/>
+        <w:t xml:space="preserve"> Un insieme A si dice </w:t>
+      </w:r>
+      <w:r>
+        <w:rPr>
+          <w:b/>
+        </w:rPr>
+        <w:t>infinito</w:t>
+      </w:r>
+      <w:r>
+        <w:rPr/>
+        <w:t xml:space="preserve"> se è equipollente a un suo sottoinsieme proprio, cioè se esiste una funzione f : A → A iniettiva ma non suriettiva. Un insieme si dice </w:t>
+      </w:r>
+      <w:r>
+        <w:rPr>
+          <w:b/>
+        </w:rPr>
+        <w:t>finito</w:t>
+      </w:r>
+      <w:r>
+        <w:rPr/>
+        <w:t xml:space="preserve"> se non è infinito, cioè se ogni funzione iniettiva f : A → A è anche suriettiva.</w:t>
+      </w:r>
+    </w:p>
+    <w:p>
+      <w:r>
+        <w:rPr/>
+        <w:t>Per gli insiemi finiti la casistica delle funzioni da A in A è molto semplice.</w:t>
+      </w:r>
+    </w:p>
+    <w:p>
+      <w:r>
+        <w:rPr>
+          <w:b/>
+        </w:rPr>
+        <w:t>Proposizione.</w:t>
+      </w:r>
+      <w:r>
+        <w:rPr/>
+        <w:t xml:space="preserve"> Sia A un insieme finito e sia f : A → A una funzione. Le seguenti affermazioni sono equivalenti: f è iniettiva; f è suriettiva; f è biettiva.</w:t>
+      </w:r>
+    </w:p>
+    <w:p>
+      <w:r>
+        <w:rPr/>
+        <w:t>Dimostrazione. Se f è iniettiva, è anche suriettiva per la definizione di insieme finito, quindi biettiva. Se f è suriettiva, ogni elemento a ha almeno una controimmagine, e si può definire una funzione g : A → A scegliendo per ogni a un elemento di f</w:t>
+      </w:r>
+      <w:r>
+        <w:rPr>
+          <w:vertAlign w:val="superscript"/>
+        </w:rPr>
+        <w:t>-1</w:t>
+      </w:r>
+      <w:r>
+        <w:rPr/>
+        <w:t>(a). Poiché le controimmagini di elementi diversi sono disgiunte, g è iniettiva, quindi (per quanto appena visto) biettiva, e in particolare suriettiva: questo vuol dire che ogni controimmagine è fatta da un solo elemento: se f</w:t>
+      </w:r>
+      <w:r>
+        <w:rPr>
+          <w:vertAlign w:val="superscript"/>
+        </w:rPr>
+        <w:t>-1</w:t>
+      </w:r>
+      <w:r>
+        <w:rPr/>
+        <w:t>(a) avesse due elementi x e x', uno solo sarebbe g(a), e l'altro non sarebbe valore di g su nessun elemento (le controimmagini sono disgiunte), contro la suriettività di g. Quindi f è iniettiva. Infine, se f è biettiva è sia iniettiva sia suriettiva.</w:t>
+      </w:r>
+    </w:p>
+    <w:p>
+      <w:r>
+        <w:rPr/>
+        <w:t>Con ℕ non succede: f(n) = n + 1 è iniettiva ma non suriettiva (0 non è immagine di niente), e questo conferma che ℕ è infinito.</w:t>
+      </w:r>
+    </w:p>
+    <w:p>
+      <w:pPr>
+        <w:pStyle w:val="Titolo2"/>
+      </w:pPr>
+      <w:r>
+        <w:rPr>
+          <w:b/>
+          <w:color w:val="E97132"/>
+        </w:rPr>
+        <w:t>Gli insiemi I</w:t>
+      </w:r>
+      <w:r>
+        <w:rPr>
+          <w:b/>
+          <w:color w:val="E97132"/>
+          <w:vertAlign w:val="subscript"/>
+        </w:rPr>
+        <w:t>n</w:t>
+      </w:r>
+      <w:r>
+        <w:rPr>
+          <w:b/>
+          <w:color w:val="E97132"/>
+        </w:rPr>
+        <w:t xml:space="preserve"> e il numero di elementi</w:t>
+      </w:r>
+    </w:p>
+    <w:p>
+      <w:r>
+        <w:rPr/>
+        <w:t>Per n ≥ 1 si pone I</w:t>
+      </w:r>
+      <w:r>
+        <w:rPr>
+          <w:vertAlign w:val="subscript"/>
+        </w:rPr>
+        <w:t>n</w:t>
+      </w:r>
+      <w:r>
+        <w:rPr/>
+        <w:t xml:space="preserve"> = {1, 2, …, n}: sono i prototipi degli insiemi finiti. Insieme all'insieme vuoto (che ha 0 elementi) esauriscono tutte le cardinalità finite, nel senso del seguente teorema.</w:t>
+      </w:r>
+    </w:p>
+    <w:p>
+      <w:r>
+        <w:rPr>
+          <w:b/>
+        </w:rPr>
+        <w:t>Teorema.</w:t>
+      </w:r>
+    </w:p>
+    <w:p>
+      <w:pPr>
+        <w:numPr>
+          <w:ilvl w:val="0"/>
+          <w:numId w:val="1"/>
+        </w:numPr>
+      </w:pPr>
+      <w:r>
+        <w:rPr/>
+        <w:t>Per ogni n ≥ 1 l'insieme I</w:t>
+      </w:r>
+      <w:r>
+        <w:rPr>
+          <w:vertAlign w:val="subscript"/>
+        </w:rPr>
+        <w:t>n</w:t>
+      </w:r>
+      <w:r>
+        <w:rPr/>
+        <w:t xml:space="preserve"> è finito.</w:t>
+      </w:r>
+    </w:p>
+    <w:p>
+      <w:pPr>
+        <w:numPr>
+          <w:ilvl w:val="0"/>
+          <w:numId w:val="1"/>
+        </w:numPr>
+      </w:pPr>
+      <w:r>
+        <w:rPr/>
+        <w:t>Se m ≠ n, gli insiemi I</w:t>
+      </w:r>
+      <w:r>
+        <w:rPr>
+          <w:vertAlign w:val="subscript"/>
+        </w:rPr>
+        <w:t>m</w:t>
+      </w:r>
+      <w:r>
+        <w:rPr/>
+        <w:t xml:space="preserve"> e I</w:t>
+      </w:r>
+      <w:r>
+        <w:rPr>
+          <w:vertAlign w:val="subscript"/>
+        </w:rPr>
+        <w:t>n</w:t>
+      </w:r>
+      <w:r>
+        <w:rPr/>
+        <w:t xml:space="preserve"> non sono equipollenti.</w:t>
+      </w:r>
+    </w:p>
+    <w:p>
+      <w:pPr>
+        <w:numPr>
+          <w:ilvl w:val="0"/>
+          <w:numId w:val="1"/>
+        </w:numPr>
+      </w:pPr>
+      <w:r>
+        <w:rPr/>
+        <w:t>Se m ≤ n allora |I</w:t>
+      </w:r>
+      <w:r>
+        <w:rPr>
+          <w:vertAlign w:val="subscript"/>
+        </w:rPr>
+        <w:t>m</w:t>
+      </w:r>
+      <w:r>
+        <w:rPr/>
+        <w:t>| ≤ |I</w:t>
+      </w:r>
+      <w:r>
+        <w:rPr>
+          <w:vertAlign w:val="subscript"/>
+        </w:rPr>
+        <w:t>n</w:t>
+      </w:r>
+      <w:r>
+        <w:rPr/>
+        <w:t>|.</w:t>
+      </w:r>
+    </w:p>
+    <w:p>
+      <w:pPr>
+        <w:numPr>
+          <w:ilvl w:val="0"/>
+          <w:numId w:val="1"/>
+        </w:numPr>
+      </w:pPr>
+      <w:r>
+        <w:rPr/>
+        <w:t>Ogni insieme finito non vuoto è equipollente a un I</w:t>
+      </w:r>
+      <w:r>
+        <w:rPr>
+          <w:vertAlign w:val="subscript"/>
+        </w:rPr>
+        <w:t>n</w:t>
+      </w:r>
+      <w:r>
+        <w:rPr/>
+        <w:t>.</w:t>
+      </w:r>
+    </w:p>
+    <w:p>
+      <w:pPr>
+        <w:numPr>
+          <w:ilvl w:val="0"/>
+          <w:numId w:val="1"/>
+        </w:numPr>
+      </w:pPr>
+      <w:r>
+        <w:rPr/>
+        <w:t>Per ogni insieme infinito X si ha |ℕ| ≤ |X|.</w:t>
+      </w:r>
+    </w:p>
+    <w:p>
+      <w:r>
+        <w:rPr/>
+        <w:t>La dimostrazione del libro usa l'induzione su n, un ragionamento per assurdo e una costruzione di sottoinsiemi decrescenti A ⊃ A₁ ⊃ A₂ ⊃ …: non serve ripeterla qui. La conseguenza importante è che per un insieme finito A esiste un unico n tale che A e I</w:t>
+      </w:r>
+      <w:r>
+        <w:rPr>
+          <w:vertAlign w:val="subscript"/>
+        </w:rPr>
+        <w:t>n</w:t>
+      </w:r>
+      <w:r>
+        <w:rPr/>
+        <w:t xml:space="preserve"> sono equipollenti, e si pone |A| = n: è </w:t>
+      </w:r>
+      <w:r>
+        <w:rPr>
+          <w:b/>
+        </w:rPr>
+        <w:t>il numero di elementi</w:t>
+      </w:r>
+      <w:r>
+        <w:rPr/>
+        <w:t xml:space="preserve"> di A. In pratica contare gli elementi di A vuol dire costruire una biiezione tra I</w:t>
+      </w:r>
+      <w:r>
+        <w:rPr>
+          <w:vertAlign w:val="subscript"/>
+        </w:rPr>
+        <w:t>n</w:t>
+      </w:r>
+      <w:r>
+        <w:rPr/>
+        <w:t xml:space="preserve"> e A, come si è fatto per gli ordinamenti nel capitolo 23.</w:t>
+      </w:r>
+    </w:p>
+    <w:p>
+      <w:r>
+        <w:rPr/>
+        <w:t>Questo permette di estendere la proposizione precedente a funzioni tra due insiemi diversi ma con lo stesso numero di elementi: se A e B hanno lo stesso numero di elementi, una funzione f : A → B è iniettiva se e solo se è suriettiva se e solo se è biettiva. Basta comporre con due biiezioni φ</w:t>
+      </w:r>
+      <w:r>
+        <w:rPr>
+          <w:vertAlign w:val="subscript"/>
+        </w:rPr>
+        <w:t>A</w:t>
+      </w:r>
+      <w:r>
+        <w:rPr/>
+        <w:t xml:space="preserve"> : I</w:t>
+      </w:r>
+      <w:r>
+        <w:rPr>
+          <w:vertAlign w:val="subscript"/>
+        </w:rPr>
+        <w:t>n</w:t>
+      </w:r>
+      <w:r>
+        <w:rPr/>
+        <w:t xml:space="preserve"> → A e φ</w:t>
+      </w:r>
+      <w:r>
+        <w:rPr>
+          <w:vertAlign w:val="subscript"/>
+        </w:rPr>
+        <w:t>B</w:t>
+      </w:r>
+      <w:r>
+        <w:rPr/>
+        <w:t xml:space="preserve"> : I</w:t>
+      </w:r>
+      <w:r>
+        <w:rPr>
+          <w:vertAlign w:val="subscript"/>
+        </w:rPr>
+        <w:t>n</w:t>
+      </w:r>
+      <w:r>
+        <w:rPr/>
+        <w:t xml:space="preserve"> → B e applicare la proposizione a φ</w:t>
+      </w:r>
+      <w:r>
+        <w:rPr>
+          <w:vertAlign w:val="subscript"/>
+        </w:rPr>
+        <w:t>B</w:t>
+      </w:r>
+      <w:r>
+        <w:rPr>
+          <w:vertAlign w:val="superscript"/>
+        </w:rPr>
+        <w:t>-1</w:t>
+      </w:r>
+      <w:r>
+        <w:rPr/>
+        <w:t xml:space="preserve"> ∘ f ∘ φ</w:t>
+      </w:r>
+      <w:r>
+        <w:rPr>
+          <w:vertAlign w:val="subscript"/>
+        </w:rPr>
+        <w:t>A</w:t>
+      </w:r>
+      <w:r>
+        <w:rPr/>
+        <w:t>.</w:t>
+      </w:r>
+    </w:p>
+    <w:p>
+      <w:pPr>
+        <w:pStyle w:val="Titolo2"/>
+      </w:pPr>
+      <w:r>
+        <w:rPr>
+          <w:b/>
+          <w:color w:val="E97132"/>
+        </w:rPr>
+        <w:t>Il principio dei cassetti</w:t>
+      </w:r>
+    </w:p>
+    <w:p>
+      <w:r>
+        <w:rPr/>
+        <w:t xml:space="preserve">Una conseguenza molto utile, che nei capitoli 22 e 24 è già stata usata, riguarda due insiemi finiti A e B con |A| &gt; |B|: non possono esistere funzioni iniettive A → B. Il fatto è noto come </w:t>
+      </w:r>
+      <w:r>
+        <w:rPr>
+          <w:b/>
+        </w:rPr>
+        <w:t>principio dei cassetti</w:t>
+      </w:r>
+      <w:r>
+        <w:rPr/>
+        <w:t xml:space="preserve"> o </w:t>
+      </w:r>
+      <w:r>
+        <w:rPr>
+          <w:b/>
+        </w:rPr>
+        <w:t>delle gabbie dei piccioni</w:t>
+      </w:r>
+      <w:r>
+        <w:rPr/>
+        <w:t>, e si enuncia così:</w:t>
+      </w:r>
+    </w:p>
+    <w:p>
+      <w:r>
+        <w:rPr>
+          <w:b/>
+        </w:rPr>
+        <w:t>se ci sono più piccioni che gabbie, almeno una gabbia contiene più di un piccione.</w:t>
+      </w:r>
+    </w:p>
+    <w:p>
+      <w:r>
+        <w:rPr/>
+        <w:t>Infatti, se P è l'insieme dei piccioni e G quello delle gabbie, assegnare a ogni piccione una gabbia è una funzione f : P → G. Per ogni gabbia g i piccioni che stanno nella gabbia g sono la controimmagine f</w:t>
+      </w:r>
+      <w:r>
+        <w:rPr>
+          <w:vertAlign w:val="superscript"/>
+        </w:rPr>
+        <w:t>-1</w:t>
+      </w:r>
+      <w:r>
+        <w:rPr/>
+        <w:t>(g). Poiché i piccioni sono più delle gabbie, f non può essere iniettiva, e questo vuol dire che c'è una gabbia la cui controimmagine ha più di un elemento.</w:t>
+      </w:r>
+    </w:p>
+    <w:p>
+      <w:r>
+        <w:rPr/>
+        <w:t>Il principio serve in casi concreti per arrivare a conclusioni altrimenti difficili da verificare. Su un corpo umano crescono circa 5 milioni di peli; ne segue che in una metropoli con ben più di 5 milioni di abitanti, anche escludendo chi è del tutto glabro, ci sono almeno due persone con lo stesso numero esatto di peli. Un altro esempio: un PIN di 4 cifre ha 10 000 possibilità, quindi tra 10 001 smartphone almeno due hanno lo stesso PIN.</w:t>
+      </w:r>
+    </w:p>
+    <w:p>
+      <w:pPr>
+        <w:pStyle w:val="Titolo2"/>
+      </w:pPr>
+      <w:r>
+        <w:rPr>
+          <w:b/>
+          <w:color w:val="E97132"/>
+        </w:rPr>
+        <w:t>Insiemi numerabili</w:t>
+      </w:r>
+    </w:p>
+    <w:p>
+      <w:r>
+        <w:rPr>
+          <w:b/>
+        </w:rPr>
+        <w:t>Definizione.</w:t>
+      </w:r>
+      <w:r>
+        <w:rPr/>
+        <w:t xml:space="preserve"> Un insieme X si dice </w:t>
+      </w:r>
+      <w:r>
+        <w:rPr>
+          <w:b/>
+        </w:rPr>
+        <w:t>numerabile</w:t>
+      </w:r>
+      <w:r>
+        <w:rPr/>
+        <w:t xml:space="preserve"> se è equipollente a ℕ. In concreto, X è numerabile se si possono elencare tutti i suoi elementi in una successione, X = {a₁, a₂, a₃, …}. Per esempio ℤ è numerabile, perché la lista 0, 1, −1, 2, −2, 3, −3, … include tutti i numeri interi (l'ordine in cui si alternano positivi e negativi non ha importanza). Anche ℚ è numerabile: si elencano i razionali non negativi come frazioni a/b, con b ≥ 1, secondo l'ordine di grandezza di a + b (con le frazioni non ridotte che si scartano o si ripetono), come si è fatto per ℕ × ℕ, e poi si intervallano i razionali negativi seguendo l'esempio di ℤ.</w:t>
+      </w:r>
+    </w:p>
+    <w:p>
+      <w:r>
+        <w:rPr/>
+        <w:t>Intorno al 1880 Cantor dimostrò che esistono insiemi infiniti non numerabili, che ℝ non è numerabile e che per ogni insieme X l'insieme delle parti P(X) ha cardinalità strettamente maggiore di |X|. Qui ci si limita a ricordare questi fatti, rimandando ai testi specialistici per le tecniche di dimostrazione.</w:t>
+      </w:r>
+    </w:p>
+    <w:p>
+      <w:r>
+        <w:rPr/>
+        <w:t>Con questo si chiude la parte sul conteggio: gli insiemi finiti e il principio dei cassetti sono alla base dei metodi dei capitoli 21-24, e il capitolo seguente (le combinazioni) riprenderà le scelte non ordinate.</w:t>
       </w:r>
     </w:p>
     <w:sectPr>

</xml_diff>

<commit_message>
Sottolineature dal Quaderno applicate al Word di Matematica discreta (18) e pagine ricostruite
Il lettore scarta da solo le voci gia' coperte da un'evidenziazione del Word.

Co-Authored-By: Claude Sonnet 5.5 <noreply@anthropic.com>
Claude-Session: https://claude.ai/code/session_0138MhBZmXTRtHbBTBzfMBYS
</commit_message>
<xml_diff>
--- a/Riassunto Matematica discreta.docx
+++ b/Riassunto Matematica discreta.docx
@@ -12632,7 +12632,17 @@
       </w:r>
       <w:r>
         <w:rPr/>
-        <w:t xml:space="preserve"> l'immagine di un sottoinsieme è la raccolta di tutti i risultati che escono se dai alla funzione, uno per uno, gli elementi di quel sottoinsieme. È un insieme dell'arrivo, non della partenza. Esempio: con la funzione «raddoppia» e S = {1, 2, 3}, l'immagine è {2, 4, 6}.</w:t>
+        <w:t xml:space="preserve"> </w:t>
+      </w:r>
+      <w:r>
+        <w:rPr>
+          <w:highlight w:val="yellow"/>
+        </w:rPr>
+        <w:t xml:space="preserve">l'immagine di un sottoinsieme è la raccolta di tutti i risultati che escono se dai alla funzione, uno per uno, gli elementi di quel sottoinsieme</w:t>
+      </w:r>
+      <w:r>
+        <w:rPr/>
+        <w:t xml:space="preserve">. È un insieme dell'arrivo, non della partenza. Esempio: con la funzione «raddoppia» e S = {1, 2, 3}, l'immagine è {2, 4, 6}.</w:t>
       </w:r>
     </w:p>
     <w:p>
@@ -12744,7 +12754,17 @@
       </w:r>
       <w:r>
         <w:rPr/>
-        <w:t xml:space="preserve"> la controimmagine fa il percorso al contrario: scegli alcuni elementi dell'insieme di arrivo e raccogli tutti gli elementi di partenza che la funzione manda proprio lì. Esempio: con la funzione «quadrato» sui numeri interi, la controimmagine di {4} è {−2, 2}. Se nessuno arriva lì, la controimmagine è l'insieme vuoto.</w:t>
+        <w:t xml:space="preserve"> la </w:t>
+      </w:r>
+      <w:r>
+        <w:rPr>
+          <w:highlight w:val="yellow"/>
+        </w:rPr>
+        <w:t xml:space="preserve">controimmagine fa il percorso al contrario: scegli alcuni elementi dell'insieme di arrivo e raccogli tutti gli elementi di partenza che la funzione manda proprio lì</w:t>
+      </w:r>
+      <w:r>
+        <w:rPr/>
+        <w:t xml:space="preserve">. Esempio: con la funzione «quadrato» sui numeri interi, la controimmagine di {4} è {−2, 2}. Se nessuno arriva lì, la controimmagine è l'insieme vuoto.</w:t>
       </w:r>
     </w:p>
     <w:p>
@@ -12797,7 +12817,13 @@
       </w:r>
       <w:r>
         <w:rPr/>
-        <w:t xml:space="preserve"> la fibra di un elemento b dell'arrivo è il «gruppo di quelli che finiscono in b», cioè la controimmagine di b da solo. Come i compagni di classe che prendono tutti lo stesso autobus: la fibra è l'insieme dei passeggeri di quell'autobus.</w:t>
+        <w:t xml:space="preserve"> la </w:t>
+      </w:r>
+      <w:r>
+        <w:rPr>
+          <w:highlight w:val="yellow"/>
+        </w:rPr>
+        <w:t xml:space="preserve">fibra di un elemento b dell'arrivo è il «gruppo di quelli che finiscono in b», cioè la controimmagine di b da solo. Come i compagni di classe che prendono tutti lo stesso autobus: la fibra è l'insieme dei passeggeri di quell'autobus.</w:t>
       </w:r>
     </w:p>
     <w:p>
@@ -12814,25 +12840,51 @@
     </w:p>
     <w:p>
       <w:r>
-        <w:t xml:space="preserve">Un singolo elemento del dominio ha </w:t>
-      </w:r>
-      <w:r>
-        <w:rPr>
-          <w:b/>
+        <w:t xml:space="preserve">Un </w:t>
+      </w:r>
+      <w:r>
+        <w:rPr>
+          <w:highlight w:val="yellow"/>
+        </w:rPr>
+        <w:t xml:space="preserve">singolo elemento del dominio ha </w:t>
+      </w:r>
+      <w:r>
+        <w:rPr>
+          <w:b/>
+          <w:highlight w:val="yellow"/>
         </w:rPr>
         <w:t>un'unica</w:t>
       </w:r>
       <w:r>
-        <w:t xml:space="preserve"> immagine, perché una funzione assume un valore e uno solo su ogni elemento. Un singolo elemento del codominio, invece, può avere </w:t>
-      </w:r>
-      <w:r>
-        <w:rPr>
-          <w:b/>
+        <w:rPr>
+          <w:highlight w:val="yellow"/>
+        </w:rPr>
+        <w:t xml:space="preserve"> immagine, perché una funzione assume un valore e uno solo su ogni elemento</w:t>
+      </w:r>
+      <w:r>
+        <w:t xml:space="preserve">. Un </w:t>
+      </w:r>
+      <w:r>
+        <w:rPr>
+          <w:highlight w:val="yellow"/>
+        </w:rPr>
+        <w:t xml:space="preserve">singolo elemento del codominio, invece, può avere </w:t>
+      </w:r>
+      <w:r>
+        <w:rPr>
+          <w:b/>
+          <w:highlight w:val="yellow"/>
         </w:rPr>
         <w:t>tanti</w:t>
       </w:r>
       <w:r>
-        <w:t xml:space="preserve"> elementi che lo hanno per immagine. Per questo la controimmagine di un elemento è un </w:t>
+        <w:rPr>
+          <w:highlight w:val="yellow"/>
+        </w:rPr>
+        <w:t xml:space="preserve"> elementi che lo hanno per immagine.</w:t>
+      </w:r>
+      <w:r>
+        <w:t xml:space="preserve"> Per questo la controimmagine di un elemento è un </w:t>
       </w:r>
       <w:r>
         <w:rPr>
@@ -13097,16 +13149,35 @@
     </w:p>
     <w:p>
       <w:r>
-        <w:t xml:space="preserve">Calcolare un'immagine, quando si ha un'espressione, significa sostituire il valore nell'espressione. Calcolare una controimmagine è più difficile: bisogna </w:t>
-      </w:r>
-      <w:r>
-        <w:rPr>
-          <w:b/>
+        <w:rPr>
+          <w:highlight w:val="yellow"/>
+        </w:rPr>
+        <w:t xml:space="preserve">Calcolare un'immagine, quando si ha un'espressione, significa sostituire il valore nell'espressione</w:t>
+      </w:r>
+      <w:r>
+        <w:t xml:space="preserve">. </w:t>
+      </w:r>
+      <w:r>
+        <w:rPr>
+          <w:highlight w:val="yellow"/>
+        </w:rPr>
+        <w:t xml:space="preserve">Calcolare una controimmagine è più difficile: bisogna </w:t>
+      </w:r>
+      <w:r>
+        <w:rPr>
+          <w:b/>
+          <w:highlight w:val="yellow"/>
         </w:rPr>
         <w:t>risolvere l'equazione</w:t>
       </w:r>
       <w:r>
-        <w:t xml:space="preserve"> f(x) = y nell'incognita x, e in certi casi risolverla può essere impossibile da fare esplicitamente. Il caso è concettualmente più difficile anche quando le funzioni non sono numeriche: se a ogni persona di un gruppo associamo la sua altezza in centimetri, la controimmagine di 170 è il sottoinsieme delle persone del gruppo alte esattamente 170 cm, che può avere molti elementi, uno solo o nessuno.</w:t>
+        <w:rPr>
+          <w:highlight w:val="yellow"/>
+        </w:rPr>
+        <w:t xml:space="preserve"> f(x) = y nell'incognita x, e in certi casi risolverla può essere impossibile da fare esplicitamente</w:t>
+      </w:r>
+      <w:r>
+        <w:t xml:space="preserve">. Il caso è concettualmente più difficile anche quando le funzioni non sono numeriche: se a ogni persona di un gruppo associamo la sua altezza in centimetri, la controimmagine di 170 è il sottoinsieme delle persone del gruppo alte esattamente 170 cm, che può avere molti elementi, uno solo o nessuno.</w:t>
       </w:r>
     </w:p>
     <w:p>
@@ -13145,11 +13216,18 @@
       <w:r>
         <w:rPr>
           <w:b/>
+          <w:highlight w:val="yellow"/>
         </w:rPr>
         <w:t>suriettiva</w:t>
       </w:r>
       <w:r>
-        <w:t xml:space="preserve"> se la sua immagine totale è tutto il codominio, cioè se f(A) = B: ogni elemento di B è raggiungibile dalla funzione partendo da qualche elemento del dominio. Si può scrivere in modi equivalenti:</w:t>
+        <w:rPr>
+          <w:highlight w:val="yellow"/>
+        </w:rPr>
+        <w:t xml:space="preserve"> se la sua immagine totale è tutto il codominio</w:t>
+      </w:r>
+      <w:r>
+        <w:t xml:space="preserve">, cioè se f(A) = B: ogni elemento di B è raggiungibile dalla funzione partendo da qualche elemento del dominio. Si può scrivere in modi equivalenti:</w:t>
       </w:r>
     </w:p>
     <w:p>
@@ -13192,7 +13270,17 @@
       </w:r>
       <w:r>
         <w:rPr/>
-        <w:t xml:space="preserve"> suriettiva vuol dire che nessun elemento dell'arrivo resta senza visite: ogni elemento del codominio è il risultato di almeno un elemento di partenza. Se immagini le frecce che vanno dal dominio al codominio, in ogni elemento di arrivo ne entra almeno una. Esempio: «x diventa 2x» da numeri reali a numeri reali è suriettiva, perché ogni numero y si ottiene da x = y/2.</w:t>
+        <w:t xml:space="preserve"> </w:t>
+      </w:r>
+      <w:r>
+        <w:rPr>
+          <w:highlight w:val="yellow"/>
+        </w:rPr>
+        <w:t xml:space="preserve">suriettiva vuol dire che nessun elemento dell'arrivo resta senza visite: ogni elemento del codominio è il risultato di almeno un elemento di partenza.</w:t>
+      </w:r>
+      <w:r>
+        <w:rPr/>
+        <w:t xml:space="preserve"> Se immagini le frecce che vanno dal dominio al codominio, in ogni elemento di arrivo ne entra almeno una. Esempio: «x diventa 2x» da numeri reali a numeri reali è suriettiva, perché ogni numero y si ottiene da x = y/2.</w:t>
       </w:r>
     </w:p>
     <w:p>
@@ -13214,11 +13302,18 @@
       <w:r>
         <w:rPr>
           <w:b/>
+          <w:highlight w:val="yellow"/>
         </w:rPr>
         <w:t>iniettiva</w:t>
       </w:r>
       <w:r>
-        <w:t xml:space="preserve"> se elementi distinti del dominio hanno immagini distinte:</w:t>
+        <w:rPr>
+          <w:highlight w:val="yellow"/>
+        </w:rPr>
+        <w:t xml:space="preserve"> se elementi distinti del dominio hanno immagini distinte</w:t>
+      </w:r>
+      <w:r>
+        <w:t xml:space="preserve">:</w:t>
       </w:r>
     </w:p>
     <w:p>
@@ -13249,7 +13344,17 @@
       </w:r>
       <w:r>
         <w:rPr/>
-        <w:t xml:space="preserve"> iniettiva vuol dire che due elementi diversi di partenza non finiscono mai nello stesso elemento di arrivo: nessun elemento dell'arrivo riceve due frecce. È come una fila di persone con un posto a sedere ciascuna: nessuno condivide la sedia. Esempio: «x diventa x + 1» è iniettiva; «x diventa x al quadrato» sui reali no, perché −2 e 2 vanno entrambi in 4.</w:t>
+        <w:t xml:space="preserve"> </w:t>
+      </w:r>
+      <w:r>
+        <w:rPr>
+          <w:highlight w:val="yellow"/>
+        </w:rPr>
+        <w:t xml:space="preserve">iniettiva vuol dire che due elementi diversi di partenza non finiscono mai nello stesso elemento di arrivo: nessun elemento dell'arrivo riceve due frecce</w:t>
+      </w:r>
+      <w:r>
+        <w:rPr/>
+        <w:t xml:space="preserve">. È come una fila di persone con un posto a sedere ciascuna: nessuno condivide la sedia. Esempio: «x diventa x + 1» è iniettiva; «x diventa x al quadrato» sui reali no, perché −2 e 2 vanno entrambi in 4.</w:t>
       </w:r>
     </w:p>
     <w:p>
@@ -13286,11 +13391,21 @@
       <w:r>
         <w:rPr>
           <w:b/>
+          <w:highlight w:val="yellow"/>
         </w:rPr>
         <w:t>biettiva</w:t>
       </w:r>
       <w:r>
-        <w:t xml:space="preserve"> (o corrispondenza biunivoca) se è sia iniettiva sia suriettiva, cioè ∀ b ∈ B, |f</w:t>
+        <w:t xml:space="preserve"> (o corrispondenza biunivoca) </w:t>
+      </w:r>
+      <w:r>
+        <w:rPr>
+          <w:highlight w:val="yellow"/>
+        </w:rPr>
+        <w:t xml:space="preserve">se è sia iniettiva sia suriettiva</w:t>
+      </w:r>
+      <w:r>
+        <w:t xml:space="preserve">, cioè ∀ b ∈ B, |f</w:t>
       </w:r>
       <w:r>
         <w:rPr>
@@ -13428,7 +13543,16 @@
     </w:p>
     <w:p>
       <w:r>
-        <w:t>Prendiamo f(x) = x². Come funzione ℝ → ℝ:</w:t>
+        <w:t xml:space="preserve">Prendiamo f(x) = </w:t>
+      </w:r>
+      <w:r>
+        <w:rPr>
+          <w:highlight w:val="yellow"/>
+        </w:rPr>
+        <w:t xml:space="preserve">x²</w:t>
+      </w:r>
+      <w:r>
+        <w:t xml:space="preserve">. Come funzione ℝ → ℝ:</w:t>
       </w:r>
     </w:p>
     <w:p>
@@ -13439,7 +13563,13 @@
         </w:numPr>
       </w:pPr>
       <w:r>
-        <w:t>non è iniettiva, perché f(−1) = f(1) = 1 pur essendo −1 ≠ 1;</w:t>
+        <w:rPr>
+          <w:highlight w:val="yellow"/>
+        </w:rPr>
+        <w:t xml:space="preserve">non è iniettiva</w:t>
+      </w:r>
+      <w:r>
+        <w:t xml:space="preserve">, perché f(−1) = f(1) = 1 pur essendo −1 ≠ 1;</w:t>
       </w:r>
     </w:p>
     <w:p>
@@ -13450,7 +13580,13 @@
         </w:numPr>
       </w:pPr>
       <w:r>
-        <w:t>non è suriettiva, perché i numeri negativi non hanno controimmagine (per esempio f</w:t>
+        <w:rPr>
+          <w:highlight w:val="yellow"/>
+        </w:rPr>
+        <w:t xml:space="preserve">non è suriettiva</w:t>
+      </w:r>
+      <w:r>
+        <w:t xml:space="preserve">, perché i numeri negativi non hanno controimmagine (per esempio f</w:t>
       </w:r>
       <w:r>
         <w:rPr>
@@ -13661,7 +13797,17 @@
       </w:r>
       <w:r>
         <w:rPr/>
-        <w:t xml:space="preserve"> comporre due funzioni vuol dire metterle in catena, come due macchine in fila: il risultato della prima diventa l'ingresso della seconda. Si può fare solo se quello che esce dalla prima è qualcosa che la seconda sa accettare. Esempio: «raddoppia» e poi «aggiungi 1» fa passare da 3 a 7.</w:t>
+        <w:t xml:space="preserve"> </w:t>
+      </w:r>
+      <w:r>
+        <w:rPr>
+          <w:highlight w:val="yellow"/>
+        </w:rPr>
+        <w:t xml:space="preserve">comporre due funzioni vuol dire metterle in catena, come due macchine in fila: il risultato della prima diventa l'ingresso della seconda. Si può fare solo se quello che esce dalla prima è qualcosa che la seconda sa accettare.</w:t>
+      </w:r>
+      <w:r>
+        <w:rPr/>
+        <w:t xml:space="preserve"> Esempio: «raddoppia» e poi «aggiungi 1» fa passare da 3 a 7.</w:t>
       </w:r>
     </w:p>
     <w:p>
@@ -13856,7 +14002,17 @@
       </w:r>
       <w:r>
         <w:rPr/>
-        <w:t xml:space="preserve"> una funzione è invertibile se esiste una funzione «di ritorno» che annulla esattamente quello che la prima ha fatto, in entrambe le direzioni: se vai e poi torni ti ritrovi al punto di partenza, e lo stesso se torni e poi vai. Esempio: «aggiungi 3» e «togli 3».</w:t>
+        <w:t xml:space="preserve"> una </w:t>
+      </w:r>
+      <w:r>
+        <w:rPr>
+          <w:highlight w:val="yellow"/>
+        </w:rPr>
+        <w:t xml:space="preserve">funzione è invertibile se esiste una funzione «di ritorno» che annulla esattamente quello che la prima ha fatto, in entrambe le direzioni: se vai e poi torni ti ritrovi al punto di partenza, e lo stesso se torni e poi vai.</w:t>
+      </w:r>
+      <w:r>
+        <w:rPr/>
+        <w:t xml:space="preserve"> Esempio: «aggiungi 3» e «togli 3».</w:t>
       </w:r>
     </w:p>
     <w:p>

</xml_diff>

<commit_message>
Matematica discreta cap. 26-28 (lezione 9: combinazioni, problemi, combinazioni con ripetizione)
Aggiornati STATO.md, figure (figure_mate_comb2.py), appunti trascritti e bozze.

Co-Authored-By: Claude Sonnet 5.5 <noreply@anthropic.com>
</commit_message>
<xml_diff>
--- a/Riassunto Matematica discreta.docx
+++ b/Riassunto Matematica discreta.docx
@@ -19115,6 +19115,1810 @@
     <w:p>
       <w:r>
         <w:t>Con questo si chiude la parte sul conteggio: gli insiemi finiti e il principio dei cassetti sono alla base dei metodi dei capitoli 21-24, e il capitolo seguente (le combinazioni) riprenderà le scelte non ordinate.</w:t>
+      </w:r>
+    </w:p>
+    <w:p>
+      <w:pPr>
+        <w:pStyle w:val="Titolo1"/>
+      </w:pPr>
+      <w:r>
+        <w:rPr>
+          <w:b/>
+          <w:color w:val="EE0000"/>
+        </w:rPr>
+        <w:t>26. Le Combinazioni Semplici e i Coefficienti Binomiali</w:t>
+      </w:r>
+    </w:p>
+    <w:p>
+      <w:pPr>
+        <w:pStyle w:val="Titolo2"/>
+      </w:pPr>
+      <w:r>
+        <w:rPr>
+          <w:b/>
+          <w:color w:val="E97132"/>
+        </w:rPr>
+        <w:t>Contare i sottoinsiemi di k elementi</w:t>
+      </w:r>
+    </w:p>
+    <w:p>
+      <w:r>
+        <w:rPr/>
+        <w:t xml:space="preserve">Nel capitolo 24 le scelte avevano un ordine. Qui l'ordine non conta, e il modello matematico è un </w:t>
+      </w:r>
+      <w:r>
+        <w:rPr>
+          <w:b/>
+        </w:rPr>
+        <w:t>sottoinsieme</w:t>
+      </w:r>
+      <w:r>
+        <w:rPr/>
+        <w:t xml:space="preserve">. Sia A un insieme con n elementi e fissiamo un numero k con 0 ≤ k ≤ n. Una </w:t>
+      </w:r>
+      <w:r>
+        <w:rPr>
+          <w:b/>
+        </w:rPr>
+        <w:t>combinazione semplice</w:t>
+      </w:r>
+      <w:r>
+        <w:rPr/>
+        <w:t xml:space="preserve"> di ordine k in A è la scelta di un sottoinsieme S ⊆ A con |S| = k. Il numero di queste scelte si indica con C</w:t>
+      </w:r>
+      <w:r>
+        <w:rPr>
+          <w:vertAlign w:val="subscript"/>
+        </w:rPr>
+        <w:t>n,k</w:t>
+      </w:r>
+      <w:r>
+        <w:rPr/>
+        <w:t>, e quindi C</w:t>
+      </w:r>
+      <w:r>
+        <w:rPr>
+          <w:vertAlign w:val="subscript"/>
+        </w:rPr>
+        <w:t>n,k</w:t>
+      </w:r>
+      <w:r>
+        <w:rPr/>
+        <w:t xml:space="preserve"> = |{ S ⊆ A : |S| = k }|. Il problema è calcolare questo numero.</w:t>
+      </w:r>
+    </w:p>
+    <w:p>
+      <w:r>
+        <w:rPr/>
+        <w:t>(In parole povere: una combinazione è una scelta "a mucchio", in cui interessa solo chi è stato scelto e non l'ordine in cui lo si è preso. Scegliere tre amici per una partita è lo stesso che scegliere gli stessi tre in un altro ordine.)</w:t>
+      </w:r>
+    </w:p>
+    <w:p>
+      <w:r>
+        <w:rPr/>
+        <w:t>Conviene fare delle osservazioni preliminari, con n fissato e k variabile fra 0 e n. Ci sono due casi estremi, che sono chiari. Con k = 0 si vuole un sottoinsieme senza elementi: ce n'è uno solo, l'insieme vuoto, perché non si fa nessuna scelta; quindi C</w:t>
+      </w:r>
+      <w:r>
+        <w:rPr>
+          <w:vertAlign w:val="subscript"/>
+        </w:rPr>
+        <w:t>n,0</w:t>
+      </w:r>
+      <w:r>
+        <w:rPr/>
+        <w:t xml:space="preserve"> = 1. Con k = n bisogna prendere tutti gli elementi e c'è un solo modo di farlo; quindi C</w:t>
+      </w:r>
+      <w:r>
+        <w:rPr>
+          <w:vertAlign w:val="subscript"/>
+        </w:rPr>
+        <w:t>n,n</w:t>
+      </w:r>
+      <w:r>
+        <w:rPr/>
+        <w:t xml:space="preserve"> = 1. Il caso generale richiede un'idea in più.</w:t>
+      </w:r>
+    </w:p>
+    <w:p>
+      <w:pPr>
+        <w:pStyle w:val="Titolo2"/>
+      </w:pPr>
+      <w:r>
+        <w:rPr>
+          <w:b/>
+          <w:color w:val="E97132"/>
+        </w:rPr>
+        <w:t>L'idea: dalle disposizioni alle combinazioni</w:t>
+      </w:r>
+    </w:p>
+    <w:p>
+      <w:r>
+        <w:rPr/>
+        <w:t xml:space="preserve">Dal punto di vista pratico, come si sceglie un sottoinsieme di tre oggetti? Se ne sceglie uno, poi un secondo, poi un terzo. Sebbene alla fine l'ordine non interessi, scegliendo un elemento alla volta si sta facendo una </w:t>
+      </w:r>
+      <w:r>
+        <w:rPr>
+          <w:b/>
+        </w:rPr>
+        <w:t>disposizione semplice</w:t>
+      </w:r>
+      <w:r>
+        <w:rPr/>
+        <w:t>: si estraggono k elementi da n in un certo ordine. Di disposizioni semplici ce ne sono D</w:t>
+      </w:r>
+      <w:r>
+        <w:rPr>
+          <w:vertAlign w:val="subscript"/>
+        </w:rPr>
+        <w:t>n,k</w:t>
+      </w:r>
+      <w:r>
+        <w:rPr/>
+        <w:t xml:space="preserve"> = n!/(n − k)!, come si è visto nel capitolo 24.</w:t>
+      </w:r>
+    </w:p>
+    <w:p>
+      <w:r>
+        <w:rPr/>
+        <w:t xml:space="preserve">Il punto è che si vuole poi </w:t>
+      </w:r>
+      <w:r>
+        <w:rPr>
+          <w:b/>
+        </w:rPr>
+        <w:t>dimenticare l'ordine</w:t>
+      </w:r>
+      <w:r>
+        <w:rPr/>
+        <w:t xml:space="preserve"> con cui gli elementi sono stati scelti. Si prenda un insieme di sei elementi a, b, c, d, e, f e si scelgano nell'ordine c, e, f. Il sottoinsieme ottenuto è S = {c, e, f}, ma si otterrebbe lo stesso con le scelte e, c, f oppure f, c, e, e così via: ogni modo di scrivere gli stessi tre elementi in un altro ordine è una disposizione diversa che dà lo stesso insieme. Le scritture diverse sono tante quanti gli ordinamenti di tre elementi, cioè 3! = 6.</w:t>
+      </w:r>
+    </w:p>
+    <w:p>
+      <w:pPr>
+        <w:keepNext/>
+        <w:jc w:val="center"/>
+      </w:pPr>
+      <w:r>
+        <w:drawing>
+          <wp:inline xmlns:a="http://schemas.openxmlformats.org/drawingml/2006/main" xmlns:pic="http://schemas.openxmlformats.org/drawingml/2006/picture">
+            <wp:extent cx="4320000" cy="2269951"/>
+            <wp:docPr id="55" name="Picture 55"/>
+            <wp:cNvGraphicFramePr>
+              <a:graphicFrameLocks noChangeAspect="1"/>
+            </wp:cNvGraphicFramePr>
+            <a:graphic>
+              <a:graphicData uri="http://schemas.openxmlformats.org/drawingml/2006/picture">
+                <pic:pic>
+                  <pic:nvPicPr>
+                    <pic:cNvPr id="0" name="ch26_riordinamenti.png"/>
+                    <pic:cNvPicPr/>
+                  </pic:nvPicPr>
+                  <pic:blipFill>
+                    <a:blip r:embed="rId59"/>
+                    <a:stretch>
+                      <a:fillRect/>
+                    </a:stretch>
+                  </pic:blipFill>
+                  <pic:spPr>
+                    <a:xfrm>
+                      <a:off x="0" y="0"/>
+                      <a:ext cx="4320000" cy="2269951"/>
+                    </a:xfrm>
+                    <a:prstGeom prst="rect"/>
+                  </pic:spPr>
+                </pic:pic>
+              </a:graphicData>
+            </a:graphic>
+          </wp:inline>
+        </w:drawing>
+      </w:r>
+    </w:p>
+    <w:p>
+      <w:pPr>
+        <w:jc w:val="center"/>
+      </w:pPr>
+      <w:r>
+        <w:rPr>
+          <w:i/>
+          <w:sz w:val="18"/>
+        </w:rPr>
+        <w:t>Le 6 disposizioni (c, e, f), (c, f, e), …, (f, e, c) danno tutte la stessa combinazione S = {c, e, f}.</w:t>
+      </w:r>
+    </w:p>
+    <w:p>
+      <w:r>
+        <w:rPr/>
+        <w:t>Nel caso generale una disposizione è una funzione iniettiva da I</w:t>
+      </w:r>
+      <w:r>
+        <w:rPr>
+          <w:vertAlign w:val="subscript"/>
+        </w:rPr>
+        <w:t>k</w:t>
+      </w:r>
+      <w:r>
+        <w:rPr/>
+        <w:t xml:space="preserve"> = {1, …, k} in A, che a 1 associa a</w:t>
+      </w:r>
+      <w:r>
+        <w:rPr>
+          <w:vertAlign w:val="subscript"/>
+        </w:rPr>
+        <w:t>1</w:t>
+      </w:r>
+      <w:r>
+        <w:rPr/>
+        <w:t>, a 2 associa a</w:t>
+      </w:r>
+      <w:r>
+        <w:rPr>
+          <w:vertAlign w:val="subscript"/>
+        </w:rPr>
+        <w:t>2</w:t>
+      </w:r>
+      <w:r>
+        <w:rPr/>
+        <w:t>, e così via fino a k, che ha come immagine a</w:t>
+      </w:r>
+      <w:r>
+        <w:rPr>
+          <w:vertAlign w:val="subscript"/>
+        </w:rPr>
+        <w:t>k</w:t>
+      </w:r>
+      <w:r>
+        <w:rPr/>
+        <w:t>; il sottoinsieme che si ottiene è S = {a</w:t>
+      </w:r>
+      <w:r>
+        <w:rPr>
+          <w:vertAlign w:val="subscript"/>
+        </w:rPr>
+        <w:t>1</w:t>
+      </w:r>
+      <w:r>
+        <w:rPr/>
+        <w:t>, …, a</w:t>
+      </w:r>
+      <w:r>
+        <w:rPr>
+          <w:vertAlign w:val="subscript"/>
+        </w:rPr>
+        <w:t>k</w:t>
+      </w:r>
+      <w:r>
+        <w:rPr/>
+        <w:t xml:space="preserve">}. Riordinare questi k elementi si può fare in k! modi, quindi </w:t>
+      </w:r>
+      <w:r>
+        <w:rPr>
+          <w:b/>
+        </w:rPr>
+        <w:t>ci sono esattamente k! disposizioni semplici che danno lo stesso sottoinsieme</w:t>
+      </w:r>
+      <w:r>
+        <w:rPr/>
+        <w:t>.</w:t>
+      </w:r>
+    </w:p>
+    <w:p>
+      <w:r>
+        <w:rPr/>
+        <w:t>Ne segue che ogni combinazione si ottiene da k! disposizioni diverse, e quindi il numero delle combinazioni è il numero delle disposizioni diviso k!:</w:t>
+      </w:r>
+    </w:p>
+    <w:p>
+      <w:r>
+        <w:rPr/>
+        <w:t>C</w:t>
+      </w:r>
+      <w:r>
+        <w:rPr>
+          <w:vertAlign w:val="subscript"/>
+        </w:rPr>
+        <w:t>n,k</w:t>
+      </w:r>
+      <w:r>
+        <w:rPr/>
+        <w:t xml:space="preserve"> = (1/k!) · D</w:t>
+      </w:r>
+      <w:r>
+        <w:rPr>
+          <w:vertAlign w:val="subscript"/>
+        </w:rPr>
+        <w:t>n,k</w:t>
+      </w:r>
+      <w:r>
+        <w:rPr/>
+        <w:t xml:space="preserve"> = n! / (k! (n − k)!).</w:t>
+      </w:r>
+    </w:p>
+    <w:p>
+      <w:r>
+        <w:rPr/>
+        <w:t>(In parole povere: si fa finta, per un momento, che l'ordine conti, e si contano tutte le scelte ordinate. Poi si corregge: ogni gruppo di k persone è stato contato k! volte, una per ogni modo di metterle in fila, e quindi si divide per k!.)</w:t>
+      </w:r>
+    </w:p>
+    <w:p>
+      <w:pPr>
+        <w:pStyle w:val="Titolo2"/>
+      </w:pPr>
+      <w:r>
+        <w:rPr>
+          <w:b/>
+          <w:color w:val="E97132"/>
+        </w:rPr>
+        <w:t>I coefficienti binomiali</w:t>
+      </w:r>
+    </w:p>
+    <w:p>
+      <w:r>
+        <w:rPr/>
+        <w:t xml:space="preserve">I numeri n!/(k!(n − k)!) sono molto importanti perché capitano spesso in diversi settori della matematica. Per questo hanno un simbolo e un nome particolari: si scrivono con n sopra k fra parentesi tonde, </w:t>
+      </w:r>
+      <w:r>
+        <w:rPr>
+          <w:b/>
+        </w:rPr>
+        <w:t>senza barra di frazione</w:t>
+      </w:r>
+      <w:r>
+        <w:rPr/>
+        <w:t xml:space="preserve">, e si leggono «n su k». Si chiamano </w:t>
+      </w:r>
+      <w:r>
+        <w:rPr>
+          <w:b/>
+        </w:rPr>
+        <w:t>coefficienti binomiali</w:t>
+      </w:r>
+      <w:r>
+        <w:rPr/>
+        <w:t>, e perché si chiamino così si scoprirà fra non molto. Quindi</w:t>
+      </w:r>
+    </w:p>
+    <w:p>
+      <w:r>
+        <w:rPr/>
+        <w:t>C</w:t>
+      </w:r>
+      <w:r>
+        <w:rPr>
+          <w:vertAlign w:val="subscript"/>
+        </w:rPr>
+        <w:t>n,k</w:t>
+      </w:r>
+      <w:r>
+        <w:rPr/>
+        <w:t xml:space="preserve"> = (n su k) = n! / (k! (n − k)!).</w:t>
+      </w:r>
+    </w:p>
+    <w:p>
+      <w:r>
+        <w:rPr/>
+        <w:t>(In parole povere: "n su k" è semplicemente il numero di modi di scegliere k oggetti da un mucchio di n quando l'ordine non conta. Si legge come "n su k" e non è una divisione, anche se per calcolarlo si usano i fattoriali.)</w:t>
+      </w:r>
+    </w:p>
+    <w:p>
+      <w:r>
+        <w:rPr/>
+        <w:t>I due casi estremi tornano dalla formula, ed è qui che la convenzione 0! = 1 è utile. Per k = 0 si ha (n su 0) = n!/(0! · n!) = 1, e per k = n si ha (n su n) = n!/(n! · 0!) = 1. Nella formula con k = 0 si dovrebbe scrivere prima 0! e poi (n − 0)!, ma poiché si stanno moltiplicando dei numeri l'ordine dei fattori non cambia il risultato.</w:t>
+      </w:r>
+    </w:p>
+    <w:p>
+      <w:pPr>
+        <w:pStyle w:val="Titolo2"/>
+      </w:pPr>
+      <w:r>
+        <w:rPr>
+          <w:b/>
+          <w:color w:val="E97132"/>
+        </w:rPr>
+        <w:t>Calcolare i coefficienti</w:t>
+      </w:r>
+    </w:p>
+    <w:p>
+      <w:r>
+        <w:rPr/>
+        <w:t>Quanti modi ci sono di scegliere tre oggetti fra sei? La risposta è (6 su 3):</w:t>
+      </w:r>
+    </w:p>
+    <w:p>
+      <w:r>
+        <w:rPr/>
+        <w:t>(6 su 3) = 6! / (3! · 3!) = (6 · 5 · 4 · 3 · 2 · 1) / ((3 · 2 · 1) · (3 · 2 · 1)).</w:t>
+      </w:r>
+    </w:p>
+    <w:p>
+      <w:r>
+        <w:rPr/>
+        <w:t xml:space="preserve">Questi numeri sono molto più semplici da calcolare di quanto sembri, perché si semplificano quasi sempre molti fattori. Il 3 · 2 · 1 del numeratore si cancella con uno dei due fattoriali del denominatore, rimane (6 · 5 · 4)/(3 · 2 · 1) e, poiché 3 · 2 = 6, si cancella anche il 6: restano 5 · 4 = 20. Conviene </w:t>
+      </w:r>
+      <w:r>
+        <w:rPr>
+          <w:b/>
+        </w:rPr>
+        <w:t>semplificare prima e usare la calcolatrice solo alla fine</w:t>
+      </w:r>
+      <w:r>
+        <w:rPr/>
+        <w:t>. Se si scrive la lista di tutti i sottoinsiemi di tre elementi di {a, b, c, d, e, f}, in ordine alfabetico da {a, b, c} a {d, e, f}, si contano in effetti 20 sottoinsiemi.</w:t>
+      </w:r>
+    </w:p>
+    <w:p>
+      <w:r>
+        <w:rPr/>
+        <w:t>Una conferma per un caso semplice: scegliere un solo elemento fra n dà n possibilità, e in effetti (n su 1) = n!/(1! (n − 1)!) = n. Per esempio (15 su 1) = 15.</w:t>
+      </w:r>
+    </w:p>
+    <w:p>
+      <w:pPr>
+        <w:pStyle w:val="Titolo2"/>
+      </w:pPr>
+      <w:r>
+        <w:rPr>
+          <w:b/>
+          <w:color w:val="E97132"/>
+        </w:rPr>
+        <w:t>Il superenalotto</w:t>
+      </w:r>
+    </w:p>
+    <w:p>
+      <w:r>
+        <w:rPr/>
+        <w:t>Un esempio concreto è il superenalotto. Si estraggono 6 numeri da 1 a 90 e per vincere bisogna indovinare i sei che escono, non l'ordine di uscita. Per sapere quante sestine possono uscire bisogna contare i sottoinsiemi di 6 elementi di I</w:t>
+      </w:r>
+      <w:r>
+        <w:rPr>
+          <w:vertAlign w:val="subscript"/>
+        </w:rPr>
+        <w:t>90</w:t>
+      </w:r>
+      <w:r>
+        <w:rPr/>
+        <w:t xml:space="preserve"> = {1, …, 90}: è una combinazione semplice, e quindi il numero delle sestine è</w:t>
+      </w:r>
+    </w:p>
+    <w:p>
+      <w:r>
+        <w:rPr/>
+        <w:t>C</w:t>
+      </w:r>
+      <w:r>
+        <w:rPr>
+          <w:vertAlign w:val="subscript"/>
+        </w:rPr>
+        <w:t>90,6</w:t>
+      </w:r>
+      <w:r>
+        <w:rPr/>
+        <w:t xml:space="preserve"> = 90! / (6! · 84!) = (90 · 89 · 88 · 87 · 86 · 85) / 720.</w:t>
+      </w:r>
+    </w:p>
+    <w:p>
+      <w:r>
+        <w:rPr/>
+        <w:t xml:space="preserve">Il 90! si semplifica con 84! lasciando solo i primi sei fattori, e poi si divide per 6! = 720. Il risultato è circa </w:t>
+      </w:r>
+      <w:r>
+        <w:rPr>
+          <w:b/>
+        </w:rPr>
+        <w:t>622 milioni</w:t>
+      </w:r>
+      <w:r>
+        <w:rPr/>
+        <w:t xml:space="preserve"> (622 614 630). Sono tutte sestine ugualmente possibili, e quindi, giocandone una sola, si ha una possibilità su circa 622 milioni di vincere (senza entrare nel discorso della probabilità).</w:t>
+      </w:r>
+    </w:p>
+    <w:p>
+      <w:pPr>
+        <w:pStyle w:val="Titolo2"/>
+      </w:pPr>
+      <w:r>
+        <w:rPr>
+          <w:b/>
+          <w:color w:val="E97132"/>
+        </w:rPr>
+        <w:t>Riassumendo</w:t>
+      </w:r>
+    </w:p>
+    <w:p>
+      <w:r>
+        <w:rPr/>
+        <w:t xml:space="preserve">I casi di scelte che si sono visti finora si possono classificare con due domande: l'ordine conta? Le scelte si possono ripetere? Le </w:t>
+      </w:r>
+      <w:r>
+        <w:rPr>
+          <w:b/>
+        </w:rPr>
+        <w:t>disposizioni</w:t>
+      </w:r>
+      <w:r>
+        <w:rPr/>
+        <w:t xml:space="preserve"> (con ripetizione: n</w:t>
+      </w:r>
+      <w:r>
+        <w:rPr>
+          <w:vertAlign w:val="superscript"/>
+        </w:rPr>
+        <w:t>k</w:t>
+      </w:r>
+      <w:r>
+        <w:rPr/>
+        <w:t xml:space="preserve">; semplici: n!/(n − k)!) sono ordinate; le </w:t>
+      </w:r>
+      <w:r>
+        <w:rPr>
+          <w:b/>
+        </w:rPr>
+        <w:t>combinazioni semplici</w:t>
+      </w:r>
+      <w:r>
+        <w:rPr/>
+        <w:t>, che si sono viste in questo capitolo, non lo sono e non ammettono ripetizioni, e il loro numero è il coefficiente binomiale (n su k). Resta da vedere il caso delle combinazioni con ripetizione. Prima, il capitolo successivo mostra come si usano le combinazioni nei problemi in cui le scelte sono più di una.</w:t>
+      </w:r>
+    </w:p>
+    <w:p>
+      <w:pPr>
+        <w:pStyle w:val="Titolo1"/>
+      </w:pPr>
+      <w:r>
+        <w:rPr>
+          <w:b/>
+          <w:color w:val="EE0000"/>
+        </w:rPr>
+        <w:t>27. Problemi con più Scelte: Quando si Moltiplica e Quando si Somma</w:t>
+      </w:r>
+    </w:p>
+    <w:p>
+      <w:pPr>
+        <w:pStyle w:val="Titolo2"/>
+      </w:pPr>
+      <w:r>
+        <w:rPr>
+          <w:b/>
+          <w:color w:val="E97132"/>
+        </w:rPr>
+        <w:t>Un problema non si risolve con una formula sola</w:t>
+      </w:r>
+    </w:p>
+    <w:p>
+      <w:r>
+        <w:rPr/>
+        <w:t xml:space="preserve">Con le combinazioni semplici si sa contare una singola scelta di k elementi fra n. I problemi veri però sono spesso più articolati: usano le combinazioni come tecnica di base, ma richiedono di suddividere la scelta in </w:t>
+      </w:r>
+      <w:r>
+        <w:rPr>
+          <w:b/>
+        </w:rPr>
+        <w:t>più passi</w:t>
+      </w:r>
+      <w:r>
+        <w:rPr/>
+        <w:t xml:space="preserve">. In questo capitolo ci sono tre problemi, e il loro confronto mostra un punto importante: a volte i numeri dei vari passi si </w:t>
+      </w:r>
+      <w:r>
+        <w:rPr>
+          <w:b/>
+        </w:rPr>
+        <w:t>moltiplicano</w:t>
+      </w:r>
+      <w:r>
+        <w:rPr/>
+        <w:t xml:space="preserve">, altre volte si </w:t>
+      </w:r>
+      <w:r>
+        <w:rPr>
+          <w:b/>
+        </w:rPr>
+        <w:t>sommano</w:t>
+      </w:r>
+      <w:r>
+        <w:rPr/>
+        <w:t>.</w:t>
+      </w:r>
+    </w:p>
+    <w:p>
+      <w:r>
+        <w:rPr/>
+        <w:t xml:space="preserve">Come sottolineato a lezione, di questi problemi </w:t>
+      </w:r>
+      <w:r>
+        <w:rPr>
+          <w:b/>
+        </w:rPr>
+        <w:t>non interessa tanto il numero finale, ma il procedimento</w:t>
+      </w:r>
+      <w:r>
+        <w:rPr/>
+        <w:t>: se si arriva a scrivere l'espressione giusta, il calcolo con la calcolatrice è secondario. Per i calcoli conviene comunque semplificare prima e usare la calcolatrice solo alla fine.</w:t>
+      </w:r>
+    </w:p>
+    <w:p>
+      <w:pPr>
+        <w:pStyle w:val="Titolo2"/>
+      </w:pPr>
+      <w:r>
+        <w:rPr>
+          <w:b/>
+          <w:color w:val="E97132"/>
+        </w:rPr>
+        <w:t>La scuola di ballo: due gruppi separati</w:t>
+      </w:r>
+    </w:p>
+    <w:p>
+      <w:r>
+        <w:rPr/>
+        <w:t>In una scuola di ballo ci sono 10 studenti maschi e 12 studentesse. Per una coreografia i maestri scelgono 4 uomini e 4 donne. Quante sono le scelte possibili?</w:t>
+      </w:r>
+    </w:p>
+    <w:p>
+      <w:r>
+        <w:rPr/>
+        <w:t>Un modo sbagliato di risolvere il problema è dire che ci sono 22 studenti e se ne devono scegliere 8, quindi C</w:t>
+      </w:r>
+      <w:r>
+        <w:rPr>
+          <w:vertAlign w:val="subscript"/>
+        </w:rPr>
+        <w:t>22,8</w:t>
+      </w:r>
+      <w:r>
+        <w:rPr/>
+        <w:t>. È sbagliato perché fra i 22 non se ne devono scegliere 8 qualsiasi: la scelta è vincolata, perché 4 vanno presi da un gruppo e 4 dall'altro. Come sottolineato a lezione, la strategia giusta è dividere la scelta in due passi, uno dopo l'altro, e disegnare l'albero delle possibilità.</w:t>
+      </w:r>
+    </w:p>
+    <w:p>
+      <w:r>
+        <w:rPr/>
+        <w:t xml:space="preserve">Si scelgono prima gli uomini: 4 su 10, cioè (10 su 4) modi. Poi si scelgono le donne: qualunque sia la scelta degli uomini, le donne sono un gruppo separato, e quindi in ogni caso ci sono (12 su 4) possibilità. L'ordine dei due passi non cambia il risultato (prima gli uomini e poi le donne, o il contrario, danno gli stessi gruppi finali). I punti finali dell'albero, cioè tutte le situazioni possibili, si ottengono </w:t>
+      </w:r>
+      <w:r>
+        <w:rPr>
+          <w:b/>
+        </w:rPr>
+        <w:t>moltiplicando</w:t>
+      </w:r>
+      <w:r>
+        <w:rPr/>
+        <w:t xml:space="preserve"> i due numeri, per il metodo delle scelte successive (capitolo 22):</w:t>
+      </w:r>
+    </w:p>
+    <w:p>
+      <w:r>
+        <w:rPr/>
+        <w:t>(10 su 4) · (12 su 4) = 210 · 495 = 103 950.</w:t>
+      </w:r>
+    </w:p>
+    <w:p>
+      <w:pPr>
+        <w:keepNext/>
+        <w:jc w:val="center"/>
+      </w:pPr>
+      <w:r>
+        <w:drawing>
+          <wp:inline xmlns:a="http://schemas.openxmlformats.org/drawingml/2006/main" xmlns:pic="http://schemas.openxmlformats.org/drawingml/2006/picture">
+            <wp:extent cx="4680000" cy="2437103"/>
+            <wp:docPr id="56" name="Picture 56"/>
+            <wp:cNvGraphicFramePr>
+              <a:graphicFrameLocks noChangeAspect="1"/>
+            </wp:cNvGraphicFramePr>
+            <a:graphic>
+              <a:graphicData uri="http://schemas.openxmlformats.org/drawingml/2006/picture">
+                <pic:pic>
+                  <pic:nvPicPr>
+                    <pic:cNvPr id="0" name="ch27_albero_ballo.png"/>
+                    <pic:cNvPicPr/>
+                  </pic:nvPicPr>
+                  <pic:blipFill>
+                    <a:blip r:embed="rId60"/>
+                    <a:stretch>
+                      <a:fillRect/>
+                    </a:stretch>
+                  </pic:blipFill>
+                  <pic:spPr>
+                    <a:xfrm>
+                      <a:off x="0" y="0"/>
+                      <a:ext cx="4680000" cy="2437103"/>
+                    </a:xfrm>
+                    <a:prstGeom prst="rect"/>
+                  </pic:spPr>
+                </pic:pic>
+              </a:graphicData>
+            </a:graphic>
+          </wp:inline>
+        </w:drawing>
+      </w:r>
+    </w:p>
+    <w:p>
+      <w:pPr>
+        <w:jc w:val="center"/>
+      </w:pPr>
+      <w:r>
+        <w:rPr>
+          <w:i/>
+          <w:sz w:val="18"/>
+        </w:rPr>
+        <w:t>L'albero delle scelte per la scuola di ballo: 210 rami per gli uomini, e da ciascuno sempre 495 rami per le donne.</w:t>
+      </w:r>
+    </w:p>
+    <w:p>
+      <w:r>
+        <w:rPr/>
+        <w:t>Il calcolo, con le semplificazioni: (10 su 4) = 10!/(4! · 6!) = (10 · 9 · 8 · 7)/(4 · 3 · 2 · 1) = 210, e (12 su 4) = 12!/(4! · 8!) = (12 · 11 · 10 · 9)/(4 · 3 · 2 · 1) = 495.</w:t>
+      </w:r>
+    </w:p>
+    <w:p>
+      <w:r>
+        <w:rPr/>
+        <w:t>(In parole povere: quando due scelte sono indipendenti, cioè quello che scegli nella seconda non dipende da quello che hai scelto nella prima, il numero totale di possibilità è il prodotto dei due numeri. Ogni scelta degli uomini si può abbinare con ogni scelta delle donne.)</w:t>
+      </w:r>
+    </w:p>
+    <w:p>
+      <w:pPr>
+        <w:pStyle w:val="Titolo2"/>
+      </w:pPr>
+      <w:r>
+        <w:rPr>
+          <w:b/>
+          <w:color w:val="E97132"/>
+        </w:rPr>
+        <w:t>La squadra di calcio: quattro scelte indipendenti</w:t>
+      </w:r>
+    </w:p>
+    <w:p>
+      <w:r>
+        <w:rPr/>
+        <w:t>Una squadra di calcio ha una rosa di 3 portieri, 8 difensori, 7 centrocampisti e 4 attaccanti, in totale 22 giocatori. L'allenatore decide di schierare 1 portiere, 4 difensori, 4 centrocampisti e 2 attaccanti, cioè 11 giocatori con il modulo 4-4-2. Quante squadre diverse può schierare?</w:t>
+      </w:r>
+    </w:p>
+    <w:p>
+      <w:r>
+        <w:rPr/>
+        <w:t>È lo stesso tipo di problema della scuola di ballo, ma con quattro scelte invece di due, e quindi un albero più alto. Il modo in cui si scelgono i difensori non influisce su quello dei centrocampisti o degli attaccanti: a ogni passo il numero di possibilità è sempre quello. I numeri da calcolare sono:</w:t>
+      </w:r>
+    </w:p>
+    <w:p>
+      <w:pPr>
+        <w:numPr>
+          <w:ilvl w:val="0"/>
+          <w:numId w:val="1"/>
+        </w:numPr>
+      </w:pPr>
+      <w:r>
+        <w:rPr/>
+        <w:t>portiere: (3 su 1) = 3;</w:t>
+      </w:r>
+    </w:p>
+    <w:p>
+      <w:pPr>
+        <w:numPr>
+          <w:ilvl w:val="0"/>
+          <w:numId w:val="1"/>
+        </w:numPr>
+      </w:pPr>
+      <w:r>
+        <w:rPr/>
+        <w:t>difensori: (8 su 4) = 8!/(4! · 4!) = (8 · 7 · 6 · 5)/(4 · 3 · 2 · 1) = 70;</w:t>
+      </w:r>
+    </w:p>
+    <w:p>
+      <w:pPr>
+        <w:numPr>
+          <w:ilvl w:val="0"/>
+          <w:numId w:val="1"/>
+        </w:numPr>
+      </w:pPr>
+      <w:r>
+        <w:rPr/>
+        <w:t>centrocampisti: (7 su 4) = 7!/(4! · 3!) = (7 · 6 · 5)/(3 · 2 · 1) = 35;</w:t>
+      </w:r>
+    </w:p>
+    <w:p>
+      <w:pPr>
+        <w:numPr>
+          <w:ilvl w:val="0"/>
+          <w:numId w:val="1"/>
+        </w:numPr>
+      </w:pPr>
+      <w:r>
+        <w:rPr/>
+        <w:t>attaccanti: (4 su 2) = 4!/(2! · 2!) = (4 · 3)/2 = 6.</w:t>
+      </w:r>
+    </w:p>
+    <w:p>
+      <w:r>
+        <w:rPr/>
+        <w:t xml:space="preserve">Dato che ogni passo ha sempre lo stesso numero di scelte, si </w:t>
+      </w:r>
+      <w:r>
+        <w:rPr>
+          <w:b/>
+        </w:rPr>
+        <w:t>moltiplica</w:t>
+      </w:r>
+      <w:r>
+        <w:rPr/>
+        <w:t>: 3 · 70 · 35 · 6 = 44 100 squadre possibili. Il docente ha osservato che, se si cominciasse a dire che un certo attaccante ha litigato con un certo difensore e non devono giocare insieme, il numero di scelte di uno dei passi dipenderebbe da quelle precedenti e l'albero e l'analisi si complicherebbero.</w:t>
+      </w:r>
+    </w:p>
+    <w:p>
+      <w:pPr>
+        <w:pStyle w:val="Titolo2"/>
+      </w:pPr>
+      <w:r>
+        <w:rPr>
+          <w:b/>
+          <w:color w:val="E97132"/>
+        </w:rPr>
+        <w:t>La gelateria: quando il secondo passo dipende dal primo</w:t>
+      </w:r>
+    </w:p>
+    <w:p>
+      <w:r>
+        <w:rPr/>
+        <w:t>Una gelateria ha 15 gusti ed è possibile acquistare coni piccoli (1 gusto), medi (2 gusti diversi) o grandi (3 gusti diversi). Quanti coni diversi si possono comprare in totale?</w:t>
+      </w:r>
+    </w:p>
+    <w:p>
+      <w:r>
+        <w:rPr/>
+        <w:t>Si divide il problema in due passi: prima si dice alla cassa la dimensione del cono (tre possibilità), poi si scelgono i gusti. Si disegna l'albero. Ogni scelta di gusti è una combinazione semplice, perché non conta l'ordine e non si ripete un gusto:</w:t>
+      </w:r>
+    </w:p>
+    <w:p>
+      <w:pPr>
+        <w:numPr>
+          <w:ilvl w:val="0"/>
+          <w:numId w:val="1"/>
+        </w:numPr>
+      </w:pPr>
+      <w:r>
+        <w:rPr/>
+        <w:t>cono piccolo: (15 su 1) = 15 possibilità;</w:t>
+      </w:r>
+    </w:p>
+    <w:p>
+      <w:pPr>
+        <w:numPr>
+          <w:ilvl w:val="0"/>
+          <w:numId w:val="1"/>
+        </w:numPr>
+      </w:pPr>
+      <w:r>
+        <w:rPr/>
+        <w:t>cono medio: (15 su 2) = 15!/(2! · 13!) = (15 · 14)/2 = 105 possibilità;</w:t>
+      </w:r>
+    </w:p>
+    <w:p>
+      <w:pPr>
+        <w:numPr>
+          <w:ilvl w:val="0"/>
+          <w:numId w:val="1"/>
+        </w:numPr>
+      </w:pPr>
+      <w:r>
+        <w:rPr/>
+        <w:t>cono grande: (15 su 3) = 15!/(3! · 12!) = (15 · 14 · 13)/(3 · 2 · 1) = 455 possibilità.</w:t>
+      </w:r>
+    </w:p>
+    <w:p>
+      <w:r>
+        <w:rPr/>
+        <w:t xml:space="preserve">Questo albero è diverso da quelli visti finora. Nei casi precedenti, da qualunque ramo del primo livello si partisse, il numero di scelte del secondo livello era sempre lo stesso, e per questo i numeri si moltiplicavano. Qui invece </w:t>
+      </w:r>
+      <w:r>
+        <w:rPr>
+          <w:b/>
+        </w:rPr>
+        <w:t>il numero delle scelte al secondo livello dipende dal ramo</w:t>
+      </w:r>
+      <w:r>
+        <w:rPr/>
+        <w:t xml:space="preserve">: sono 15 per il piccolo, 105 per il medio e 455 per il grande. I punti finali dell'albero sono quindi la </w:t>
+      </w:r>
+      <w:r>
+        <w:rPr>
+          <w:b/>
+        </w:rPr>
+        <w:t>somma</w:t>
+      </w:r>
+      <w:r>
+        <w:rPr/>
+        <w:t xml:space="preserve"> dei punti finali di ciascun ramo:</w:t>
+      </w:r>
+    </w:p>
+    <w:p>
+      <w:r>
+        <w:rPr/>
+        <w:t>15 + 105 + 455 = 575 coni.</w:t>
+      </w:r>
+    </w:p>
+    <w:p>
+      <w:pPr>
+        <w:keepNext/>
+        <w:jc w:val="center"/>
+      </w:pPr>
+      <w:r>
+        <w:drawing>
+          <wp:inline xmlns:a="http://schemas.openxmlformats.org/drawingml/2006/main" xmlns:pic="http://schemas.openxmlformats.org/drawingml/2006/picture">
+            <wp:extent cx="4680000" cy="2459113"/>
+            <wp:docPr id="57" name="Picture 57"/>
+            <wp:cNvGraphicFramePr>
+              <a:graphicFrameLocks noChangeAspect="1"/>
+            </wp:cNvGraphicFramePr>
+            <a:graphic>
+              <a:graphicData uri="http://schemas.openxmlformats.org/drawingml/2006/picture">
+                <pic:pic>
+                  <pic:nvPicPr>
+                    <pic:cNvPr id="0" name="ch27_albero_gelato.png"/>
+                    <pic:cNvPicPr/>
+                  </pic:nvPicPr>
+                  <pic:blipFill>
+                    <a:blip r:embed="rId61"/>
+                    <a:stretch>
+                      <a:fillRect/>
+                    </a:stretch>
+                  </pic:blipFill>
+                  <pic:spPr>
+                    <a:xfrm>
+                      <a:off x="0" y="0"/>
+                      <a:ext cx="4680000" cy="2459113"/>
+                    </a:xfrm>
+                    <a:prstGeom prst="rect"/>
+                  </pic:spPr>
+                </pic:pic>
+              </a:graphicData>
+            </a:graphic>
+          </wp:inline>
+        </w:drawing>
+      </w:r>
+    </w:p>
+    <w:p>
+      <w:pPr>
+        <w:jc w:val="center"/>
+      </w:pPr>
+      <w:r>
+        <w:rPr>
+          <w:i/>
+          <w:sz w:val="18"/>
+        </w:rPr>
+        <w:t>L'albero della gelateria: ogni tipo di cono ha un numero diverso di scelte di gusti, e i punti finali si sommano.</w:t>
+      </w:r>
+    </w:p>
+    <w:p>
+      <w:r>
+        <w:rPr/>
+        <w:t>(In parole povere: il tipo di cono divide il problema in casi alternativi, "o prendi il cono piccolo, o il medio, o il grande", e ogni caso ha un numero diverso di scelte di gusti. I casi non si abbinano fra loro come nella scuola di ballo: si sommano i loro conteggi.)</w:t>
+      </w:r>
+    </w:p>
+    <w:p>
+      <w:pPr>
+        <w:pStyle w:val="Titolo2"/>
+      </w:pPr>
+      <w:r>
+        <w:rPr>
+          <w:b/>
+          <w:color w:val="E97132"/>
+        </w:rPr>
+        <w:t>Quando si moltiplica e quando si somma</w:t>
+      </w:r>
+    </w:p>
+    <w:p>
+      <w:r>
+        <w:rPr/>
+        <w:t>Come sottolineato a lezione, è una cosa da tenere molto presente quando si analizzano questi problemi:</w:t>
+      </w:r>
+    </w:p>
+    <w:p>
+      <w:pPr>
+        <w:numPr>
+          <w:ilvl w:val="0"/>
+          <w:numId w:val="1"/>
+        </w:numPr>
+      </w:pPr>
+      <w:r>
+        <w:rPr/>
+        <w:t xml:space="preserve">se a ogni passo il numero delle scelte è </w:t>
+      </w:r>
+      <w:r>
+        <w:rPr>
+          <w:b/>
+        </w:rPr>
+        <w:t>sempre lo stesso</w:t>
+      </w:r>
+      <w:r>
+        <w:rPr/>
+        <w:t xml:space="preserve">, qualunque sia il percorso fatto fin lì, si </w:t>
+      </w:r>
+      <w:r>
+        <w:rPr>
+          <w:b/>
+        </w:rPr>
+        <w:t>moltiplicano</w:t>
+      </w:r>
+      <w:r>
+        <w:rPr/>
+        <w:t xml:space="preserve"> i numeri dei vari passi (scuola di ballo, squadra di calcio);</w:t>
+      </w:r>
+    </w:p>
+    <w:p>
+      <w:pPr>
+        <w:numPr>
+          <w:ilvl w:val="0"/>
+          <w:numId w:val="1"/>
+        </w:numPr>
+      </w:pPr>
+      <w:r>
+        <w:rPr/>
+        <w:t xml:space="preserve">se invece il numero delle scelte di un passo </w:t>
+      </w:r>
+      <w:r>
+        <w:rPr>
+          <w:b/>
+        </w:rPr>
+        <w:t>dipende da dove si è arrivati</w:t>
+      </w:r>
+      <w:r>
+        <w:rPr/>
+        <w:t xml:space="preserve"> al passo precedente, l'espressione è più complicata e coinvolge delle </w:t>
+      </w:r>
+      <w:r>
+        <w:rPr>
+          <w:b/>
+        </w:rPr>
+        <w:t>somme</w:t>
+      </w:r>
+      <w:r>
+        <w:rPr/>
+        <w:t xml:space="preserve"> (gelateria), una per ciascun ramo.</w:t>
+      </w:r>
+    </w:p>
+    <w:p>
+      <w:r>
+        <w:rPr/>
+        <w:t>Quando un problema si complica in questo modo il numero di casi esplode e non è possibile elencare tutte le possibilità. Il metodo è quindi prima di tutto capire che cosa chiede il problema, poi capire se è una questione di ordine oppure no, poi suddividere in pezzi più piccoli da risolvere uno alla volta e infine rimetterli insieme, moltiplicando o sommando a seconda dei casi.</w:t>
+      </w:r>
+    </w:p>
+    <w:p>
+      <w:r>
+        <w:rPr/>
+        <w:t>Nel prossimo capitolo manca ancora un tipo di scelta, quella non ordinata in cui lo stesso elemento si può prendere più volte: le combinazioni con ripetizione.</w:t>
+      </w:r>
+    </w:p>
+    <w:p>
+      <w:pPr>
+        <w:pStyle w:val="Titolo1"/>
+      </w:pPr>
+      <w:r>
+        <w:rPr>
+          <w:b/>
+          <w:color w:val="EE0000"/>
+        </w:rPr>
+        <w:t>28. Le Combinazioni con Ripetizione</w:t>
+      </w:r>
+    </w:p>
+    <w:p>
+      <w:pPr>
+        <w:pStyle w:val="Titolo2"/>
+      </w:pPr>
+      <w:r>
+        <w:rPr>
+          <w:b/>
+          <w:color w:val="E97132"/>
+        </w:rPr>
+        <w:t>Il quarto tipo di scelta</w:t>
+      </w:r>
+    </w:p>
+    <w:p>
+      <w:r>
+        <w:rPr/>
+        <w:t xml:space="preserve">Si sono visti gli ordinamenti, le disposizioni semplici e con ripetizione e le combinazioni semplici. Manca l'ultimo caso, le </w:t>
+      </w:r>
+      <w:r>
+        <w:rPr>
+          <w:b/>
+        </w:rPr>
+        <w:t>combinazioni con ripetizione</w:t>
+      </w:r>
+      <w:r>
+        <w:rPr/>
+        <w:t>: scelte non ordinate in cui lo stesso elemento si può scegliere più volte. Un esempio già incontrato è una pasticceria con un certo numero di tipi di pasticcini, da cui si vuole un vassoio con un certo numero di pezzi: l'ordine in cui si mettono i pasticcini non conta, ma lo stesso tipo si può prendere sei o sette volte. Un esempio più matematico sono i monomi.</w:t>
+      </w:r>
+    </w:p>
+    <w:p>
+      <w:r>
+        <w:rPr/>
+        <w:t xml:space="preserve">Sia A un insieme con n ≥ 1 elementi e si devono fare k scelte in A, non ordinate e possibilmente ripetute. Una </w:t>
+      </w:r>
+      <w:r>
+        <w:rPr>
+          <w:b/>
+        </w:rPr>
+        <w:t>combinazione con ripetizione</w:t>
+      </w:r>
+      <w:r>
+        <w:rPr/>
+        <w:t xml:space="preserve"> di ordine k in A è una scelta di questo tipo; il loro numero si indica con C</w:t>
+      </w:r>
+      <w:r>
+        <w:rPr>
+          <w:vertAlign w:val="superscript"/>
+        </w:rPr>
+        <w:t>r</w:t>
+      </w:r>
+      <w:r>
+        <w:rPr>
+          <w:vertAlign w:val="subscript"/>
+        </w:rPr>
+        <w:t>n,k</w:t>
+      </w:r>
+      <w:r>
+        <w:rPr/>
+        <w:t>, dove la r sta per «ripetizione» (non è un esponente). Il numero k è qualunque: non è detto che debba essere minore di n, come si vede sotto.</w:t>
+      </w:r>
+    </w:p>
+    <w:p>
+      <w:r>
+        <w:rPr/>
+        <w:t>(In parole povere: è la scelta di un vassoio di pasticcini, in cui non conta l'ordine in cui li metti dentro ma conta quanti ne prendi di ogni tipo. Puoi prendere il tipo preferito anche cinque volte, e puoi prenderne più di quanti siano i tipi.)</w:t>
+      </w:r>
+    </w:p>
+    <w:p>
+      <w:pPr>
+        <w:pStyle w:val="Titolo2"/>
+      </w:pPr>
+      <w:r>
+        <w:rPr>
+          <w:b/>
+          <w:color w:val="E97132"/>
+        </w:rPr>
+        <w:t>Contare i monomi</w:t>
+      </w:r>
+    </w:p>
+    <w:p>
+      <w:r>
+        <w:rPr/>
+        <w:t xml:space="preserve">Un </w:t>
+      </w:r>
+      <w:r>
+        <w:rPr>
+          <w:b/>
+        </w:rPr>
+        <w:t>monomio</w:t>
+      </w:r>
+      <w:r>
+        <w:rPr/>
+        <w:t xml:space="preserve"> in più variabili è un'espressione fatta di variabili elevate a un certo esponente. Il suo </w:t>
+      </w:r>
+      <w:r>
+        <w:rPr>
+          <w:b/>
+        </w:rPr>
+        <w:t>grado</w:t>
+      </w:r>
+      <w:r>
+        <w:rPr/>
+        <w:t xml:space="preserve"> è la </w:t>
+      </w:r>
+      <w:r>
+        <w:rPr>
+          <w:b/>
+        </w:rPr>
+        <w:t>somma degli esponenti</w:t>
+      </w:r>
+      <w:r>
+        <w:rPr/>
+        <w:t>. Per esempio x³ y² z⁵ è un monomio in tre variabili x, y, z, e ha grado 3 + 2 + 5 = 10. Per semplicità si considerano solo monomi con coefficiente 1.</w:t>
+      </w:r>
+    </w:p>
+    <w:p>
+      <w:r>
+        <w:rPr/>
+        <w:t>(In parole povere: un monomio è una "parola" fatta di lettere ripetute, per esempio x x x y y z z z z z, che si scrive in breve x³ y² z⁵. Il grado è quante lettere ci sono in tutto: qui 3 + 2 + 5 = 10.)</w:t>
+      </w:r>
+    </w:p>
+    <w:p>
+      <w:r>
+        <w:rPr/>
+        <w:t>La domanda è: quanti sono i monomi diversi di grado 10 in tre variabili? Se ne possono scrivere moltissimi, a cominciare da x¹⁰ (una variabile può comparire con esponente 0), poi x⁹ y, x⁹ z, x⁸ y² e così via. Si può saperlo senza elencarli tutti?</w:t>
+      </w:r>
+    </w:p>
+    <w:p>
+      <w:r>
+        <w:rPr/>
+        <w:t xml:space="preserve">Si osserva che si sta facendo una scelta in un insieme (le variabili x, y, z) e che è </w:t>
+      </w:r>
+      <w:r>
+        <w:rPr>
+          <w:b/>
+        </w:rPr>
+        <w:t>non ordinata</w:t>
+      </w:r>
+      <w:r>
+        <w:rPr/>
+        <w:t xml:space="preserve">: x² · x · y² · z³ · z² e x · x² · z² · y² · z³ sono lo stesso monomio x³ y² z⁵: scritti con i fattori in un altro ordine, sono uguali, perché il prodotto è commutativo e si possono raggruppare tutte le x, tutte le y e tutte le z. Quindi l'ordine di scelta non conta. A differenza delle combinazioni semplici però qui gli elementi si scelgono </w:t>
+      </w:r>
+      <w:r>
+        <w:rPr>
+          <w:b/>
+        </w:rPr>
+        <w:t>più volte</w:t>
+      </w:r>
+      <w:r>
+        <w:rPr/>
+        <w:t>: nel monomio x³ y² z⁵ si sono scelte 3 volte la x, 2 volte la y e 5 volte la z, per un totale di 10 scelte, cioè il grado.</w:t>
+      </w:r>
+    </w:p>
+    <w:p>
+      <w:pPr>
+        <w:pStyle w:val="Titolo2"/>
+      </w:pPr>
+      <w:r>
+        <w:rPr>
+          <w:b/>
+          <w:color w:val="E97132"/>
+        </w:rPr>
+        <w:t>Il trucco delle caselle e dei separatori</w:t>
+      </w:r>
+    </w:p>
+    <w:p>
+      <w:r>
+        <w:rPr/>
+        <w:t>Per contarli si rappresenta ogni monomio con una riga di 10 caselle, ognuna delle quali è la scelta di una variabile. Per comodità si dispongono in ordine tutte le x, poi le y, poi le z: il monomio x³ y² z⁵ diventa x x x y y z z z z z. Per un altro monomio, per esempio x⁴ y³ z³, si cambiano solo i punti in cui si passa da una variabile all'altra.</w:t>
+      </w:r>
+    </w:p>
+    <w:p>
+      <w:r>
+        <w:rPr/>
+        <w:t xml:space="preserve">Il passo cruciale è che </w:t>
+      </w:r>
+      <w:r>
+        <w:rPr>
+          <w:b/>
+        </w:rPr>
+        <w:t>tutta l'informazione sta nei punti di cambiamento</w:t>
+      </w:r>
+      <w:r>
+        <w:rPr/>
+        <w:t>, non in che cosa c'è nelle caselle. Se si decide dove la x diventa y e dove la y diventa z, il monomio è determinato. Con tre variabili ci sono due punti di cambiamento (con sei variabili sarebbero cinque, e in generale una in meno del numero di variabili). Quindi contare i monomi equivale a contare in quanti modi si possono inserire due «sbarrette» di separazione nella riga.</w:t>
+      </w:r>
+    </w:p>
+    <w:p>
+      <w:pPr>
+        <w:keepNext/>
+        <w:jc w:val="center"/>
+      </w:pPr>
+      <w:r>
+        <w:drawing>
+          <wp:inline xmlns:a="http://schemas.openxmlformats.org/drawingml/2006/main" xmlns:pic="http://schemas.openxmlformats.org/drawingml/2006/picture">
+            <wp:extent cx="4680000" cy="2734875"/>
+            <wp:docPr id="58" name="Picture 58"/>
+            <wp:cNvGraphicFramePr>
+              <a:graphicFrameLocks noChangeAspect="1"/>
+            </wp:cNvGraphicFramePr>
+            <a:graphic>
+              <a:graphicData uri="http://schemas.openxmlformats.org/drawingml/2006/picture">
+                <pic:pic>
+                  <pic:nvPicPr>
+                    <pic:cNvPr id="0" name="ch28_caselle_separatori.png"/>
+                    <pic:cNvPicPr/>
+                  </pic:nvPicPr>
+                  <pic:blipFill>
+                    <a:blip r:embed="rId62"/>
+                    <a:stretch>
+                      <a:fillRect/>
+                    </a:stretch>
+                  </pic:blipFill>
+                  <pic:spPr>
+                    <a:xfrm>
+                      <a:off x="0" y="0"/>
+                      <a:ext cx="4680000" cy="2734875"/>
+                    </a:xfrm>
+                    <a:prstGeom prst="rect"/>
+                  </pic:spPr>
+                </pic:pic>
+              </a:graphicData>
+            </a:graphic>
+          </wp:inline>
+        </w:drawing>
+      </w:r>
+    </w:p>
+    <w:p>
+      <w:pPr>
+        <w:jc w:val="center"/>
+      </w:pPr>
+      <w:r>
+        <w:rPr>
+          <w:i/>
+          <w:sz w:val="18"/>
+        </w:rPr>
+        <w:t>Il monomio x³ y² z⁵ in 10 caselle, e nella versione a 12 caselle in cui le due separazioni occupano una casella ciascuna; sotto, il caso x² z⁸, in cui mancando la y i separatori sono vicini ma in caselle distinte.</w:t>
+      </w:r>
+    </w:p>
+    <w:p>
+      <w:r>
+        <w:rPr/>
+        <w:t xml:space="preserve">Qui c'è però una complicazione. Per un monomio come x² z⁸, in cui manca la y, le due sbarrette finiscono nello stesso punto (la zona delle y si restringe a zero), e lo stesso accade se manca la prima o l'ultima variabile, per esempio x¹⁰ o z¹⁰. Bisogna quindi tenere conto che le due sbarrette possono cadere nello stesso posto, e questo complica il conteggio. Si risolve con un trucco: invece di mettere le separazioni </w:t>
+      </w:r>
+      <w:r>
+        <w:rPr>
+          <w:b/>
+        </w:rPr>
+        <w:t>fra</w:t>
+      </w:r>
+      <w:r>
+        <w:rPr/>
+        <w:t xml:space="preserve"> le caselle, si prende una striscia di </w:t>
+      </w:r>
+      <w:r>
+        <w:rPr>
+          <w:b/>
+        </w:rPr>
+        <w:t>12 caselle</w:t>
+      </w:r>
+      <w:r>
+        <w:rPr/>
+        <w:t xml:space="preserve">, cioè le 10 di prima più 2, e si </w:t>
+      </w:r>
+      <w:r>
+        <w:rPr>
+          <w:b/>
+        </w:rPr>
+        <w:t>riservano due caselle</w:t>
+      </w:r>
+      <w:r>
+        <w:rPr/>
+        <w:t xml:space="preserve"> alle separazioni. Si riscrive per esempio x x x • y y • z z z z z, dove i due punti segnano le separazioni.</w:t>
+      </w:r>
+    </w:p>
+    <w:p>
+      <w:r>
+        <w:rPr/>
+        <w:t xml:space="preserve">Non si è persa informazione: da questa striscia si ricava il monomio cancellando le due caselle di separazione, e viceversa dal monomio si ricostruisce la striscia. Il vantaggio è che ora le due separazioni occupano </w:t>
+      </w:r>
+      <w:r>
+        <w:rPr>
+          <w:b/>
+        </w:rPr>
+        <w:t>caselle distinte</w:t>
+      </w:r>
+      <w:r>
+        <w:rPr/>
+        <w:t>, e si possono scegliere in modo del tutto arbitrario: per x² z⁸ la striscia è x x • • z z z z z z z z, con le separazioni vicine ma non sovrapposte.</w:t>
+      </w:r>
+    </w:p>
+    <w:p>
+      <w:pPr>
+        <w:pStyle w:val="Titolo2"/>
+      </w:pPr>
+      <w:r>
+        <w:rPr>
+          <w:b/>
+          <w:color w:val="E97132"/>
+        </w:rPr>
+        <w:t>Il conteggio</w:t>
+      </w:r>
+    </w:p>
+    <w:p>
+      <w:r>
+        <w:rPr/>
+        <w:t>I monomi di grado 10 in tre variabili sono quindi tanti quanti i modi di scegliere 2 caselle (le separazioni) fra 12. Scegliere 2 caselle su 12 è una combinazione semplice di ordine 2 sulle 12, e quindi</w:t>
+      </w:r>
+    </w:p>
+    <w:p>
+      <w:r>
+        <w:rPr/>
+        <w:t>C</w:t>
+      </w:r>
+      <w:r>
+        <w:rPr>
+          <w:vertAlign w:val="superscript"/>
+        </w:rPr>
+        <w:t>r</w:t>
+      </w:r>
+      <w:r>
+        <w:rPr>
+          <w:vertAlign w:val="subscript"/>
+        </w:rPr>
+        <w:t>3,10</w:t>
+      </w:r>
+      <w:r>
+        <w:rPr/>
+        <w:t xml:space="preserve"> = C</w:t>
+      </w:r>
+      <w:r>
+        <w:rPr>
+          <w:vertAlign w:val="subscript"/>
+        </w:rPr>
+        <w:t>12,2</w:t>
+      </w:r>
+      <w:r>
+        <w:rPr/>
+        <w:t xml:space="preserve"> = 12! / (2! · 10!) = (12 · 11)/2 = 66.</w:t>
+      </w:r>
+    </w:p>
+    <w:p>
+      <w:r>
+        <w:rPr/>
+        <w:t>Ci sono 66 monomi di grado 10 in tre variabili.</w:t>
+      </w:r>
+    </w:p>
+    <w:p>
+      <w:r>
+        <w:rPr/>
+        <w:t>(In parole povere: invece di contare i monomi direttamente, si conta una cosa più facile che corrisponde esattamente a loro, cioè quante coppie di caselle si possono scegliere per mettere le separazioni. Dato che da una striscia si ricava un monomio e viceversa, i due conteggi coincidono.)</w:t>
+      </w:r>
+    </w:p>
+    <w:p>
+      <w:pPr>
+        <w:pStyle w:val="Titolo2"/>
+      </w:pPr>
+      <w:r>
+        <w:rPr>
+          <w:b/>
+          <w:color w:val="E97132"/>
+        </w:rPr>
+        <w:t>La formula generale</w:t>
+      </w:r>
+    </w:p>
+    <w:p>
+      <w:r>
+        <w:rPr/>
+        <w:t>Questo metodo non dipende dal problema particolare: le variabili x, y, z sono semplicemente gli elementi di un insieme da cui si sceglie. Il 2 che compare nel risultato è il numero delle separazioni, cioè il numero degli oggetti meno 1, perché per separare n oggetti servono n − 1 sbarrette (con un solo oggetto non servono separazioni, con due ne basta una, con tre ne servono due). Il 12 è invece il numero delle scelte originali, 10, più le caselle di separazione, 2.</w:t>
+      </w:r>
+    </w:p>
+    <w:p>
+      <w:r>
+        <w:rPr/>
+        <w:t>In generale, con A insieme di n elementi e k scelte (anche ripetute):</w:t>
+      </w:r>
+    </w:p>
+    <w:p>
+      <w:pPr>
+        <w:numPr>
+          <w:ilvl w:val="0"/>
+          <w:numId w:val="1"/>
+        </w:numPr>
+      </w:pPr>
+      <w:r>
+        <w:rPr/>
+        <w:t>le separazioni sono n − 1;</w:t>
+      </w:r>
+    </w:p>
+    <w:p>
+      <w:pPr>
+        <w:numPr>
+          <w:ilvl w:val="0"/>
+          <w:numId w:val="1"/>
+        </w:numPr>
+      </w:pPr>
+      <w:r>
+        <w:rPr/>
+        <w:t>la striscia ha k + (n − 1) = k + n − 1 caselle;</w:t>
+      </w:r>
+    </w:p>
+    <w:p>
+      <w:pPr>
+        <w:numPr>
+          <w:ilvl w:val="0"/>
+          <w:numId w:val="1"/>
+        </w:numPr>
+      </w:pPr>
+      <w:r>
+        <w:rPr/>
+        <w:t>si scelgono le n − 1 caselle delle separazioni fra le k + n − 1.</w:t>
+      </w:r>
+    </w:p>
+    <w:p>
+      <w:r>
+        <w:rPr>
+          <w:b/>
+        </w:rPr>
+        <w:t>Proposizione.</w:t>
+      </w:r>
+      <w:r>
+        <w:rPr/>
+        <w:t xml:space="preserve"> Il numero delle combinazioni con ripetizione di k elementi scelti fra n è</w:t>
+      </w:r>
+    </w:p>
+    <w:p>
+      <w:r>
+        <w:rPr/>
+        <w:t>C</w:t>
+      </w:r>
+      <w:r>
+        <w:rPr>
+          <w:vertAlign w:val="superscript"/>
+        </w:rPr>
+        <w:t>r</w:t>
+      </w:r>
+      <w:r>
+        <w:rPr>
+          <w:vertAlign w:val="subscript"/>
+        </w:rPr>
+        <w:t>n,k</w:t>
+      </w:r>
+      <w:r>
+        <w:rPr/>
+        <w:t xml:space="preserve"> = C</w:t>
+      </w:r>
+      <w:r>
+        <w:rPr>
+          <w:vertAlign w:val="subscript"/>
+        </w:rPr>
+        <w:t>k+n−1, n−1</w:t>
+      </w:r>
+      <w:r>
+        <w:rPr/>
+        <w:t xml:space="preserve"> = (k + n − 1)! / ((n − 1)! · k!).</w:t>
+      </w:r>
+    </w:p>
+    <w:p>
+      <w:r>
+        <w:rPr/>
+        <w:t>Nella formula, la differenza (k + n − 1) − (n − 1) è proprio k, ed è per questo che al denominatore compare k!. Con n = 3 e k = 10 si ritrova C</w:t>
+      </w:r>
+      <w:r>
+        <w:rPr>
+          <w:vertAlign w:val="subscript"/>
+        </w:rPr>
+        <w:t>12,2</w:t>
+      </w:r>
+      <w:r>
+        <w:rPr/>
+        <w:t xml:space="preserve"> = 66. È un risultato curioso e interessante: il calcolo delle combinazioni con ripetizione si è ricondotto a un problema già risolto, quello delle combinazioni semplici, in una situazione non identica ma strettamente imparentata, in cui cambiano soltanto i numeri.</w:t>
+      </w:r>
+    </w:p>
+    <w:p>
+      <w:pPr>
+        <w:pStyle w:val="Titolo2"/>
+      </w:pPr>
+      <w:r>
+        <w:rPr>
+          <w:b/>
+          <w:color w:val="E97132"/>
+        </w:rPr>
+        <w:t>I pasticcini</w:t>
+      </w:r>
+    </w:p>
+    <w:p>
+      <w:r>
+        <w:rPr/>
+        <w:t>La formula serve anche per il problema della pasticceria. Una pasticceria ha 20 tipi di pasticcini e si vuole un vassoio con 30 pasticcini. Poiché lo stesso tipo si può scegliere più volte, è un problema di combinazioni con ripetizione: 30 scelte (k = 30) fra 20 oggetti (n = 20). Si noti che le scelte sono più degli oggetti, e va bene lo stesso, perché la ripetizione è ammessa. Il numero è</w:t>
+      </w:r>
+    </w:p>
+    <w:p>
+      <w:r>
+        <w:rPr/>
+        <w:t>C</w:t>
+      </w:r>
+      <w:r>
+        <w:rPr>
+          <w:vertAlign w:val="superscript"/>
+        </w:rPr>
+        <w:t>r</w:t>
+      </w:r>
+      <w:r>
+        <w:rPr>
+          <w:vertAlign w:val="subscript"/>
+        </w:rPr>
+        <w:t>20,30</w:t>
+      </w:r>
+      <w:r>
+        <w:rPr/>
+        <w:t xml:space="preserve"> = C</w:t>
+      </w:r>
+      <w:r>
+        <w:rPr>
+          <w:vertAlign w:val="subscript"/>
+        </w:rPr>
+        <w:t>30+20−1, 20−1</w:t>
+      </w:r>
+      <w:r>
+        <w:rPr/>
+        <w:t xml:space="preserve"> = C</w:t>
+      </w:r>
+      <w:r>
+        <w:rPr>
+          <w:vertAlign w:val="subscript"/>
+        </w:rPr>
+        <w:t>49,19</w:t>
+      </w:r>
+      <w:r>
+        <w:rPr/>
+        <w:t xml:space="preserve"> = (49 su 19) = 49! / (19! · 30!).</w:t>
+      </w:r>
+    </w:p>
+    <w:p>
+      <w:r>
+        <w:rPr/>
+        <w:t>Si può immaginare la striscia di caselle: le 30 caselle dei pasticcini più 19 caselle di separazione fra i 20 tipi, in totale 49; il numero è quello dei modi di scegliere le 19 caselle di separazione fra le 49. È un numero molto grande (circa 1,9 · 10¹³, cioè 18 851 684 897 584), molto più grande delle sestine del superenalotto, e come per gli altri problemi interessa soprattutto il procedimento.</w:t>
+      </w:r>
+    </w:p>
+    <w:p>
+      <w:pPr>
+        <w:pStyle w:val="Titolo2"/>
+      </w:pPr>
+      <w:r>
+        <w:rPr>
+          <w:b/>
+          <w:color w:val="E97132"/>
+        </w:rPr>
+        <w:t>Il quadro completo dei conteggi</w:t>
+      </w:r>
+    </w:p>
+    <w:p>
+      <w:r>
+        <w:rPr/>
+        <w:t>Con questo capitolo si completa il quadro delle scelte di k elementi in un insieme di n, che si distinguono con due domande, l'ordine conta? e le scelte si possono ripetere?:</w:t>
+      </w:r>
+    </w:p>
+    <w:p>
+      <w:pPr>
+        <w:numPr>
+          <w:ilvl w:val="0"/>
+          <w:numId w:val="1"/>
+        </w:numPr>
+      </w:pPr>
+      <w:r>
+        <w:rPr/>
+        <w:t xml:space="preserve">scelte ordinate, </w:t>
+      </w:r>
+      <w:r>
+        <w:rPr>
+          <w:b/>
+        </w:rPr>
+        <w:t>con ripetizione</w:t>
+      </w:r>
+      <w:r>
+        <w:rPr/>
+        <w:t>: disposizioni con ripetizione, D</w:t>
+      </w:r>
+      <w:r>
+        <w:rPr>
+          <w:vertAlign w:val="superscript"/>
+        </w:rPr>
+        <w:t>r</w:t>
+      </w:r>
+      <w:r>
+        <w:rPr>
+          <w:vertAlign w:val="subscript"/>
+        </w:rPr>
+        <w:t>n,k</w:t>
+      </w:r>
+      <w:r>
+        <w:rPr/>
+        <w:t xml:space="preserve"> = n</w:t>
+      </w:r>
+      <w:r>
+        <w:rPr>
+          <w:vertAlign w:val="superscript"/>
+        </w:rPr>
+        <w:t>k</w:t>
+      </w:r>
+      <w:r>
+        <w:rPr/>
+        <w:t>;</w:t>
+      </w:r>
+    </w:p>
+    <w:p>
+      <w:pPr>
+        <w:numPr>
+          <w:ilvl w:val="0"/>
+          <w:numId w:val="1"/>
+        </w:numPr>
+      </w:pPr>
+      <w:r>
+        <w:rPr/>
+        <w:t xml:space="preserve">scelte ordinate, </w:t>
+      </w:r>
+      <w:r>
+        <w:rPr>
+          <w:b/>
+        </w:rPr>
+        <w:t>senza ripetizione</w:t>
+      </w:r>
+      <w:r>
+        <w:rPr/>
+        <w:t>: disposizioni semplici, D</w:t>
+      </w:r>
+      <w:r>
+        <w:rPr>
+          <w:vertAlign w:val="subscript"/>
+        </w:rPr>
+        <w:t>n,k</w:t>
+      </w:r>
+      <w:r>
+        <w:rPr/>
+        <w:t xml:space="preserve"> = n!/(n − k)!, e con k = n gli ordinamenti, n!;</w:t>
+      </w:r>
+    </w:p>
+    <w:p>
+      <w:pPr>
+        <w:numPr>
+          <w:ilvl w:val="0"/>
+          <w:numId w:val="1"/>
+        </w:numPr>
+      </w:pPr>
+      <w:r>
+        <w:rPr/>
+        <w:t xml:space="preserve">scelte non ordinate, </w:t>
+      </w:r>
+      <w:r>
+        <w:rPr>
+          <w:b/>
+        </w:rPr>
+        <w:t>senza ripetizione</w:t>
+      </w:r>
+      <w:r>
+        <w:rPr/>
+        <w:t>: combinazioni semplici, C</w:t>
+      </w:r>
+      <w:r>
+        <w:rPr>
+          <w:vertAlign w:val="subscript"/>
+        </w:rPr>
+        <w:t>n,k</w:t>
+      </w:r>
+      <w:r>
+        <w:rPr/>
+        <w:t xml:space="preserve"> = (n su k);</w:t>
+      </w:r>
+    </w:p>
+    <w:p>
+      <w:pPr>
+        <w:numPr>
+          <w:ilvl w:val="0"/>
+          <w:numId w:val="1"/>
+        </w:numPr>
+      </w:pPr>
+      <w:r>
+        <w:rPr/>
+        <w:t xml:space="preserve">scelte non ordinate, </w:t>
+      </w:r>
+      <w:r>
+        <w:rPr>
+          <w:b/>
+        </w:rPr>
+        <w:t>con ripetizione</w:t>
+      </w:r>
+      <w:r>
+        <w:rPr/>
+        <w:t>: combinazioni con ripetizione, C</w:t>
+      </w:r>
+      <w:r>
+        <w:rPr>
+          <w:vertAlign w:val="superscript"/>
+        </w:rPr>
+        <w:t>r</w:t>
+      </w:r>
+      <w:r>
+        <w:rPr>
+          <w:vertAlign w:val="subscript"/>
+        </w:rPr>
+        <w:t>n,k</w:t>
+      </w:r>
+      <w:r>
+        <w:rPr/>
+        <w:t xml:space="preserve"> = C</w:t>
+      </w:r>
+      <w:r>
+        <w:rPr>
+          <w:vertAlign w:val="subscript"/>
+        </w:rPr>
+        <w:t>k+n−1, n−1</w:t>
+      </w:r>
+      <w:r>
+        <w:rPr/>
+        <w:t>.</w:t>
+      </w:r>
+    </w:p>
+    <w:p>
+      <w:r>
+        <w:rPr/>
+        <w:t>Queste sono le tecniche di base: con i problemi dei capitoli 26 e 27 si tratta poi di capire a quale tipo di scelta si riconduce il testo e di suddividere la scelta in passi.</w:t>
       </w:r>
     </w:p>
     <w:sectPr>

</xml_diff>